<commit_message>
Add T-score (50 + 10 z) as second normalisation in scoring model and brief
Co-Authored-By: Claude Sonnet 5.5 <noreply@anthropic.com>
Claude-Session: https://claude.ai/code/session_01RkWScMhuRmEB4zppSmB7Ri
</commit_message>
<xml_diff>
--- a/WT26-27/Student Brief Midterm Presentation WT26-27.docx
+++ b/WT26-27/Student Brief Midterm Presentation WT26-27.docx
@@ -2921,15 +2921,15 @@
           <w:sz w:val="19"/>
           <w:szCs w:val="19"/>
         </w:rPr>
-        <w:t xml:space="preserve">z-scores</w:t>
-      </w:r>
-      <w:r>
-        <w:rPr>
-          <w:rFonts w:ascii="Verdana" w:cs="Verdana" w:eastAsia="Verdana" w:hAnsi="Verdana"/>
-          <w:sz w:val="19"/>
-          <w:szCs w:val="19"/>
-        </w:rPr>
-        <w:t xml:space="preserve"> (centering plus scaling: subtract the mean, divide by the standard deviation), which keep the distances in the data. Compare the two for your country and explain where they differ (Pollesch and Dale; JRC pocket guide). </w:t>
+        <w:t xml:space="preserve">T-scores</w:t>
+      </w:r>
+      <w:r>
+        <w:rPr>
+          <w:rFonts w:ascii="Verdana" w:cs="Verdana" w:eastAsia="Verdana" w:hAnsi="Verdana"/>
+          <w:sz w:val="19"/>
+          <w:szCs w:val="19"/>
+        </w:rPr>
+        <w:t xml:space="preserve">: first the z-score (centering plus scaling: subtract the mean, divide by the standard deviation), then T = 50 + 10 x z. A T-score of 50 is the average of the six countries and 60 is one standard deviation better. T-scores keep the distances in the data and are not capped at 0 and 100. Compare both scales for your country and explain where they differ (Pollesch and Dale; JRC pocket guide). </w:t>
       </w:r>
       <w:r>
         <w:rPr>
@@ -8271,7 +8271,7 @@
                 <w:sz w:val="16"/>
                 <w:szCs w:val="16"/>
               </w:rPr>
-              <w:t xml:space="preserve">Normalised and Z-scores</w:t>
+              <w:t xml:space="preserve">Normalised and T-scores</w:t>
             </w:r>
           </w:p>
         </w:tc>
@@ -8302,7 +8302,7 @@
                 <w:sz w:val="16"/>
                 <w:szCs w:val="16"/>
               </w:rPr>
-              <w:t xml:space="preserve">Two normalisations by formula</w:t>
+              <w:t xml:space="preserve">Two normalisations by formula: min-max (0 to 100) and T-score (50 + 10 x z)</w:t>
             </w:r>
           </w:p>
         </w:tc>
@@ -8373,7 +8373,7 @@
                 <w:sz w:val="16"/>
                 <w:szCs w:val="16"/>
               </w:rPr>
-              <w:t xml:space="preserve">Weighted scores and ranks for all weight sets, score by PESTEL dimension, z-score check</w:t>
+              <w:t xml:space="preserve">Weighted scores and ranks for all weight sets, score by PESTEL dimension, T-score check</w:t>
             </w:r>
           </w:p>
         </w:tc>
@@ -10265,7 +10265,7 @@
       <w:pPr>
         <w:spacing w:after="140"/>
       </w:pPr>
-      <w:hyperlink w:history="1" r:id="rId_alaagr_tq1okr4yqtcty">
+      <w:hyperlink w:history="1" r:id="rIdnnmk11dxru0_oszoh2gjx">
         <w:r>
           <w:rPr>
             <w:rStyle w:val="Hyperlink"/>
@@ -10311,7 +10311,7 @@
         </w:rPr>
         <w:t xml:space="preserve">JRC: 10-step pocket guide to composite indicators (free): </w:t>
       </w:r>
-      <w:hyperlink w:history="1" r:id="rIdylfl0k4jm_slnghu2aoer">
+      <w:hyperlink w:history="1" r:id="rIdmpeotfdc7cvalu4q0cr5f">
         <w:r>
           <w:rPr>
             <w:rStyle w:val="Hyperlink"/>
@@ -10340,7 +10340,7 @@
         </w:rPr>
         <w:t xml:space="preserve">OECD/JRC: Handbook on constructing composite indicators (free): </w:t>
       </w:r>
-      <w:hyperlink w:history="1" r:id="rId-0bdqn7yqixwg_g0jqds-">
+      <w:hyperlink w:history="1" r:id="rId8lcewn06tm0kmb3imbrh4">
         <w:r>
           <w:rPr>
             <w:rStyle w:val="Hyperlink"/>
@@ -10369,7 +10369,7 @@
         </w:rPr>
         <w:t xml:space="preserve">Greco et al. (2019): weighting and aggregation in composite indices (open access): </w:t>
       </w:r>
-      <w:hyperlink w:history="1" r:id="rIdeizwxbcp6dlnicxhompvv">
+      <w:hyperlink w:history="1" r:id="rIdk--crpasr54opls0mxxap">
         <w:r>
           <w:rPr>
             <w:rStyle w:val="Hyperlink"/>
@@ -10398,7 +10398,7 @@
         </w:rPr>
         <w:t xml:space="preserve">BPMSG: AHP Excel template (free): </w:t>
       </w:r>
-      <w:hyperlink w:history="1" r:id="rIdcd_abrll5m9vv8mpwfzhk">
+      <w:hyperlink w:history="1" r:id="rIdhwuggwjkgiozid_3crtmb">
         <w:r>
           <w:rPr>
             <w:rStyle w:val="Hyperlink"/>
@@ -10427,7 +10427,7 @@
         </w:rPr>
         <w:t xml:space="preserve">Best-Worst Method solvers (free): </w:t>
       </w:r>
-      <w:hyperlink w:history="1" r:id="rIdni3xazc5b0evrsetxwbki">
+      <w:hyperlink w:history="1" r:id="rIdnanzdpuclpwmraxapi_vn">
         <w:r>
           <w:rPr>
             <w:rStyle w:val="Hyperlink"/>
@@ -10456,7 +10456,7 @@
         </w:rPr>
         <w:t xml:space="preserve">JRC COIN Tool, Excel composite indicators (free): </w:t>
       </w:r>
-      <w:hyperlink w:history="1" r:id="rIdjyp3ml1-qf4d1tz382f3w">
+      <w:hyperlink w:history="1" r:id="rIdguph01pallxv5qeiwyhvk">
         <w:r>
           <w:rPr>
             <w:rStyle w:val="Hyperlink"/>
@@ -10502,7 +10502,7 @@
         </w:rPr>
         <w:t xml:space="preserve">globalEDGE Market Potential Index: eight dimensions with published weights (25, 15, 12.5, 12.5, 10, 10, 7.5, 7.5): </w:t>
       </w:r>
-      <w:hyperlink w:history="1" r:id="rIdfwghugsuhu3ul_ngvxmd6">
+      <w:hyperlink w:history="1" r:id="rIdpgxp3mstcphal0mp78trl">
         <w:r>
           <w:rPr>
             <w:rStyle w:val="Hyperlink"/>
@@ -10531,7 +10531,7 @@
         </w:rPr>
         <w:t xml:space="preserve">Cavusgil (1997): measuring the potential of emerging markets (WU library): </w:t>
       </w:r>
-      <w:hyperlink w:history="1" r:id="rIdisyhpsod4q_vcj4ufipk1">
+      <w:hyperlink w:history="1" r:id="rId7tfm_6fttnrolymzkbs2_">
         <w:r>
           <w:rPr>
             <w:rStyle w:val="Hyperlink"/>
@@ -10560,7 +10560,7 @@
         </w:rPr>
         <w:t xml:space="preserve">Ghemawat (2001): Distance still matters, the CAGE framework (WU library): </w:t>
       </w:r>
-      <w:hyperlink w:history="1" r:id="rIdi3fx6ge2dg9b0xuufuvwd">
+      <w:hyperlink w:history="1" r:id="rIdj_vfkmclmploch1moeip8">
         <w:r>
           <w:rPr>
             <w:rStyle w:val="Hyperlink"/>
@@ -10589,7 +10589,7 @@
         </w:rPr>
         <w:t xml:space="preserve">Musso and Francioni: how smaller firms select foreign markets (open access): </w:t>
       </w:r>
-      <w:hyperlink w:history="1" r:id="rId3qvgmwjq_6onofpv44rp6">
+      <w:hyperlink w:history="1" r:id="rIdn4ysbglt4dz0ut1cmxqb-">
         <w:r>
           <w:rPr>
             <w:rStyle w:val="Hyperlink"/>
@@ -10618,7 +10618,7 @@
         </w:rPr>
         <w:t xml:space="preserve">Pollesch and Dale (2016): normalisation choices (WU library): </w:t>
       </w:r>
-      <w:hyperlink w:history="1" r:id="rIdhnxyh2qwr2d0r6-xrmy9p">
+      <w:hyperlink w:history="1" r:id="rId-rlqtdigsibiherszrle_">
         <w:r>
           <w:rPr>
             <w:rStyle w:val="Hyperlink"/>
@@ -10664,7 +10664,7 @@
         </w:rPr>
         <w:t xml:space="preserve">ITC Export Potential Map, methodology (free): </w:t>
       </w:r>
-      <w:hyperlink w:history="1" r:id="rIdpi_fqlqo2fdtk3rhcvyqb">
+      <w:hyperlink w:history="1" r:id="rIdfoydlkflpyqvu7p6fn62m">
         <w:r>
           <w:rPr>
             <w:rStyle w:val="Hyperlink"/>
@@ -10693,7 +10693,7 @@
         </w:rPr>
         <w:t xml:space="preserve">Kearney Global Retail Development Index (free): </w:t>
       </w:r>
-      <w:hyperlink w:history="1" r:id="rId1wns4if33xaq7q4mbi7io">
+      <w:hyperlink w:history="1" r:id="rIdfycvswm-nez3xq-iw1dpx">
         <w:r>
           <w:rPr>
             <w:rStyle w:val="Hyperlink"/>
@@ -10722,7 +10722,7 @@
         </w:rPr>
         <w:t xml:space="preserve">Eurazeo: International Expansion Playbook (free): </w:t>
       </w:r>
-      <w:hyperlink w:history="1" r:id="rIdhjryrustyc_isrxfvqdlf">
+      <w:hyperlink w:history="1" r:id="rIdkzhrv9ermh2hcn9qlxy2a">
         <w:r>
           <w:rPr>
             <w:rStyle w:val="Hyperlink"/>
@@ -10751,7 +10751,7 @@
         </w:rPr>
         <w:t xml:space="preserve">Optional case about coffee: The Espresso Lane to Global Markets, illy (Ivey Publishing, paid): </w:t>
       </w:r>
-      <w:hyperlink w:history="1" r:id="rIdcrpv_febdrfywueh4fuum">
+      <w:hyperlink w:history="1" r:id="rIdo5u6sqgkqd1zb1feffody">
         <w:r>
           <w:rPr>
             <w:rStyle w:val="Hyperlink"/>
@@ -10780,7 +10780,7 @@
         </w:rPr>
         <w:t xml:space="preserve">IFC PAYG Market Attractiveness Index, an Excel tool with user guide (free): </w:t>
       </w:r>
-      <w:hyperlink w:history="1" r:id="rIdakyk4b33qmzltyow5ed8u">
+      <w:hyperlink w:history="1" r:id="rIdnlljenxk7nbpsgwgy_occ">
         <w:r>
           <w:rPr>
             <w:rStyle w:val="Hyperlink"/>
@@ -10826,7 +10826,7 @@
         </w:rPr>
         <w:t xml:space="preserve">World Bank World Development Indicators: </w:t>
       </w:r>
-      <w:hyperlink w:history="1" r:id="rIdd0zaeu-7gx_glpxr4f8i1">
+      <w:hyperlink w:history="1" r:id="rId4ag2-ocbdl7qa5j-gega3">
         <w:r>
           <w:rPr>
             <w:rStyle w:val="Hyperlink"/>
@@ -10855,7 +10855,7 @@
         </w:rPr>
         <w:t xml:space="preserve">IMF World Economic Outlook: </w:t>
       </w:r>
-      <w:hyperlink w:history="1" r:id="rIdwrhpvt8844nfwg_ymxvny">
+      <w:hyperlink w:history="1" r:id="rIduxyxqhoxntzparbygz51f">
         <w:r>
           <w:rPr>
             <w:rStyle w:val="Hyperlink"/>
@@ -10884,7 +10884,7 @@
         </w:rPr>
         <w:t xml:space="preserve">World Bank Worldwide Governance Indicators: </w:t>
       </w:r>
-      <w:hyperlink w:history="1" r:id="rId8_dzuw2pmum9b_cotcjxg">
+      <w:hyperlink w:history="1" r:id="rIdebkjfr7w7aaenuxqezxcf">
         <w:r>
           <w:rPr>
             <w:rStyle w:val="Hyperlink"/>
@@ -10913,7 +10913,7 @@
         </w:rPr>
         <w:t xml:space="preserve">EU Access2Markets (tariffs, requirements, rules of origin for EU exporters): </w:t>
       </w:r>
-      <w:hyperlink w:history="1" r:id="rIdxikqrg-niqvxloj4-t7w7">
+      <w:hyperlink w:history="1" r:id="rIdcjghy5nmklwevfgydw-q3">
         <w:r>
           <w:rPr>
             <w:rStyle w:val="Hyperlink"/>
@@ -10942,7 +10942,7 @@
         </w:rPr>
         <w:t xml:space="preserve">WTO tariff and trade data: </w:t>
       </w:r>
-      <w:hyperlink w:history="1" r:id="rIdjf8vaga7hetdu1meq78_-">
+      <w:hyperlink w:history="1" r:id="rIdi4ilpqxfwob0jb-fwp8bp">
         <w:r>
           <w:rPr>
             <w:rStyle w:val="Hyperlink"/>
@@ -10971,7 +10971,7 @@
         </w:rPr>
         <w:t xml:space="preserve">CEPII Gravity database (distance, language; free login): </w:t>
       </w:r>
-      <w:hyperlink w:history="1" r:id="rId9emnrugli75a3vpjwbzph">
+      <w:hyperlink w:history="1" r:id="rIdzjxhxyhyutzhcegpviqrw">
         <w:r>
           <w:rPr>
             <w:rStyle w:val="Hyperlink"/>
@@ -11000,7 +11000,7 @@
         </w:rPr>
         <w:t xml:space="preserve">Hofstede dimension data matrix: </w:t>
       </w:r>
-      <w:hyperlink w:history="1" r:id="rIdxkcvhunpuahjleoasr-vb">
+      <w:hyperlink w:history="1" r:id="rIdgjruogk2ulj7c_9zeb_s-">
         <w:r>
           <w:rPr>
             <w:rStyle w:val="Hyperlink"/>
@@ -11029,7 +11029,7 @@
         </w:rPr>
         <w:t xml:space="preserve">Coface country risk assessments: </w:t>
       </w:r>
-      <w:hyperlink w:history="1" r:id="rId-fvcsy5fxjx-zjhvz3zp0">
+      <w:hyperlink w:history="1" r:id="rIdleqggmvv6xsazocximqcf">
         <w:r>
           <w:rPr>
             <w:rStyle w:val="Hyperlink"/>
@@ -11058,7 +11058,7 @@
         </w:rPr>
         <w:t xml:space="preserve">Euromonitor Passport and Statista (WU library; statista.com): </w:t>
       </w:r>
-      <w:hyperlink w:history="1" r:id="rIdaf-aqrpktpywivnb6jv9v">
+      <w:hyperlink w:history="1" r:id="rId4puoqp-_9p1dlbmkqpedr">
         <w:r>
           <w:rPr>
             <w:rStyle w:val="Hyperlink"/>
@@ -11087,7 +11087,7 @@
         </w:rPr>
         <w:t xml:space="preserve">International Coffee Organization: coffee statistics: </w:t>
       </w:r>
-      <w:hyperlink w:history="1" r:id="rIdatyev3c79d07cgybofygp">
+      <w:hyperlink w:history="1" r:id="rIduh-scxedr6bxtec2sb16q">
         <w:r>
           <w:rPr>
             <w:rStyle w:val="Hyperlink"/>
@@ -11116,7 +11116,7 @@
         </w:rPr>
         <w:t xml:space="preserve">USDA Foreign Agricultural Service: annual coffee reports by country (search for your countries): </w:t>
       </w:r>
-      <w:hyperlink w:history="1" r:id="rIdp6lc6xwtp7mkaqroumkuk">
+      <w:hyperlink w:history="1" r:id="rIdb5ptfb5yshrabcqivnpw6">
         <w:r>
           <w:rPr>
             <w:rStyle w:val="Hyperlink"/>
@@ -11145,7 +11145,7 @@
         </w:rPr>
         <w:t xml:space="preserve">UN Comtrade (comtradeplus.un.org) and ITC Trade Map (free login): coffee trade flows and tariffs, HS 0901: </w:t>
       </w:r>
-      <w:hyperlink w:history="1" r:id="rIdmyk41z4fwjb6vdwjkaro_">
+      <w:hyperlink w:history="1" r:id="rIdem0cfv3qjsk7j2kcgkpil">
         <w:r>
           <w:rPr>
             <w:rStyle w:val="Hyperlink"/>
@@ -11174,7 +11174,7 @@
         </w:rPr>
         <w:t xml:space="preserve">WKO AUSSENWIRTSCHAFT: reports and country profiles: </w:t>
       </w:r>
-      <w:hyperlink w:history="1" r:id="rId0d_mnwnfdoemzh6by_z4r">
+      <w:hyperlink w:history="1" r:id="rIdgie16zbvgzgcpvltagbcp">
         <w:r>
           <w:rPr>
             <w:rStyle w:val="Hyperlink"/>

</xml_diff>

<commit_message>
Brief: pitfall wording T-scores
Co-Authored-By: Claude Sonnet 5.5 <noreply@anthropic.com>
Claude-Session: https://claude.ai/code/session_01RkWScMhuRmEB4zppSmB7Ri
</commit_message>
<xml_diff>
--- a/WT26-27/Student Brief Midterm Presentation WT26-27.docx
+++ b/WT26-27/Student Brief Midterm Presentation WT26-27.docx
@@ -10073,7 +10073,7 @@
           <w:sz w:val="19"/>
           <w:szCs w:val="19"/>
         </w:rPr>
-        <w:t xml:space="preserve"> It stretches tiny differences. Compare it with the z-scores.</w:t>
+        <w:t xml:space="preserve"> It stretches tiny differences. Compare it with the T-scores.</w:t>
       </w:r>
     </w:p>
     <w:p>
@@ -10265,7 +10265,7 @@
       <w:pPr>
         <w:spacing w:after="140"/>
       </w:pPr>
-      <w:hyperlink w:history="1" r:id="rIdnnmk11dxru0_oszoh2gjx">
+      <w:hyperlink w:history="1" r:id="rIdijgpp-cybvq_6zfwswa2j">
         <w:r>
           <w:rPr>
             <w:rStyle w:val="Hyperlink"/>
@@ -10311,7 +10311,7 @@
         </w:rPr>
         <w:t xml:space="preserve">JRC: 10-step pocket guide to composite indicators (free): </w:t>
       </w:r>
-      <w:hyperlink w:history="1" r:id="rIdmpeotfdc7cvalu4q0cr5f">
+      <w:hyperlink w:history="1" r:id="rIdavgutl6yc7fkxen_akyu6">
         <w:r>
           <w:rPr>
             <w:rStyle w:val="Hyperlink"/>
@@ -10340,7 +10340,7 @@
         </w:rPr>
         <w:t xml:space="preserve">OECD/JRC: Handbook on constructing composite indicators (free): </w:t>
       </w:r>
-      <w:hyperlink w:history="1" r:id="rId8lcewn06tm0kmb3imbrh4">
+      <w:hyperlink w:history="1" r:id="rIdhbmzvahkmbivbpz6ljfku">
         <w:r>
           <w:rPr>
             <w:rStyle w:val="Hyperlink"/>
@@ -10369,7 +10369,7 @@
         </w:rPr>
         <w:t xml:space="preserve">Greco et al. (2019): weighting and aggregation in composite indices (open access): </w:t>
       </w:r>
-      <w:hyperlink w:history="1" r:id="rIdk--crpasr54opls0mxxap">
+      <w:hyperlink w:history="1" r:id="rIdgcmnsejfx0sujhabhhwxm">
         <w:r>
           <w:rPr>
             <w:rStyle w:val="Hyperlink"/>
@@ -10398,7 +10398,7 @@
         </w:rPr>
         <w:t xml:space="preserve">BPMSG: AHP Excel template (free): </w:t>
       </w:r>
-      <w:hyperlink w:history="1" r:id="rIdhwuggwjkgiozid_3crtmb">
+      <w:hyperlink w:history="1" r:id="rIduurgb-5lnunfbpkkpke26">
         <w:r>
           <w:rPr>
             <w:rStyle w:val="Hyperlink"/>
@@ -10427,7 +10427,7 @@
         </w:rPr>
         <w:t xml:space="preserve">Best-Worst Method solvers (free): </w:t>
       </w:r>
-      <w:hyperlink w:history="1" r:id="rIdnanzdpuclpwmraxapi_vn">
+      <w:hyperlink w:history="1" r:id="rIdq46kjsmtezjnwqkwdyedz">
         <w:r>
           <w:rPr>
             <w:rStyle w:val="Hyperlink"/>
@@ -10456,7 +10456,7 @@
         </w:rPr>
         <w:t xml:space="preserve">JRC COIN Tool, Excel composite indicators (free): </w:t>
       </w:r>
-      <w:hyperlink w:history="1" r:id="rIdguph01pallxv5qeiwyhvk">
+      <w:hyperlink w:history="1" r:id="rIdvd8iscy80okingg1k72ej">
         <w:r>
           <w:rPr>
             <w:rStyle w:val="Hyperlink"/>
@@ -10502,7 +10502,7 @@
         </w:rPr>
         <w:t xml:space="preserve">globalEDGE Market Potential Index: eight dimensions with published weights (25, 15, 12.5, 12.5, 10, 10, 7.5, 7.5): </w:t>
       </w:r>
-      <w:hyperlink w:history="1" r:id="rIdpgxp3mstcphal0mp78trl">
+      <w:hyperlink w:history="1" r:id="rIdsrhwl-lhtd0otgrzonrtj">
         <w:r>
           <w:rPr>
             <w:rStyle w:val="Hyperlink"/>
@@ -10531,7 +10531,7 @@
         </w:rPr>
         <w:t xml:space="preserve">Cavusgil (1997): measuring the potential of emerging markets (WU library): </w:t>
       </w:r>
-      <w:hyperlink w:history="1" r:id="rId7tfm_6fttnrolymzkbs2_">
+      <w:hyperlink w:history="1" r:id="rIdvh3-gnwq2uorgjw_tq9ia">
         <w:r>
           <w:rPr>
             <w:rStyle w:val="Hyperlink"/>
@@ -10560,7 +10560,7 @@
         </w:rPr>
         <w:t xml:space="preserve">Ghemawat (2001): Distance still matters, the CAGE framework (WU library): </w:t>
       </w:r>
-      <w:hyperlink w:history="1" r:id="rIdj_vfkmclmploch1moeip8">
+      <w:hyperlink w:history="1" r:id="rId5p3oof45glly3pkl6nhxi">
         <w:r>
           <w:rPr>
             <w:rStyle w:val="Hyperlink"/>
@@ -10589,7 +10589,7 @@
         </w:rPr>
         <w:t xml:space="preserve">Musso and Francioni: how smaller firms select foreign markets (open access): </w:t>
       </w:r>
-      <w:hyperlink w:history="1" r:id="rIdn4ysbglt4dz0ut1cmxqb-">
+      <w:hyperlink w:history="1" r:id="rIdpmnw5yyukuofjimx8y5_4">
         <w:r>
           <w:rPr>
             <w:rStyle w:val="Hyperlink"/>
@@ -10618,7 +10618,7 @@
         </w:rPr>
         <w:t xml:space="preserve">Pollesch and Dale (2016): normalisation choices (WU library): </w:t>
       </w:r>
-      <w:hyperlink w:history="1" r:id="rId-rlqtdigsibiherszrle_">
+      <w:hyperlink w:history="1" r:id="rIda9rwohoxe3omtjpljuude">
         <w:r>
           <w:rPr>
             <w:rStyle w:val="Hyperlink"/>
@@ -10664,7 +10664,7 @@
         </w:rPr>
         <w:t xml:space="preserve">ITC Export Potential Map, methodology (free): </w:t>
       </w:r>
-      <w:hyperlink w:history="1" r:id="rIdfoydlkflpyqvu7p6fn62m">
+      <w:hyperlink w:history="1" r:id="rIdd4-rwgbmb-2cfhnzcqjyo">
         <w:r>
           <w:rPr>
             <w:rStyle w:val="Hyperlink"/>
@@ -10693,7 +10693,7 @@
         </w:rPr>
         <w:t xml:space="preserve">Kearney Global Retail Development Index (free): </w:t>
       </w:r>
-      <w:hyperlink w:history="1" r:id="rIdfycvswm-nez3xq-iw1dpx">
+      <w:hyperlink w:history="1" r:id="rIdqrsiwce9_zrqz5akyg5_d">
         <w:r>
           <w:rPr>
             <w:rStyle w:val="Hyperlink"/>
@@ -10722,7 +10722,7 @@
         </w:rPr>
         <w:t xml:space="preserve">Eurazeo: International Expansion Playbook (free): </w:t>
       </w:r>
-      <w:hyperlink w:history="1" r:id="rIdkzhrv9ermh2hcn9qlxy2a">
+      <w:hyperlink w:history="1" r:id="rIdu6d10bkzme0crsghvkz_2">
         <w:r>
           <w:rPr>
             <w:rStyle w:val="Hyperlink"/>
@@ -10751,7 +10751,7 @@
         </w:rPr>
         <w:t xml:space="preserve">Optional case about coffee: The Espresso Lane to Global Markets, illy (Ivey Publishing, paid): </w:t>
       </w:r>
-      <w:hyperlink w:history="1" r:id="rIdo5u6sqgkqd1zb1feffody">
+      <w:hyperlink w:history="1" r:id="rIdyxxfg4bhxv5kydttdouux">
         <w:r>
           <w:rPr>
             <w:rStyle w:val="Hyperlink"/>
@@ -10780,7 +10780,7 @@
         </w:rPr>
         <w:t xml:space="preserve">IFC PAYG Market Attractiveness Index, an Excel tool with user guide (free): </w:t>
       </w:r>
-      <w:hyperlink w:history="1" r:id="rIdnlljenxk7nbpsgwgy_occ">
+      <w:hyperlink w:history="1" r:id="rId4llinet1l4wcxev-j-m4w">
         <w:r>
           <w:rPr>
             <w:rStyle w:val="Hyperlink"/>
@@ -10826,7 +10826,7 @@
         </w:rPr>
         <w:t xml:space="preserve">World Bank World Development Indicators: </w:t>
       </w:r>
-      <w:hyperlink w:history="1" r:id="rId4ag2-ocbdl7qa5j-gega3">
+      <w:hyperlink w:history="1" r:id="rIduimlmb6qsyenhurt4g39w">
         <w:r>
           <w:rPr>
             <w:rStyle w:val="Hyperlink"/>
@@ -10855,7 +10855,7 @@
         </w:rPr>
         <w:t xml:space="preserve">IMF World Economic Outlook: </w:t>
       </w:r>
-      <w:hyperlink w:history="1" r:id="rIduxyxqhoxntzparbygz51f">
+      <w:hyperlink w:history="1" r:id="rIdruqy9k5lkho9tz0wrgorn">
         <w:r>
           <w:rPr>
             <w:rStyle w:val="Hyperlink"/>
@@ -10884,7 +10884,7 @@
         </w:rPr>
         <w:t xml:space="preserve">World Bank Worldwide Governance Indicators: </w:t>
       </w:r>
-      <w:hyperlink w:history="1" r:id="rIdebkjfr7w7aaenuxqezxcf">
+      <w:hyperlink w:history="1" r:id="rId6ca7xzw3g5twtgnw-xjjg">
         <w:r>
           <w:rPr>
             <w:rStyle w:val="Hyperlink"/>
@@ -10913,7 +10913,7 @@
         </w:rPr>
         <w:t xml:space="preserve">EU Access2Markets (tariffs, requirements, rules of origin for EU exporters): </w:t>
       </w:r>
-      <w:hyperlink w:history="1" r:id="rIdcjghy5nmklwevfgydw-q3">
+      <w:hyperlink w:history="1" r:id="rIdxcex8wobolcxyyip-zx34">
         <w:r>
           <w:rPr>
             <w:rStyle w:val="Hyperlink"/>
@@ -10942,7 +10942,7 @@
         </w:rPr>
         <w:t xml:space="preserve">WTO tariff and trade data: </w:t>
       </w:r>
-      <w:hyperlink w:history="1" r:id="rIdi4ilpqxfwob0jb-fwp8bp">
+      <w:hyperlink w:history="1" r:id="rId4my0wylmqqlqf_sxx3u3q">
         <w:r>
           <w:rPr>
             <w:rStyle w:val="Hyperlink"/>
@@ -10971,7 +10971,7 @@
         </w:rPr>
         <w:t xml:space="preserve">CEPII Gravity database (distance, language; free login): </w:t>
       </w:r>
-      <w:hyperlink w:history="1" r:id="rIdzjxhxyhyutzhcegpviqrw">
+      <w:hyperlink w:history="1" r:id="rIdhi4xeg0s9fwiyz_q8ial4">
         <w:r>
           <w:rPr>
             <w:rStyle w:val="Hyperlink"/>
@@ -11000,7 +11000,7 @@
         </w:rPr>
         <w:t xml:space="preserve">Hofstede dimension data matrix: </w:t>
       </w:r>
-      <w:hyperlink w:history="1" r:id="rIdgjruogk2ulj7c_9zeb_s-">
+      <w:hyperlink w:history="1" r:id="rIdczlq2ffeqbmb1ne452n5q">
         <w:r>
           <w:rPr>
             <w:rStyle w:val="Hyperlink"/>
@@ -11029,7 +11029,7 @@
         </w:rPr>
         <w:t xml:space="preserve">Coface country risk assessments: </w:t>
       </w:r>
-      <w:hyperlink w:history="1" r:id="rIdleqggmvv6xsazocximqcf">
+      <w:hyperlink w:history="1" r:id="rIdywpox1qnrp-mm5i-6knxr">
         <w:r>
           <w:rPr>
             <w:rStyle w:val="Hyperlink"/>
@@ -11058,7 +11058,7 @@
         </w:rPr>
         <w:t xml:space="preserve">Euromonitor Passport and Statista (WU library; statista.com): </w:t>
       </w:r>
-      <w:hyperlink w:history="1" r:id="rId4puoqp-_9p1dlbmkqpedr">
+      <w:hyperlink w:history="1" r:id="rIdcclxnckhsfwpgtnfo2blb">
         <w:r>
           <w:rPr>
             <w:rStyle w:val="Hyperlink"/>
@@ -11087,7 +11087,7 @@
         </w:rPr>
         <w:t xml:space="preserve">International Coffee Organization: coffee statistics: </w:t>
       </w:r>
-      <w:hyperlink w:history="1" r:id="rIduh-scxedr6bxtec2sb16q">
+      <w:hyperlink w:history="1" r:id="rIdtbzynv0qdib-bituklg1q">
         <w:r>
           <w:rPr>
             <w:rStyle w:val="Hyperlink"/>
@@ -11116,7 +11116,7 @@
         </w:rPr>
         <w:t xml:space="preserve">USDA Foreign Agricultural Service: annual coffee reports by country (search for your countries): </w:t>
       </w:r>
-      <w:hyperlink w:history="1" r:id="rIdb5ptfb5yshrabcqivnpw6">
+      <w:hyperlink w:history="1" r:id="rIdc4dmhmuvz7nsgcehn9xjm">
         <w:r>
           <w:rPr>
             <w:rStyle w:val="Hyperlink"/>
@@ -11145,7 +11145,7 @@
         </w:rPr>
         <w:t xml:space="preserve">UN Comtrade (comtradeplus.un.org) and ITC Trade Map (free login): coffee trade flows and tariffs, HS 0901: </w:t>
       </w:r>
-      <w:hyperlink w:history="1" r:id="rIdem0cfv3qjsk7j2kcgkpil">
+      <w:hyperlink w:history="1" r:id="rId9hbugltl6vcddfzjp7q3o">
         <w:r>
           <w:rPr>
             <w:rStyle w:val="Hyperlink"/>
@@ -11174,7 +11174,7 @@
         </w:rPr>
         <w:t xml:space="preserve">WKO AUSSENWIRTSCHAFT: reports and country profiles: </w:t>
       </w:r>
-      <w:hyperlink w:history="1" r:id="rIdgie16zbvgzgcpvltagbcp">
+      <w:hyperlink w:history="1" r:id="rIdtfmf4tqkwgfwthfblxyyd">
         <w:r>
           <w:rPr>
             <w:rStyle w:val="Hyperlink"/>

</xml_diff>

<commit_message>
Align syllabus and slide deck with midterm brief; add discussion time and submission deadline
Co-Authored-By: Claude Sonnet 5.5 <noreply@anthropic.com>
Claude-Session: https://claude.ai/code/session_01RkWScMhuRmEB4zppSmB7Ri
</commit_message>
<xml_diff>
--- a/WT26-27/Student Brief Midterm Presentation WT26-27.docx
+++ b/WT26-27/Student Brief Midterm Presentation WT26-27.docx
@@ -307,24 +307,7 @@
                 <w:sz w:val="16"/>
                 <w:szCs w:val="16"/>
               </w:rPr>
-              <w:t xml:space="preserve">Group presentation of 20 minutes plus one Excel file with your data and industry analysis. Discussion time: </w:t>
-            </w:r>
-            <w:r>
-              <w:rPr>
-                <w:rFonts w:ascii="Verdana" w:cs="Verdana" w:eastAsia="Verdana" w:hAnsi="Verdana"/>
-                <w:sz w:val="16"/>
-                <w:szCs w:val="16"/>
-                <w:highlight w:val="yellow"/>
-              </w:rPr>
-              <w:t xml:space="preserve">[x minutes]</w:t>
-            </w:r>
-            <w:r>
-              <w:rPr>
-                <w:rFonts w:ascii="Verdana" w:cs="Verdana" w:eastAsia="Verdana" w:hAnsi="Verdana"/>
-                <w:sz w:val="16"/>
-                <w:szCs w:val="16"/>
-              </w:rPr>
-              <w:t xml:space="preserve">.</w:t>
+              <w:t xml:space="preserve">Group presentation of 20 minutes plus one Excel file with your data and industry analysis. Discussion time: 10 minutes.</w:t>
             </w:r>
           </w:p>
         </w:tc>
@@ -527,17 +510,8 @@
                 <w:rFonts w:ascii="Verdana" w:cs="Verdana" w:eastAsia="Verdana" w:hAnsi="Verdana"/>
                 <w:sz w:val="16"/>
                 <w:szCs w:val="16"/>
-                <w:highlight w:val="yellow"/>
-              </w:rPr>
-              <w:t xml:space="preserve">[date and time]</w:t>
-            </w:r>
-            <w:r>
-              <w:rPr>
-                <w:rFonts w:ascii="Verdana" w:cs="Verdana" w:eastAsia="Verdana" w:hAnsi="Verdana"/>
-                <w:sz w:val="16"/>
-                <w:szCs w:val="16"/>
-              </w:rPr>
-              <w:t xml:space="preserve"> on Canvas: one presentation file and one Excel file, named GroupX_Midterm and GroupX_Midterm_Data; your country's data are due in the shared Google Sheet earlier (Step 3).</w:t>
+              </w:rPr>
+              <w:t xml:space="preserve">Monday 16 November 2026, 08:00 on Canvas: one presentation file and one Excel file, named GroupX_Midterm and GroupX_Midterm_Data; your country's data are due in the shared Google Sheet earlier (Step 3).</w:t>
             </w:r>
           </w:p>
         </w:tc>
@@ -7025,7 +6999,7 @@
           <w:sz w:val="19"/>
           <w:szCs w:val="19"/>
         </w:rPr>
-        <w:t xml:space="preserve">20 minutes. Rehearse to time. Slide limit: </w:t>
+        <w:t xml:space="preserve">20 minutes plus 10 minutes of discussion. Rehearse to time. Slide limit: </w:t>
       </w:r>
       <w:r>
         <w:rPr>
@@ -9896,16 +9870,7 @@
                 <w:sz w:val="16"/>
                 <w:szCs w:val="16"/>
               </w:rPr>
-              <w:t xml:space="preserve">Finish robustness and your recommendation; Part B; rehearse; submit the files by </w:t>
-            </w:r>
-            <w:r>
-              <w:rPr>
-                <w:rFonts w:ascii="Verdana" w:cs="Verdana" w:eastAsia="Verdana" w:hAnsi="Verdana"/>
-                <w:sz w:val="16"/>
-                <w:szCs w:val="16"/>
-                <w:highlight w:val="yellow"/>
-              </w:rPr>
-              <w:t xml:space="preserve">[deadline]</w:t>
+              <w:t xml:space="preserve">Finish robustness and your recommendation; Part B; rehearse; submit the files on Canvas by Monday 16 November 2026, 08:00</w:t>
             </w:r>
           </w:p>
         </w:tc>
@@ -10265,7 +10230,7 @@
       <w:pPr>
         <w:spacing w:after="140"/>
       </w:pPr>
-      <w:hyperlink w:history="1" r:id="rIdijgpp-cybvq_6zfwswa2j">
+      <w:hyperlink w:history="1" r:id="rIdgiphmnpee8j4stsieah1g">
         <w:r>
           <w:rPr>
             <w:rStyle w:val="Hyperlink"/>
@@ -10311,7 +10276,7 @@
         </w:rPr>
         <w:t xml:space="preserve">JRC: 10-step pocket guide to composite indicators (free): </w:t>
       </w:r>
-      <w:hyperlink w:history="1" r:id="rIdavgutl6yc7fkxen_akyu6">
+      <w:hyperlink w:history="1" r:id="rId35ckwkirdkes110rnfzte">
         <w:r>
           <w:rPr>
             <w:rStyle w:val="Hyperlink"/>
@@ -10340,7 +10305,7 @@
         </w:rPr>
         <w:t xml:space="preserve">OECD/JRC: Handbook on constructing composite indicators (free): </w:t>
       </w:r>
-      <w:hyperlink w:history="1" r:id="rIdhbmzvahkmbivbpz6ljfku">
+      <w:hyperlink w:history="1" r:id="rIdgpa_u4lewlp8k6zdlc8vs">
         <w:r>
           <w:rPr>
             <w:rStyle w:val="Hyperlink"/>
@@ -10369,7 +10334,7 @@
         </w:rPr>
         <w:t xml:space="preserve">Greco et al. (2019): weighting and aggregation in composite indices (open access): </w:t>
       </w:r>
-      <w:hyperlink w:history="1" r:id="rIdgcmnsejfx0sujhabhhwxm">
+      <w:hyperlink w:history="1" r:id="rIdrpfjeq7udnqm1nitc2vc4">
         <w:r>
           <w:rPr>
             <w:rStyle w:val="Hyperlink"/>
@@ -10398,7 +10363,7 @@
         </w:rPr>
         <w:t xml:space="preserve">BPMSG: AHP Excel template (free): </w:t>
       </w:r>
-      <w:hyperlink w:history="1" r:id="rIduurgb-5lnunfbpkkpke26">
+      <w:hyperlink w:history="1" r:id="rIdcwshbylpop9-ru5xeaccu">
         <w:r>
           <w:rPr>
             <w:rStyle w:val="Hyperlink"/>
@@ -10427,7 +10392,7 @@
         </w:rPr>
         <w:t xml:space="preserve">Best-Worst Method solvers (free): </w:t>
       </w:r>
-      <w:hyperlink w:history="1" r:id="rIdq46kjsmtezjnwqkwdyedz">
+      <w:hyperlink w:history="1" r:id="rIdeixolidbvj6v6k3jqeb-y">
         <w:r>
           <w:rPr>
             <w:rStyle w:val="Hyperlink"/>
@@ -10456,7 +10421,7 @@
         </w:rPr>
         <w:t xml:space="preserve">JRC COIN Tool, Excel composite indicators (free): </w:t>
       </w:r>
-      <w:hyperlink w:history="1" r:id="rIdvd8iscy80okingg1k72ej">
+      <w:hyperlink w:history="1" r:id="rId2pqgfggftrhvt2eh7sm3a">
         <w:r>
           <w:rPr>
             <w:rStyle w:val="Hyperlink"/>
@@ -10502,7 +10467,7 @@
         </w:rPr>
         <w:t xml:space="preserve">globalEDGE Market Potential Index: eight dimensions with published weights (25, 15, 12.5, 12.5, 10, 10, 7.5, 7.5): </w:t>
       </w:r>
-      <w:hyperlink w:history="1" r:id="rIdsrhwl-lhtd0otgrzonrtj">
+      <w:hyperlink w:history="1" r:id="rIdzmqvnmdh7yxxftaonhjus">
         <w:r>
           <w:rPr>
             <w:rStyle w:val="Hyperlink"/>
@@ -10531,7 +10496,7 @@
         </w:rPr>
         <w:t xml:space="preserve">Cavusgil (1997): measuring the potential of emerging markets (WU library): </w:t>
       </w:r>
-      <w:hyperlink w:history="1" r:id="rIdvh3-gnwq2uorgjw_tq9ia">
+      <w:hyperlink w:history="1" r:id="rIdlmoijbgx2kjz2j33fxc1r">
         <w:r>
           <w:rPr>
             <w:rStyle w:val="Hyperlink"/>
@@ -10560,7 +10525,7 @@
         </w:rPr>
         <w:t xml:space="preserve">Ghemawat (2001): Distance still matters, the CAGE framework (WU library): </w:t>
       </w:r>
-      <w:hyperlink w:history="1" r:id="rId5p3oof45glly3pkl6nhxi">
+      <w:hyperlink w:history="1" r:id="rIdnnqbzdyum86w4ntkmjrbq">
         <w:r>
           <w:rPr>
             <w:rStyle w:val="Hyperlink"/>
@@ -10589,7 +10554,7 @@
         </w:rPr>
         <w:t xml:space="preserve">Musso and Francioni: how smaller firms select foreign markets (open access): </w:t>
       </w:r>
-      <w:hyperlink w:history="1" r:id="rIdpmnw5yyukuofjimx8y5_4">
+      <w:hyperlink w:history="1" r:id="rIdfuo_kg-sgmsygk_gt1u3v">
         <w:r>
           <w:rPr>
             <w:rStyle w:val="Hyperlink"/>
@@ -10618,7 +10583,7 @@
         </w:rPr>
         <w:t xml:space="preserve">Pollesch and Dale (2016): normalisation choices (WU library): </w:t>
       </w:r>
-      <w:hyperlink w:history="1" r:id="rIda9rwohoxe3omtjpljuude">
+      <w:hyperlink w:history="1" r:id="rIdw82jcph6c0eg6555eb_vz">
         <w:r>
           <w:rPr>
             <w:rStyle w:val="Hyperlink"/>
@@ -10664,7 +10629,7 @@
         </w:rPr>
         <w:t xml:space="preserve">ITC Export Potential Map, methodology (free): </w:t>
       </w:r>
-      <w:hyperlink w:history="1" r:id="rIdd4-rwgbmb-2cfhnzcqjyo">
+      <w:hyperlink w:history="1" r:id="rIdgbesqko-wdzwctoxiat_t">
         <w:r>
           <w:rPr>
             <w:rStyle w:val="Hyperlink"/>
@@ -10693,7 +10658,7 @@
         </w:rPr>
         <w:t xml:space="preserve">Kearney Global Retail Development Index (free): </w:t>
       </w:r>
-      <w:hyperlink w:history="1" r:id="rIdqrsiwce9_zrqz5akyg5_d">
+      <w:hyperlink w:history="1" r:id="rIdhd3lfzk_g-suyyau6iyfg">
         <w:r>
           <w:rPr>
             <w:rStyle w:val="Hyperlink"/>
@@ -10722,7 +10687,7 @@
         </w:rPr>
         <w:t xml:space="preserve">Eurazeo: International Expansion Playbook (free): </w:t>
       </w:r>
-      <w:hyperlink w:history="1" r:id="rIdu6d10bkzme0crsghvkz_2">
+      <w:hyperlink w:history="1" r:id="rIdqt3-vpn2rmu4r1evq1alv">
         <w:r>
           <w:rPr>
             <w:rStyle w:val="Hyperlink"/>
@@ -10751,7 +10716,7 @@
         </w:rPr>
         <w:t xml:space="preserve">Optional case about coffee: The Espresso Lane to Global Markets, illy (Ivey Publishing, paid): </w:t>
       </w:r>
-      <w:hyperlink w:history="1" r:id="rIdyxxfg4bhxv5kydttdouux">
+      <w:hyperlink w:history="1" r:id="rIdtyg5mw0mfuuzna5sbycin">
         <w:r>
           <w:rPr>
             <w:rStyle w:val="Hyperlink"/>
@@ -10780,7 +10745,7 @@
         </w:rPr>
         <w:t xml:space="preserve">IFC PAYG Market Attractiveness Index, an Excel tool with user guide (free): </w:t>
       </w:r>
-      <w:hyperlink w:history="1" r:id="rId4llinet1l4wcxev-j-m4w">
+      <w:hyperlink w:history="1" r:id="rIdxap9ipjpfudegdvp1asiw">
         <w:r>
           <w:rPr>
             <w:rStyle w:val="Hyperlink"/>
@@ -10826,7 +10791,7 @@
         </w:rPr>
         <w:t xml:space="preserve">World Bank World Development Indicators: </w:t>
       </w:r>
-      <w:hyperlink w:history="1" r:id="rIduimlmb6qsyenhurt4g39w">
+      <w:hyperlink w:history="1" r:id="rIdb7mmsx6yzqatytf0xoypk">
         <w:r>
           <w:rPr>
             <w:rStyle w:val="Hyperlink"/>
@@ -10855,7 +10820,7 @@
         </w:rPr>
         <w:t xml:space="preserve">IMF World Economic Outlook: </w:t>
       </w:r>
-      <w:hyperlink w:history="1" r:id="rIdruqy9k5lkho9tz0wrgorn">
+      <w:hyperlink w:history="1" r:id="rIdkvpr1at58g1ber7lvh3ml">
         <w:r>
           <w:rPr>
             <w:rStyle w:val="Hyperlink"/>
@@ -10884,7 +10849,7 @@
         </w:rPr>
         <w:t xml:space="preserve">World Bank Worldwide Governance Indicators: </w:t>
       </w:r>
-      <w:hyperlink w:history="1" r:id="rId6ca7xzw3g5twtgnw-xjjg">
+      <w:hyperlink w:history="1" r:id="rIdnxxqus1yeictjjyqjeuns">
         <w:r>
           <w:rPr>
             <w:rStyle w:val="Hyperlink"/>
@@ -10913,7 +10878,7 @@
         </w:rPr>
         <w:t xml:space="preserve">EU Access2Markets (tariffs, requirements, rules of origin for EU exporters): </w:t>
       </w:r>
-      <w:hyperlink w:history="1" r:id="rIdxcex8wobolcxyyip-zx34">
+      <w:hyperlink w:history="1" r:id="rIduirpfv5w8hr2osvmwxafh">
         <w:r>
           <w:rPr>
             <w:rStyle w:val="Hyperlink"/>
@@ -10942,7 +10907,7 @@
         </w:rPr>
         <w:t xml:space="preserve">WTO tariff and trade data: </w:t>
       </w:r>
-      <w:hyperlink w:history="1" r:id="rId4my0wylmqqlqf_sxx3u3q">
+      <w:hyperlink w:history="1" r:id="rIdo2vp8htvw0xtnysuprvlk">
         <w:r>
           <w:rPr>
             <w:rStyle w:val="Hyperlink"/>
@@ -10971,7 +10936,7 @@
         </w:rPr>
         <w:t xml:space="preserve">CEPII Gravity database (distance, language; free login): </w:t>
       </w:r>
-      <w:hyperlink w:history="1" r:id="rIdhi4xeg0s9fwiyz_q8ial4">
+      <w:hyperlink w:history="1" r:id="rIdntjk4kolsn-sousqhwdo8">
         <w:r>
           <w:rPr>
             <w:rStyle w:val="Hyperlink"/>
@@ -11000,7 +10965,7 @@
         </w:rPr>
         <w:t xml:space="preserve">Hofstede dimension data matrix: </w:t>
       </w:r>
-      <w:hyperlink w:history="1" r:id="rIdczlq2ffeqbmb1ne452n5q">
+      <w:hyperlink w:history="1" r:id="rIdmkcghbbawewh1lfob-t2-">
         <w:r>
           <w:rPr>
             <w:rStyle w:val="Hyperlink"/>
@@ -11029,7 +10994,7 @@
         </w:rPr>
         <w:t xml:space="preserve">Coface country risk assessments: </w:t>
       </w:r>
-      <w:hyperlink w:history="1" r:id="rIdywpox1qnrp-mm5i-6knxr">
+      <w:hyperlink w:history="1" r:id="rIdcs2rbkzzxfl7njc6gpiav">
         <w:r>
           <w:rPr>
             <w:rStyle w:val="Hyperlink"/>
@@ -11058,7 +11023,7 @@
         </w:rPr>
         <w:t xml:space="preserve">Euromonitor Passport and Statista (WU library; statista.com): </w:t>
       </w:r>
-      <w:hyperlink w:history="1" r:id="rIdcclxnckhsfwpgtnfo2blb">
+      <w:hyperlink w:history="1" r:id="rIdy2yvncpyqwpg2cfmhey_z">
         <w:r>
           <w:rPr>
             <w:rStyle w:val="Hyperlink"/>
@@ -11087,7 +11052,7 @@
         </w:rPr>
         <w:t xml:space="preserve">International Coffee Organization: coffee statistics: </w:t>
       </w:r>
-      <w:hyperlink w:history="1" r:id="rIdtbzynv0qdib-bituklg1q">
+      <w:hyperlink w:history="1" r:id="rId4vojajgyfxeiz5oxo3_w4">
         <w:r>
           <w:rPr>
             <w:rStyle w:val="Hyperlink"/>
@@ -11116,7 +11081,7 @@
         </w:rPr>
         <w:t xml:space="preserve">USDA Foreign Agricultural Service: annual coffee reports by country (search for your countries): </w:t>
       </w:r>
-      <w:hyperlink w:history="1" r:id="rIdc4dmhmuvz7nsgcehn9xjm">
+      <w:hyperlink w:history="1" r:id="rIdncp8mrf5ovtpzadpbwqun">
         <w:r>
           <w:rPr>
             <w:rStyle w:val="Hyperlink"/>
@@ -11145,7 +11110,7 @@
         </w:rPr>
         <w:t xml:space="preserve">UN Comtrade (comtradeplus.un.org) and ITC Trade Map (free login): coffee trade flows and tariffs, HS 0901: </w:t>
       </w:r>
-      <w:hyperlink w:history="1" r:id="rId9hbugltl6vcddfzjp7q3o">
+      <w:hyperlink w:history="1" r:id="rIdk_utbtiv4tt3ztlphhndc">
         <w:r>
           <w:rPr>
             <w:rStyle w:val="Hyperlink"/>
@@ -11174,7 +11139,7 @@
         </w:rPr>
         <w:t xml:space="preserve">WKO AUSSENWIRTSCHAFT: reports and country profiles: </w:t>
       </w:r>
-      <w:hyperlink w:history="1" r:id="rIdtfmf4tqkwgfwthfblxyyd">
+      <w:hyperlink w:history="1" r:id="rIdyg_6jeb1ylzwqsgvodbc5">
         <w:r>
           <w:rPr>
             <w:rStyle w:val="Hyperlink"/>

</xml_diff>

<commit_message>
Brief: country allocation applies to Part A and Part B
Co-Authored-By: Claude Sonnet 5.5 <noreply@anthropic.com>
Claude-Session: https://claude.ai/code/session_01RkWScMhuRmEB4zppSmB7Ri
</commit_message>
<xml_diff>
--- a/WT26-27/Student Brief Midterm Presentation WT26-27.docx
+++ b/WT26-27/Student Brief Midterm Presentation WT26-27.docx
@@ -985,7 +985,8 @@
     </w:p>
     <w:p>
       <w:pPr>
-        <w:spacing w:after="120" w:before="0" w:line="252"/>
+        <w:keepNext/>
+        <w:spacing w:after="80" w:before="0" w:line="252"/>
       </w:pPr>
       <w:r>
         <w:rPr>
@@ -995,15 +996,15 @@
           <w:sz w:val="19"/>
           <w:szCs w:val="19"/>
         </w:rPr>
-        <w:t xml:space="preserve">Part A: scoring method (the core of the midterm).</w:t>
-      </w:r>
-      <w:r>
-        <w:rPr>
-          <w:rFonts w:ascii="Verdana" w:cs="Verdana" w:eastAsia="Verdana" w:hAnsi="Verdana"/>
-          <w:sz w:val="19"/>
-          <w:szCs w:val="19"/>
-        </w:rPr>
-        <w:t xml:space="preserve"> All groups apply the </w:t>
+        <w:t xml:space="preserve">Country allocation</w:t>
+      </w:r>
+      <w:r>
+        <w:rPr>
+          <w:rFonts w:ascii="Verdana" w:cs="Verdana" w:eastAsia="Verdana" w:hAnsi="Verdana"/>
+          <w:sz w:val="19"/>
+          <w:szCs w:val="19"/>
+        </w:rPr>
+        <w:t xml:space="preserve"> (one country per group, drawn at random). Your allocated country is the country you present in </w:t>
       </w:r>
       <w:r>
         <w:rPr>
@@ -1013,62 +1014,15 @@
           <w:sz w:val="19"/>
           <w:szCs w:val="19"/>
         </w:rPr>
-        <w:t xml:space="preserve">same criteria and indicators</w:t>
-      </w:r>
-      <w:r>
-        <w:rPr>
-          <w:rFonts w:ascii="Verdana" w:cs="Verdana" w:eastAsia="Verdana" w:hAnsi="Verdana"/>
-          <w:sz w:val="19"/>
-          <w:szCs w:val="19"/>
-        </w:rPr>
-        <w:t xml:space="preserve">, so the six country results can be compared. Your group collects the data for its allocated country, scores it, and shows how it ranks against the other five, how stable that rank is, and what you recommend for Julius Meinl regarding this country.</w:t>
-      </w:r>
-    </w:p>
-    <w:p>
-      <w:pPr>
-        <w:spacing w:after="80" w:before="0" w:line="252"/>
-      </w:pPr>
-      <w:r>
-        <w:rPr>
-          <w:rFonts w:ascii="Verdana" w:cs="Verdana" w:eastAsia="Verdana" w:hAnsi="Verdana"/>
-          <w:b/>
-          <w:bCs/>
-          <w:sz w:val="19"/>
-          <w:szCs w:val="19"/>
-        </w:rPr>
-        <w:t xml:space="preserve">Part B: industry analysis.</w:t>
-      </w:r>
-      <w:r>
-        <w:rPr>
-          <w:rFonts w:ascii="Verdana" w:cs="Verdana" w:eastAsia="Verdana" w:hAnsi="Verdana"/>
-          <w:sz w:val="19"/>
-          <w:szCs w:val="19"/>
-        </w:rPr>
-        <w:t xml:space="preserve"> A focused analysis of the coffee industry in one country, its structure and its attractiveness for a premium newcomer from Vienna, in your allocated country. Section 8 describes the content.</w:t>
-      </w:r>
-    </w:p>
-    <w:p>
-      <w:pPr>
-        <w:keepNext/>
-        <w:spacing w:after="80" w:before="0" w:line="252"/>
-      </w:pPr>
-      <w:r>
-        <w:rPr>
-          <w:rFonts w:ascii="Verdana" w:cs="Verdana" w:eastAsia="Verdana" w:hAnsi="Verdana"/>
-          <w:b/>
-          <w:bCs/>
-          <w:sz w:val="19"/>
-          <w:szCs w:val="19"/>
-        </w:rPr>
-        <w:t xml:space="preserve">Country allocation for Part B</w:t>
-      </w:r>
-      <w:r>
-        <w:rPr>
-          <w:rFonts w:ascii="Verdana" w:cs="Verdana" w:eastAsia="Verdana" w:hAnsi="Verdana"/>
-          <w:sz w:val="19"/>
-          <w:szCs w:val="19"/>
-        </w:rPr>
-        <w:t xml:space="preserve"> (one country per group, drawn at random):</w:t>
+        <w:t xml:space="preserve">both</w:t>
+      </w:r>
+      <w:r>
+        <w:rPr>
+          <w:rFonts w:ascii="Verdana" w:cs="Verdana" w:eastAsia="Verdana" w:hAnsi="Verdana"/>
+          <w:sz w:val="19"/>
+          <w:szCs w:val="19"/>
+        </w:rPr>
+        <w:t xml:space="preserve"> Part A and Part B:</w:t>
       </w:r>
     </w:p>
     <w:tbl>
@@ -1158,7 +1112,7 @@
                 <w:sz w:val="16"/>
                 <w:szCs w:val="16"/>
               </w:rPr>
-              <w:t xml:space="preserve">Country for Part B</w:t>
+              <w:t xml:space="preserve">Your country (Parts A and B)</w:t>
             </w:r>
           </w:p>
         </w:tc>
@@ -1588,6 +1542,70 @@
       <w:pPr>
         <w:spacing w:after="80"/>
       </w:pPr>
+    </w:p>
+    <w:p>
+      <w:pPr>
+        <w:spacing w:after="120" w:before="0" w:line="252"/>
+      </w:pPr>
+      <w:r>
+        <w:rPr>
+          <w:rFonts w:ascii="Verdana" w:cs="Verdana" w:eastAsia="Verdana" w:hAnsi="Verdana"/>
+          <w:b/>
+          <w:bCs/>
+          <w:sz w:val="19"/>
+          <w:szCs w:val="19"/>
+        </w:rPr>
+        <w:t xml:space="preserve">Part A: scoring method (the core of the midterm).</w:t>
+      </w:r>
+      <w:r>
+        <w:rPr>
+          <w:rFonts w:ascii="Verdana" w:cs="Verdana" w:eastAsia="Verdana" w:hAnsi="Verdana"/>
+          <w:sz w:val="19"/>
+          <w:szCs w:val="19"/>
+        </w:rPr>
+        <w:t xml:space="preserve"> All groups apply the </w:t>
+      </w:r>
+      <w:r>
+        <w:rPr>
+          <w:rFonts w:ascii="Verdana" w:cs="Verdana" w:eastAsia="Verdana" w:hAnsi="Verdana"/>
+          <w:b/>
+          <w:bCs/>
+          <w:sz w:val="19"/>
+          <w:szCs w:val="19"/>
+        </w:rPr>
+        <w:t xml:space="preserve">same criteria and indicators</w:t>
+      </w:r>
+      <w:r>
+        <w:rPr>
+          <w:rFonts w:ascii="Verdana" w:cs="Verdana" w:eastAsia="Verdana" w:hAnsi="Verdana"/>
+          <w:sz w:val="19"/>
+          <w:szCs w:val="19"/>
+        </w:rPr>
+        <w:t xml:space="preserve">, so the six country results can be compared. Your group collects the data for its allocated country, scores it, and shows how it ranks against the other five, how stable that rank is, and what you recommend for Julius Meinl regarding this country.</w:t>
+      </w:r>
+    </w:p>
+    <w:p>
+      <w:pPr>
+        <w:spacing w:after="80" w:before="0" w:line="252"/>
+      </w:pPr>
+      <w:r>
+        <w:rPr>
+          <w:rFonts w:ascii="Verdana" w:cs="Verdana" w:eastAsia="Verdana" w:hAnsi="Verdana"/>
+          <w:b/>
+          <w:bCs/>
+          <w:sz w:val="19"/>
+          <w:szCs w:val="19"/>
+        </w:rPr>
+        <w:t xml:space="preserve">Part B: industry analysis.</w:t>
+      </w:r>
+      <w:r>
+        <w:rPr>
+          <w:rFonts w:ascii="Verdana" w:cs="Verdana" w:eastAsia="Verdana" w:hAnsi="Verdana"/>
+          <w:sz w:val="19"/>
+          <w:szCs w:val="19"/>
+        </w:rPr>
+        <w:t xml:space="preserve"> A focused analysis of the coffee industry in one country, its structure and its attractiveness for a premium newcomer from Vienna, in your allocated country (see the allocation table). Section 8 describes the content.</w:t>
+      </w:r>
     </w:p>
     <w:p>
       <w:pPr>
@@ -10230,7 +10248,7 @@
       <w:pPr>
         <w:spacing w:after="140"/>
       </w:pPr>
-      <w:hyperlink w:history="1" r:id="rIdgiphmnpee8j4stsieah1g">
+      <w:hyperlink w:history="1" r:id="rIdnnjgxuuemcld9l6llmacz">
         <w:r>
           <w:rPr>
             <w:rStyle w:val="Hyperlink"/>
@@ -10276,7 +10294,7 @@
         </w:rPr>
         <w:t xml:space="preserve">JRC: 10-step pocket guide to composite indicators (free): </w:t>
       </w:r>
-      <w:hyperlink w:history="1" r:id="rId35ckwkirdkes110rnfzte">
+      <w:hyperlink w:history="1" r:id="rIdccgksyxvglqd1lposamgx">
         <w:r>
           <w:rPr>
             <w:rStyle w:val="Hyperlink"/>
@@ -10305,7 +10323,7 @@
         </w:rPr>
         <w:t xml:space="preserve">OECD/JRC: Handbook on constructing composite indicators (free): </w:t>
       </w:r>
-      <w:hyperlink w:history="1" r:id="rIdgpa_u4lewlp8k6zdlc8vs">
+      <w:hyperlink w:history="1" r:id="rId2bwkxlkfggm4aasmatqr3">
         <w:r>
           <w:rPr>
             <w:rStyle w:val="Hyperlink"/>
@@ -10334,7 +10352,7 @@
         </w:rPr>
         <w:t xml:space="preserve">Greco et al. (2019): weighting and aggregation in composite indices (open access): </w:t>
       </w:r>
-      <w:hyperlink w:history="1" r:id="rIdrpfjeq7udnqm1nitc2vc4">
+      <w:hyperlink w:history="1" r:id="rIdlm6oebkrzyha6srlnqelx">
         <w:r>
           <w:rPr>
             <w:rStyle w:val="Hyperlink"/>
@@ -10363,7 +10381,7 @@
         </w:rPr>
         <w:t xml:space="preserve">BPMSG: AHP Excel template (free): </w:t>
       </w:r>
-      <w:hyperlink w:history="1" r:id="rIdcwshbylpop9-ru5xeaccu">
+      <w:hyperlink w:history="1" r:id="rIdvtci79yipo-wbmura8n0x">
         <w:r>
           <w:rPr>
             <w:rStyle w:val="Hyperlink"/>
@@ -10392,7 +10410,7 @@
         </w:rPr>
         <w:t xml:space="preserve">Best-Worst Method solvers (free): </w:t>
       </w:r>
-      <w:hyperlink w:history="1" r:id="rIdeixolidbvj6v6k3jqeb-y">
+      <w:hyperlink w:history="1" r:id="rIdv_w8gmsb9oayju42gjbd3">
         <w:r>
           <w:rPr>
             <w:rStyle w:val="Hyperlink"/>
@@ -10421,7 +10439,7 @@
         </w:rPr>
         <w:t xml:space="preserve">JRC COIN Tool, Excel composite indicators (free): </w:t>
       </w:r>
-      <w:hyperlink w:history="1" r:id="rId2pqgfggftrhvt2eh7sm3a">
+      <w:hyperlink w:history="1" r:id="rIdea3bkpe3dvm7mtqussswb">
         <w:r>
           <w:rPr>
             <w:rStyle w:val="Hyperlink"/>
@@ -10467,7 +10485,7 @@
         </w:rPr>
         <w:t xml:space="preserve">globalEDGE Market Potential Index: eight dimensions with published weights (25, 15, 12.5, 12.5, 10, 10, 7.5, 7.5): </w:t>
       </w:r>
-      <w:hyperlink w:history="1" r:id="rIdzmqvnmdh7yxxftaonhjus">
+      <w:hyperlink w:history="1" r:id="rIdjcgzi-jfp4dqevuw7tpbo">
         <w:r>
           <w:rPr>
             <w:rStyle w:val="Hyperlink"/>
@@ -10496,7 +10514,7 @@
         </w:rPr>
         <w:t xml:space="preserve">Cavusgil (1997): measuring the potential of emerging markets (WU library): </w:t>
       </w:r>
-      <w:hyperlink w:history="1" r:id="rIdlmoijbgx2kjz2j33fxc1r">
+      <w:hyperlink w:history="1" r:id="rIdvzmxqit3b6ilk6b6ykkt3">
         <w:r>
           <w:rPr>
             <w:rStyle w:val="Hyperlink"/>
@@ -10525,7 +10543,7 @@
         </w:rPr>
         <w:t xml:space="preserve">Ghemawat (2001): Distance still matters, the CAGE framework (WU library): </w:t>
       </w:r>
-      <w:hyperlink w:history="1" r:id="rIdnnqbzdyum86w4ntkmjrbq">
+      <w:hyperlink w:history="1" r:id="rIdip010mzmkm7iobvewafa8">
         <w:r>
           <w:rPr>
             <w:rStyle w:val="Hyperlink"/>
@@ -10554,7 +10572,7 @@
         </w:rPr>
         <w:t xml:space="preserve">Musso and Francioni: how smaller firms select foreign markets (open access): </w:t>
       </w:r>
-      <w:hyperlink w:history="1" r:id="rIdfuo_kg-sgmsygk_gt1u3v">
+      <w:hyperlink w:history="1" r:id="rIdad-ust2z4omawle_s6rlm">
         <w:r>
           <w:rPr>
             <w:rStyle w:val="Hyperlink"/>
@@ -10583,7 +10601,7 @@
         </w:rPr>
         <w:t xml:space="preserve">Pollesch and Dale (2016): normalisation choices (WU library): </w:t>
       </w:r>
-      <w:hyperlink w:history="1" r:id="rIdw82jcph6c0eg6555eb_vz">
+      <w:hyperlink w:history="1" r:id="rIdqmvxd5ubgqecv7gxdgggg">
         <w:r>
           <w:rPr>
             <w:rStyle w:val="Hyperlink"/>
@@ -10629,7 +10647,7 @@
         </w:rPr>
         <w:t xml:space="preserve">ITC Export Potential Map, methodology (free): </w:t>
       </w:r>
-      <w:hyperlink w:history="1" r:id="rIdgbesqko-wdzwctoxiat_t">
+      <w:hyperlink w:history="1" r:id="rIdhtsdvtdnu43yjh5p5kiol">
         <w:r>
           <w:rPr>
             <w:rStyle w:val="Hyperlink"/>
@@ -10658,7 +10676,7 @@
         </w:rPr>
         <w:t xml:space="preserve">Kearney Global Retail Development Index (free): </w:t>
       </w:r>
-      <w:hyperlink w:history="1" r:id="rIdhd3lfzk_g-suyyau6iyfg">
+      <w:hyperlink w:history="1" r:id="rIdzjo2imyesyestyedkhpgu">
         <w:r>
           <w:rPr>
             <w:rStyle w:val="Hyperlink"/>
@@ -10687,7 +10705,7 @@
         </w:rPr>
         <w:t xml:space="preserve">Eurazeo: International Expansion Playbook (free): </w:t>
       </w:r>
-      <w:hyperlink w:history="1" r:id="rIdqt3-vpn2rmu4r1evq1alv">
+      <w:hyperlink w:history="1" r:id="rId44aa-ockgembdsjhqcxn7">
         <w:r>
           <w:rPr>
             <w:rStyle w:val="Hyperlink"/>
@@ -10716,7 +10734,7 @@
         </w:rPr>
         <w:t xml:space="preserve">Optional case about coffee: The Espresso Lane to Global Markets, illy (Ivey Publishing, paid): </w:t>
       </w:r>
-      <w:hyperlink w:history="1" r:id="rIdtyg5mw0mfuuzna5sbycin">
+      <w:hyperlink w:history="1" r:id="rIdfwipp6k0a1b5u79s7ey8w">
         <w:r>
           <w:rPr>
             <w:rStyle w:val="Hyperlink"/>
@@ -10745,7 +10763,7 @@
         </w:rPr>
         <w:t xml:space="preserve">IFC PAYG Market Attractiveness Index, an Excel tool with user guide (free): </w:t>
       </w:r>
-      <w:hyperlink w:history="1" r:id="rIdxap9ipjpfudegdvp1asiw">
+      <w:hyperlink w:history="1" r:id="rIds8vvxonddmqga58-4jsoi">
         <w:r>
           <w:rPr>
             <w:rStyle w:val="Hyperlink"/>
@@ -10791,7 +10809,7 @@
         </w:rPr>
         <w:t xml:space="preserve">World Bank World Development Indicators: </w:t>
       </w:r>
-      <w:hyperlink w:history="1" r:id="rIdb7mmsx6yzqatytf0xoypk">
+      <w:hyperlink w:history="1" r:id="rId-uqoe_7uafwmq0biv6hla">
         <w:r>
           <w:rPr>
             <w:rStyle w:val="Hyperlink"/>
@@ -10820,7 +10838,7 @@
         </w:rPr>
         <w:t xml:space="preserve">IMF World Economic Outlook: </w:t>
       </w:r>
-      <w:hyperlink w:history="1" r:id="rIdkvpr1at58g1ber7lvh3ml">
+      <w:hyperlink w:history="1" r:id="rIdeunbt9hqtkhm6sdu_7gjf">
         <w:r>
           <w:rPr>
             <w:rStyle w:val="Hyperlink"/>
@@ -10849,7 +10867,7 @@
         </w:rPr>
         <w:t xml:space="preserve">World Bank Worldwide Governance Indicators: </w:t>
       </w:r>
-      <w:hyperlink w:history="1" r:id="rIdnxxqus1yeictjjyqjeuns">
+      <w:hyperlink w:history="1" r:id="rId759i42lz37ii66cld7xct">
         <w:r>
           <w:rPr>
             <w:rStyle w:val="Hyperlink"/>
@@ -10878,7 +10896,7 @@
         </w:rPr>
         <w:t xml:space="preserve">EU Access2Markets (tariffs, requirements, rules of origin for EU exporters): </w:t>
       </w:r>
-      <w:hyperlink w:history="1" r:id="rIduirpfv5w8hr2osvmwxafh">
+      <w:hyperlink w:history="1" r:id="rIdic1qwsrijcpn1b5z-jezk">
         <w:r>
           <w:rPr>
             <w:rStyle w:val="Hyperlink"/>
@@ -10907,7 +10925,7 @@
         </w:rPr>
         <w:t xml:space="preserve">WTO tariff and trade data: </w:t>
       </w:r>
-      <w:hyperlink w:history="1" r:id="rIdo2vp8htvw0xtnysuprvlk">
+      <w:hyperlink w:history="1" r:id="rIdhgbpxezspfotpelk7fwni">
         <w:r>
           <w:rPr>
             <w:rStyle w:val="Hyperlink"/>
@@ -10936,7 +10954,7 @@
         </w:rPr>
         <w:t xml:space="preserve">CEPII Gravity database (distance, language; free login): </w:t>
       </w:r>
-      <w:hyperlink w:history="1" r:id="rIdntjk4kolsn-sousqhwdo8">
+      <w:hyperlink w:history="1" r:id="rIdyaqcdh-9p_5latctz_ola">
         <w:r>
           <w:rPr>
             <w:rStyle w:val="Hyperlink"/>
@@ -10965,7 +10983,7 @@
         </w:rPr>
         <w:t xml:space="preserve">Hofstede dimension data matrix: </w:t>
       </w:r>
-      <w:hyperlink w:history="1" r:id="rIdmkcghbbawewh1lfob-t2-">
+      <w:hyperlink w:history="1" r:id="rIdgrtbumjxlsll_ikzpqlqm">
         <w:r>
           <w:rPr>
             <w:rStyle w:val="Hyperlink"/>
@@ -10994,7 +11012,7 @@
         </w:rPr>
         <w:t xml:space="preserve">Coface country risk assessments: </w:t>
       </w:r>
-      <w:hyperlink w:history="1" r:id="rIdcs2rbkzzxfl7njc6gpiav">
+      <w:hyperlink w:history="1" r:id="rIdsdd59ygaobd0mb74hfhww">
         <w:r>
           <w:rPr>
             <w:rStyle w:val="Hyperlink"/>
@@ -11023,7 +11041,7 @@
         </w:rPr>
         <w:t xml:space="preserve">Euromonitor Passport and Statista (WU library; statista.com): </w:t>
       </w:r>
-      <w:hyperlink w:history="1" r:id="rIdy2yvncpyqwpg2cfmhey_z">
+      <w:hyperlink w:history="1" r:id="rId9hscxrkbjwjtxuyqrucbp">
         <w:r>
           <w:rPr>
             <w:rStyle w:val="Hyperlink"/>
@@ -11052,7 +11070,7 @@
         </w:rPr>
         <w:t xml:space="preserve">International Coffee Organization: coffee statistics: </w:t>
       </w:r>
-      <w:hyperlink w:history="1" r:id="rId4vojajgyfxeiz5oxo3_w4">
+      <w:hyperlink w:history="1" r:id="rIdalw_okbpekblbzl7uotio">
         <w:r>
           <w:rPr>
             <w:rStyle w:val="Hyperlink"/>
@@ -11081,7 +11099,7 @@
         </w:rPr>
         <w:t xml:space="preserve">USDA Foreign Agricultural Service: annual coffee reports by country (search for your countries): </w:t>
       </w:r>
-      <w:hyperlink w:history="1" r:id="rIdncp8mrf5ovtpzadpbwqun">
+      <w:hyperlink w:history="1" r:id="rIdpttac1huiinv-8s6egfi0">
         <w:r>
           <w:rPr>
             <w:rStyle w:val="Hyperlink"/>
@@ -11110,7 +11128,7 @@
         </w:rPr>
         <w:t xml:space="preserve">UN Comtrade (comtradeplus.un.org) and ITC Trade Map (free login): coffee trade flows and tariffs, HS 0901: </w:t>
       </w:r>
-      <w:hyperlink w:history="1" r:id="rIdk_utbtiv4tt3ztlphhndc">
+      <w:hyperlink w:history="1" r:id="rIdj0pprrrxsulkemmbjj-ob">
         <w:r>
           <w:rPr>
             <w:rStyle w:val="Hyperlink"/>
@@ -11139,7 +11157,7 @@
         </w:rPr>
         <w:t xml:space="preserve">WKO AUSSENWIRTSCHAFT: reports and country profiles: </w:t>
       </w:r>
-      <w:hyperlink w:history="1" r:id="rIdyg_6jeb1ylzwqsgvodbc5">
+      <w:hyperlink w:history="1" r:id="rIdsb3xd9ycq52fbissg5hgl">
         <w:r>
           <w:rPr>
             <w:rStyle w:val="Hyperlink"/>

</xml_diff>

<commit_message>
Scoring model: students enter numbers only, everything else automatic and locked; brief updated
Co-Authored-By: Claude Sonnet 5.5 <noreply@anthropic.com>
Claude-Session: https://claude.ai/code/session_01RkWScMhuRmEB4zppSmB7Ri
</commit_message>
<xml_diff>
--- a/WT26-27/Student Brief Midterm Presentation WT26-27.docx
+++ b/WT26-27/Student Brief Midterm Presentation WT26-27.docx
@@ -2766,24 +2766,7 @@
           <w:sz w:val="19"/>
           <w:szCs w:val="19"/>
         </w:rPr>
-        <w:t xml:space="preserve">Collect the values of your allocated country for all 14 indicators and enter them in the yellow cells of your country on the Data sheet of the shared Google Sheet. Use the latest year available and record the year and source (name and link) for every number. If a value is missing, substitute a comparable indicator with the instructor's agreement </w:t>
-      </w:r>
-      <w:r>
-        <w:rPr>
-          <w:rFonts w:ascii="Verdana" w:cs="Verdana" w:eastAsia="Verdana" w:hAnsi="Verdana"/>
-          <w:sz w:val="19"/>
-          <w:szCs w:val="19"/>
-          <w:highlight w:val="yellow"/>
-        </w:rPr>
-        <w:t xml:space="preserve">[process to be confirmed]</w:t>
-      </w:r>
-      <w:r>
-        <w:rPr>
-          <w:rFonts w:ascii="Verdana" w:cs="Verdana" w:eastAsia="Verdana" w:hAnsi="Verdana"/>
-          <w:sz w:val="19"/>
-          <w:szCs w:val="19"/>
-        </w:rPr>
-        <w:t xml:space="preserve"> and document it. Follow the definitions exactly: the other groups use your numbers. </w:t>
+        <w:t xml:space="preserve">Collect the values of your allocated country for all 14 indicators and enter them in the yellow cells of your country on the Data sheet of the shared Google Sheet. </w:t>
       </w:r>
       <w:r>
         <w:rPr>
@@ -2793,6 +2776,41 @@
           <w:sz w:val="19"/>
           <w:szCs w:val="19"/>
         </w:rPr>
+        <w:t xml:space="preserve">You only enter the numbers</w:t>
+      </w:r>
+      <w:r>
+        <w:rPr>
+          <w:rFonts w:ascii="Verdana" w:cs="Verdana" w:eastAsia="Verdana" w:hAnsi="Verdana"/>
+          <w:sz w:val="19"/>
+          <w:szCs w:val="19"/>
+        </w:rPr>
+        <w:t xml:space="preserve"> (rubric indicators: a whole number from 1 to 5); the sheet does everything else. Use the latest year available and record the year and source (name and link) for every number. If a value is missing, substitute a comparable indicator with the instructor's agreement </w:t>
+      </w:r>
+      <w:r>
+        <w:rPr>
+          <w:rFonts w:ascii="Verdana" w:cs="Verdana" w:eastAsia="Verdana" w:hAnsi="Verdana"/>
+          <w:sz w:val="19"/>
+          <w:szCs w:val="19"/>
+          <w:highlight w:val="yellow"/>
+        </w:rPr>
+        <w:t xml:space="preserve">[process to be confirmed]</w:t>
+      </w:r>
+      <w:r>
+        <w:rPr>
+          <w:rFonts w:ascii="Verdana" w:cs="Verdana" w:eastAsia="Verdana" w:hAnsi="Verdana"/>
+          <w:sz w:val="19"/>
+          <w:szCs w:val="19"/>
+        </w:rPr>
+        <w:t xml:space="preserve"> and document it. Follow the definitions exactly: the other groups use your numbers. </w:t>
+      </w:r>
+      <w:r>
+        <w:rPr>
+          <w:rFonts w:ascii="Verdana" w:cs="Verdana" w:eastAsia="Verdana" w:hAnsi="Verdana"/>
+          <w:b/>
+          <w:bCs/>
+          <w:sz w:val="19"/>
+          <w:szCs w:val="19"/>
+        </w:rPr>
         <w:t xml:space="preserve">Hand in:</w:t>
       </w:r>
       <w:r>
@@ -2818,7 +2836,7 @@
           <w:sz w:val="19"/>
           <w:szCs w:val="19"/>
         </w:rPr>
-        <w:t xml:space="preserve">. The sheet shows scores and ranks as soon as all six countries are complete.</w:t>
+        <w:t xml:space="preserve">. Normalisation, scores, ranks and the weight-set comparison appear automatically as soon as all six countries are complete; the other sheets are locked.</w:t>
       </w:r>
     </w:p>
     <w:p>
@@ -2830,7 +2848,7 @@
         <w:rPr>
           <w:rFonts w:ascii="Verdana" w:cs="Verdana" w:eastAsia="Verdana" w:hAnsi="Verdana"/>
         </w:rPr>
-        <w:t xml:space="preserve">Step 4  Normalise (standardise)</w:t>
+        <w:t xml:space="preserve">Step 4  Normalisation: automatic, you interpret</w:t>
       </w:r>
     </w:p>
     <w:p>
@@ -2844,7 +2862,7 @@
           <w:sz w:val="19"/>
           <w:szCs w:val="19"/>
         </w:rPr>
-        <w:t xml:space="preserve">Indicators come in different units (US dollars, percent, index points), so subtracting the mean (centering) alone is not enough: it fixes the zero point but not the unit. The sheet therefore rescales every indicator across the six countries to 0 to 100 (min-max, direction respected):</w:t>
+        <w:t xml:space="preserve">You do not normalise anything yourself. As soon as all six countries are entered, the Google Sheet rescales every indicator across the six countries and applies the direction (higher or lower is better) automatically. Indicators come in different units (US dollars, percent, index points), so subtracting the mean (centering) alone would not be enough: it fixes the zero point but not the unit. The sheet therefore gives two normalised scores:</w:t>
       </w:r>
     </w:p>
     <w:p>
@@ -2859,10 +2877,20 @@
       <w:r>
         <w:rPr>
           <w:rFonts w:ascii="Verdana" w:cs="Verdana" w:eastAsia="Verdana" w:hAnsi="Verdana"/>
-          <w:sz w:val="19"/>
-          <w:szCs w:val="19"/>
-        </w:rPr>
-        <w:t xml:space="preserve">Higher is better: score = 100 x (x - min) / (max - min)</w:t>
+          <w:b/>
+          <w:bCs/>
+          <w:sz w:val="19"/>
+          <w:szCs w:val="19"/>
+        </w:rPr>
+        <w:t xml:space="preserve">Normalised sheet (min-max, 0 to 100):</w:t>
+      </w:r>
+      <w:r>
+        <w:rPr>
+          <w:rFonts w:ascii="Verdana" w:cs="Verdana" w:eastAsia="Verdana" w:hAnsi="Verdana"/>
+          <w:sz w:val="19"/>
+          <w:szCs w:val="19"/>
+        </w:rPr>
+        <w:t xml:space="preserve"> the best country scores 100 and the weakest 0 on each indicator.</w:t>
       </w:r>
     </w:p>
     <w:p>
@@ -2877,34 +2905,26 @@
       <w:r>
         <w:rPr>
           <w:rFonts w:ascii="Verdana" w:cs="Verdana" w:eastAsia="Verdana" w:hAnsi="Verdana"/>
-          <w:sz w:val="19"/>
-          <w:szCs w:val="19"/>
-        </w:rPr>
-        <w:t xml:space="preserve">Lower is better: score = 100 x (max - x) / (max - min)</w:t>
-      </w:r>
-    </w:p>
-    <w:p>
-      <w:pPr>
-        <w:spacing w:after="120" w:before="0" w:line="252"/>
-      </w:pPr>
-      <w:r>
-        <w:rPr>
-          <w:rFonts w:ascii="Verdana" w:cs="Verdana" w:eastAsia="Verdana" w:hAnsi="Verdana"/>
           <w:b/>
           <w:bCs/>
           <w:sz w:val="19"/>
           <w:szCs w:val="19"/>
         </w:rPr>
-        <w:t xml:space="preserve">Caution with six countries:</w:t>
-      </w:r>
-      <w:r>
-        <w:rPr>
-          <w:rFonts w:ascii="Verdana" w:cs="Verdana" w:eastAsia="Verdana" w:hAnsi="Verdana"/>
-          <w:sz w:val="19"/>
-          <w:szCs w:val="19"/>
-        </w:rPr>
-        <w:t xml:space="preserve"> min-max scaling gives the best country 100 and the weakest 0 on every indicator, even if the real gap is tiny. The sheet therefore also shows </w:t>
-      </w:r>
+        <w:t xml:space="preserve">T-scores sheet:</w:t>
+      </w:r>
+      <w:r>
+        <w:rPr>
+          <w:rFonts w:ascii="Verdana" w:cs="Verdana" w:eastAsia="Verdana" w:hAnsi="Verdana"/>
+          <w:sz w:val="19"/>
+          <w:szCs w:val="19"/>
+        </w:rPr>
+        <w:t xml:space="preserve"> z-score (subtract the mean, divide by the standard deviation), then T = 50 + 10 x z. A T-score of 50 is the average of the six countries and 60 is one standard deviation better.</w:t>
+      </w:r>
+    </w:p>
+    <w:p>
+      <w:pPr>
+        <w:spacing w:after="120" w:before="0" w:line="252"/>
+      </w:pPr>
       <w:r>
         <w:rPr>
           <w:rFonts w:ascii="Verdana" w:cs="Verdana" w:eastAsia="Verdana" w:hAnsi="Verdana"/>
@@ -2913,15 +2933,15 @@
           <w:sz w:val="19"/>
           <w:szCs w:val="19"/>
         </w:rPr>
-        <w:t xml:space="preserve">T-scores</w:t>
-      </w:r>
-      <w:r>
-        <w:rPr>
-          <w:rFonts w:ascii="Verdana" w:cs="Verdana" w:eastAsia="Verdana" w:hAnsi="Verdana"/>
-          <w:sz w:val="19"/>
-          <w:szCs w:val="19"/>
-        </w:rPr>
-        <w:t xml:space="preserve">: first the z-score (centering plus scaling: subtract the mean, divide by the standard deviation), then T = 50 + 10 x z. A T-score of 50 is the average of the six countries and 60 is one standard deviation better. T-scores keep the distances in the data and are not capped at 0 and 100. Compare both scales for your country and explain where they differ (Pollesch and Dale; JRC pocket guide). </w:t>
+        <w:t xml:space="preserve">Caution with six countries:</w:t>
+      </w:r>
+      <w:r>
+        <w:rPr>
+          <w:rFonts w:ascii="Verdana" w:cs="Verdana" w:eastAsia="Verdana" w:hAnsi="Verdana"/>
+          <w:sz w:val="19"/>
+          <w:szCs w:val="19"/>
+        </w:rPr>
+        <w:t xml:space="preserve"> min-max scaling exaggerates small differences, because it stretches the weakest and the best country to 0 and 100 even if the real gap is tiny. T-scores keep the distances in the data and are not capped. Compare both for your country and explain where they differ (Pollesch and Dale; JRC pocket guide). </w:t>
       </w:r>
       <w:r>
         <w:rPr>
@@ -2939,7 +2959,7 @@
           <w:sz w:val="19"/>
           <w:szCs w:val="19"/>
         </w:rPr>
-        <w:t xml:space="preserve"> one slide with the normalised scores of your country and a comment.</w:t>
+        <w:t xml:space="preserve"> one slide with the normalised scores of your country and your comment.</w:t>
       </w:r>
     </w:p>
     <w:p>
@@ -6969,29 +6989,6 @@
     </w:p>
     <w:p>
       <w:pPr>
-        <w:spacing w:after="120" w:before="0" w:line="252"/>
-      </w:pPr>
-      <w:r>
-        <w:rPr>
-          <w:rFonts w:ascii="Verdana" w:cs="Verdana" w:eastAsia="Verdana" w:hAnsi="Verdana"/>
-          <w:b/>
-          <w:bCs/>
-          <w:sz w:val="19"/>
-          <w:szCs w:val="19"/>
-        </w:rPr>
-        <w:t xml:space="preserve">Worked mini-example of the weighted sum.</w:t>
-      </w:r>
-      <w:r>
-        <w:rPr>
-          <w:rFonts w:ascii="Verdana" w:cs="Verdana" w:eastAsia="Verdana" w:hAnsi="Verdana"/>
-          <w:sz w:val="19"/>
-          <w:szCs w:val="19"/>
-        </w:rPr>
-        <w:t xml:space="preserve"> Three indicators with weights 50, 30 and 20. Country X scores 80, 40 and 60, country Y scores 50, 90 and 70. X: 0.5 x 80 + 0.3 x 40 + 0.2 x 60 = 64. Y: 0.5 x 50 + 0.3 x 90 + 0.2 x 70 = 66. Y wins by 2 points. If the weights were 60, 20 and 20, X would score 68 and Y 62: the ranking flips. This is why Step 7 tests other weights.</w:t>
-      </w:r>
-    </w:p>
-    <w:p>
-      <w:pPr>
         <w:pStyle w:val="Heading1"/>
         <w:keepNext/>
       </w:pPr>
@@ -7855,7 +7852,7 @@
           <w:sz w:val="19"/>
           <w:szCs w:val="19"/>
         </w:rPr>
-        <w:t xml:space="preserve"> for all six groups. You enter data only in the yellow cells of your own country; the rest is formulas. Sheets:</w:t>
+        <w:t xml:space="preserve"> for all six groups. You enter data only in the yellow cells of your own country (the numbers, with year and source for documentation); the rest is automatic and locked. Sheets:</w:t>
       </w:r>
     </w:p>
     <w:tbl>
@@ -8294,7 +8291,7 @@
                 <w:sz w:val="16"/>
                 <w:szCs w:val="16"/>
               </w:rPr>
-              <w:t xml:space="preserve">Two normalisations by formula: min-max (0 to 100) and T-score (50 + 10 x z)</w:t>
+              <w:t xml:space="preserve">Automatic: two normalisations by formula, min-max (0 to 100) and T-score (50 + 10 x z). Nothing to enter</w:t>
             </w:r>
           </w:p>
         </w:tc>
@@ -10248,7 +10245,7 @@
       <w:pPr>
         <w:spacing w:after="140"/>
       </w:pPr>
-      <w:hyperlink w:history="1" r:id="rIdnnjgxuuemcld9l6llmacz">
+      <w:hyperlink w:history="1" r:id="rIddoc4qq4pqo0nv_x3khmjx">
         <w:r>
           <w:rPr>
             <w:rStyle w:val="Hyperlink"/>
@@ -10294,7 +10291,7 @@
         </w:rPr>
         <w:t xml:space="preserve">JRC: 10-step pocket guide to composite indicators (free): </w:t>
       </w:r>
-      <w:hyperlink w:history="1" r:id="rIdccgksyxvglqd1lposamgx">
+      <w:hyperlink w:history="1" r:id="rIdb-_meedf8vmtxyri1hcso">
         <w:r>
           <w:rPr>
             <w:rStyle w:val="Hyperlink"/>
@@ -10323,7 +10320,7 @@
         </w:rPr>
         <w:t xml:space="preserve">OECD/JRC: Handbook on constructing composite indicators (free): </w:t>
       </w:r>
-      <w:hyperlink w:history="1" r:id="rId2bwkxlkfggm4aasmatqr3">
+      <w:hyperlink w:history="1" r:id="rIddo4afqffvaqk_9lv-qtii">
         <w:r>
           <w:rPr>
             <w:rStyle w:val="Hyperlink"/>
@@ -10352,7 +10349,7 @@
         </w:rPr>
         <w:t xml:space="preserve">Greco et al. (2019): weighting and aggregation in composite indices (open access): </w:t>
       </w:r>
-      <w:hyperlink w:history="1" r:id="rIdlm6oebkrzyha6srlnqelx">
+      <w:hyperlink w:history="1" r:id="rIdy5aj0suwhebqx-wxexwcd">
         <w:r>
           <w:rPr>
             <w:rStyle w:val="Hyperlink"/>
@@ -10381,7 +10378,7 @@
         </w:rPr>
         <w:t xml:space="preserve">BPMSG: AHP Excel template (free): </w:t>
       </w:r>
-      <w:hyperlink w:history="1" r:id="rIdvtci79yipo-wbmura8n0x">
+      <w:hyperlink w:history="1" r:id="rIdfakcgxygyisnsjhmc7gx1">
         <w:r>
           <w:rPr>
             <w:rStyle w:val="Hyperlink"/>
@@ -10410,7 +10407,7 @@
         </w:rPr>
         <w:t xml:space="preserve">Best-Worst Method solvers (free): </w:t>
       </w:r>
-      <w:hyperlink w:history="1" r:id="rIdv_w8gmsb9oayju42gjbd3">
+      <w:hyperlink w:history="1" r:id="rIdpn1af7jvqwfxyaatbfyfx">
         <w:r>
           <w:rPr>
             <w:rStyle w:val="Hyperlink"/>
@@ -10439,7 +10436,7 @@
         </w:rPr>
         <w:t xml:space="preserve">JRC COIN Tool, Excel composite indicators (free): </w:t>
       </w:r>
-      <w:hyperlink w:history="1" r:id="rIdea3bkpe3dvm7mtqussswb">
+      <w:hyperlink w:history="1" r:id="rIddebmioacxkini6yvl98kl">
         <w:r>
           <w:rPr>
             <w:rStyle w:val="Hyperlink"/>
@@ -10485,7 +10482,7 @@
         </w:rPr>
         <w:t xml:space="preserve">globalEDGE Market Potential Index: eight dimensions with published weights (25, 15, 12.5, 12.5, 10, 10, 7.5, 7.5): </w:t>
       </w:r>
-      <w:hyperlink w:history="1" r:id="rIdjcgzi-jfp4dqevuw7tpbo">
+      <w:hyperlink w:history="1" r:id="rIdgq1nchm1xqipagyziqy0k">
         <w:r>
           <w:rPr>
             <w:rStyle w:val="Hyperlink"/>
@@ -10514,7 +10511,7 @@
         </w:rPr>
         <w:t xml:space="preserve">Cavusgil (1997): measuring the potential of emerging markets (WU library): </w:t>
       </w:r>
-      <w:hyperlink w:history="1" r:id="rIdvzmxqit3b6ilk6b6ykkt3">
+      <w:hyperlink w:history="1" r:id="rIdndmtijvrehblckjnfeia-">
         <w:r>
           <w:rPr>
             <w:rStyle w:val="Hyperlink"/>
@@ -10543,7 +10540,7 @@
         </w:rPr>
         <w:t xml:space="preserve">Ghemawat (2001): Distance still matters, the CAGE framework (WU library): </w:t>
       </w:r>
-      <w:hyperlink w:history="1" r:id="rIdip010mzmkm7iobvewafa8">
+      <w:hyperlink w:history="1" r:id="rId0ptlofnr6emxobjs0zwcb">
         <w:r>
           <w:rPr>
             <w:rStyle w:val="Hyperlink"/>
@@ -10572,7 +10569,7 @@
         </w:rPr>
         <w:t xml:space="preserve">Musso and Francioni: how smaller firms select foreign markets (open access): </w:t>
       </w:r>
-      <w:hyperlink w:history="1" r:id="rIdad-ust2z4omawle_s6rlm">
+      <w:hyperlink w:history="1" r:id="rIdjagnfpztt3d9ukyeb4qvi">
         <w:r>
           <w:rPr>
             <w:rStyle w:val="Hyperlink"/>
@@ -10601,7 +10598,7 @@
         </w:rPr>
         <w:t xml:space="preserve">Pollesch and Dale (2016): normalisation choices (WU library): </w:t>
       </w:r>
-      <w:hyperlink w:history="1" r:id="rIdqmvxd5ubgqecv7gxdgggg">
+      <w:hyperlink w:history="1" r:id="rIdsanky7w2vn6vebcvlper6">
         <w:r>
           <w:rPr>
             <w:rStyle w:val="Hyperlink"/>
@@ -10647,7 +10644,7 @@
         </w:rPr>
         <w:t xml:space="preserve">ITC Export Potential Map, methodology (free): </w:t>
       </w:r>
-      <w:hyperlink w:history="1" r:id="rIdhtsdvtdnu43yjh5p5kiol">
+      <w:hyperlink w:history="1" r:id="rIdylbhaktcrrv9tpcrsi0lp">
         <w:r>
           <w:rPr>
             <w:rStyle w:val="Hyperlink"/>
@@ -10676,7 +10673,7 @@
         </w:rPr>
         <w:t xml:space="preserve">Kearney Global Retail Development Index (free): </w:t>
       </w:r>
-      <w:hyperlink w:history="1" r:id="rIdzjo2imyesyestyedkhpgu">
+      <w:hyperlink w:history="1" r:id="rIdzzt-yqsj1wi0lcbnwonlc">
         <w:r>
           <w:rPr>
             <w:rStyle w:val="Hyperlink"/>
@@ -10705,7 +10702,7 @@
         </w:rPr>
         <w:t xml:space="preserve">Eurazeo: International Expansion Playbook (free): </w:t>
       </w:r>
-      <w:hyperlink w:history="1" r:id="rId44aa-ockgembdsjhqcxn7">
+      <w:hyperlink w:history="1" r:id="rIdcqdnadyjzhup6qa2crxw5">
         <w:r>
           <w:rPr>
             <w:rStyle w:val="Hyperlink"/>
@@ -10734,7 +10731,7 @@
         </w:rPr>
         <w:t xml:space="preserve">Optional case about coffee: The Espresso Lane to Global Markets, illy (Ivey Publishing, paid): </w:t>
       </w:r>
-      <w:hyperlink w:history="1" r:id="rIdfwipp6k0a1b5u79s7ey8w">
+      <w:hyperlink w:history="1" r:id="rIdraptvgrctsvge2nqu21n5">
         <w:r>
           <w:rPr>
             <w:rStyle w:val="Hyperlink"/>
@@ -10763,7 +10760,7 @@
         </w:rPr>
         <w:t xml:space="preserve">IFC PAYG Market Attractiveness Index, an Excel tool with user guide (free): </w:t>
       </w:r>
-      <w:hyperlink w:history="1" r:id="rIds8vvxonddmqga58-4jsoi">
+      <w:hyperlink w:history="1" r:id="rIdx2s1ljtvjriufr1pzd-vc">
         <w:r>
           <w:rPr>
             <w:rStyle w:val="Hyperlink"/>
@@ -10809,7 +10806,7 @@
         </w:rPr>
         <w:t xml:space="preserve">World Bank World Development Indicators: </w:t>
       </w:r>
-      <w:hyperlink w:history="1" r:id="rId-uqoe_7uafwmq0biv6hla">
+      <w:hyperlink w:history="1" r:id="rIdz5e-heetqd3k615amagws">
         <w:r>
           <w:rPr>
             <w:rStyle w:val="Hyperlink"/>
@@ -10838,7 +10835,7 @@
         </w:rPr>
         <w:t xml:space="preserve">IMF World Economic Outlook: </w:t>
       </w:r>
-      <w:hyperlink w:history="1" r:id="rIdeunbt9hqtkhm6sdu_7gjf">
+      <w:hyperlink w:history="1" r:id="rIdpqwjsdrr02l4pz6rs93w5">
         <w:r>
           <w:rPr>
             <w:rStyle w:val="Hyperlink"/>
@@ -10867,7 +10864,7 @@
         </w:rPr>
         <w:t xml:space="preserve">World Bank Worldwide Governance Indicators: </w:t>
       </w:r>
-      <w:hyperlink w:history="1" r:id="rId759i42lz37ii66cld7xct">
+      <w:hyperlink w:history="1" r:id="rId7l-xewjqeyrlgtfpywy2z">
         <w:r>
           <w:rPr>
             <w:rStyle w:val="Hyperlink"/>
@@ -10896,7 +10893,7 @@
         </w:rPr>
         <w:t xml:space="preserve">EU Access2Markets (tariffs, requirements, rules of origin for EU exporters): </w:t>
       </w:r>
-      <w:hyperlink w:history="1" r:id="rIdic1qwsrijcpn1b5z-jezk">
+      <w:hyperlink w:history="1" r:id="rIdy-gmticbdbjybb7oboaz8">
         <w:r>
           <w:rPr>
             <w:rStyle w:val="Hyperlink"/>
@@ -10925,7 +10922,7 @@
         </w:rPr>
         <w:t xml:space="preserve">WTO tariff and trade data: </w:t>
       </w:r>
-      <w:hyperlink w:history="1" r:id="rIdhgbpxezspfotpelk7fwni">
+      <w:hyperlink w:history="1" r:id="rIdy6yotnmmehatulgv0qggx">
         <w:r>
           <w:rPr>
             <w:rStyle w:val="Hyperlink"/>
@@ -10954,7 +10951,7 @@
         </w:rPr>
         <w:t xml:space="preserve">CEPII Gravity database (distance, language; free login): </w:t>
       </w:r>
-      <w:hyperlink w:history="1" r:id="rIdyaqcdh-9p_5latctz_ola">
+      <w:hyperlink w:history="1" r:id="rIdc-3jffonmmaew3hcbg_ub">
         <w:r>
           <w:rPr>
             <w:rStyle w:val="Hyperlink"/>
@@ -10983,7 +10980,7 @@
         </w:rPr>
         <w:t xml:space="preserve">Hofstede dimension data matrix: </w:t>
       </w:r>
-      <w:hyperlink w:history="1" r:id="rIdgrtbumjxlsll_ikzpqlqm">
+      <w:hyperlink w:history="1" r:id="rIdxqgoyvqn3bhto7spszjha">
         <w:r>
           <w:rPr>
             <w:rStyle w:val="Hyperlink"/>
@@ -11012,7 +11009,7 @@
         </w:rPr>
         <w:t xml:space="preserve">Coface country risk assessments: </w:t>
       </w:r>
-      <w:hyperlink w:history="1" r:id="rIdsdd59ygaobd0mb74hfhww">
+      <w:hyperlink w:history="1" r:id="rIdhqif7znm-lyvjeq32v87s">
         <w:r>
           <w:rPr>
             <w:rStyle w:val="Hyperlink"/>
@@ -11041,7 +11038,7 @@
         </w:rPr>
         <w:t xml:space="preserve">Euromonitor Passport and Statista (WU library; statista.com): </w:t>
       </w:r>
-      <w:hyperlink w:history="1" r:id="rId9hscxrkbjwjtxuyqrucbp">
+      <w:hyperlink w:history="1" r:id="rIdaf_dfzzl-xll4qjniagak">
         <w:r>
           <w:rPr>
             <w:rStyle w:val="Hyperlink"/>
@@ -11070,7 +11067,7 @@
         </w:rPr>
         <w:t xml:space="preserve">International Coffee Organization: coffee statistics: </w:t>
       </w:r>
-      <w:hyperlink w:history="1" r:id="rIdalw_okbpekblbzl7uotio">
+      <w:hyperlink w:history="1" r:id="rIdzmp9qgkqa2syasyxw2y4h">
         <w:r>
           <w:rPr>
             <w:rStyle w:val="Hyperlink"/>
@@ -11099,7 +11096,7 @@
         </w:rPr>
         <w:t xml:space="preserve">USDA Foreign Agricultural Service: annual coffee reports by country (search for your countries): </w:t>
       </w:r>
-      <w:hyperlink w:history="1" r:id="rIdpttac1huiinv-8s6egfi0">
+      <w:hyperlink w:history="1" r:id="rIdqyzmsfsbrbmunxwqssej2">
         <w:r>
           <w:rPr>
             <w:rStyle w:val="Hyperlink"/>
@@ -11128,7 +11125,7 @@
         </w:rPr>
         <w:t xml:space="preserve">UN Comtrade (comtradeplus.un.org) and ITC Trade Map (free login): coffee trade flows and tariffs, HS 0901: </w:t>
       </w:r>
-      <w:hyperlink w:history="1" r:id="rIdj0pprrrxsulkemmbjj-ob">
+      <w:hyperlink w:history="1" r:id="rIddrqs6m8tyij3cuewzgion">
         <w:r>
           <w:rPr>
             <w:rStyle w:val="Hyperlink"/>
@@ -11157,7 +11154,7 @@
         </w:rPr>
         <w:t xml:space="preserve">WKO AUSSENWIRTSCHAFT: reports and country profiles: </w:t>
       </w:r>
-      <w:hyperlink w:history="1" r:id="rIdsb3xd9ycq52fbissg5hgl">
+      <w:hyperlink w:history="1" r:id="rIdtmbxx6eimlzjtirnwindr">
         <w:r>
           <w:rPr>
             <w:rStyle w:val="Hyperlink"/>

</xml_diff>

<commit_message>
45 common indicators (5/10/10/10/5/5 per PESTEL dimension), remove five forces, slide limit 20 plus appendix
Co-Authored-By: Claude Sonnet 5.5 <noreply@anthropic.com>
Claude-Session: https://claude.ai/code/session_01RkWScMhuRmEB4zppSmB7Ri
</commit_message>
<xml_diff>
--- a/WT26-27/Student Brief Midterm Presentation WT26-27.docx
+++ b/WT26-27/Student Brief Midterm Presentation WT26-27.docx
@@ -2646,7 +2646,7 @@
           <w:sz w:val="19"/>
           <w:szCs w:val="19"/>
         </w:rPr>
-        <w:t xml:space="preserve">: 14 indicators grouped under the six PESTEL dimensions (section 5). </w:t>
+        <w:t xml:space="preserve">: 45 indicators grouped under the six PESTEL dimensions (section 5). </w:t>
       </w:r>
       <w:r>
         <w:rPr>
@@ -2766,7 +2766,7 @@
           <w:sz w:val="19"/>
           <w:szCs w:val="19"/>
         </w:rPr>
-        <w:t xml:space="preserve">Collect the values of your allocated country for all 14 indicators and enter them in the yellow cells of your country on the Data sheet of the shared Google Sheet. </w:t>
+        <w:t xml:space="preserve">Collect the values of your allocated country for all 45 indicators and enter them in the yellow cells of your country on the Data sheet of the shared Google Sheet. </w:t>
       </w:r>
       <w:r>
         <w:rPr>
@@ -4912,7 +4912,7 @@
           <w:sz w:val="19"/>
           <w:szCs w:val="19"/>
         </w:rPr>
-        <w:t xml:space="preserve">Fourteen indicators, the same for all groups (proposal; the instructor confirms the final set after Step 1). The second label shows which of Julius Meinl's six dimensions each indicator serves. Rubric scores follow the Rubrics sheet of the Google Sheet.</w:t>
+        <w:t xml:space="preserve">Forty-five indicators in total, the same for all groups (proposal; the instructor confirms the final set after Step 1). The weight of a dimension is split equally among its indicators. Units, definitions and sources are on the Indicators sheet of the Google Sheet; rubric scores (R) follow the Rubrics sheet.</w:t>
       </w:r>
     </w:p>
     <w:tbl>
@@ -4928,10 +4928,8 @@
         </w:tblBorders>
       </w:tblPr>
       <w:tblGrid>
-        <w:gridCol w:w="1500"/>
-        <w:gridCol w:w="3722"/>
-        <w:gridCol w:w="1900"/>
-        <w:gridCol w:w="1950"/>
+        <w:gridCol w:w="1700"/>
+        <w:gridCol w:w="7372"/>
       </w:tblGrid>
       <w:tr>
         <w:trPr>
@@ -4940,7 +4938,7 @@
         </w:trPr>
         <w:tc>
           <w:tcPr>
-            <w:tcW w:type="dxa" w:w="1500"/>
+            <w:tcW w:type="dxa" w:w="1700"/>
             <w:tcBorders>
               <w:top w:val="single" w:color="BFBFBF" w:sz="4"/>
               <w:left w:val="single" w:color="BFBFBF" w:sz="4"/>
@@ -4968,13 +4966,13 @@
                 <w:sz w:val="15"/>
                 <w:szCs w:val="15"/>
               </w:rPr>
-              <w:t xml:space="preserve">PESTEL dimension and weight</w:t>
-            </w:r>
-          </w:p>
-        </w:tc>
-        <w:tc>
-          <w:tcPr>
-            <w:tcW w:type="dxa" w:w="3722"/>
+              <w:t xml:space="preserve">PESTEL dimension</w:t>
+            </w:r>
+          </w:p>
+        </w:tc>
+        <w:tc>
+          <w:tcPr>
+            <w:tcW w:type="dxa" w:w="7372"/>
             <w:tcBorders>
               <w:top w:val="single" w:color="BFBFBF" w:sz="4"/>
               <w:left w:val="single" w:color="BFBFBF" w:sz="4"/>
@@ -5002,75 +5000,7 @@
                 <w:sz w:val="15"/>
                 <w:szCs w:val="15"/>
               </w:rPr>
-              <w:t xml:space="preserve">Indicators (unit)</w:t>
-            </w:r>
-          </w:p>
-        </w:tc>
-        <w:tc>
-          <w:tcPr>
-            <w:tcW w:type="dxa" w:w="1900"/>
-            <w:tcBorders>
-              <w:top w:val="single" w:color="BFBFBF" w:sz="4"/>
-              <w:left w:val="single" w:color="BFBFBF" w:sz="4"/>
-              <w:bottom w:val="single" w:color="BFBFBF" w:sz="4"/>
-              <w:right w:val="single" w:color="BFBFBF" w:sz="4"/>
-            </w:tcBorders>
-            <w:shd w:fill="002350" w:color="auto" w:val="clear"/>
-            <w:tcMar>
-              <w:top w:type="dxa" w:w="60"/>
-              <w:left w:type="dxa" w:w="100"/>
-              <w:bottom w:type="dxa" w:w="40"/>
-              <w:right w:type="dxa" w:w="100"/>
-            </w:tcMar>
-          </w:tcPr>
-          <w:p>
-            <w:pPr>
-              <w:spacing w:after="40" w:line="240"/>
-            </w:pPr>
-            <w:r>
-              <w:rPr>
-                <w:rFonts w:ascii="Verdana" w:cs="Verdana" w:eastAsia="Verdana" w:hAnsi="Verdana"/>
-                <w:b/>
-                <w:bCs/>
-                <w:color w:val="FFFFFF"/>
-                <w:sz w:val="15"/>
-                <w:szCs w:val="15"/>
-              </w:rPr>
-              <w:t xml:space="preserve">Julius Meinl dimension</w:t>
-            </w:r>
-          </w:p>
-        </w:tc>
-        <w:tc>
-          <w:tcPr>
-            <w:tcW w:type="dxa" w:w="1950"/>
-            <w:tcBorders>
-              <w:top w:val="single" w:color="BFBFBF" w:sz="4"/>
-              <w:left w:val="single" w:color="BFBFBF" w:sz="4"/>
-              <w:bottom w:val="single" w:color="BFBFBF" w:sz="4"/>
-              <w:right w:val="single" w:color="BFBFBF" w:sz="4"/>
-            </w:tcBorders>
-            <w:shd w:fill="002350" w:color="auto" w:val="clear"/>
-            <w:tcMar>
-              <w:top w:type="dxa" w:w="60"/>
-              <w:left w:type="dxa" w:w="100"/>
-              <w:bottom w:type="dxa" w:w="40"/>
-              <w:right w:type="dxa" w:w="100"/>
-            </w:tcMar>
-          </w:tcPr>
-          <w:p>
-            <w:pPr>
-              <w:spacing w:after="40" w:line="240"/>
-            </w:pPr>
-            <w:r>
-              <w:rPr>
-                <w:rFonts w:ascii="Verdana" w:cs="Verdana" w:eastAsia="Verdana" w:hAnsi="Verdana"/>
-                <w:b/>
-                <w:bCs/>
-                <w:color w:val="FFFFFF"/>
-                <w:sz w:val="15"/>
-                <w:szCs w:val="15"/>
-              </w:rPr>
-              <w:t xml:space="preserve">Source</w:t>
+              <w:t xml:space="preserve">Indicators</w:t>
             </w:r>
           </w:p>
         </w:tc>
@@ -5081,7 +5011,7 @@
         </w:trPr>
         <w:tc>
           <w:tcPr>
-            <w:tcW w:type="dxa" w:w="1500"/>
+            <w:tcW w:type="dxa" w:w="1700"/>
             <w:tcBorders>
               <w:top w:val="single" w:color="BFBFBF" w:sz="4"/>
               <w:left w:val="single" w:color="BFBFBF" w:sz="4"/>
@@ -5115,136 +5045,89 @@
                 <w:sz w:val="15"/>
                 <w:szCs w:val="15"/>
               </w:rPr>
-              <w:t xml:space="preserve"> (15)</w:t>
-            </w:r>
-          </w:p>
-        </w:tc>
-        <w:tc>
-          <w:tcPr>
-            <w:tcW w:type="dxa" w:w="3722"/>
-            <w:tcBorders>
-              <w:top w:val="single" w:color="BFBFBF" w:sz="4"/>
-              <w:left w:val="single" w:color="BFBFBF" w:sz="4"/>
-              <w:bottom w:val="single" w:color="BFBFBF" w:sz="4"/>
-              <w:right w:val="single" w:color="BFBFBF" w:sz="4"/>
-            </w:tcBorders>
-            <w:tcMar>
-              <w:top w:type="dxa" w:w="60"/>
-              <w:left w:type="dxa" w:w="100"/>
-              <w:bottom w:type="dxa" w:w="40"/>
-              <w:right w:type="dxa" w:w="100"/>
-            </w:tcMar>
-          </w:tcPr>
-          <w:p>
-            <w:pPr>
-              <w:spacing w:after="40" w:line="240"/>
-            </w:pPr>
-            <w:r>
-              <w:rPr>
-                <w:rFonts w:ascii="Verdana" w:cs="Verdana" w:eastAsia="Verdana" w:hAnsi="Verdana"/>
-                <w:sz w:val="15"/>
-                <w:szCs w:val="15"/>
-              </w:rPr>
-              <w:t xml:space="preserve">Political stability and absence of violence (WGI estimate)</w:t>
-            </w:r>
-          </w:p>
-          <w:p>
-            <w:pPr>
-              <w:spacing w:after="40" w:line="240"/>
-            </w:pPr>
-            <w:r>
-              <w:rPr>
-                <w:rFonts w:ascii="Verdana" w:cs="Verdana" w:eastAsia="Verdana" w:hAnsi="Verdana"/>
-                <w:sz w:val="15"/>
-                <w:szCs w:val="15"/>
-              </w:rPr>
-              <w:t xml:space="preserve">EU trade agreement with the country (rubric 1 to 5)</w:t>
-            </w:r>
-          </w:p>
-        </w:tc>
-        <w:tc>
-          <w:tcPr>
-            <w:tcW w:type="dxa" w:w="1900"/>
-            <w:tcBorders>
-              <w:top w:val="single" w:color="BFBFBF" w:sz="4"/>
-              <w:left w:val="single" w:color="BFBFBF" w:sz="4"/>
-              <w:bottom w:val="single" w:color="BFBFBF" w:sz="4"/>
-              <w:right w:val="single" w:color="BFBFBF" w:sz="4"/>
-            </w:tcBorders>
-            <w:tcMar>
-              <w:top w:type="dxa" w:w="60"/>
-              <w:left w:type="dxa" w:w="100"/>
-              <w:bottom w:type="dxa" w:w="40"/>
-              <w:right w:type="dxa" w:w="100"/>
-            </w:tcMar>
-          </w:tcPr>
-          <w:p>
-            <w:pPr>
-              <w:spacing w:after="40" w:line="240"/>
-            </w:pPr>
-            <w:r>
-              <w:rPr>
-                <w:rFonts w:ascii="Verdana" w:cs="Verdana" w:eastAsia="Verdana" w:hAnsi="Verdana"/>
-                <w:sz w:val="15"/>
-                <w:szCs w:val="15"/>
-              </w:rPr>
-              <w:t xml:space="preserve">Country risk</w:t>
-            </w:r>
-          </w:p>
-          <w:p>
-            <w:pPr>
-              <w:spacing w:after="40" w:line="240"/>
-            </w:pPr>
-            <w:r>
-              <w:rPr>
-                <w:rFonts w:ascii="Verdana" w:cs="Verdana" w:eastAsia="Verdana" w:hAnsi="Verdana"/>
-                <w:sz w:val="15"/>
-                <w:szCs w:val="15"/>
-              </w:rPr>
-              <w:t xml:space="preserve">Import and regulation</w:t>
-            </w:r>
-          </w:p>
-        </w:tc>
-        <w:tc>
-          <w:tcPr>
-            <w:tcW w:type="dxa" w:w="1950"/>
-            <w:tcBorders>
-              <w:top w:val="single" w:color="BFBFBF" w:sz="4"/>
-              <w:left w:val="single" w:color="BFBFBF" w:sz="4"/>
-              <w:bottom w:val="single" w:color="BFBFBF" w:sz="4"/>
-              <w:right w:val="single" w:color="BFBFBF" w:sz="4"/>
-            </w:tcBorders>
-            <w:tcMar>
-              <w:top w:type="dxa" w:w="60"/>
-              <w:left w:type="dxa" w:w="100"/>
-              <w:bottom w:type="dxa" w:w="40"/>
-              <w:right w:type="dxa" w:w="100"/>
-            </w:tcMar>
-          </w:tcPr>
-          <w:p>
-            <w:pPr>
-              <w:spacing w:after="40" w:line="240"/>
-            </w:pPr>
-            <w:r>
-              <w:rPr>
-                <w:rFonts w:ascii="Verdana" w:cs="Verdana" w:eastAsia="Verdana" w:hAnsi="Verdana"/>
-                <w:sz w:val="15"/>
-                <w:szCs w:val="15"/>
-              </w:rPr>
-              <w:t xml:space="preserve">World Bank WGI</w:t>
-            </w:r>
-          </w:p>
-          <w:p>
-            <w:pPr>
-              <w:spacing w:after="40" w:line="240"/>
-            </w:pPr>
-            <w:r>
-              <w:rPr>
-                <w:rFonts w:ascii="Verdana" w:cs="Verdana" w:eastAsia="Verdana" w:hAnsi="Verdana"/>
-                <w:sz w:val="15"/>
-                <w:szCs w:val="15"/>
-              </w:rPr>
-              <w:t xml:space="preserve">EU Access2Markets</w:t>
+              <w:t xml:space="preserve"> (5 indicators, weight 15)</w:t>
+            </w:r>
+          </w:p>
+        </w:tc>
+        <w:tc>
+          <w:tcPr>
+            <w:tcW w:type="dxa" w:w="7372"/>
+            <w:tcBorders>
+              <w:top w:val="single" w:color="BFBFBF" w:sz="4"/>
+              <w:left w:val="single" w:color="BFBFBF" w:sz="4"/>
+              <w:bottom w:val="single" w:color="BFBFBF" w:sz="4"/>
+              <w:right w:val="single" w:color="BFBFBF" w:sz="4"/>
+            </w:tcBorders>
+            <w:tcMar>
+              <w:top w:type="dxa" w:w="60"/>
+              <w:left w:type="dxa" w:w="100"/>
+              <w:bottom w:type="dxa" w:w="40"/>
+              <w:right w:type="dxa" w:w="100"/>
+            </w:tcMar>
+          </w:tcPr>
+          <w:p>
+            <w:pPr>
+              <w:spacing w:after="40" w:line="240"/>
+            </w:pPr>
+            <w:r>
+              <w:rPr>
+                <w:rFonts w:ascii="Verdana" w:cs="Verdana" w:eastAsia="Verdana" w:hAnsi="Verdana"/>
+                <w:sz w:val="15"/>
+                <w:szCs w:val="15"/>
+              </w:rPr>
+              <w:t xml:space="preserve">Political stability and absence of violence (WGI)</w:t>
+            </w:r>
+          </w:p>
+          <w:p>
+            <w:pPr>
+              <w:spacing w:after="40" w:line="240"/>
+            </w:pPr>
+            <w:r>
+              <w:rPr>
+                <w:rFonts w:ascii="Verdana" w:cs="Verdana" w:eastAsia="Verdana" w:hAnsi="Verdana"/>
+                <w:sz w:val="15"/>
+                <w:szCs w:val="15"/>
+              </w:rPr>
+              <w:t xml:space="preserve">Government effectiveness (WGI)</w:t>
+            </w:r>
+          </w:p>
+          <w:p>
+            <w:pPr>
+              <w:spacing w:after="40" w:line="240"/>
+            </w:pPr>
+            <w:r>
+              <w:rPr>
+                <w:rFonts w:ascii="Verdana" w:cs="Verdana" w:eastAsia="Verdana" w:hAnsi="Verdana"/>
+                <w:sz w:val="15"/>
+                <w:szCs w:val="15"/>
+              </w:rPr>
+              <w:t xml:space="preserve">Corruption Perceptions Index</w:t>
+            </w:r>
+          </w:p>
+          <w:p>
+            <w:pPr>
+              <w:spacing w:after="40" w:line="240"/>
+            </w:pPr>
+            <w:r>
+              <w:rPr>
+                <w:rFonts w:ascii="Verdana" w:cs="Verdana" w:eastAsia="Verdana" w:hAnsi="Verdana"/>
+                <w:sz w:val="15"/>
+                <w:szCs w:val="15"/>
+              </w:rPr>
+              <w:t xml:space="preserve">Country risk rating (Coface)</w:t>
+            </w:r>
+          </w:p>
+          <w:p>
+            <w:pPr>
+              <w:spacing w:after="40" w:line="240"/>
+            </w:pPr>
+            <w:r>
+              <w:rPr>
+                <w:rFonts w:ascii="Verdana" w:cs="Verdana" w:eastAsia="Verdana" w:hAnsi="Verdana"/>
+                <w:sz w:val="15"/>
+                <w:szCs w:val="15"/>
+              </w:rPr>
+              <w:t xml:space="preserve">EU trade agreement with the country (R)</w:t>
             </w:r>
           </w:p>
         </w:tc>
@@ -5255,7 +5138,7 @@
         </w:trPr>
         <w:tc>
           <w:tcPr>
-            <w:tcW w:type="dxa" w:w="1500"/>
+            <w:tcW w:type="dxa" w:w="1700"/>
             <w:tcBorders>
               <w:top w:val="single" w:color="BFBFBF" w:sz="4"/>
               <w:left w:val="single" w:color="BFBFBF" w:sz="4"/>
@@ -5289,214 +5172,154 @@
                 <w:sz w:val="15"/>
                 <w:szCs w:val="15"/>
               </w:rPr>
-              <w:t xml:space="preserve"> (25)</w:t>
-            </w:r>
-          </w:p>
-        </w:tc>
-        <w:tc>
-          <w:tcPr>
-            <w:tcW w:type="dxa" w:w="3722"/>
-            <w:tcBorders>
-              <w:top w:val="single" w:color="BFBFBF" w:sz="4"/>
-              <w:left w:val="single" w:color="BFBFBF" w:sz="4"/>
-              <w:bottom w:val="single" w:color="BFBFBF" w:sz="4"/>
-              <w:right w:val="single" w:color="BFBFBF" w:sz="4"/>
-            </w:tcBorders>
-            <w:tcMar>
-              <w:top w:type="dxa" w:w="60"/>
-              <w:left w:type="dxa" w:w="100"/>
-              <w:bottom w:type="dxa" w:w="40"/>
-              <w:right w:type="dxa" w:w="100"/>
-            </w:tcMar>
-          </w:tcPr>
-          <w:p>
-            <w:pPr>
-              <w:spacing w:after="40" w:line="240"/>
-            </w:pPr>
-            <w:r>
-              <w:rPr>
-                <w:rFonts w:ascii="Verdana" w:cs="Verdana" w:eastAsia="Verdana" w:hAnsi="Verdana"/>
-                <w:sz w:val="15"/>
-                <w:szCs w:val="15"/>
-              </w:rPr>
-              <w:t xml:space="preserve">GDP per capita, PPP (international dollars)</w:t>
-            </w:r>
-          </w:p>
-          <w:p>
-            <w:pPr>
-              <w:spacing w:after="40" w:line="240"/>
-            </w:pPr>
-            <w:r>
-              <w:rPr>
-                <w:rFonts w:ascii="Verdana" w:cs="Verdana" w:eastAsia="Verdana" w:hAnsi="Verdana"/>
-                <w:sz w:val="15"/>
-                <w:szCs w:val="15"/>
-              </w:rPr>
-              <w:t xml:space="preserve">Household consumption per capita (US dollars)</w:t>
-            </w:r>
-          </w:p>
-          <w:p>
-            <w:pPr>
-              <w:spacing w:after="40" w:line="240"/>
-            </w:pPr>
-            <w:r>
-              <w:rPr>
-                <w:rFonts w:ascii="Verdana" w:cs="Verdana" w:eastAsia="Verdana" w:hAnsi="Verdana"/>
-                <w:sz w:val="15"/>
-                <w:szCs w:val="15"/>
-              </w:rPr>
-              <w:t xml:space="preserve">Inflation (% per year; lower is better)</w:t>
-            </w:r>
-          </w:p>
-          <w:p>
-            <w:pPr>
-              <w:spacing w:after="40" w:line="240"/>
-            </w:pPr>
-            <w:r>
-              <w:rPr>
-                <w:rFonts w:ascii="Verdana" w:cs="Verdana" w:eastAsia="Verdana" w:hAnsi="Verdana"/>
-                <w:sz w:val="15"/>
-                <w:szCs w:val="15"/>
-              </w:rPr>
-              <w:t xml:space="preserve">Applied tariff on roasted coffee, HS 0901.21, EU origin (%; lower is better)</w:t>
-            </w:r>
-          </w:p>
-        </w:tc>
-        <w:tc>
-          <w:tcPr>
-            <w:tcW w:type="dxa" w:w="1900"/>
-            <w:tcBorders>
-              <w:top w:val="single" w:color="BFBFBF" w:sz="4"/>
-              <w:left w:val="single" w:color="BFBFBF" w:sz="4"/>
-              <w:bottom w:val="single" w:color="BFBFBF" w:sz="4"/>
-              <w:right w:val="single" w:color="BFBFBF" w:sz="4"/>
-            </w:tcBorders>
-            <w:tcMar>
-              <w:top w:type="dxa" w:w="60"/>
-              <w:left w:type="dxa" w:w="100"/>
-              <w:bottom w:type="dxa" w:w="40"/>
-              <w:right w:type="dxa" w:w="100"/>
-            </w:tcMar>
-          </w:tcPr>
-          <w:p>
-            <w:pPr>
-              <w:spacing w:after="40" w:line="240"/>
-            </w:pPr>
-            <w:r>
-              <w:rPr>
-                <w:rFonts w:ascii="Verdana" w:cs="Verdana" w:eastAsia="Verdana" w:hAnsi="Verdana"/>
-                <w:sz w:val="15"/>
-                <w:szCs w:val="15"/>
-              </w:rPr>
-              <w:t xml:space="preserve">Purchasing power</w:t>
-            </w:r>
-          </w:p>
-          <w:p>
-            <w:pPr>
-              <w:spacing w:after="40" w:line="240"/>
-            </w:pPr>
-            <w:r>
-              <w:rPr>
-                <w:rFonts w:ascii="Verdana" w:cs="Verdana" w:eastAsia="Verdana" w:hAnsi="Verdana"/>
-                <w:sz w:val="15"/>
-                <w:szCs w:val="15"/>
-              </w:rPr>
-              <w:t xml:space="preserve">Premium coffee segment</w:t>
-            </w:r>
-          </w:p>
-          <w:p>
-            <w:pPr>
-              <w:spacing w:after="40" w:line="240"/>
-            </w:pPr>
-            <w:r>
-              <w:rPr>
-                <w:rFonts w:ascii="Verdana" w:cs="Verdana" w:eastAsia="Verdana" w:hAnsi="Verdana"/>
-                <w:sz w:val="15"/>
-                <w:szCs w:val="15"/>
-              </w:rPr>
-              <w:t xml:space="preserve">Purchasing power</w:t>
-            </w:r>
-          </w:p>
-          <w:p>
-            <w:pPr>
-              <w:spacing w:after="40" w:line="240"/>
-            </w:pPr>
-            <w:r>
-              <w:rPr>
-                <w:rFonts w:ascii="Verdana" w:cs="Verdana" w:eastAsia="Verdana" w:hAnsi="Verdana"/>
-                <w:sz w:val="15"/>
-                <w:szCs w:val="15"/>
-              </w:rPr>
-              <w:t xml:space="preserve">Import and regulation</w:t>
-            </w:r>
-          </w:p>
-        </w:tc>
-        <w:tc>
-          <w:tcPr>
-            <w:tcW w:type="dxa" w:w="1950"/>
-            <w:tcBorders>
-              <w:top w:val="single" w:color="BFBFBF" w:sz="4"/>
-              <w:left w:val="single" w:color="BFBFBF" w:sz="4"/>
-              <w:bottom w:val="single" w:color="BFBFBF" w:sz="4"/>
-              <w:right w:val="single" w:color="BFBFBF" w:sz="4"/>
-            </w:tcBorders>
-            <w:tcMar>
-              <w:top w:type="dxa" w:w="60"/>
-              <w:left w:type="dxa" w:w="100"/>
-              <w:bottom w:type="dxa" w:w="40"/>
-              <w:right w:type="dxa" w:w="100"/>
-            </w:tcMar>
-          </w:tcPr>
-          <w:p>
-            <w:pPr>
-              <w:spacing w:after="40" w:line="240"/>
-            </w:pPr>
-            <w:r>
-              <w:rPr>
-                <w:rFonts w:ascii="Verdana" w:cs="Verdana" w:eastAsia="Verdana" w:hAnsi="Verdana"/>
-                <w:sz w:val="15"/>
-                <w:szCs w:val="15"/>
-              </w:rPr>
-              <w:t xml:space="preserve">World Bank WDI</w:t>
-            </w:r>
-          </w:p>
-          <w:p>
-            <w:pPr>
-              <w:spacing w:after="40" w:line="240"/>
-            </w:pPr>
-            <w:r>
-              <w:rPr>
-                <w:rFonts w:ascii="Verdana" w:cs="Verdana" w:eastAsia="Verdana" w:hAnsi="Verdana"/>
-                <w:sz w:val="15"/>
-                <w:szCs w:val="15"/>
-              </w:rPr>
-              <w:t xml:space="preserve">World Bank WDI</w:t>
-            </w:r>
-          </w:p>
-          <w:p>
-            <w:pPr>
-              <w:spacing w:after="40" w:line="240"/>
-            </w:pPr>
-            <w:r>
-              <w:rPr>
-                <w:rFonts w:ascii="Verdana" w:cs="Verdana" w:eastAsia="Verdana" w:hAnsi="Verdana"/>
-                <w:sz w:val="15"/>
-                <w:szCs w:val="15"/>
-              </w:rPr>
-              <w:t xml:space="preserve">World Bank WDI</w:t>
-            </w:r>
-          </w:p>
-          <w:p>
-            <w:pPr>
-              <w:spacing w:after="40" w:line="240"/>
-            </w:pPr>
-            <w:r>
-              <w:rPr>
-                <w:rFonts w:ascii="Verdana" w:cs="Verdana" w:eastAsia="Verdana" w:hAnsi="Verdana"/>
-                <w:sz w:val="15"/>
-                <w:szCs w:val="15"/>
-              </w:rPr>
-              <w:t xml:space="preserve">EU Access2Markets; WTO</w:t>
+              <w:t xml:space="preserve"> (10, weight 25)</w:t>
+            </w:r>
+          </w:p>
+        </w:tc>
+        <w:tc>
+          <w:tcPr>
+            <w:tcW w:type="dxa" w:w="7372"/>
+            <w:tcBorders>
+              <w:top w:val="single" w:color="BFBFBF" w:sz="4"/>
+              <w:left w:val="single" w:color="BFBFBF" w:sz="4"/>
+              <w:bottom w:val="single" w:color="BFBFBF" w:sz="4"/>
+              <w:right w:val="single" w:color="BFBFBF" w:sz="4"/>
+            </w:tcBorders>
+            <w:tcMar>
+              <w:top w:type="dxa" w:w="60"/>
+              <w:left w:type="dxa" w:w="100"/>
+              <w:bottom w:type="dxa" w:w="40"/>
+              <w:right w:type="dxa" w:w="100"/>
+            </w:tcMar>
+          </w:tcPr>
+          <w:p>
+            <w:pPr>
+              <w:spacing w:after="40" w:line="240"/>
+            </w:pPr>
+            <w:r>
+              <w:rPr>
+                <w:rFonts w:ascii="Verdana" w:cs="Verdana" w:eastAsia="Verdana" w:hAnsi="Verdana"/>
+                <w:sz w:val="15"/>
+                <w:szCs w:val="15"/>
+              </w:rPr>
+              <w:t xml:space="preserve">GDP per capita, PPP</w:t>
+            </w:r>
+          </w:p>
+          <w:p>
+            <w:pPr>
+              <w:spacing w:after="40" w:line="240"/>
+            </w:pPr>
+            <w:r>
+              <w:rPr>
+                <w:rFonts w:ascii="Verdana" w:cs="Verdana" w:eastAsia="Verdana" w:hAnsi="Verdana"/>
+                <w:sz w:val="15"/>
+                <w:szCs w:val="15"/>
+              </w:rPr>
+              <w:t xml:space="preserve">GDP growth, projected (IMF)</w:t>
+            </w:r>
+          </w:p>
+          <w:p>
+            <w:pPr>
+              <w:spacing w:after="40" w:line="240"/>
+            </w:pPr>
+            <w:r>
+              <w:rPr>
+                <w:rFonts w:ascii="Verdana" w:cs="Verdana" w:eastAsia="Verdana" w:hAnsi="Verdana"/>
+                <w:sz w:val="15"/>
+                <w:szCs w:val="15"/>
+              </w:rPr>
+              <w:t xml:space="preserve">Household consumption per capita</w:t>
+            </w:r>
+          </w:p>
+          <w:p>
+            <w:pPr>
+              <w:spacing w:after="40" w:line="240"/>
+            </w:pPr>
+            <w:r>
+              <w:rPr>
+                <w:rFonts w:ascii="Verdana" w:cs="Verdana" w:eastAsia="Verdana" w:hAnsi="Verdana"/>
+                <w:sz w:val="15"/>
+                <w:szCs w:val="15"/>
+              </w:rPr>
+              <w:t xml:space="preserve">Inflation (lower is better)</w:t>
+            </w:r>
+          </w:p>
+          <w:p>
+            <w:pPr>
+              <w:spacing w:after="40" w:line="240"/>
+            </w:pPr>
+            <w:r>
+              <w:rPr>
+                <w:rFonts w:ascii="Verdana" w:cs="Verdana" w:eastAsia="Verdana" w:hAnsi="Verdana"/>
+                <w:sz w:val="15"/>
+                <w:szCs w:val="15"/>
+              </w:rPr>
+              <w:t xml:space="preserve">Income inequality, Gini (lower is better)</w:t>
+            </w:r>
+          </w:p>
+          <w:p>
+            <w:pPr>
+              <w:spacing w:after="40" w:line="240"/>
+            </w:pPr>
+            <w:r>
+              <w:rPr>
+                <w:rFonts w:ascii="Verdana" w:cs="Verdana" w:eastAsia="Verdana" w:hAnsi="Verdana"/>
+                <w:sz w:val="15"/>
+                <w:szCs w:val="15"/>
+              </w:rPr>
+              <w:t xml:space="preserve">Exchange-rate change against the US dollar (lower is better)</w:t>
+            </w:r>
+          </w:p>
+          <w:p>
+            <w:pPr>
+              <w:spacing w:after="40" w:line="240"/>
+            </w:pPr>
+            <w:r>
+              <w:rPr>
+                <w:rFonts w:ascii="Verdana" w:cs="Verdana" w:eastAsia="Verdana" w:hAnsi="Verdana"/>
+                <w:sz w:val="15"/>
+                <w:szCs w:val="15"/>
+              </w:rPr>
+              <w:t xml:space="preserve">Population</w:t>
+            </w:r>
+          </w:p>
+          <w:p>
+            <w:pPr>
+              <w:spacing w:after="40" w:line="240"/>
+            </w:pPr>
+            <w:r>
+              <w:rPr>
+                <w:rFonts w:ascii="Verdana" w:cs="Verdana" w:eastAsia="Verdana" w:hAnsi="Verdana"/>
+                <w:sz w:val="15"/>
+                <w:szCs w:val="15"/>
+              </w:rPr>
+              <w:t xml:space="preserve">International tourism receipts</w:t>
+            </w:r>
+          </w:p>
+          <w:p>
+            <w:pPr>
+              <w:spacing w:after="40" w:line="240"/>
+            </w:pPr>
+            <w:r>
+              <w:rPr>
+                <w:rFonts w:ascii="Verdana" w:cs="Verdana" w:eastAsia="Verdana" w:hAnsi="Verdana"/>
+                <w:sz w:val="15"/>
+                <w:szCs w:val="15"/>
+              </w:rPr>
+              <w:t xml:space="preserve">Coffee imports, HS 0901</w:t>
+            </w:r>
+          </w:p>
+          <w:p>
+            <w:pPr>
+              <w:spacing w:after="40" w:line="240"/>
+            </w:pPr>
+            <w:r>
+              <w:rPr>
+                <w:rFonts w:ascii="Verdana" w:cs="Verdana" w:eastAsia="Verdana" w:hAnsi="Verdana"/>
+                <w:sz w:val="15"/>
+                <w:szCs w:val="15"/>
+              </w:rPr>
+              <w:t xml:space="preserve">Applied tariff on roasted coffee, HS 0901.21, EU origin (lower is better)</w:t>
             </w:r>
           </w:p>
         </w:tc>
@@ -5507,7 +5330,7 @@
         </w:trPr>
         <w:tc>
           <w:tcPr>
-            <w:tcW w:type="dxa" w:w="1500"/>
+            <w:tcW w:type="dxa" w:w="1700"/>
             <w:tcBorders>
               <w:top w:val="single" w:color="BFBFBF" w:sz="4"/>
               <w:left w:val="single" w:color="BFBFBF" w:sz="4"/>
@@ -5541,175 +5364,154 @@
                 <w:sz w:val="15"/>
                 <w:szCs w:val="15"/>
               </w:rPr>
-              <w:t xml:space="preserve"> (25)</w:t>
-            </w:r>
-          </w:p>
-        </w:tc>
-        <w:tc>
-          <w:tcPr>
-            <w:tcW w:type="dxa" w:w="3722"/>
-            <w:tcBorders>
-              <w:top w:val="single" w:color="BFBFBF" w:sz="4"/>
-              <w:left w:val="single" w:color="BFBFBF" w:sz="4"/>
-              <w:bottom w:val="single" w:color="BFBFBF" w:sz="4"/>
-              <w:right w:val="single" w:color="BFBFBF" w:sz="4"/>
-            </w:tcBorders>
-            <w:tcMar>
-              <w:top w:type="dxa" w:w="60"/>
-              <w:left w:type="dxa" w:w="100"/>
-              <w:bottom w:type="dxa" w:w="40"/>
-              <w:right w:type="dxa" w:w="100"/>
-            </w:tcMar>
-          </w:tcPr>
-          <w:p>
-            <w:pPr>
-              <w:spacing w:after="40" w:line="240"/>
-            </w:pPr>
-            <w:r>
-              <w:rPr>
-                <w:rFonts w:ascii="Verdana" w:cs="Verdana" w:eastAsia="Verdana" w:hAnsi="Verdana"/>
-                <w:sz w:val="15"/>
-                <w:szCs w:val="15"/>
-              </w:rPr>
-              <w:t xml:space="preserve">Coffee consumption per capita (kg)</w:t>
-            </w:r>
-          </w:p>
-          <w:p>
-            <w:pPr>
-              <w:spacing w:after="40" w:line="240"/>
-            </w:pPr>
-            <w:r>
-              <w:rPr>
-                <w:rFonts w:ascii="Verdana" w:cs="Verdana" w:eastAsia="Verdana" w:hAnsi="Verdana"/>
-                <w:sz w:val="15"/>
-                <w:szCs w:val="15"/>
-              </w:rPr>
-              <w:t xml:space="preserve">International tourist arrivals (number)</w:t>
-            </w:r>
-          </w:p>
-          <w:p>
-            <w:pPr>
-              <w:spacing w:after="40" w:line="240"/>
-            </w:pPr>
-            <w:r>
-              <w:rPr>
-                <w:rFonts w:ascii="Verdana" w:cs="Verdana" w:eastAsia="Verdana" w:hAnsi="Verdana"/>
-                <w:sz w:val="15"/>
-                <w:szCs w:val="15"/>
-              </w:rPr>
-              <w:t xml:space="preserve">Cafe culture (rubric 1 to 5)</w:t>
-            </w:r>
-          </w:p>
-        </w:tc>
-        <w:tc>
-          <w:tcPr>
-            <w:tcW w:type="dxa" w:w="1900"/>
-            <w:tcBorders>
-              <w:top w:val="single" w:color="BFBFBF" w:sz="4"/>
-              <w:left w:val="single" w:color="BFBFBF" w:sz="4"/>
-              <w:bottom w:val="single" w:color="BFBFBF" w:sz="4"/>
-              <w:right w:val="single" w:color="BFBFBF" w:sz="4"/>
-            </w:tcBorders>
-            <w:tcMar>
-              <w:top w:type="dxa" w:w="60"/>
-              <w:left w:type="dxa" w:w="100"/>
-              <w:bottom w:type="dxa" w:w="40"/>
-              <w:right w:type="dxa" w:w="100"/>
-            </w:tcMar>
-          </w:tcPr>
-          <w:p>
-            <w:pPr>
-              <w:spacing w:after="40" w:line="240"/>
-            </w:pPr>
-            <w:r>
-              <w:rPr>
-                <w:rFonts w:ascii="Verdana" w:cs="Verdana" w:eastAsia="Verdana" w:hAnsi="Verdana"/>
-                <w:sz w:val="15"/>
-                <w:szCs w:val="15"/>
-              </w:rPr>
-              <w:t xml:space="preserve">Coffee culture</w:t>
-            </w:r>
-          </w:p>
-          <w:p>
-            <w:pPr>
-              <w:spacing w:after="40" w:line="240"/>
-            </w:pPr>
-            <w:r>
-              <w:rPr>
-                <w:rFonts w:ascii="Verdana" w:cs="Verdana" w:eastAsia="Verdana" w:hAnsi="Verdana"/>
-                <w:sz w:val="15"/>
-                <w:szCs w:val="15"/>
-              </w:rPr>
-              <w:t xml:space="preserve">Tourism and hotels</w:t>
-            </w:r>
-          </w:p>
-          <w:p>
-            <w:pPr>
-              <w:spacing w:after="40" w:line="240"/>
-            </w:pPr>
-            <w:r>
-              <w:rPr>
-                <w:rFonts w:ascii="Verdana" w:cs="Verdana" w:eastAsia="Verdana" w:hAnsi="Verdana"/>
-                <w:sz w:val="15"/>
-                <w:szCs w:val="15"/>
-              </w:rPr>
-              <w:t xml:space="preserve">Coffee culture</w:t>
-            </w:r>
-          </w:p>
-        </w:tc>
-        <w:tc>
-          <w:tcPr>
-            <w:tcW w:type="dxa" w:w="1950"/>
-            <w:tcBorders>
-              <w:top w:val="single" w:color="BFBFBF" w:sz="4"/>
-              <w:left w:val="single" w:color="BFBFBF" w:sz="4"/>
-              <w:bottom w:val="single" w:color="BFBFBF" w:sz="4"/>
-              <w:right w:val="single" w:color="BFBFBF" w:sz="4"/>
-            </w:tcBorders>
-            <w:tcMar>
-              <w:top w:type="dxa" w:w="60"/>
-              <w:left w:type="dxa" w:w="100"/>
-              <w:bottom w:type="dxa" w:w="40"/>
-              <w:right w:type="dxa" w:w="100"/>
-            </w:tcMar>
-          </w:tcPr>
-          <w:p>
-            <w:pPr>
-              <w:spacing w:after="40" w:line="240"/>
-            </w:pPr>
-            <w:r>
-              <w:rPr>
-                <w:rFonts w:ascii="Verdana" w:cs="Verdana" w:eastAsia="Verdana" w:hAnsi="Verdana"/>
-                <w:sz w:val="15"/>
-                <w:szCs w:val="15"/>
-              </w:rPr>
-              <w:t xml:space="preserve">International Coffee Organization</w:t>
-            </w:r>
-          </w:p>
-          <w:p>
-            <w:pPr>
-              <w:spacing w:after="40" w:line="240"/>
-            </w:pPr>
-            <w:r>
-              <w:rPr>
-                <w:rFonts w:ascii="Verdana" w:cs="Verdana" w:eastAsia="Verdana" w:hAnsi="Verdana"/>
-                <w:sz w:val="15"/>
-                <w:szCs w:val="15"/>
-              </w:rPr>
-              <w:t xml:space="preserve">World Bank WDI (UN Tourism)</w:t>
-            </w:r>
-          </w:p>
-          <w:p>
-            <w:pPr>
-              <w:spacing w:after="40" w:line="240"/>
-            </w:pPr>
-            <w:r>
-              <w:rPr>
-                <w:rFonts w:ascii="Verdana" w:cs="Verdana" w:eastAsia="Verdana" w:hAnsi="Verdana"/>
-                <w:sz w:val="15"/>
-                <w:szCs w:val="15"/>
-              </w:rPr>
-              <w:t xml:space="preserve">Own assessment with sources</w:t>
+              <w:t xml:space="preserve"> (10, weight 25)</w:t>
+            </w:r>
+          </w:p>
+        </w:tc>
+        <w:tc>
+          <w:tcPr>
+            <w:tcW w:type="dxa" w:w="7372"/>
+            <w:tcBorders>
+              <w:top w:val="single" w:color="BFBFBF" w:sz="4"/>
+              <w:left w:val="single" w:color="BFBFBF" w:sz="4"/>
+              <w:bottom w:val="single" w:color="BFBFBF" w:sz="4"/>
+              <w:right w:val="single" w:color="BFBFBF" w:sz="4"/>
+            </w:tcBorders>
+            <w:tcMar>
+              <w:top w:type="dxa" w:w="60"/>
+              <w:left w:type="dxa" w:w="100"/>
+              <w:bottom w:type="dxa" w:w="40"/>
+              <w:right w:type="dxa" w:w="100"/>
+            </w:tcMar>
+          </w:tcPr>
+          <w:p>
+            <w:pPr>
+              <w:spacing w:after="40" w:line="240"/>
+            </w:pPr>
+            <w:r>
+              <w:rPr>
+                <w:rFonts w:ascii="Verdana" w:cs="Verdana" w:eastAsia="Verdana" w:hAnsi="Verdana"/>
+                <w:sz w:val="15"/>
+                <w:szCs w:val="15"/>
+              </w:rPr>
+              <w:t xml:space="preserve">Coffee consumption per capita</w:t>
+            </w:r>
+          </w:p>
+          <w:p>
+            <w:pPr>
+              <w:spacing w:after="40" w:line="240"/>
+            </w:pPr>
+            <w:r>
+              <w:rPr>
+                <w:rFonts w:ascii="Verdana" w:cs="Verdana" w:eastAsia="Verdana" w:hAnsi="Verdana"/>
+                <w:sz w:val="15"/>
+                <w:szCs w:val="15"/>
+              </w:rPr>
+              <w:t xml:space="preserve">International tourist arrivals</w:t>
+            </w:r>
+          </w:p>
+          <w:p>
+            <w:pPr>
+              <w:spacing w:after="40" w:line="240"/>
+            </w:pPr>
+            <w:r>
+              <w:rPr>
+                <w:rFonts w:ascii="Verdana" w:cs="Verdana" w:eastAsia="Verdana" w:hAnsi="Verdana"/>
+                <w:sz w:val="15"/>
+                <w:szCs w:val="15"/>
+              </w:rPr>
+              <w:t xml:space="preserve">Share of visitors from Europe</w:t>
+            </w:r>
+          </w:p>
+          <w:p>
+            <w:pPr>
+              <w:spacing w:after="40" w:line="240"/>
+            </w:pPr>
+            <w:r>
+              <w:rPr>
+                <w:rFonts w:ascii="Verdana" w:cs="Verdana" w:eastAsia="Verdana" w:hAnsi="Verdana"/>
+                <w:sz w:val="15"/>
+                <w:szCs w:val="15"/>
+              </w:rPr>
+              <w:t xml:space="preserve">Urban population share</w:t>
+            </w:r>
+          </w:p>
+          <w:p>
+            <w:pPr>
+              <w:spacing w:after="40" w:line="240"/>
+            </w:pPr>
+            <w:r>
+              <w:rPr>
+                <w:rFonts w:ascii="Verdana" w:cs="Verdana" w:eastAsia="Verdana" w:hAnsi="Verdana"/>
+                <w:sz w:val="15"/>
+                <w:szCs w:val="15"/>
+              </w:rPr>
+              <w:t xml:space="preserve">Cafe culture (R)</w:t>
+            </w:r>
+          </w:p>
+          <w:p>
+            <w:pPr>
+              <w:spacing w:after="40" w:line="240"/>
+            </w:pPr>
+            <w:r>
+              <w:rPr>
+                <w:rFonts w:ascii="Verdana" w:cs="Verdana" w:eastAsia="Verdana" w:hAnsi="Verdana"/>
+                <w:sz w:val="15"/>
+                <w:szCs w:val="15"/>
+              </w:rPr>
+              <w:t xml:space="preserve">European influence on coffee culture (R)</w:t>
+            </w:r>
+          </w:p>
+          <w:p>
+            <w:pPr>
+              <w:spacing w:after="40" w:line="240"/>
+            </w:pPr>
+            <w:r>
+              <w:rPr>
+                <w:rFonts w:ascii="Verdana" w:cs="Verdana" w:eastAsia="Verdana" w:hAnsi="Verdana"/>
+                <w:sz w:val="15"/>
+                <w:szCs w:val="15"/>
+              </w:rPr>
+              <w:t xml:space="preserve">Human Development Index</w:t>
+            </w:r>
+          </w:p>
+          <w:p>
+            <w:pPr>
+              <w:spacing w:after="40" w:line="240"/>
+            </w:pPr>
+            <w:r>
+              <w:rPr>
+                <w:rFonts w:ascii="Verdana" w:cs="Verdana" w:eastAsia="Verdana" w:hAnsi="Verdana"/>
+                <w:sz w:val="15"/>
+                <w:szCs w:val="15"/>
+              </w:rPr>
+              <w:t xml:space="preserve">Specialty cafes in the capital (own count)</w:t>
+            </w:r>
+          </w:p>
+          <w:p>
+            <w:pPr>
+              <w:spacing w:after="40" w:line="240"/>
+            </w:pPr>
+            <w:r>
+              <w:rPr>
+                <w:rFonts w:ascii="Verdana" w:cs="Verdana" w:eastAsia="Verdana" w:hAnsi="Verdana"/>
+                <w:sz w:val="15"/>
+                <w:szCs w:val="15"/>
+              </w:rPr>
+              <w:t xml:space="preserve">International-brand hotels in the capital (own count)</w:t>
+            </w:r>
+          </w:p>
+          <w:p>
+            <w:pPr>
+              <w:spacing w:after="40" w:line="240"/>
+            </w:pPr>
+            <w:r>
+              <w:rPr>
+                <w:rFonts w:ascii="Verdana" w:cs="Verdana" w:eastAsia="Verdana" w:hAnsi="Verdana"/>
+                <w:sz w:val="15"/>
+                <w:szCs w:val="15"/>
+              </w:rPr>
+              <w:t xml:space="preserve">Tertiary school enrolment</w:t>
             </w:r>
           </w:p>
         </w:tc>
@@ -5720,7 +5522,7 @@
         </w:trPr>
         <w:tc>
           <w:tcPr>
-            <w:tcW w:type="dxa" w:w="1500"/>
+            <w:tcW w:type="dxa" w:w="1700"/>
             <w:tcBorders>
               <w:top w:val="single" w:color="BFBFBF" w:sz="4"/>
               <w:left w:val="single" w:color="BFBFBF" w:sz="4"/>
@@ -5754,136 +5556,154 @@
                 <w:sz w:val="15"/>
                 <w:szCs w:val="15"/>
               </w:rPr>
-              <w:t xml:space="preserve"> (10)</w:t>
-            </w:r>
-          </w:p>
-        </w:tc>
-        <w:tc>
-          <w:tcPr>
-            <w:tcW w:type="dxa" w:w="3722"/>
-            <w:tcBorders>
-              <w:top w:val="single" w:color="BFBFBF" w:sz="4"/>
-              <w:left w:val="single" w:color="BFBFBF" w:sz="4"/>
-              <w:bottom w:val="single" w:color="BFBFBF" w:sz="4"/>
-              <w:right w:val="single" w:color="BFBFBF" w:sz="4"/>
-            </w:tcBorders>
-            <w:tcMar>
-              <w:top w:type="dxa" w:w="60"/>
-              <w:left w:type="dxa" w:w="100"/>
-              <w:bottom w:type="dxa" w:w="40"/>
-              <w:right w:type="dxa" w:w="100"/>
-            </w:tcMar>
-          </w:tcPr>
-          <w:p>
-            <w:pPr>
-              <w:spacing w:after="40" w:line="240"/>
-            </w:pPr>
-            <w:r>
-              <w:rPr>
-                <w:rFonts w:ascii="Verdana" w:cs="Verdana" w:eastAsia="Verdana" w:hAnsi="Verdana"/>
-                <w:sz w:val="15"/>
-                <w:szCs w:val="15"/>
-              </w:rPr>
-              <w:t xml:space="preserve">Individuals using the Internet (% of population)</w:t>
-            </w:r>
-          </w:p>
-          <w:p>
-            <w:pPr>
-              <w:spacing w:after="40" w:line="240"/>
-            </w:pPr>
-            <w:r>
-              <w:rPr>
-                <w:rFonts w:ascii="Verdana" w:cs="Verdana" w:eastAsia="Verdana" w:hAnsi="Verdana"/>
-                <w:sz w:val="15"/>
-                <w:szCs w:val="15"/>
-              </w:rPr>
-              <w:t xml:space="preserve">Logistics Performance Index (1 to 5)</w:t>
-            </w:r>
-          </w:p>
-        </w:tc>
-        <w:tc>
-          <w:tcPr>
-            <w:tcW w:type="dxa" w:w="1900"/>
-            <w:tcBorders>
-              <w:top w:val="single" w:color="BFBFBF" w:sz="4"/>
-              <w:left w:val="single" w:color="BFBFBF" w:sz="4"/>
-              <w:bottom w:val="single" w:color="BFBFBF" w:sz="4"/>
-              <w:right w:val="single" w:color="BFBFBF" w:sz="4"/>
-            </w:tcBorders>
-            <w:tcMar>
-              <w:top w:type="dxa" w:w="60"/>
-              <w:left w:type="dxa" w:w="100"/>
-              <w:bottom w:type="dxa" w:w="40"/>
-              <w:right w:type="dxa" w:w="100"/>
-            </w:tcMar>
-          </w:tcPr>
-          <w:p>
-            <w:pPr>
-              <w:spacing w:after="40" w:line="240"/>
-            </w:pPr>
-            <w:r>
-              <w:rPr>
-                <w:rFonts w:ascii="Verdana" w:cs="Verdana" w:eastAsia="Verdana" w:hAnsi="Verdana"/>
-                <w:sz w:val="15"/>
-                <w:szCs w:val="15"/>
-              </w:rPr>
-              <w:t xml:space="preserve">Premium coffee segment</w:t>
-            </w:r>
-          </w:p>
-          <w:p>
-            <w:pPr>
-              <w:spacing w:after="40" w:line="240"/>
-            </w:pPr>
-            <w:r>
-              <w:rPr>
-                <w:rFonts w:ascii="Verdana" w:cs="Verdana" w:eastAsia="Verdana" w:hAnsi="Verdana"/>
-                <w:sz w:val="15"/>
-                <w:szCs w:val="15"/>
-              </w:rPr>
-              <w:t xml:space="preserve">Import and regulation</w:t>
-            </w:r>
-          </w:p>
-        </w:tc>
-        <w:tc>
-          <w:tcPr>
-            <w:tcW w:type="dxa" w:w="1950"/>
-            <w:tcBorders>
-              <w:top w:val="single" w:color="BFBFBF" w:sz="4"/>
-              <w:left w:val="single" w:color="BFBFBF" w:sz="4"/>
-              <w:bottom w:val="single" w:color="BFBFBF" w:sz="4"/>
-              <w:right w:val="single" w:color="BFBFBF" w:sz="4"/>
-            </w:tcBorders>
-            <w:tcMar>
-              <w:top w:type="dxa" w:w="60"/>
-              <w:left w:type="dxa" w:w="100"/>
-              <w:bottom w:type="dxa" w:w="40"/>
-              <w:right w:type="dxa" w:w="100"/>
-            </w:tcMar>
-          </w:tcPr>
-          <w:p>
-            <w:pPr>
-              <w:spacing w:after="40" w:line="240"/>
-            </w:pPr>
-            <w:r>
-              <w:rPr>
-                <w:rFonts w:ascii="Verdana" w:cs="Verdana" w:eastAsia="Verdana" w:hAnsi="Verdana"/>
-                <w:sz w:val="15"/>
-                <w:szCs w:val="15"/>
-              </w:rPr>
-              <w:t xml:space="preserve">World Bank WDI</w:t>
-            </w:r>
-          </w:p>
-          <w:p>
-            <w:pPr>
-              <w:spacing w:after="40" w:line="240"/>
-            </w:pPr>
-            <w:r>
-              <w:rPr>
-                <w:rFonts w:ascii="Verdana" w:cs="Verdana" w:eastAsia="Verdana" w:hAnsi="Verdana"/>
-                <w:sz w:val="15"/>
-                <w:szCs w:val="15"/>
-              </w:rPr>
-              <w:t xml:space="preserve">World Bank LPI</w:t>
+              <w:t xml:space="preserve"> (10, weight 10)</w:t>
+            </w:r>
+          </w:p>
+        </w:tc>
+        <w:tc>
+          <w:tcPr>
+            <w:tcW w:type="dxa" w:w="7372"/>
+            <w:tcBorders>
+              <w:top w:val="single" w:color="BFBFBF" w:sz="4"/>
+              <w:left w:val="single" w:color="BFBFBF" w:sz="4"/>
+              <w:bottom w:val="single" w:color="BFBFBF" w:sz="4"/>
+              <w:right w:val="single" w:color="BFBFBF" w:sz="4"/>
+            </w:tcBorders>
+            <w:tcMar>
+              <w:top w:type="dxa" w:w="60"/>
+              <w:left w:type="dxa" w:w="100"/>
+              <w:bottom w:type="dxa" w:w="40"/>
+              <w:right w:type="dxa" w:w="100"/>
+            </w:tcMar>
+          </w:tcPr>
+          <w:p>
+            <w:pPr>
+              <w:spacing w:after="40" w:line="240"/>
+            </w:pPr>
+            <w:r>
+              <w:rPr>
+                <w:rFonts w:ascii="Verdana" w:cs="Verdana" w:eastAsia="Verdana" w:hAnsi="Verdana"/>
+                <w:sz w:val="15"/>
+                <w:szCs w:val="15"/>
+              </w:rPr>
+              <w:t xml:space="preserve">Individuals using the Internet</w:t>
+            </w:r>
+          </w:p>
+          <w:p>
+            <w:pPr>
+              <w:spacing w:after="40" w:line="240"/>
+            </w:pPr>
+            <w:r>
+              <w:rPr>
+                <w:rFonts w:ascii="Verdana" w:cs="Verdana" w:eastAsia="Verdana" w:hAnsi="Verdana"/>
+                <w:sz w:val="15"/>
+                <w:szCs w:val="15"/>
+              </w:rPr>
+              <w:t xml:space="preserve">Logistics Performance Index</w:t>
+            </w:r>
+          </w:p>
+          <w:p>
+            <w:pPr>
+              <w:spacing w:after="40" w:line="240"/>
+            </w:pPr>
+            <w:r>
+              <w:rPr>
+                <w:rFonts w:ascii="Verdana" w:cs="Verdana" w:eastAsia="Verdana" w:hAnsi="Verdana"/>
+                <w:sz w:val="15"/>
+                <w:szCs w:val="15"/>
+              </w:rPr>
+              <w:t xml:space="preserve">Global Innovation Index</w:t>
+            </w:r>
+          </w:p>
+          <w:p>
+            <w:pPr>
+              <w:spacing w:after="40" w:line="240"/>
+            </w:pPr>
+            <w:r>
+              <w:rPr>
+                <w:rFonts w:ascii="Verdana" w:cs="Verdana" w:eastAsia="Verdana" w:hAnsi="Verdana"/>
+                <w:sz w:val="15"/>
+                <w:szCs w:val="15"/>
+              </w:rPr>
+              <w:t xml:space="preserve">Online retail and food delivery share</w:t>
+            </w:r>
+          </w:p>
+          <w:p>
+            <w:pPr>
+              <w:spacing w:after="40" w:line="240"/>
+            </w:pPr>
+            <w:r>
+              <w:rPr>
+                <w:rFonts w:ascii="Verdana" w:cs="Verdana" w:eastAsia="Verdana" w:hAnsi="Verdana"/>
+                <w:sz w:val="15"/>
+                <w:szCs w:val="15"/>
+              </w:rPr>
+              <w:t xml:space="preserve">Account ownership, adults</w:t>
+            </w:r>
+          </w:p>
+          <w:p>
+            <w:pPr>
+              <w:spacing w:after="40" w:line="240"/>
+            </w:pPr>
+            <w:r>
+              <w:rPr>
+                <w:rFonts w:ascii="Verdana" w:cs="Verdana" w:eastAsia="Verdana" w:hAnsi="Verdana"/>
+                <w:sz w:val="15"/>
+                <w:szCs w:val="15"/>
+              </w:rPr>
+              <w:t xml:space="preserve">Mobile cellular subscriptions</w:t>
+            </w:r>
+          </w:p>
+          <w:p>
+            <w:pPr>
+              <w:spacing w:after="40" w:line="240"/>
+            </w:pPr>
+            <w:r>
+              <w:rPr>
+                <w:rFonts w:ascii="Verdana" w:cs="Verdana" w:eastAsia="Verdana" w:hAnsi="Verdana"/>
+                <w:sz w:val="15"/>
+                <w:szCs w:val="15"/>
+              </w:rPr>
+              <w:t xml:space="preserve">Fixed broadband subscriptions</w:t>
+            </w:r>
+          </w:p>
+          <w:p>
+            <w:pPr>
+              <w:spacing w:after="40" w:line="240"/>
+            </w:pPr>
+            <w:r>
+              <w:rPr>
+                <w:rFonts w:ascii="Verdana" w:cs="Verdana" w:eastAsia="Verdana" w:hAnsi="Verdana"/>
+                <w:sz w:val="15"/>
+                <w:szCs w:val="15"/>
+              </w:rPr>
+              <w:t xml:space="preserve">Secure Internet servers</w:t>
+            </w:r>
+          </w:p>
+          <w:p>
+            <w:pPr>
+              <w:spacing w:after="40" w:line="240"/>
+            </w:pPr>
+            <w:r>
+              <w:rPr>
+                <w:rFonts w:ascii="Verdana" w:cs="Verdana" w:eastAsia="Verdana" w:hAnsi="Verdana"/>
+                <w:sz w:val="15"/>
+                <w:szCs w:val="15"/>
+              </w:rPr>
+              <w:t xml:space="preserve">E-Government Development Index</w:t>
+            </w:r>
+          </w:p>
+          <w:p>
+            <w:pPr>
+              <w:spacing w:after="40" w:line="240"/>
+            </w:pPr>
+            <w:r>
+              <w:rPr>
+                <w:rFonts w:ascii="Verdana" w:cs="Verdana" w:eastAsia="Verdana" w:hAnsi="Verdana"/>
+                <w:sz w:val="15"/>
+                <w:szCs w:val="15"/>
+              </w:rPr>
+              <w:t xml:space="preserve">Container port traffic</w:t>
             </w:r>
           </w:p>
         </w:tc>
@@ -5894,7 +5714,7 @@
         </w:trPr>
         <w:tc>
           <w:tcPr>
-            <w:tcW w:type="dxa" w:w="1500"/>
+            <w:tcW w:type="dxa" w:w="1700"/>
             <w:tcBorders>
               <w:top w:val="single" w:color="BFBFBF" w:sz="4"/>
               <w:left w:val="single" w:color="BFBFBF" w:sz="4"/>
@@ -5928,97 +5748,89 @@
                 <w:sz w:val="15"/>
                 <w:szCs w:val="15"/>
               </w:rPr>
-              <w:t xml:space="preserve"> (5)</w:t>
-            </w:r>
-          </w:p>
-        </w:tc>
-        <w:tc>
-          <w:tcPr>
-            <w:tcW w:type="dxa" w:w="3722"/>
-            <w:tcBorders>
-              <w:top w:val="single" w:color="BFBFBF" w:sz="4"/>
-              <w:left w:val="single" w:color="BFBFBF" w:sz="4"/>
-              <w:bottom w:val="single" w:color="BFBFBF" w:sz="4"/>
-              <w:right w:val="single" w:color="BFBFBF" w:sz="4"/>
-            </w:tcBorders>
-            <w:tcMar>
-              <w:top w:type="dxa" w:w="60"/>
-              <w:left w:type="dxa" w:w="100"/>
-              <w:bottom w:type="dxa" w:w="40"/>
-              <w:right w:type="dxa" w:w="100"/>
-            </w:tcMar>
-          </w:tcPr>
-          <w:p>
-            <w:pPr>
-              <w:spacing w:after="40" w:line="240"/>
-            </w:pPr>
-            <w:r>
-              <w:rPr>
-                <w:rFonts w:ascii="Verdana" w:cs="Verdana" w:eastAsia="Verdana" w:hAnsi="Verdana"/>
-                <w:sz w:val="15"/>
-                <w:szCs w:val="15"/>
-              </w:rPr>
-              <w:t xml:space="preserve">Demand for certified and sustainable coffee (rubric 1 to 5)</w:t>
-            </w:r>
-          </w:p>
-        </w:tc>
-        <w:tc>
-          <w:tcPr>
-            <w:tcW w:type="dxa" w:w="1900"/>
-            <w:tcBorders>
-              <w:top w:val="single" w:color="BFBFBF" w:sz="4"/>
-              <w:left w:val="single" w:color="BFBFBF" w:sz="4"/>
-              <w:bottom w:val="single" w:color="BFBFBF" w:sz="4"/>
-              <w:right w:val="single" w:color="BFBFBF" w:sz="4"/>
-            </w:tcBorders>
-            <w:tcMar>
-              <w:top w:type="dxa" w:w="60"/>
-              <w:left w:type="dxa" w:w="100"/>
-              <w:bottom w:type="dxa" w:w="40"/>
-              <w:right w:type="dxa" w:w="100"/>
-            </w:tcMar>
-          </w:tcPr>
-          <w:p>
-            <w:pPr>
-              <w:spacing w:after="40" w:line="240"/>
-            </w:pPr>
-            <w:r>
-              <w:rPr>
-                <w:rFonts w:ascii="Verdana" w:cs="Verdana" w:eastAsia="Verdana" w:hAnsi="Verdana"/>
-                <w:sz w:val="15"/>
-                <w:szCs w:val="15"/>
-              </w:rPr>
-              <w:t xml:space="preserve">Premium coffee segment</w:t>
-            </w:r>
-          </w:p>
-        </w:tc>
-        <w:tc>
-          <w:tcPr>
-            <w:tcW w:type="dxa" w:w="1950"/>
-            <w:tcBorders>
-              <w:top w:val="single" w:color="BFBFBF" w:sz="4"/>
-              <w:left w:val="single" w:color="BFBFBF" w:sz="4"/>
-              <w:bottom w:val="single" w:color="BFBFBF" w:sz="4"/>
-              <w:right w:val="single" w:color="BFBFBF" w:sz="4"/>
-            </w:tcBorders>
-            <w:tcMar>
-              <w:top w:type="dxa" w:w="60"/>
-              <w:left w:type="dxa" w:w="100"/>
-              <w:bottom w:type="dxa" w:w="40"/>
-              <w:right w:type="dxa" w:w="100"/>
-            </w:tcMar>
-          </w:tcPr>
-          <w:p>
-            <w:pPr>
-              <w:spacing w:after="40" w:line="240"/>
-            </w:pPr>
-            <w:r>
-              <w:rPr>
-                <w:rFonts w:ascii="Verdana" w:cs="Verdana" w:eastAsia="Verdana" w:hAnsi="Verdana"/>
-                <w:sz w:val="15"/>
-                <w:szCs w:val="15"/>
-              </w:rPr>
-              <w:t xml:space="preserve">Industry reports, certification bodies</w:t>
+              <w:t xml:space="preserve"> (5, weight 5)</w:t>
+            </w:r>
+          </w:p>
+        </w:tc>
+        <w:tc>
+          <w:tcPr>
+            <w:tcW w:type="dxa" w:w="7372"/>
+            <w:tcBorders>
+              <w:top w:val="single" w:color="BFBFBF" w:sz="4"/>
+              <w:left w:val="single" w:color="BFBFBF" w:sz="4"/>
+              <w:bottom w:val="single" w:color="BFBFBF" w:sz="4"/>
+              <w:right w:val="single" w:color="BFBFBF" w:sz="4"/>
+            </w:tcBorders>
+            <w:tcMar>
+              <w:top w:type="dxa" w:w="60"/>
+              <w:left w:type="dxa" w:w="100"/>
+              <w:bottom w:type="dxa" w:w="40"/>
+              <w:right w:type="dxa" w:w="100"/>
+            </w:tcMar>
+          </w:tcPr>
+          <w:p>
+            <w:pPr>
+              <w:spacing w:after="40" w:line="240"/>
+            </w:pPr>
+            <w:r>
+              <w:rPr>
+                <w:rFonts w:ascii="Verdana" w:cs="Verdana" w:eastAsia="Verdana" w:hAnsi="Verdana"/>
+                <w:sz w:val="15"/>
+                <w:szCs w:val="15"/>
+              </w:rPr>
+              <w:t xml:space="preserve">Demand for certified and sustainable coffee (R)</w:t>
+            </w:r>
+          </w:p>
+          <w:p>
+            <w:pPr>
+              <w:spacing w:after="40" w:line="240"/>
+            </w:pPr>
+            <w:r>
+              <w:rPr>
+                <w:rFonts w:ascii="Verdana" w:cs="Verdana" w:eastAsia="Verdana" w:hAnsi="Verdana"/>
+                <w:sz w:val="15"/>
+                <w:szCs w:val="15"/>
+              </w:rPr>
+              <w:t xml:space="preserve">Environmental Performance Index</w:t>
+            </w:r>
+          </w:p>
+          <w:p>
+            <w:pPr>
+              <w:spacing w:after="40" w:line="240"/>
+            </w:pPr>
+            <w:r>
+              <w:rPr>
+                <w:rFonts w:ascii="Verdana" w:cs="Verdana" w:eastAsia="Verdana" w:hAnsi="Verdana"/>
+                <w:sz w:val="15"/>
+                <w:szCs w:val="15"/>
+              </w:rPr>
+              <w:t xml:space="preserve">Climate vulnerability and readiness (ND-GAIN)</w:t>
+            </w:r>
+          </w:p>
+          <w:p>
+            <w:pPr>
+              <w:spacing w:after="40" w:line="240"/>
+            </w:pPr>
+            <w:r>
+              <w:rPr>
+                <w:rFonts w:ascii="Verdana" w:cs="Verdana" w:eastAsia="Verdana" w:hAnsi="Verdana"/>
+                <w:sz w:val="15"/>
+                <w:szCs w:val="15"/>
+              </w:rPr>
+              <w:t xml:space="preserve">Domestic coffee production (lower is better: local competition)</w:t>
+            </w:r>
+          </w:p>
+          <w:p>
+            <w:pPr>
+              <w:spacing w:after="40" w:line="240"/>
+            </w:pPr>
+            <w:r>
+              <w:rPr>
+                <w:rFonts w:ascii="Verdana" w:cs="Verdana" w:eastAsia="Verdana" w:hAnsi="Verdana"/>
+                <w:sz w:val="15"/>
+                <w:szCs w:val="15"/>
+              </w:rPr>
+              <w:t xml:space="preserve">Packaging and waste rules for imported goods (R)</w:t>
             </w:r>
           </w:p>
         </w:tc>
@@ -6029,7 +5841,7 @@
         </w:trPr>
         <w:tc>
           <w:tcPr>
-            <w:tcW w:type="dxa" w:w="1500"/>
+            <w:tcW w:type="dxa" w:w="1700"/>
             <w:tcBorders>
               <w:top w:val="single" w:color="BFBFBF" w:sz="4"/>
               <w:left w:val="single" w:color="BFBFBF" w:sz="4"/>
@@ -6063,136 +5875,89 @@
                 <w:sz w:val="15"/>
                 <w:szCs w:val="15"/>
               </w:rPr>
-              <w:t xml:space="preserve"> (20)</w:t>
-            </w:r>
-          </w:p>
-        </w:tc>
-        <w:tc>
-          <w:tcPr>
-            <w:tcW w:type="dxa" w:w="3722"/>
-            <w:tcBorders>
-              <w:top w:val="single" w:color="BFBFBF" w:sz="4"/>
-              <w:left w:val="single" w:color="BFBFBF" w:sz="4"/>
-              <w:bottom w:val="single" w:color="BFBFBF" w:sz="4"/>
-              <w:right w:val="single" w:color="BFBFBF" w:sz="4"/>
-            </w:tcBorders>
-            <w:tcMar>
-              <w:top w:type="dxa" w:w="60"/>
-              <w:left w:type="dxa" w:w="100"/>
-              <w:bottom w:type="dxa" w:w="40"/>
-              <w:right w:type="dxa" w:w="100"/>
-            </w:tcMar>
-          </w:tcPr>
-          <w:p>
-            <w:pPr>
-              <w:spacing w:after="40" w:line="240"/>
-            </w:pPr>
-            <w:r>
-              <w:rPr>
-                <w:rFonts w:ascii="Verdana" w:cs="Verdana" w:eastAsia="Verdana" w:hAnsi="Verdana"/>
-                <w:sz w:val="15"/>
-                <w:szCs w:val="15"/>
-              </w:rPr>
-              <w:t xml:space="preserve">Regulatory quality (WGI estimate)</w:t>
-            </w:r>
-          </w:p>
-          <w:p>
-            <w:pPr>
-              <w:spacing w:after="40" w:line="240"/>
-            </w:pPr>
-            <w:r>
-              <w:rPr>
-                <w:rFonts w:ascii="Verdana" w:cs="Verdana" w:eastAsia="Verdana" w:hAnsi="Verdana"/>
-                <w:sz w:val="15"/>
-                <w:szCs w:val="15"/>
-              </w:rPr>
-              <w:t xml:space="preserve">Product, labelling and certification requirements for coffee (rubric 1 to 5)</w:t>
-            </w:r>
-          </w:p>
-        </w:tc>
-        <w:tc>
-          <w:tcPr>
-            <w:tcW w:type="dxa" w:w="1900"/>
-            <w:tcBorders>
-              <w:top w:val="single" w:color="BFBFBF" w:sz="4"/>
-              <w:left w:val="single" w:color="BFBFBF" w:sz="4"/>
-              <w:bottom w:val="single" w:color="BFBFBF" w:sz="4"/>
-              <w:right w:val="single" w:color="BFBFBF" w:sz="4"/>
-            </w:tcBorders>
-            <w:tcMar>
-              <w:top w:type="dxa" w:w="60"/>
-              <w:left w:type="dxa" w:w="100"/>
-              <w:bottom w:type="dxa" w:w="40"/>
-              <w:right w:type="dxa" w:w="100"/>
-            </w:tcMar>
-          </w:tcPr>
-          <w:p>
-            <w:pPr>
-              <w:spacing w:after="40" w:line="240"/>
-            </w:pPr>
-            <w:r>
-              <w:rPr>
-                <w:rFonts w:ascii="Verdana" w:cs="Verdana" w:eastAsia="Verdana" w:hAnsi="Verdana"/>
-                <w:sz w:val="15"/>
-                <w:szCs w:val="15"/>
-              </w:rPr>
-              <w:t xml:space="preserve">Import and regulation</w:t>
-            </w:r>
-          </w:p>
-          <w:p>
-            <w:pPr>
-              <w:spacing w:after="40" w:line="240"/>
-            </w:pPr>
-            <w:r>
-              <w:rPr>
-                <w:rFonts w:ascii="Verdana" w:cs="Verdana" w:eastAsia="Verdana" w:hAnsi="Verdana"/>
-                <w:sz w:val="15"/>
-                <w:szCs w:val="15"/>
-              </w:rPr>
-              <w:t xml:space="preserve">Import and regulation</w:t>
-            </w:r>
-          </w:p>
-        </w:tc>
-        <w:tc>
-          <w:tcPr>
-            <w:tcW w:type="dxa" w:w="1950"/>
-            <w:tcBorders>
-              <w:top w:val="single" w:color="BFBFBF" w:sz="4"/>
-              <w:left w:val="single" w:color="BFBFBF" w:sz="4"/>
-              <w:bottom w:val="single" w:color="BFBFBF" w:sz="4"/>
-              <w:right w:val="single" w:color="BFBFBF" w:sz="4"/>
-            </w:tcBorders>
-            <w:tcMar>
-              <w:top w:type="dxa" w:w="60"/>
-              <w:left w:type="dxa" w:w="100"/>
-              <w:bottom w:type="dxa" w:w="40"/>
-              <w:right w:type="dxa" w:w="100"/>
-            </w:tcMar>
-          </w:tcPr>
-          <w:p>
-            <w:pPr>
-              <w:spacing w:after="40" w:line="240"/>
-            </w:pPr>
-            <w:r>
-              <w:rPr>
-                <w:rFonts w:ascii="Verdana" w:cs="Verdana" w:eastAsia="Verdana" w:hAnsi="Verdana"/>
-                <w:sz w:val="15"/>
-                <w:szCs w:val="15"/>
-              </w:rPr>
-              <w:t xml:space="preserve">World Bank WGI</w:t>
-            </w:r>
-          </w:p>
-          <w:p>
-            <w:pPr>
-              <w:spacing w:after="40" w:line="240"/>
-            </w:pPr>
-            <w:r>
-              <w:rPr>
-                <w:rFonts w:ascii="Verdana" w:cs="Verdana" w:eastAsia="Verdana" w:hAnsi="Verdana"/>
-                <w:sz w:val="15"/>
-                <w:szCs w:val="15"/>
-              </w:rPr>
-              <w:t xml:space="preserve">EU Access2Markets</w:t>
+              <w:t xml:space="preserve"> (5, weight 20)</w:t>
+            </w:r>
+          </w:p>
+        </w:tc>
+        <w:tc>
+          <w:tcPr>
+            <w:tcW w:type="dxa" w:w="7372"/>
+            <w:tcBorders>
+              <w:top w:val="single" w:color="BFBFBF" w:sz="4"/>
+              <w:left w:val="single" w:color="BFBFBF" w:sz="4"/>
+              <w:bottom w:val="single" w:color="BFBFBF" w:sz="4"/>
+              <w:right w:val="single" w:color="BFBFBF" w:sz="4"/>
+            </w:tcBorders>
+            <w:tcMar>
+              <w:top w:type="dxa" w:w="60"/>
+              <w:left w:type="dxa" w:w="100"/>
+              <w:bottom w:type="dxa" w:w="40"/>
+              <w:right w:type="dxa" w:w="100"/>
+            </w:tcMar>
+          </w:tcPr>
+          <w:p>
+            <w:pPr>
+              <w:spacing w:after="40" w:line="240"/>
+            </w:pPr>
+            <w:r>
+              <w:rPr>
+                <w:rFonts w:ascii="Verdana" w:cs="Verdana" w:eastAsia="Verdana" w:hAnsi="Verdana"/>
+                <w:sz w:val="15"/>
+                <w:szCs w:val="15"/>
+              </w:rPr>
+              <w:t xml:space="preserve">Regulatory quality (WGI)</w:t>
+            </w:r>
+          </w:p>
+          <w:p>
+            <w:pPr>
+              <w:spacing w:after="40" w:line="240"/>
+            </w:pPr>
+            <w:r>
+              <w:rPr>
+                <w:rFonts w:ascii="Verdana" w:cs="Verdana" w:eastAsia="Verdana" w:hAnsi="Verdana"/>
+                <w:sz w:val="15"/>
+                <w:szCs w:val="15"/>
+              </w:rPr>
+              <w:t xml:space="preserve">Rule of law (WGI)</w:t>
+            </w:r>
+          </w:p>
+          <w:p>
+            <w:pPr>
+              <w:spacing w:after="40" w:line="240"/>
+            </w:pPr>
+            <w:r>
+              <w:rPr>
+                <w:rFonts w:ascii="Verdana" w:cs="Verdana" w:eastAsia="Verdana" w:hAnsi="Verdana"/>
+                <w:sz w:val="15"/>
+                <w:szCs w:val="15"/>
+              </w:rPr>
+              <w:t xml:space="preserve">Product, labelling and certification requirements for coffee (R)</w:t>
+            </w:r>
+          </w:p>
+          <w:p>
+            <w:pPr>
+              <w:spacing w:after="40" w:line="240"/>
+            </w:pPr>
+            <w:r>
+              <w:rPr>
+                <w:rFonts w:ascii="Verdana" w:cs="Verdana" w:eastAsia="Verdana" w:hAnsi="Verdana"/>
+                <w:sz w:val="15"/>
+                <w:szCs w:val="15"/>
+              </w:rPr>
+              <w:t xml:space="preserve">Trademark protection (R)</w:t>
+            </w:r>
+          </w:p>
+          <w:p>
+            <w:pPr>
+              <w:spacing w:after="40" w:line="240"/>
+            </w:pPr>
+            <w:r>
+              <w:rPr>
+                <w:rFonts w:ascii="Verdana" w:cs="Verdana" w:eastAsia="Verdana" w:hAnsi="Verdana"/>
+                <w:sz w:val="15"/>
+                <w:szCs w:val="15"/>
+              </w:rPr>
+              <w:t xml:space="preserve">Rules for ending a distribution agreement (R)</w:t>
             </w:r>
           </w:p>
         </w:tc>
@@ -7014,24 +6779,7 @@
           <w:sz w:val="19"/>
           <w:szCs w:val="19"/>
         </w:rPr>
-        <w:t xml:space="preserve">20 minutes plus 10 minutes of discussion. Rehearse to time. Slide limit: </w:t>
-      </w:r>
-      <w:r>
-        <w:rPr>
-          <w:rFonts w:ascii="Verdana" w:cs="Verdana" w:eastAsia="Verdana" w:hAnsi="Verdana"/>
-          <w:sz w:val="19"/>
-          <w:szCs w:val="19"/>
-          <w:highlight w:val="yellow"/>
-        </w:rPr>
-        <w:t xml:space="preserve">[to be confirmed, for example 20 slides plus appendix]</w:t>
-      </w:r>
-      <w:r>
-        <w:rPr>
-          <w:rFonts w:ascii="Verdana" w:cs="Verdana" w:eastAsia="Verdana" w:hAnsi="Verdana"/>
-          <w:sz w:val="19"/>
-          <w:szCs w:val="19"/>
-        </w:rPr>
-        <w:t xml:space="preserve">. Every slide has an action title that states its message.</w:t>
+        <w:t xml:space="preserve">20 minutes plus 10 minutes of discussion. Rehearse to time. Slide limit: 20 slides plus appendix. Every slide has an action title that states its message.</w:t>
       </w:r>
     </w:p>
     <w:p>
@@ -7292,8 +7040,7 @@
     </w:p>
     <w:p>
       <w:pPr>
-        <w:keepNext/>
-        <w:spacing w:after="80" w:before="0" w:line="252"/>
+        <w:spacing w:after="120" w:before="100" w:line="252"/>
       </w:pPr>
       <w:r>
         <w:rPr>
@@ -7303,462 +7050,20 @@
           <w:sz w:val="19"/>
           <w:szCs w:val="19"/>
         </w:rPr>
-        <w:t xml:space="preserve">Assess the industry with Porter's five forces</w:t>
-      </w:r>
-      <w:r>
-        <w:rPr>
-          <w:rFonts w:ascii="Verdana" w:cs="Verdana" w:eastAsia="Verdana" w:hAnsi="Verdana"/>
-          <w:sz w:val="19"/>
-          <w:szCs w:val="19"/>
-        </w:rPr>
-        <w:t xml:space="preserve">, adapted to a premium entrant from Vienna. Rate each force from 1 (weak, good for Julius Meinl) to 5 (strong, bad for Julius Meinl), give two or three pieces of evidence per force, and sum up industry attractiveness in one sentence.</w:t>
-      </w:r>
-    </w:p>
-    <w:tbl>
-      <w:tblPr>
-        <w:tblW w:type="dxa" w:w="9072"/>
-        <w:tblBorders>
-          <w:top w:val="single" w:color="auto" w:sz="4"/>
-          <w:left w:val="single" w:color="auto" w:sz="4"/>
-          <w:bottom w:val="single" w:color="auto" w:sz="4"/>
-          <w:right w:val="single" w:color="auto" w:sz="4"/>
-          <w:insideH w:val="single" w:color="auto" w:sz="4"/>
-          <w:insideV w:val="single" w:color="auto" w:sz="4"/>
-        </w:tblBorders>
-      </w:tblPr>
-      <w:tblGrid>
-        <w:gridCol w:w="2500"/>
-        <w:gridCol w:w="6572"/>
-      </w:tblGrid>
-      <w:tr>
-        <w:trPr>
-          <w:cantSplit/>
-          <w:tblHeader/>
-        </w:trPr>
-        <w:tc>
-          <w:tcPr>
-            <w:tcW w:type="dxa" w:w="2500"/>
-            <w:tcBorders>
-              <w:top w:val="single" w:color="BFBFBF" w:sz="4"/>
-              <w:left w:val="single" w:color="BFBFBF" w:sz="4"/>
-              <w:bottom w:val="single" w:color="BFBFBF" w:sz="4"/>
-              <w:right w:val="single" w:color="BFBFBF" w:sz="4"/>
-            </w:tcBorders>
-            <w:shd w:fill="002350" w:color="auto" w:val="clear"/>
-            <w:tcMar>
-              <w:top w:type="dxa" w:w="60"/>
-              <w:left w:type="dxa" w:w="100"/>
-              <w:bottom w:type="dxa" w:w="40"/>
-              <w:right w:type="dxa" w:w="100"/>
-            </w:tcMar>
-          </w:tcPr>
-          <w:p>
-            <w:pPr>
-              <w:keepNext/>
-              <w:spacing w:after="40" w:line="240"/>
-            </w:pPr>
-            <w:r>
-              <w:rPr>
-                <w:rFonts w:ascii="Verdana" w:cs="Verdana" w:eastAsia="Verdana" w:hAnsi="Verdana"/>
-                <w:b/>
-                <w:bCs/>
-                <w:color w:val="FFFFFF"/>
-                <w:sz w:val="15"/>
-                <w:szCs w:val="15"/>
-              </w:rPr>
-              <w:t xml:space="preserve">Force</w:t>
-            </w:r>
-          </w:p>
-        </w:tc>
-        <w:tc>
-          <w:tcPr>
-            <w:tcW w:type="dxa" w:w="6572"/>
-            <w:tcBorders>
-              <w:top w:val="single" w:color="BFBFBF" w:sz="4"/>
-              <w:left w:val="single" w:color="BFBFBF" w:sz="4"/>
-              <w:bottom w:val="single" w:color="BFBFBF" w:sz="4"/>
-              <w:right w:val="single" w:color="BFBFBF" w:sz="4"/>
-            </w:tcBorders>
-            <w:shd w:fill="002350" w:color="auto" w:val="clear"/>
-            <w:tcMar>
-              <w:top w:type="dxa" w:w="60"/>
-              <w:left w:type="dxa" w:w="100"/>
-              <w:bottom w:type="dxa" w:w="40"/>
-              <w:right w:type="dxa" w:w="100"/>
-            </w:tcMar>
-          </w:tcPr>
-          <w:p>
-            <w:pPr>
-              <w:keepNext/>
-              <w:spacing w:after="40" w:line="240"/>
-            </w:pPr>
-            <w:r>
-              <w:rPr>
-                <w:rFonts w:ascii="Verdana" w:cs="Verdana" w:eastAsia="Verdana" w:hAnsi="Verdana"/>
-                <w:b/>
-                <w:bCs/>
-                <w:color w:val="FFFFFF"/>
-                <w:sz w:val="15"/>
-                <w:szCs w:val="15"/>
-              </w:rPr>
-              <w:t xml:space="preserve">Questions to ask</w:t>
-            </w:r>
-          </w:p>
-        </w:tc>
-      </w:tr>
-      <w:tr>
-        <w:trPr>
-          <w:cantSplit/>
-        </w:trPr>
-        <w:tc>
-          <w:tcPr>
-            <w:tcW w:type="dxa" w:w="2500"/>
-            <w:tcBorders>
-              <w:top w:val="single" w:color="BFBFBF" w:sz="4"/>
-              <w:left w:val="single" w:color="BFBFBF" w:sz="4"/>
-              <w:bottom w:val="single" w:color="BFBFBF" w:sz="4"/>
-              <w:right w:val="single" w:color="BFBFBF" w:sz="4"/>
-            </w:tcBorders>
-            <w:tcMar>
-              <w:top w:type="dxa" w:w="60"/>
-              <w:left w:type="dxa" w:w="100"/>
-              <w:bottom w:type="dxa" w:w="40"/>
-              <w:right w:type="dxa" w:w="100"/>
-            </w:tcMar>
-          </w:tcPr>
-          <w:p>
-            <w:pPr>
-              <w:keepNext/>
-              <w:spacing w:after="40" w:line="240"/>
-            </w:pPr>
-            <w:r>
-              <w:rPr>
-                <w:rFonts w:ascii="Verdana" w:cs="Verdana" w:eastAsia="Verdana" w:hAnsi="Verdana"/>
-                <w:b/>
-                <w:bCs/>
-                <w:sz w:val="15"/>
-                <w:szCs w:val="15"/>
-              </w:rPr>
-              <w:t xml:space="preserve">Threat of new entrants</w:t>
-            </w:r>
-          </w:p>
-        </w:tc>
-        <w:tc>
-          <w:tcPr>
-            <w:tcW w:type="dxa" w:w="6572"/>
-            <w:tcBorders>
-              <w:top w:val="single" w:color="BFBFBF" w:sz="4"/>
-              <w:left w:val="single" w:color="BFBFBF" w:sz="4"/>
-              <w:bottom w:val="single" w:color="BFBFBF" w:sz="4"/>
-              <w:right w:val="single" w:color="BFBFBF" w:sz="4"/>
-            </w:tcBorders>
-            <w:tcMar>
-              <w:top w:type="dxa" w:w="60"/>
-              <w:left w:type="dxa" w:w="100"/>
-              <w:bottom w:type="dxa" w:w="40"/>
-              <w:right w:type="dxa" w:w="100"/>
-            </w:tcMar>
-          </w:tcPr>
-          <w:p>
-            <w:pPr>
-              <w:keepNext/>
-              <w:spacing w:after="40" w:line="240"/>
-            </w:pPr>
-            <w:r>
-              <w:rPr>
-                <w:rFonts w:ascii="Verdana" w:cs="Verdana" w:eastAsia="Verdana" w:hAnsi="Verdana"/>
-                <w:sz w:val="15"/>
-                <w:szCs w:val="15"/>
-              </w:rPr>
-              <w:t xml:space="preserve">Entry barriers: tariffs, certification, access to distribution, cost of building a brand, scale advantages of local roasters</w:t>
-            </w:r>
-          </w:p>
-        </w:tc>
-      </w:tr>
-      <w:tr>
-        <w:trPr>
-          <w:cantSplit/>
-        </w:trPr>
-        <w:tc>
-          <w:tcPr>
-            <w:tcW w:type="dxa" w:w="2500"/>
-            <w:tcBorders>
-              <w:top w:val="single" w:color="BFBFBF" w:sz="4"/>
-              <w:left w:val="single" w:color="BFBFBF" w:sz="4"/>
-              <w:bottom w:val="single" w:color="BFBFBF" w:sz="4"/>
-              <w:right w:val="single" w:color="BFBFBF" w:sz="4"/>
-            </w:tcBorders>
-            <w:shd w:fill="F2F2F2" w:color="auto" w:val="clear"/>
-            <w:tcMar>
-              <w:top w:type="dxa" w:w="60"/>
-              <w:left w:type="dxa" w:w="100"/>
-              <w:bottom w:type="dxa" w:w="40"/>
-              <w:right w:type="dxa" w:w="100"/>
-            </w:tcMar>
-          </w:tcPr>
-          <w:p>
-            <w:pPr>
-              <w:keepNext/>
-              <w:spacing w:after="40" w:line="240"/>
-            </w:pPr>
-            <w:r>
-              <w:rPr>
-                <w:rFonts w:ascii="Verdana" w:cs="Verdana" w:eastAsia="Verdana" w:hAnsi="Verdana"/>
-                <w:b/>
-                <w:bCs/>
-                <w:sz w:val="15"/>
-                <w:szCs w:val="15"/>
-              </w:rPr>
-              <w:t xml:space="preserve">Power of buyers</w:t>
-            </w:r>
-          </w:p>
-        </w:tc>
-        <w:tc>
-          <w:tcPr>
-            <w:tcW w:type="dxa" w:w="6572"/>
-            <w:tcBorders>
-              <w:top w:val="single" w:color="BFBFBF" w:sz="4"/>
-              <w:left w:val="single" w:color="BFBFBF" w:sz="4"/>
-              <w:bottom w:val="single" w:color="BFBFBF" w:sz="4"/>
-              <w:right w:val="single" w:color="BFBFBF" w:sz="4"/>
-            </w:tcBorders>
-            <w:shd w:fill="F2F2F2" w:color="auto" w:val="clear"/>
-            <w:tcMar>
-              <w:top w:type="dxa" w:w="60"/>
-              <w:left w:type="dxa" w:w="100"/>
-              <w:bottom w:type="dxa" w:w="40"/>
-              <w:right w:type="dxa" w:w="100"/>
-            </w:tcMar>
-          </w:tcPr>
-          <w:p>
-            <w:pPr>
-              <w:keepNext/>
-              <w:spacing w:after="40" w:line="240"/>
-            </w:pPr>
-            <w:r>
-              <w:rPr>
-                <w:rFonts w:ascii="Verdana" w:cs="Verdana" w:eastAsia="Verdana" w:hAnsi="Verdana"/>
-                <w:sz w:val="15"/>
-                <w:szCs w:val="15"/>
-              </w:rPr>
-              <w:t xml:space="preserve">Hotel groups, café chains, supermarket chains and importers: how concentrated and how price-driven are they?</w:t>
-            </w:r>
-          </w:p>
-        </w:tc>
-      </w:tr>
-      <w:tr>
-        <w:trPr>
-          <w:cantSplit/>
-        </w:trPr>
-        <w:tc>
-          <w:tcPr>
-            <w:tcW w:type="dxa" w:w="2500"/>
-            <w:tcBorders>
-              <w:top w:val="single" w:color="BFBFBF" w:sz="4"/>
-              <w:left w:val="single" w:color="BFBFBF" w:sz="4"/>
-              <w:bottom w:val="single" w:color="BFBFBF" w:sz="4"/>
-              <w:right w:val="single" w:color="BFBFBF" w:sz="4"/>
-            </w:tcBorders>
-            <w:tcMar>
-              <w:top w:type="dxa" w:w="60"/>
-              <w:left w:type="dxa" w:w="100"/>
-              <w:bottom w:type="dxa" w:w="40"/>
-              <w:right w:type="dxa" w:w="100"/>
-            </w:tcMar>
-          </w:tcPr>
-          <w:p>
-            <w:pPr>
-              <w:keepNext/>
-              <w:spacing w:after="40" w:line="240"/>
-            </w:pPr>
-            <w:r>
-              <w:rPr>
-                <w:rFonts w:ascii="Verdana" w:cs="Verdana" w:eastAsia="Verdana" w:hAnsi="Verdana"/>
-                <w:b/>
-                <w:bCs/>
-                <w:sz w:val="15"/>
-                <w:szCs w:val="15"/>
-              </w:rPr>
-              <w:t xml:space="preserve">Power of suppliers</w:t>
-            </w:r>
-          </w:p>
-        </w:tc>
-        <w:tc>
-          <w:tcPr>
-            <w:tcW w:type="dxa" w:w="6572"/>
-            <w:tcBorders>
-              <w:top w:val="single" w:color="BFBFBF" w:sz="4"/>
-              <w:left w:val="single" w:color="BFBFBF" w:sz="4"/>
-              <w:bottom w:val="single" w:color="BFBFBF" w:sz="4"/>
-              <w:right w:val="single" w:color="BFBFBF" w:sz="4"/>
-            </w:tcBorders>
-            <w:tcMar>
-              <w:top w:type="dxa" w:w="60"/>
-              <w:left w:type="dxa" w:w="100"/>
-              <w:bottom w:type="dxa" w:w="40"/>
-              <w:right w:type="dxa" w:w="100"/>
-            </w:tcMar>
-          </w:tcPr>
-          <w:p>
-            <w:pPr>
-              <w:keepNext/>
-              <w:spacing w:after="40" w:line="240"/>
-            </w:pPr>
-            <w:r>
-              <w:rPr>
-                <w:rFonts w:ascii="Verdana" w:cs="Verdana" w:eastAsia="Verdana" w:hAnsi="Verdana"/>
-                <w:sz w:val="15"/>
-                <w:szCs w:val="15"/>
-              </w:rPr>
-              <w:t xml:space="preserve">Green coffee, packaging and logistics; for local roasters, cheap domestic green coffee is an advantage over an importer</w:t>
-            </w:r>
-          </w:p>
-        </w:tc>
-      </w:tr>
-      <w:tr>
-        <w:trPr>
-          <w:cantSplit/>
-        </w:trPr>
-        <w:tc>
-          <w:tcPr>
-            <w:tcW w:type="dxa" w:w="2500"/>
-            <w:tcBorders>
-              <w:top w:val="single" w:color="BFBFBF" w:sz="4"/>
-              <w:left w:val="single" w:color="BFBFBF" w:sz="4"/>
-              <w:bottom w:val="single" w:color="BFBFBF" w:sz="4"/>
-              <w:right w:val="single" w:color="BFBFBF" w:sz="4"/>
-            </w:tcBorders>
-            <w:shd w:fill="F2F2F2" w:color="auto" w:val="clear"/>
-            <w:tcMar>
-              <w:top w:type="dxa" w:w="60"/>
-              <w:left w:type="dxa" w:w="100"/>
-              <w:bottom w:type="dxa" w:w="40"/>
-              <w:right w:type="dxa" w:w="100"/>
-            </w:tcMar>
-          </w:tcPr>
-          <w:p>
-            <w:pPr>
-              <w:keepNext/>
-              <w:spacing w:after="40" w:line="240"/>
-            </w:pPr>
-            <w:r>
-              <w:rPr>
-                <w:rFonts w:ascii="Verdana" w:cs="Verdana" w:eastAsia="Verdana" w:hAnsi="Verdana"/>
-                <w:b/>
-                <w:bCs/>
-                <w:sz w:val="15"/>
-                <w:szCs w:val="15"/>
-              </w:rPr>
-              <w:t xml:space="preserve">Threat of substitutes</w:t>
-            </w:r>
-          </w:p>
-        </w:tc>
-        <w:tc>
-          <w:tcPr>
-            <w:tcW w:type="dxa" w:w="6572"/>
-            <w:tcBorders>
-              <w:top w:val="single" w:color="BFBFBF" w:sz="4"/>
-              <w:left w:val="single" w:color="BFBFBF" w:sz="4"/>
-              <w:bottom w:val="single" w:color="BFBFBF" w:sz="4"/>
-              <w:right w:val="single" w:color="BFBFBF" w:sz="4"/>
-            </w:tcBorders>
-            <w:shd w:fill="F2F2F2" w:color="auto" w:val="clear"/>
-            <w:tcMar>
-              <w:top w:type="dxa" w:w="60"/>
-              <w:left w:type="dxa" w:w="100"/>
-              <w:bottom w:type="dxa" w:w="40"/>
-              <w:right w:type="dxa" w:w="100"/>
-            </w:tcMar>
-          </w:tcPr>
-          <w:p>
-            <w:pPr>
-              <w:keepNext/>
-              <w:spacing w:after="40" w:line="240"/>
-            </w:pPr>
-            <w:r>
-              <w:rPr>
-                <w:rFonts w:ascii="Verdana" w:cs="Verdana" w:eastAsia="Verdana" w:hAnsi="Verdana"/>
-                <w:sz w:val="15"/>
-                <w:szCs w:val="15"/>
-              </w:rPr>
-              <w:t xml:space="preserve">Tea and other drinks, capsule and home coffee, ready-to-drink coffee</w:t>
-            </w:r>
-          </w:p>
-        </w:tc>
-      </w:tr>
-      <w:tr>
-        <w:trPr>
-          <w:cantSplit/>
-        </w:trPr>
-        <w:tc>
-          <w:tcPr>
-            <w:tcW w:type="dxa" w:w="2500"/>
-            <w:tcBorders>
-              <w:top w:val="single" w:color="BFBFBF" w:sz="4"/>
-              <w:left w:val="single" w:color="BFBFBF" w:sz="4"/>
-              <w:bottom w:val="single" w:color="BFBFBF" w:sz="4"/>
-              <w:right w:val="single" w:color="BFBFBF" w:sz="4"/>
-            </w:tcBorders>
-            <w:tcMar>
-              <w:top w:type="dxa" w:w="60"/>
-              <w:left w:type="dxa" w:w="100"/>
-              <w:bottom w:type="dxa" w:w="40"/>
-              <w:right w:type="dxa" w:w="100"/>
-            </w:tcMar>
-          </w:tcPr>
-          <w:p>
-            <w:pPr>
-              <w:keepNext w:val="false"/>
-              <w:spacing w:after="40" w:line="240"/>
-            </w:pPr>
-            <w:r>
-              <w:rPr>
-                <w:rFonts w:ascii="Verdana" w:cs="Verdana" w:eastAsia="Verdana" w:hAnsi="Verdana"/>
-                <w:b/>
-                <w:bCs/>
-                <w:sz w:val="15"/>
-                <w:szCs w:val="15"/>
-              </w:rPr>
-              <w:t xml:space="preserve">Rivalry</w:t>
-            </w:r>
-          </w:p>
-        </w:tc>
-        <w:tc>
-          <w:tcPr>
-            <w:tcW w:type="dxa" w:w="6572"/>
-            <w:tcBorders>
-              <w:top w:val="single" w:color="BFBFBF" w:sz="4"/>
-              <w:left w:val="single" w:color="BFBFBF" w:sz="4"/>
-              <w:bottom w:val="single" w:color="BFBFBF" w:sz="4"/>
-              <w:right w:val="single" w:color="BFBFBF" w:sz="4"/>
-            </w:tcBorders>
-            <w:tcMar>
-              <w:top w:type="dxa" w:w="60"/>
-              <w:left w:type="dxa" w:w="100"/>
-              <w:bottom w:type="dxa" w:w="40"/>
-              <w:right w:type="dxa" w:w="100"/>
-            </w:tcMar>
-          </w:tcPr>
-          <w:p>
-            <w:pPr>
-              <w:keepNext w:val="false"/>
-              <w:spacing w:after="40" w:line="240"/>
-            </w:pPr>
-            <w:r>
-              <w:rPr>
-                <w:rFonts w:ascii="Verdana" w:cs="Verdana" w:eastAsia="Verdana" w:hAnsi="Verdana"/>
-                <w:sz w:val="15"/>
-                <w:szCs w:val="15"/>
-              </w:rPr>
-              <w:t xml:space="preserve">Number and strength of premium players, price competition, market growth, how easily customers switch</w:t>
-            </w:r>
-          </w:p>
-        </w:tc>
-      </w:tr>
-    </w:tbl>
-    <w:p>
-      <w:pPr>
-        <w:spacing w:after="120" w:before="100" w:line="252"/>
+        <w:t xml:space="preserve">Sources.</w:t>
+      </w:r>
+      <w:r>
+        <w:rPr>
+          <w:rFonts w:ascii="Verdana" w:cs="Verdana" w:eastAsia="Verdana" w:hAnsi="Verdana"/>
+          <w:sz w:val="19"/>
+          <w:szCs w:val="19"/>
+        </w:rPr>
+        <w:t xml:space="preserve"> USDA Foreign Agricultural Service annual coffee reports and International Coffee Organization statistics; Euromonitor Passport and Statista (WU library); UN Comtrade and ITC Trade Map for coffee trade (HS 0901); WKO AUSSENWIRTSCHAFT country reports; EU Access2Markets. A short online scan of brands and prices (cafés, supermarkets, online shops, hotels) gives evidence for the industry structure and also feeds your Part A indicator "competitive landscape". Record each observation with brand, channel, product, price and unit, URL and date.</w:t>
+      </w:r>
+    </w:p>
+    <w:p>
+      <w:pPr>
+        <w:spacing w:after="120" w:before="0" w:line="252"/>
       </w:pPr>
       <w:r>
         <w:rPr>
@@ -7768,29 +7073,6 @@
           <w:sz w:val="19"/>
           <w:szCs w:val="19"/>
         </w:rPr>
-        <w:t xml:space="preserve">Sources.</w:t>
-      </w:r>
-      <w:r>
-        <w:rPr>
-          <w:rFonts w:ascii="Verdana" w:cs="Verdana" w:eastAsia="Verdana" w:hAnsi="Verdana"/>
-          <w:sz w:val="19"/>
-          <w:szCs w:val="19"/>
-        </w:rPr>
-        <w:t xml:space="preserve"> USDA Foreign Agricultural Service annual coffee reports and International Coffee Organization statistics; Euromonitor Passport and Statista (WU library); UN Comtrade and ITC Trade Map for coffee trade (HS 0901); WKO AUSSENWIRTSCHAFT country reports; EU Access2Markets. A short online scan of brands and prices (cafés, supermarkets, online shops, hotels) gives evidence for the industry structure and also feeds your Part A indicator "competitive landscape". Record each observation with brand, channel, product, price and unit, URL and date.</w:t>
-      </w:r>
-    </w:p>
-    <w:p>
-      <w:pPr>
-        <w:spacing w:after="120" w:before="0" w:line="252"/>
-      </w:pPr>
-      <w:r>
-        <w:rPr>
-          <w:rFonts w:ascii="Verdana" w:cs="Verdana" w:eastAsia="Verdana" w:hAnsi="Verdana"/>
-          <w:b/>
-          <w:bCs/>
-          <w:sz w:val="19"/>
-          <w:szCs w:val="19"/>
-        </w:rPr>
         <w:t xml:space="preserve">Hand in:</w:t>
       </w:r>
       <w:r>
@@ -7799,7 +7081,7 @@
           <w:sz w:val="19"/>
           <w:szCs w:val="19"/>
         </w:rPr>
-        <w:t xml:space="preserve"> the industry sheet in Excel (data, value-chain notes, five-forces ratings with evidence) and one or two slides: an industry snapshot (size, structure, value chain) and the five-forces summary. Close with the implication for Julius Meinl: where is there room for a Viennese coffee house brand, and where is none?</w:t>
+        <w:t xml:space="preserve"> the industry sheet in Excel (data, value-chain notes, industry structure, sources) and one or two slides: an industry snapshot (size, growth, structure, value chain) and the main trends. Close with the implication for Julius Meinl: where is there room for a Viennese coffee house brand, and where is none?</w:t>
       </w:r>
     </w:p>
     <w:p>
@@ -8151,7 +7433,7 @@
                 <w:sz w:val="16"/>
                 <w:szCs w:val="16"/>
               </w:rPr>
-              <w:t xml:space="preserve">The 14 common indicators grouped by PESTEL, with unit, direction and source</w:t>
+              <w:t xml:space="preserve">The 45 common indicators grouped by PESTEL, with unit, direction and source</w:t>
             </w:r>
           </w:p>
         </w:tc>
@@ -8457,7 +7739,7 @@
           <w:sz w:val="19"/>
           <w:szCs w:val="19"/>
         </w:rPr>
-        <w:t xml:space="preserve"> (hand-in): a short workbook with (1) a copy of your country's data and sources, (2) the Part B industry sheet (data, value-chain notes, five-forces ratings with evidence, brand and price scan) and (3) a list of the AI tools you used. Sources need URL, date accessed and who collected the data. Results come from formulas, not pasted values; inputs and formulas are visibly different.</w:t>
+        <w:t xml:space="preserve"> (hand-in): a short workbook with (1) a copy of your country's data and sources, (2) the Part B industry sheet (data, value-chain notes, industry structure, brand and price scan) and (3) a list of the AI tools you used. Sources need URL, date accessed and who collected the data. Results come from formulas, not pasted values; inputs and formulas are visibly different.</w:t>
       </w:r>
     </w:p>
     <w:p>
@@ -10245,7 +9527,7 @@
       <w:pPr>
         <w:spacing w:after="140"/>
       </w:pPr>
-      <w:hyperlink w:history="1" r:id="rIddoc4qq4pqo0nv_x3khmjx">
+      <w:hyperlink w:history="1" r:id="rIdt9iob8rebj2l9ukr1qjkz">
         <w:r>
           <w:rPr>
             <w:rStyle w:val="Hyperlink"/>
@@ -10286,18 +9568,18 @@
       <w:r>
         <w:rPr>
           <w:rFonts w:ascii="Verdana" w:cs="Verdana" w:eastAsia="Verdana" w:hAnsi="Verdana"/>
-          <w:sz w:val="15"/>
-          <w:szCs w:val="15"/>
+          <w:sz w:val="14"/>
+          <w:szCs w:val="14"/>
         </w:rPr>
         <w:t xml:space="preserve">JRC: 10-step pocket guide to composite indicators (free): </w:t>
       </w:r>
-      <w:hyperlink w:history="1" r:id="rIdb-_meedf8vmtxyri1hcso">
+      <w:hyperlink w:history="1" r:id="rId5ssrum1dsklfizwld_xbm">
         <w:r>
           <w:rPr>
             <w:rStyle w:val="Hyperlink"/>
             <w:rFonts w:ascii="Verdana" w:cs="Verdana" w:eastAsia="Verdana" w:hAnsi="Verdana"/>
-            <w:sz w:val="13"/>
-            <w:szCs w:val="13"/>
+            <w:sz w:val="12"/>
+            <w:szCs w:val="12"/>
           </w:rPr>
           <w:t xml:space="preserve">https://knowledge4policy.ec.europa.eu/composite-indicators/toolkit_en/your-10-step-pocket-guide-composite-indicators-scoreboards_en</w:t>
         </w:r>
@@ -10315,18 +9597,18 @@
       <w:r>
         <w:rPr>
           <w:rFonts w:ascii="Verdana" w:cs="Verdana" w:eastAsia="Verdana" w:hAnsi="Verdana"/>
-          <w:sz w:val="15"/>
-          <w:szCs w:val="15"/>
+          <w:sz w:val="14"/>
+          <w:szCs w:val="14"/>
         </w:rPr>
         <w:t xml:space="preserve">OECD/JRC: Handbook on constructing composite indicators (free): </w:t>
       </w:r>
-      <w:hyperlink w:history="1" r:id="rIddo4afqffvaqk_9lv-qtii">
+      <w:hyperlink w:history="1" r:id="rIdptrifg17thd4cfwjcrz9n">
         <w:r>
           <w:rPr>
             <w:rStyle w:val="Hyperlink"/>
             <w:rFonts w:ascii="Verdana" w:cs="Verdana" w:eastAsia="Verdana" w:hAnsi="Verdana"/>
-            <w:sz w:val="13"/>
-            <w:szCs w:val="13"/>
+            <w:sz w:val="12"/>
+            <w:szCs w:val="12"/>
           </w:rPr>
           <w:t xml:space="preserve">https://doi.org/10.1787/9789264043466-en</w:t>
         </w:r>
@@ -10344,18 +9626,18 @@
       <w:r>
         <w:rPr>
           <w:rFonts w:ascii="Verdana" w:cs="Verdana" w:eastAsia="Verdana" w:hAnsi="Verdana"/>
-          <w:sz w:val="15"/>
-          <w:szCs w:val="15"/>
+          <w:sz w:val="14"/>
+          <w:szCs w:val="14"/>
         </w:rPr>
         <w:t xml:space="preserve">Greco et al. (2019): weighting and aggregation in composite indices (open access): </w:t>
       </w:r>
-      <w:hyperlink w:history="1" r:id="rIdy5aj0suwhebqx-wxexwcd">
+      <w:hyperlink w:history="1" r:id="rIdoe3skiusspiwlnt1kclte">
         <w:r>
           <w:rPr>
             <w:rStyle w:val="Hyperlink"/>
             <w:rFonts w:ascii="Verdana" w:cs="Verdana" w:eastAsia="Verdana" w:hAnsi="Verdana"/>
-            <w:sz w:val="13"/>
-            <w:szCs w:val="13"/>
+            <w:sz w:val="12"/>
+            <w:szCs w:val="12"/>
           </w:rPr>
           <w:t xml:space="preserve">https://doi.org/10.1007/s11205-017-1832-9</w:t>
         </w:r>
@@ -10373,18 +9655,18 @@
       <w:r>
         <w:rPr>
           <w:rFonts w:ascii="Verdana" w:cs="Verdana" w:eastAsia="Verdana" w:hAnsi="Verdana"/>
-          <w:sz w:val="15"/>
-          <w:szCs w:val="15"/>
+          <w:sz w:val="14"/>
+          <w:szCs w:val="14"/>
         </w:rPr>
         <w:t xml:space="preserve">BPMSG: AHP Excel template (free): </w:t>
       </w:r>
-      <w:hyperlink w:history="1" r:id="rIdfakcgxygyisnsjhmc7gx1">
+      <w:hyperlink w:history="1" r:id="rIdomhbqqouf_fu9q4apthio">
         <w:r>
           <w:rPr>
             <w:rStyle w:val="Hyperlink"/>
             <w:rFonts w:ascii="Verdana" w:cs="Verdana" w:eastAsia="Verdana" w:hAnsi="Verdana"/>
-            <w:sz w:val="13"/>
-            <w:szCs w:val="13"/>
+            <w:sz w:val="12"/>
+            <w:szCs w:val="12"/>
           </w:rPr>
           <w:t xml:space="preserve">https://bpmsg.com/new-ahp-excel-template-with-multiple-inputs/</w:t>
         </w:r>
@@ -10402,18 +9684,18 @@
       <w:r>
         <w:rPr>
           <w:rFonts w:ascii="Verdana" w:cs="Verdana" w:eastAsia="Verdana" w:hAnsi="Verdana"/>
-          <w:sz w:val="15"/>
-          <w:szCs w:val="15"/>
+          <w:sz w:val="14"/>
+          <w:szCs w:val="14"/>
         </w:rPr>
         <w:t xml:space="preserve">Best-Worst Method solvers (free): </w:t>
       </w:r>
-      <w:hyperlink w:history="1" r:id="rIdpn1af7jvqwfxyaatbfyfx">
+      <w:hyperlink w:history="1" r:id="rIdqhnavvr4tfi6k0lgumthz">
         <w:r>
           <w:rPr>
             <w:rStyle w:val="Hyperlink"/>
             <w:rFonts w:ascii="Verdana" w:cs="Verdana" w:eastAsia="Verdana" w:hAnsi="Verdana"/>
-            <w:sz w:val="13"/>
-            <w:szCs w:val="13"/>
+            <w:sz w:val="12"/>
+            <w:szCs w:val="12"/>
           </w:rPr>
           <w:t xml:space="preserve">https://bestworstmethod.com/</w:t>
         </w:r>
@@ -10431,18 +9713,18 @@
       <w:r>
         <w:rPr>
           <w:rFonts w:ascii="Verdana" w:cs="Verdana" w:eastAsia="Verdana" w:hAnsi="Verdana"/>
-          <w:sz w:val="15"/>
-          <w:szCs w:val="15"/>
+          <w:sz w:val="14"/>
+          <w:szCs w:val="14"/>
         </w:rPr>
         <w:t xml:space="preserve">JRC COIN Tool, Excel composite indicators (free): </w:t>
       </w:r>
-      <w:hyperlink w:history="1" r:id="rIddebmioacxkini6yvl98kl">
+      <w:hyperlink w:history="1" r:id="rIdytih1g2zayvls5ypu2tnf">
         <w:r>
           <w:rPr>
             <w:rStyle w:val="Hyperlink"/>
             <w:rFonts w:ascii="Verdana" w:cs="Verdana" w:eastAsia="Verdana" w:hAnsi="Verdana"/>
-            <w:sz w:val="13"/>
-            <w:szCs w:val="13"/>
+            <w:sz w:val="12"/>
+            <w:szCs w:val="12"/>
           </w:rPr>
           <w:t xml:space="preserve">https://knowledge4policy.ec.europa.eu/composite-indicators/coin-tool_en</w:t>
         </w:r>
@@ -10477,18 +9759,18 @@
       <w:r>
         <w:rPr>
           <w:rFonts w:ascii="Verdana" w:cs="Verdana" w:eastAsia="Verdana" w:hAnsi="Verdana"/>
-          <w:sz w:val="15"/>
-          <w:szCs w:val="15"/>
+          <w:sz w:val="14"/>
+          <w:szCs w:val="14"/>
         </w:rPr>
         <w:t xml:space="preserve">globalEDGE Market Potential Index: eight dimensions with published weights (25, 15, 12.5, 12.5, 10, 10, 7.5, 7.5): </w:t>
       </w:r>
-      <w:hyperlink w:history="1" r:id="rIdgq1nchm1xqipagyziqy0k">
+      <w:hyperlink w:history="1" r:id="rIdk5msak34zwiuqvevtmyev">
         <w:r>
           <w:rPr>
             <w:rStyle w:val="Hyperlink"/>
             <w:rFonts w:ascii="Verdana" w:cs="Verdana" w:eastAsia="Verdana" w:hAnsi="Verdana"/>
-            <w:sz w:val="13"/>
-            <w:szCs w:val="13"/>
+            <w:sz w:val="12"/>
+            <w:szCs w:val="12"/>
           </w:rPr>
           <w:t xml:space="preserve">https://globaledge.msu.edu/mpi</w:t>
         </w:r>
@@ -10506,18 +9788,18 @@
       <w:r>
         <w:rPr>
           <w:rFonts w:ascii="Verdana" w:cs="Verdana" w:eastAsia="Verdana" w:hAnsi="Verdana"/>
-          <w:sz w:val="15"/>
-          <w:szCs w:val="15"/>
+          <w:sz w:val="14"/>
+          <w:szCs w:val="14"/>
         </w:rPr>
         <w:t xml:space="preserve">Cavusgil (1997): measuring the potential of emerging markets (WU library): </w:t>
       </w:r>
-      <w:hyperlink w:history="1" r:id="rIdndmtijvrehblckjnfeia-">
+      <w:hyperlink w:history="1" r:id="rId1qxyhmt1sg9pupfp87mlg">
         <w:r>
           <w:rPr>
             <w:rStyle w:val="Hyperlink"/>
             <w:rFonts w:ascii="Verdana" w:cs="Verdana" w:eastAsia="Verdana" w:hAnsi="Verdana"/>
-            <w:sz w:val="13"/>
-            <w:szCs w:val="13"/>
+            <w:sz w:val="12"/>
+            <w:szCs w:val="12"/>
           </w:rPr>
           <w:t xml:space="preserve">https://doi.org/10.1016/S0007-6813%2897%2990030-6</w:t>
         </w:r>
@@ -10535,18 +9817,18 @@
       <w:r>
         <w:rPr>
           <w:rFonts w:ascii="Verdana" w:cs="Verdana" w:eastAsia="Verdana" w:hAnsi="Verdana"/>
-          <w:sz w:val="15"/>
-          <w:szCs w:val="15"/>
+          <w:sz w:val="14"/>
+          <w:szCs w:val="14"/>
         </w:rPr>
         <w:t xml:space="preserve">Ghemawat (2001): Distance still matters, the CAGE framework (WU library): </w:t>
       </w:r>
-      <w:hyperlink w:history="1" r:id="rId0ptlofnr6emxobjs0zwcb">
+      <w:hyperlink w:history="1" r:id="rIdvqh6kvy3wmbhzpkghhstc">
         <w:r>
           <w:rPr>
             <w:rStyle w:val="Hyperlink"/>
             <w:rFonts w:ascii="Verdana" w:cs="Verdana" w:eastAsia="Verdana" w:hAnsi="Verdana"/>
-            <w:sz w:val="13"/>
-            <w:szCs w:val="13"/>
+            <w:sz w:val="12"/>
+            <w:szCs w:val="12"/>
           </w:rPr>
           <w:t xml:space="preserve">https://hbr.org/2001/09/distance-still-matters-the-hard-reality-of-global-expansion</w:t>
         </w:r>
@@ -10564,18 +9846,18 @@
       <w:r>
         <w:rPr>
           <w:rFonts w:ascii="Verdana" w:cs="Verdana" w:eastAsia="Verdana" w:hAnsi="Verdana"/>
-          <w:sz w:val="15"/>
-          <w:szCs w:val="15"/>
+          <w:sz w:val="14"/>
+          <w:szCs w:val="14"/>
         </w:rPr>
         <w:t xml:space="preserve">Musso and Francioni: how smaller firms select foreign markets (open access): </w:t>
       </w:r>
-      <w:hyperlink w:history="1" r:id="rIdjagnfpztt3d9ukyeb4qvi">
+      <w:hyperlink w:history="1" r:id="rIdld0s4tgmyg4cbzc0pqn37">
         <w:r>
           <w:rPr>
             <w:rStyle w:val="Hyperlink"/>
             <w:rFonts w:ascii="Verdana" w:cs="Verdana" w:eastAsia="Verdana" w:hAnsi="Verdana"/>
-            <w:sz w:val="13"/>
-            <w:szCs w:val="13"/>
+            <w:sz w:val="12"/>
+            <w:szCs w:val="12"/>
           </w:rPr>
           <w:t xml:space="preserve">https://doi.org/10.5539/ijms.v4n6p44</w:t>
         </w:r>
@@ -10593,18 +9875,18 @@
       <w:r>
         <w:rPr>
           <w:rFonts w:ascii="Verdana" w:cs="Verdana" w:eastAsia="Verdana" w:hAnsi="Verdana"/>
-          <w:sz w:val="15"/>
-          <w:szCs w:val="15"/>
+          <w:sz w:val="14"/>
+          <w:szCs w:val="14"/>
         </w:rPr>
         <w:t xml:space="preserve">Pollesch and Dale (2016): normalisation choices (WU library): </w:t>
       </w:r>
-      <w:hyperlink w:history="1" r:id="rIdsanky7w2vn6vebcvlper6">
+      <w:hyperlink w:history="1" r:id="rIdgvlrpjpitgm9sfhu91zwq">
         <w:r>
           <w:rPr>
             <w:rStyle w:val="Hyperlink"/>
             <w:rFonts w:ascii="Verdana" w:cs="Verdana" w:eastAsia="Verdana" w:hAnsi="Verdana"/>
-            <w:sz w:val="13"/>
-            <w:szCs w:val="13"/>
+            <w:sz w:val="12"/>
+            <w:szCs w:val="12"/>
           </w:rPr>
           <w:t xml:space="preserve">https://doi.org/10.1016/j.ecolecon.2016.06.018</w:t>
         </w:r>
@@ -10639,18 +9921,18 @@
       <w:r>
         <w:rPr>
           <w:rFonts w:ascii="Verdana" w:cs="Verdana" w:eastAsia="Verdana" w:hAnsi="Verdana"/>
-          <w:sz w:val="15"/>
-          <w:szCs w:val="15"/>
+          <w:sz w:val="14"/>
+          <w:szCs w:val="14"/>
         </w:rPr>
         <w:t xml:space="preserve">ITC Export Potential Map, methodology (free): </w:t>
       </w:r>
-      <w:hyperlink w:history="1" r:id="rIdylbhaktcrrv9tpcrsi0lp">
+      <w:hyperlink w:history="1" r:id="rIdvcwoaakfznrjrqrrcppbz">
         <w:r>
           <w:rPr>
             <w:rStyle w:val="Hyperlink"/>
             <w:rFonts w:ascii="Verdana" w:cs="Verdana" w:eastAsia="Verdana" w:hAnsi="Verdana"/>
-            <w:sz w:val="13"/>
-            <w:szCs w:val="13"/>
+            <w:sz w:val="12"/>
+            <w:szCs w:val="12"/>
           </w:rPr>
           <w:t xml:space="preserve">https://umbraco.exportpotential.intracen.org/media/cklh2pi5/epa-methodology_230627.pdf</w:t>
         </w:r>
@@ -10668,18 +9950,18 @@
       <w:r>
         <w:rPr>
           <w:rFonts w:ascii="Verdana" w:cs="Verdana" w:eastAsia="Verdana" w:hAnsi="Verdana"/>
-          <w:sz w:val="15"/>
-          <w:szCs w:val="15"/>
+          <w:sz w:val="14"/>
+          <w:szCs w:val="14"/>
         </w:rPr>
         <w:t xml:space="preserve">Kearney Global Retail Development Index (free): </w:t>
       </w:r>
-      <w:hyperlink w:history="1" r:id="rIdzzt-yqsj1wi0lcbnwonlc">
+      <w:hyperlink w:history="1" r:id="rIdbr6ntpmvah00vjrb8o_9l">
         <w:r>
           <w:rPr>
             <w:rStyle w:val="Hyperlink"/>
             <w:rFonts w:ascii="Verdana" w:cs="Verdana" w:eastAsia="Verdana" w:hAnsi="Verdana"/>
-            <w:sz w:val="13"/>
-            <w:szCs w:val="13"/>
+            <w:sz w:val="12"/>
+            <w:szCs w:val="12"/>
           </w:rPr>
           <w:t xml:space="preserve">https://www.kearney.com/industry/consumer-retail/global-retail-development-index</w:t>
         </w:r>
@@ -10697,18 +9979,18 @@
       <w:r>
         <w:rPr>
           <w:rFonts w:ascii="Verdana" w:cs="Verdana" w:eastAsia="Verdana" w:hAnsi="Verdana"/>
-          <w:sz w:val="15"/>
-          <w:szCs w:val="15"/>
+          <w:sz w:val="14"/>
+          <w:szCs w:val="14"/>
         </w:rPr>
         <w:t xml:space="preserve">Eurazeo: International Expansion Playbook (free): </w:t>
       </w:r>
-      <w:hyperlink w:history="1" r:id="rIdcqdnadyjzhup6qa2crxw5">
+      <w:hyperlink w:history="1" r:id="rIdlxoqwyeweokdxg8tzt7ax">
         <w:r>
           <w:rPr>
             <w:rStyle w:val="Hyperlink"/>
             <w:rFonts w:ascii="Verdana" w:cs="Verdana" w:eastAsia="Verdana" w:hAnsi="Verdana"/>
-            <w:sz w:val="13"/>
-            <w:szCs w:val="13"/>
+            <w:sz w:val="12"/>
+            <w:szCs w:val="12"/>
           </w:rPr>
           <w:t xml:space="preserve">https://www.eurazeo.com/sites/default/files/2023-10/Eurazeo-International-Expansion-Playbook-GROWTH.pdf</w:t>
         </w:r>
@@ -10726,18 +10008,18 @@
       <w:r>
         <w:rPr>
           <w:rFonts w:ascii="Verdana" w:cs="Verdana" w:eastAsia="Verdana" w:hAnsi="Verdana"/>
-          <w:sz w:val="15"/>
-          <w:szCs w:val="15"/>
+          <w:sz w:val="14"/>
+          <w:szCs w:val="14"/>
         </w:rPr>
         <w:t xml:space="preserve">Optional case about coffee: The Espresso Lane to Global Markets, illy (Ivey Publishing, paid): </w:t>
       </w:r>
-      <w:hyperlink w:history="1" r:id="rIdraptvgrctsvge2nqu21n5">
+      <w:hyperlink w:history="1" r:id="rIdwruljdrah7t4pnoc5o7f-">
         <w:r>
           <w:rPr>
             <w:rStyle w:val="Hyperlink"/>
             <w:rFonts w:ascii="Verdana" w:cs="Verdana" w:eastAsia="Verdana" w:hAnsi="Verdana"/>
-            <w:sz w:val="13"/>
-            <w:szCs w:val="13"/>
+            <w:sz w:val="12"/>
+            <w:szCs w:val="12"/>
           </w:rPr>
           <w:t xml:space="preserve">https://www.iveypublishing.ca/s/product/the-espresso-lane-to-global-markets/01t5c00000CwqzKAAR</w:t>
         </w:r>
@@ -10755,18 +10037,18 @@
       <w:r>
         <w:rPr>
           <w:rFonts w:ascii="Verdana" w:cs="Verdana" w:eastAsia="Verdana" w:hAnsi="Verdana"/>
-          <w:sz w:val="15"/>
-          <w:szCs w:val="15"/>
+          <w:sz w:val="14"/>
+          <w:szCs w:val="14"/>
         </w:rPr>
         <w:t xml:space="preserve">IFC PAYG Market Attractiveness Index, an Excel tool with user guide (free): </w:t>
       </w:r>
-      <w:hyperlink w:history="1" r:id="rIdx2s1ljtvjriufr1pzd-vc">
+      <w:hyperlink w:history="1" r:id="rIdey5woavfdo1gbriznoksb">
         <w:r>
           <w:rPr>
             <w:rStyle w:val="Hyperlink"/>
             <w:rFonts w:ascii="Verdana" w:cs="Verdana" w:eastAsia="Verdana" w:hAnsi="Verdana"/>
-            <w:sz w:val="13"/>
-            <w:szCs w:val="13"/>
+            <w:sz w:val="12"/>
+            <w:szCs w:val="12"/>
           </w:rPr>
           <w:t xml:space="preserve">https://www.lightingglobal.org/wp-content/uploads/2018/11/IFC-PAYG-market-attractiveness-index-USER-GUIDE-AND-DATA-1Oct2018.pdf</w:t>
         </w:r>
@@ -10801,18 +10083,18 @@
       <w:r>
         <w:rPr>
           <w:rFonts w:ascii="Verdana" w:cs="Verdana" w:eastAsia="Verdana" w:hAnsi="Verdana"/>
-          <w:sz w:val="15"/>
-          <w:szCs w:val="15"/>
+          <w:sz w:val="14"/>
+          <w:szCs w:val="14"/>
         </w:rPr>
         <w:t xml:space="preserve">World Bank World Development Indicators: </w:t>
       </w:r>
-      <w:hyperlink w:history="1" r:id="rIdz5e-heetqd3k615amagws">
+      <w:hyperlink w:history="1" r:id="rIdi_7couo44ufentky2qe5r">
         <w:r>
           <w:rPr>
             <w:rStyle w:val="Hyperlink"/>
             <w:rFonts w:ascii="Verdana" w:cs="Verdana" w:eastAsia="Verdana" w:hAnsi="Verdana"/>
-            <w:sz w:val="13"/>
-            <w:szCs w:val="13"/>
+            <w:sz w:val="12"/>
+            <w:szCs w:val="12"/>
           </w:rPr>
           <w:t xml:space="preserve">https://databank.worldbank.org/source/world-development-indicators</w:t>
         </w:r>
@@ -10830,18 +10112,18 @@
       <w:r>
         <w:rPr>
           <w:rFonts w:ascii="Verdana" w:cs="Verdana" w:eastAsia="Verdana" w:hAnsi="Verdana"/>
-          <w:sz w:val="15"/>
-          <w:szCs w:val="15"/>
+          <w:sz w:val="14"/>
+          <w:szCs w:val="14"/>
         </w:rPr>
         <w:t xml:space="preserve">IMF World Economic Outlook: </w:t>
       </w:r>
-      <w:hyperlink w:history="1" r:id="rIdpqwjsdrr02l4pz6rs93w5">
+      <w:hyperlink w:history="1" r:id="rId-edxiz84q2xpo3tqywg5z">
         <w:r>
           <w:rPr>
             <w:rStyle w:val="Hyperlink"/>
             <w:rFonts w:ascii="Verdana" w:cs="Verdana" w:eastAsia="Verdana" w:hAnsi="Verdana"/>
-            <w:sz w:val="13"/>
-            <w:szCs w:val="13"/>
+            <w:sz w:val="12"/>
+            <w:szCs w:val="12"/>
           </w:rPr>
           <w:t xml:space="preserve">https://data.imf.org/datasets/WEO</w:t>
         </w:r>
@@ -10859,18 +10141,18 @@
       <w:r>
         <w:rPr>
           <w:rFonts w:ascii="Verdana" w:cs="Verdana" w:eastAsia="Verdana" w:hAnsi="Verdana"/>
-          <w:sz w:val="15"/>
-          <w:szCs w:val="15"/>
+          <w:sz w:val="14"/>
+          <w:szCs w:val="14"/>
         </w:rPr>
         <w:t xml:space="preserve">World Bank Worldwide Governance Indicators: </w:t>
       </w:r>
-      <w:hyperlink w:history="1" r:id="rId7l-xewjqeyrlgtfpywy2z">
+      <w:hyperlink w:history="1" r:id="rIdgoyc3pf5u1qu7xchwsnkh">
         <w:r>
           <w:rPr>
             <w:rStyle w:val="Hyperlink"/>
             <w:rFonts w:ascii="Verdana" w:cs="Verdana" w:eastAsia="Verdana" w:hAnsi="Verdana"/>
-            <w:sz w:val="13"/>
-            <w:szCs w:val="13"/>
+            <w:sz w:val="12"/>
+            <w:szCs w:val="12"/>
           </w:rPr>
           <w:t xml:space="preserve">https://www.worldbank.org/en/publication/worldwide-governance-indicators</w:t>
         </w:r>
@@ -10888,18 +10170,18 @@
       <w:r>
         <w:rPr>
           <w:rFonts w:ascii="Verdana" w:cs="Verdana" w:eastAsia="Verdana" w:hAnsi="Verdana"/>
-          <w:sz w:val="15"/>
-          <w:szCs w:val="15"/>
+          <w:sz w:val="14"/>
+          <w:szCs w:val="14"/>
         </w:rPr>
         <w:t xml:space="preserve">EU Access2Markets (tariffs, requirements, rules of origin for EU exporters): </w:t>
       </w:r>
-      <w:hyperlink w:history="1" r:id="rIdy-gmticbdbjybb7oboaz8">
+      <w:hyperlink w:history="1" r:id="rIdtmsg0qse3wdikvopemda8">
         <w:r>
           <w:rPr>
             <w:rStyle w:val="Hyperlink"/>
             <w:rFonts w:ascii="Verdana" w:cs="Verdana" w:eastAsia="Verdana" w:hAnsi="Verdana"/>
-            <w:sz w:val="13"/>
-            <w:szCs w:val="13"/>
+            <w:sz w:val="12"/>
+            <w:szCs w:val="12"/>
           </w:rPr>
           <w:t xml:space="preserve">https://trade.ec.europa.eu/access-to-markets/en/content/what-access2markets-0</w:t>
         </w:r>
@@ -10917,18 +10199,18 @@
       <w:r>
         <w:rPr>
           <w:rFonts w:ascii="Verdana" w:cs="Verdana" w:eastAsia="Verdana" w:hAnsi="Verdana"/>
-          <w:sz w:val="15"/>
-          <w:szCs w:val="15"/>
+          <w:sz w:val="14"/>
+          <w:szCs w:val="14"/>
         </w:rPr>
         <w:t xml:space="preserve">WTO tariff and trade data: </w:t>
       </w:r>
-      <w:hyperlink w:history="1" r:id="rIdy6yotnmmehatulgv0qggx">
+      <w:hyperlink w:history="1" r:id="rIdf1d_yg77ry0oc69myac_6">
         <w:r>
           <w:rPr>
             <w:rStyle w:val="Hyperlink"/>
             <w:rFonts w:ascii="Verdana" w:cs="Verdana" w:eastAsia="Verdana" w:hAnsi="Verdana"/>
-            <w:sz w:val="13"/>
-            <w:szCs w:val="13"/>
+            <w:sz w:val="12"/>
+            <w:szCs w:val="12"/>
           </w:rPr>
           <w:t xml:space="preserve">https://stats.wto.org/</w:t>
         </w:r>
@@ -10946,18 +10228,18 @@
       <w:r>
         <w:rPr>
           <w:rFonts w:ascii="Verdana" w:cs="Verdana" w:eastAsia="Verdana" w:hAnsi="Verdana"/>
-          <w:sz w:val="15"/>
-          <w:szCs w:val="15"/>
+          <w:sz w:val="14"/>
+          <w:szCs w:val="14"/>
         </w:rPr>
         <w:t xml:space="preserve">CEPII Gravity database (distance, language; free login): </w:t>
       </w:r>
-      <w:hyperlink w:history="1" r:id="rIdc-3jffonmmaew3hcbg_ub">
+      <w:hyperlink w:history="1" r:id="rIdatawouo3l754zppt-mxih">
         <w:r>
           <w:rPr>
             <w:rStyle w:val="Hyperlink"/>
             <w:rFonts w:ascii="Verdana" w:cs="Verdana" w:eastAsia="Verdana" w:hAnsi="Verdana"/>
-            <w:sz w:val="13"/>
-            <w:szCs w:val="13"/>
+            <w:sz w:val="12"/>
+            <w:szCs w:val="12"/>
           </w:rPr>
           <w:t xml:space="preserve">https://www.cepii.fr/CEPII/en/bdd_modele/bdd_modele_item.asp?id=8</w:t>
         </w:r>
@@ -10975,18 +10257,18 @@
       <w:r>
         <w:rPr>
           <w:rFonts w:ascii="Verdana" w:cs="Verdana" w:eastAsia="Verdana" w:hAnsi="Verdana"/>
-          <w:sz w:val="15"/>
-          <w:szCs w:val="15"/>
+          <w:sz w:val="14"/>
+          <w:szCs w:val="14"/>
         </w:rPr>
         <w:t xml:space="preserve">Hofstede dimension data matrix: </w:t>
       </w:r>
-      <w:hyperlink w:history="1" r:id="rIdxqgoyvqn3bhto7spszjha">
+      <w:hyperlink w:history="1" r:id="rIdn06lu06yg6rhnvk3zef3w">
         <w:r>
           <w:rPr>
             <w:rStyle w:val="Hyperlink"/>
             <w:rFonts w:ascii="Verdana" w:cs="Verdana" w:eastAsia="Verdana" w:hAnsi="Verdana"/>
-            <w:sz w:val="13"/>
-            <w:szCs w:val="13"/>
+            <w:sz w:val="12"/>
+            <w:szCs w:val="12"/>
           </w:rPr>
           <w:t xml:space="preserve">https://geerthofstede.com/research-and-vsm/dimension-data-matrix/</w:t>
         </w:r>
@@ -11004,18 +10286,18 @@
       <w:r>
         <w:rPr>
           <w:rFonts w:ascii="Verdana" w:cs="Verdana" w:eastAsia="Verdana" w:hAnsi="Verdana"/>
-          <w:sz w:val="15"/>
-          <w:szCs w:val="15"/>
+          <w:sz w:val="14"/>
+          <w:szCs w:val="14"/>
         </w:rPr>
         <w:t xml:space="preserve">Coface country risk assessments: </w:t>
       </w:r>
-      <w:hyperlink w:history="1" r:id="rIdhqif7znm-lyvjeq32v87s">
+      <w:hyperlink w:history="1" r:id="rIdr-unemad0aygtgz6eysjc">
         <w:r>
           <w:rPr>
             <w:rStyle w:val="Hyperlink"/>
             <w:rFonts w:ascii="Verdana" w:cs="Verdana" w:eastAsia="Verdana" w:hAnsi="Verdana"/>
-            <w:sz w:val="13"/>
-            <w:szCs w:val="13"/>
+            <w:sz w:val="12"/>
+            <w:szCs w:val="12"/>
           </w:rPr>
           <w:t xml:space="preserve">https://www.coface.com/news-economy-and-insights/business-risk-dashboard/country-risk-files</w:t>
         </w:r>
@@ -11033,18 +10315,18 @@
       <w:r>
         <w:rPr>
           <w:rFonts w:ascii="Verdana" w:cs="Verdana" w:eastAsia="Verdana" w:hAnsi="Verdana"/>
-          <w:sz w:val="15"/>
-          <w:szCs w:val="15"/>
+          <w:sz w:val="14"/>
+          <w:szCs w:val="14"/>
         </w:rPr>
         <w:t xml:space="preserve">Euromonitor Passport and Statista (WU library; statista.com): </w:t>
       </w:r>
-      <w:hyperlink w:history="1" r:id="rIdaf_dfzzl-xll4qjniagak">
+      <w:hyperlink w:history="1" r:id="rIdtqcelezvn3c6f5fhyysix">
         <w:r>
           <w:rPr>
             <w:rStyle w:val="Hyperlink"/>
             <w:rFonts w:ascii="Verdana" w:cs="Verdana" w:eastAsia="Verdana" w:hAnsi="Verdana"/>
-            <w:sz w:val="13"/>
-            <w:szCs w:val="13"/>
+            <w:sz w:val="12"/>
+            <w:szCs w:val="12"/>
           </w:rPr>
           <w:t xml:space="preserve">https://www.euromonitor.com/our-expertise/passport</w:t>
         </w:r>
@@ -11062,18 +10344,18 @@
       <w:r>
         <w:rPr>
           <w:rFonts w:ascii="Verdana" w:cs="Verdana" w:eastAsia="Verdana" w:hAnsi="Verdana"/>
-          <w:sz w:val="15"/>
-          <w:szCs w:val="15"/>
+          <w:sz w:val="14"/>
+          <w:szCs w:val="14"/>
         </w:rPr>
         <w:t xml:space="preserve">International Coffee Organization: coffee statistics: </w:t>
       </w:r>
-      <w:hyperlink w:history="1" r:id="rIdzmp9qgkqa2syasyxw2y4h">
+      <w:hyperlink w:history="1" r:id="rIdodrgxke6ejugwhxegtowj">
         <w:r>
           <w:rPr>
             <w:rStyle w:val="Hyperlink"/>
             <w:rFonts w:ascii="Verdana" w:cs="Verdana" w:eastAsia="Verdana" w:hAnsi="Verdana"/>
-            <w:sz w:val="13"/>
-            <w:szCs w:val="13"/>
+            <w:sz w:val="12"/>
+            <w:szCs w:val="12"/>
           </w:rPr>
           <w:t xml:space="preserve">https://www.ico.org/</w:t>
         </w:r>
@@ -11091,18 +10373,18 @@
       <w:r>
         <w:rPr>
           <w:rFonts w:ascii="Verdana" w:cs="Verdana" w:eastAsia="Verdana" w:hAnsi="Verdana"/>
-          <w:sz w:val="15"/>
-          <w:szCs w:val="15"/>
+          <w:sz w:val="14"/>
+          <w:szCs w:val="14"/>
         </w:rPr>
         <w:t xml:space="preserve">USDA Foreign Agricultural Service: annual coffee reports by country (search for your countries): </w:t>
       </w:r>
-      <w:hyperlink w:history="1" r:id="rIdqyzmsfsbrbmunxwqssej2">
+      <w:hyperlink w:history="1" r:id="rIdudsgmdp0hm7sygqx1g_xl">
         <w:r>
           <w:rPr>
             <w:rStyle w:val="Hyperlink"/>
             <w:rFonts w:ascii="Verdana" w:cs="Verdana" w:eastAsia="Verdana" w:hAnsi="Verdana"/>
-            <w:sz w:val="13"/>
-            <w:szCs w:val="13"/>
+            <w:sz w:val="12"/>
+            <w:szCs w:val="12"/>
           </w:rPr>
           <w:t xml:space="preserve">https://www.fas.usda.gov/</w:t>
         </w:r>
@@ -11120,18 +10402,18 @@
       <w:r>
         <w:rPr>
           <w:rFonts w:ascii="Verdana" w:cs="Verdana" w:eastAsia="Verdana" w:hAnsi="Verdana"/>
-          <w:sz w:val="15"/>
-          <w:szCs w:val="15"/>
+          <w:sz w:val="14"/>
+          <w:szCs w:val="14"/>
         </w:rPr>
         <w:t xml:space="preserve">UN Comtrade (comtradeplus.un.org) and ITC Trade Map (free login): coffee trade flows and tariffs, HS 0901: </w:t>
       </w:r>
-      <w:hyperlink w:history="1" r:id="rIddrqs6m8tyij3cuewzgion">
+      <w:hyperlink w:history="1" r:id="rIdgq5_v1fxzxd8rfxbkjsbi">
         <w:r>
           <w:rPr>
             <w:rStyle w:val="Hyperlink"/>
             <w:rFonts w:ascii="Verdana" w:cs="Verdana" w:eastAsia="Verdana" w:hAnsi="Verdana"/>
-            <w:sz w:val="13"/>
-            <w:szCs w:val="13"/>
+            <w:sz w:val="12"/>
+            <w:szCs w:val="12"/>
           </w:rPr>
           <w:t xml:space="preserve">https://www.trademap.org/</w:t>
         </w:r>
@@ -11149,18 +10431,18 @@
       <w:r>
         <w:rPr>
           <w:rFonts w:ascii="Verdana" w:cs="Verdana" w:eastAsia="Verdana" w:hAnsi="Verdana"/>
-          <w:sz w:val="15"/>
-          <w:szCs w:val="15"/>
+          <w:sz w:val="14"/>
+          <w:szCs w:val="14"/>
         </w:rPr>
         <w:t xml:space="preserve">WKO AUSSENWIRTSCHAFT: reports and country profiles: </w:t>
       </w:r>
-      <w:hyperlink w:history="1" r:id="rIdtmbxx6eimlzjtirnwindr">
+      <w:hyperlink w:history="1" r:id="rIdujviokfgins12cidlsrdv">
         <w:r>
           <w:rPr>
             <w:rStyle w:val="Hyperlink"/>
             <w:rFonts w:ascii="Verdana" w:cs="Verdana" w:eastAsia="Verdana" w:hAnsi="Verdana"/>
-            <w:sz w:val="13"/>
-            <w:szCs w:val="13"/>
+            <w:sz w:val="12"/>
+            <w:szCs w:val="12"/>
           </w:rPr>
           <w:t xml:space="preserve">https://www.wko.at/aussenwirtschaft/berichte</w:t>
         </w:r>

</xml_diff>

<commit_message>
Part B: students search and present industry statistics by segment (hotels, restaurants, cafes, coffee stores, private end customers)
Co-Authored-By: Claude Sonnet 5.5 <noreply@anthropic.com>
Claude-Session: https://claude.ai/code/session_01RkWScMhuRmEB4zppSmB7Ri
</commit_message>
<xml_diff>
--- a/WT26-27/Student Brief Midterm Presentation WT26-27.docx
+++ b/WT26-27/Student Brief Midterm Presentation WT26-27.docx
@@ -1604,7 +1604,7 @@
           <w:sz w:val="19"/>
           <w:szCs w:val="19"/>
         </w:rPr>
-        <w:t xml:space="preserve"> A focused analysis of the coffee industry in one country, its structure and its attractiveness for a premium newcomer from Vienna, in your allocated country (see the allocation table). Section 8 describes the content.</w:t>
+        <w:t xml:space="preserve"> Search for statistics and facts on the coffee industry in your allocated country (hotels, restaurants, cafes, coffee stores and private end customers) and present them. Section 8 describes the content.</w:t>
       </w:r>
     </w:p>
     <w:p>
@@ -2319,7 +2319,7 @@
                 <w:sz w:val="16"/>
                 <w:szCs w:val="16"/>
               </w:rPr>
-              <w:t xml:space="preserve">Industry analysis of your country</w:t>
+              <w:t xml:space="preserve">Industry statistics of your country by segment</w:t>
             </w:r>
           </w:p>
         </w:tc>
@@ -6869,15 +6869,15 @@
     <w:p>
       <w:pPr>
         <w:keepNext/>
-        <w:spacing w:after="60" w:before="0" w:line="252"/>
-      </w:pPr>
-      <w:r>
-        <w:rPr>
-          <w:rFonts w:ascii="Verdana" w:cs="Verdana" w:eastAsia="Verdana" w:hAnsi="Verdana"/>
-          <w:sz w:val="19"/>
-          <w:szCs w:val="19"/>
-        </w:rPr>
-        <w:t xml:space="preserve">Part B looks at the </w:t>
+        <w:spacing w:after="80" w:before="0" w:line="252"/>
+      </w:pPr>
+      <w:r>
+        <w:rPr>
+          <w:rFonts w:ascii="Verdana" w:cs="Verdana" w:eastAsia="Verdana" w:hAnsi="Verdana"/>
+          <w:sz w:val="19"/>
+          <w:szCs w:val="19"/>
+        </w:rPr>
+        <w:t xml:space="preserve">Part B is about </w:t>
       </w:r>
       <w:r>
         <w:rPr>
@@ -6887,15 +6887,471 @@
           <w:sz w:val="19"/>
           <w:szCs w:val="19"/>
         </w:rPr>
-        <w:t xml:space="preserve">industry</w:t>
-      </w:r>
-      <w:r>
-        <w:rPr>
-          <w:rFonts w:ascii="Verdana" w:cs="Verdana" w:eastAsia="Verdana" w:hAnsi="Verdana"/>
-          <w:sz w:val="19"/>
-          <w:szCs w:val="19"/>
-        </w:rPr>
-        <w:t xml:space="preserve">, not at individual competitors: how is the coffee industry in one country structured, how attractive is it for a premium newcomer from Vienna, and what does that mean for Julius Meinl's entry? The country is the one allocated to your group in section 3. Focus on the segments Julius Meinl serves: premium coffee in hospitality (especially hotels) and in grocery retail. Cover five blocks:</w:t>
+        <w:t xml:space="preserve">facts and statistics</w:t>
+      </w:r>
+      <w:r>
+        <w:rPr>
+          <w:rFonts w:ascii="Verdana" w:cs="Verdana" w:eastAsia="Verdana" w:hAnsi="Verdana"/>
+          <w:sz w:val="19"/>
+          <w:szCs w:val="19"/>
+        </w:rPr>
+        <w:t xml:space="preserve">. Search for information and numbers on the coffee industry in your allocated country and present them, segment by segment, as an evidence base for Julius Meinl: how big is each segment, how is it structured, how is it developing, and what does that mean for a premium newcomer from Vienna? Focus on the customers of the segments Julius Meinl serves, plus private end customers:</w:t>
+      </w:r>
+    </w:p>
+    <w:tbl>
+      <w:tblPr>
+        <w:tblW w:type="dxa" w:w="9072"/>
+        <w:tblBorders>
+          <w:top w:val="single" w:color="auto" w:sz="4"/>
+          <w:left w:val="single" w:color="auto" w:sz="4"/>
+          <w:bottom w:val="single" w:color="auto" w:sz="4"/>
+          <w:right w:val="single" w:color="auto" w:sz="4"/>
+          <w:insideH w:val="single" w:color="auto" w:sz="4"/>
+          <w:insideV w:val="single" w:color="auto" w:sz="4"/>
+        </w:tblBorders>
+      </w:tblPr>
+      <w:tblGrid>
+        <w:gridCol w:w="2000"/>
+        <w:gridCol w:w="7072"/>
+      </w:tblGrid>
+      <w:tr>
+        <w:trPr>
+          <w:cantSplit/>
+          <w:tblHeader/>
+        </w:trPr>
+        <w:tc>
+          <w:tcPr>
+            <w:tcW w:type="dxa" w:w="2000"/>
+            <w:tcBorders>
+              <w:top w:val="single" w:color="BFBFBF" w:sz="4"/>
+              <w:left w:val="single" w:color="BFBFBF" w:sz="4"/>
+              <w:bottom w:val="single" w:color="BFBFBF" w:sz="4"/>
+              <w:right w:val="single" w:color="BFBFBF" w:sz="4"/>
+            </w:tcBorders>
+            <w:shd w:fill="002350" w:color="auto" w:val="clear"/>
+            <w:tcMar>
+              <w:top w:type="dxa" w:w="60"/>
+              <w:left w:type="dxa" w:w="100"/>
+              <w:bottom w:type="dxa" w:w="40"/>
+              <w:right w:type="dxa" w:w="100"/>
+            </w:tcMar>
+          </w:tcPr>
+          <w:p>
+            <w:pPr>
+              <w:keepNext/>
+              <w:spacing w:after="40" w:line="240"/>
+            </w:pPr>
+            <w:r>
+              <w:rPr>
+                <w:rFonts w:ascii="Verdana" w:cs="Verdana" w:eastAsia="Verdana" w:hAnsi="Verdana"/>
+                <w:b/>
+                <w:bCs/>
+                <w:color w:val="FFFFFF"/>
+                <w:sz w:val="15"/>
+                <w:szCs w:val="15"/>
+              </w:rPr>
+              <w:t xml:space="preserve">Segment</w:t>
+            </w:r>
+          </w:p>
+        </w:tc>
+        <w:tc>
+          <w:tcPr>
+            <w:tcW w:type="dxa" w:w="7072"/>
+            <w:tcBorders>
+              <w:top w:val="single" w:color="BFBFBF" w:sz="4"/>
+              <w:left w:val="single" w:color="BFBFBF" w:sz="4"/>
+              <w:bottom w:val="single" w:color="BFBFBF" w:sz="4"/>
+              <w:right w:val="single" w:color="BFBFBF" w:sz="4"/>
+            </w:tcBorders>
+            <w:shd w:fill="002350" w:color="auto" w:val="clear"/>
+            <w:tcMar>
+              <w:top w:type="dxa" w:w="60"/>
+              <w:left w:type="dxa" w:w="100"/>
+              <w:bottom w:type="dxa" w:w="40"/>
+              <w:right w:type="dxa" w:w="100"/>
+            </w:tcMar>
+          </w:tcPr>
+          <w:p>
+            <w:pPr>
+              <w:keepNext/>
+              <w:spacing w:after="40" w:line="240"/>
+            </w:pPr>
+            <w:r>
+              <w:rPr>
+                <w:rFonts w:ascii="Verdana" w:cs="Verdana" w:eastAsia="Verdana" w:hAnsi="Verdana"/>
+                <w:b/>
+                <w:bCs/>
+                <w:color w:val="FFFFFF"/>
+                <w:sz w:val="15"/>
+                <w:szCs w:val="15"/>
+              </w:rPr>
+              <w:t xml:space="preserve">Statistics to search for (examples)</w:t>
+            </w:r>
+          </w:p>
+        </w:tc>
+      </w:tr>
+      <w:tr>
+        <w:trPr>
+          <w:cantSplit/>
+        </w:trPr>
+        <w:tc>
+          <w:tcPr>
+            <w:tcW w:type="dxa" w:w="2000"/>
+            <w:tcBorders>
+              <w:top w:val="single" w:color="BFBFBF" w:sz="4"/>
+              <w:left w:val="single" w:color="BFBFBF" w:sz="4"/>
+              <w:bottom w:val="single" w:color="BFBFBF" w:sz="4"/>
+              <w:right w:val="single" w:color="BFBFBF" w:sz="4"/>
+            </w:tcBorders>
+            <w:tcMar>
+              <w:top w:type="dxa" w:w="60"/>
+              <w:left w:type="dxa" w:w="100"/>
+              <w:bottom w:type="dxa" w:w="40"/>
+              <w:right w:type="dxa" w:w="100"/>
+            </w:tcMar>
+          </w:tcPr>
+          <w:p>
+            <w:pPr>
+              <w:keepNext/>
+              <w:spacing w:after="40" w:line="240"/>
+            </w:pPr>
+            <w:r>
+              <w:rPr>
+                <w:rFonts w:ascii="Verdana" w:cs="Verdana" w:eastAsia="Verdana" w:hAnsi="Verdana"/>
+                <w:b/>
+                <w:bCs/>
+                <w:sz w:val="15"/>
+                <w:szCs w:val="15"/>
+              </w:rPr>
+              <w:t xml:space="preserve">Hotels</w:t>
+            </w:r>
+          </w:p>
+        </w:tc>
+        <w:tc>
+          <w:tcPr>
+            <w:tcW w:type="dxa" w:w="7072"/>
+            <w:tcBorders>
+              <w:top w:val="single" w:color="BFBFBF" w:sz="4"/>
+              <w:left w:val="single" w:color="BFBFBF" w:sz="4"/>
+              <w:bottom w:val="single" w:color="BFBFBF" w:sz="4"/>
+              <w:right w:val="single" w:color="BFBFBF" w:sz="4"/>
+            </w:tcBorders>
+            <w:tcMar>
+              <w:top w:type="dxa" w:w="60"/>
+              <w:left w:type="dxa" w:w="100"/>
+              <w:bottom w:type="dxa" w:w="40"/>
+              <w:right w:type="dxa" w:w="100"/>
+            </w:tcMar>
+          </w:tcPr>
+          <w:p>
+            <w:pPr>
+              <w:keepNext/>
+              <w:spacing w:after="40" w:line="240"/>
+            </w:pPr>
+            <w:r>
+              <w:rPr>
+                <w:rFonts w:ascii="Verdana" w:cs="Verdana" w:eastAsia="Verdana" w:hAnsi="Verdana"/>
+                <w:sz w:val="15"/>
+                <w:szCs w:val="15"/>
+              </w:rPr>
+              <w:t xml:space="preserve">Number of hotels and rooms by category; international hotel chains and brands; occupancy and overnight stays of international guests; food and beverage spending; coffee brands served in the top hotels</w:t>
+            </w:r>
+          </w:p>
+        </w:tc>
+      </w:tr>
+      <w:tr>
+        <w:trPr>
+          <w:cantSplit/>
+        </w:trPr>
+        <w:tc>
+          <w:tcPr>
+            <w:tcW w:type="dxa" w:w="2000"/>
+            <w:tcBorders>
+              <w:top w:val="single" w:color="BFBFBF" w:sz="4"/>
+              <w:left w:val="single" w:color="BFBFBF" w:sz="4"/>
+              <w:bottom w:val="single" w:color="BFBFBF" w:sz="4"/>
+              <w:right w:val="single" w:color="BFBFBF" w:sz="4"/>
+            </w:tcBorders>
+            <w:shd w:fill="F2F2F2" w:color="auto" w:val="clear"/>
+            <w:tcMar>
+              <w:top w:type="dxa" w:w="60"/>
+              <w:left w:type="dxa" w:w="100"/>
+              <w:bottom w:type="dxa" w:w="40"/>
+              <w:right w:type="dxa" w:w="100"/>
+            </w:tcMar>
+          </w:tcPr>
+          <w:p>
+            <w:pPr>
+              <w:keepNext/>
+              <w:spacing w:after="40" w:line="240"/>
+            </w:pPr>
+            <w:r>
+              <w:rPr>
+                <w:rFonts w:ascii="Verdana" w:cs="Verdana" w:eastAsia="Verdana" w:hAnsi="Verdana"/>
+                <w:b/>
+                <w:bCs/>
+                <w:sz w:val="15"/>
+                <w:szCs w:val="15"/>
+              </w:rPr>
+              <w:t xml:space="preserve">Restaurants</w:t>
+            </w:r>
+          </w:p>
+        </w:tc>
+        <w:tc>
+          <w:tcPr>
+            <w:tcW w:type="dxa" w:w="7072"/>
+            <w:tcBorders>
+              <w:top w:val="single" w:color="BFBFBF" w:sz="4"/>
+              <w:left w:val="single" w:color="BFBFBF" w:sz="4"/>
+              <w:bottom w:val="single" w:color="BFBFBF" w:sz="4"/>
+              <w:right w:val="single" w:color="BFBFBF" w:sz="4"/>
+            </w:tcBorders>
+            <w:shd w:fill="F2F2F2" w:color="auto" w:val="clear"/>
+            <w:tcMar>
+              <w:top w:type="dxa" w:w="60"/>
+              <w:left w:type="dxa" w:w="100"/>
+              <w:bottom w:type="dxa" w:w="40"/>
+              <w:right w:type="dxa" w:w="100"/>
+            </w:tcMar>
+          </w:tcPr>
+          <w:p>
+            <w:pPr>
+              <w:keepNext/>
+              <w:spacing w:after="40" w:line="240"/>
+            </w:pPr>
+            <w:r>
+              <w:rPr>
+                <w:rFonts w:ascii="Verdana" w:cs="Verdana" w:eastAsia="Verdana" w:hAnsi="Verdana"/>
+                <w:sz w:val="15"/>
+                <w:szCs w:val="15"/>
+              </w:rPr>
+              <w:t xml:space="preserve">Number of restaurants and sales, growth; chains versus independents; out-of-home spending on food and coffee; typical price of a coffee on the menu</w:t>
+            </w:r>
+          </w:p>
+        </w:tc>
+      </w:tr>
+      <w:tr>
+        <w:trPr>
+          <w:cantSplit/>
+        </w:trPr>
+        <w:tc>
+          <w:tcPr>
+            <w:tcW w:type="dxa" w:w="2000"/>
+            <w:tcBorders>
+              <w:top w:val="single" w:color="BFBFBF" w:sz="4"/>
+              <w:left w:val="single" w:color="BFBFBF" w:sz="4"/>
+              <w:bottom w:val="single" w:color="BFBFBF" w:sz="4"/>
+              <w:right w:val="single" w:color="BFBFBF" w:sz="4"/>
+            </w:tcBorders>
+            <w:tcMar>
+              <w:top w:type="dxa" w:w="60"/>
+              <w:left w:type="dxa" w:w="100"/>
+              <w:bottom w:type="dxa" w:w="40"/>
+              <w:right w:type="dxa" w:w="100"/>
+            </w:tcMar>
+          </w:tcPr>
+          <w:p>
+            <w:pPr>
+              <w:keepNext/>
+              <w:spacing w:after="40" w:line="240"/>
+            </w:pPr>
+            <w:r>
+              <w:rPr>
+                <w:rFonts w:ascii="Verdana" w:cs="Verdana" w:eastAsia="Verdana" w:hAnsi="Verdana"/>
+                <w:b/>
+                <w:bCs/>
+                <w:sz w:val="15"/>
+                <w:szCs w:val="15"/>
+              </w:rPr>
+              <w:t xml:space="preserve">Cafes</w:t>
+            </w:r>
+          </w:p>
+        </w:tc>
+        <w:tc>
+          <w:tcPr>
+            <w:tcW w:type="dxa" w:w="7072"/>
+            <w:tcBorders>
+              <w:top w:val="single" w:color="BFBFBF" w:sz="4"/>
+              <w:left w:val="single" w:color="BFBFBF" w:sz="4"/>
+              <w:bottom w:val="single" w:color="BFBFBF" w:sz="4"/>
+              <w:right w:val="single" w:color="BFBFBF" w:sz="4"/>
+            </w:tcBorders>
+            <w:tcMar>
+              <w:top w:type="dxa" w:w="60"/>
+              <w:left w:type="dxa" w:w="100"/>
+              <w:bottom w:type="dxa" w:w="40"/>
+              <w:right w:type="dxa" w:w="100"/>
+            </w:tcMar>
+          </w:tcPr>
+          <w:p>
+            <w:pPr>
+              <w:keepNext/>
+              <w:spacing w:after="40" w:line="240"/>
+            </w:pPr>
+            <w:r>
+              <w:rPr>
+                <w:rFonts w:ascii="Verdana" w:cs="Verdana" w:eastAsia="Verdana" w:hAnsi="Verdana"/>
+                <w:sz w:val="15"/>
+                <w:szCs w:val="15"/>
+              </w:rPr>
+              <w:t xml:space="preserve">Number of cafes and specialty cafes; chains versus independents; sales and growth; price of an espresso and a cappuccino in premium cafes; main roasters and brands used</w:t>
+            </w:r>
+          </w:p>
+        </w:tc>
+      </w:tr>
+      <w:tr>
+        <w:trPr>
+          <w:cantSplit/>
+        </w:trPr>
+        <w:tc>
+          <w:tcPr>
+            <w:tcW w:type="dxa" w:w="2000"/>
+            <w:tcBorders>
+              <w:top w:val="single" w:color="BFBFBF" w:sz="4"/>
+              <w:left w:val="single" w:color="BFBFBF" w:sz="4"/>
+              <w:bottom w:val="single" w:color="BFBFBF" w:sz="4"/>
+              <w:right w:val="single" w:color="BFBFBF" w:sz="4"/>
+            </w:tcBorders>
+            <w:shd w:fill="F2F2F2" w:color="auto" w:val="clear"/>
+            <w:tcMar>
+              <w:top w:type="dxa" w:w="60"/>
+              <w:left w:type="dxa" w:w="100"/>
+              <w:bottom w:type="dxa" w:w="40"/>
+              <w:right w:type="dxa" w:w="100"/>
+            </w:tcMar>
+          </w:tcPr>
+          <w:p>
+            <w:pPr>
+              <w:keepNext/>
+              <w:spacing w:after="40" w:line="240"/>
+            </w:pPr>
+            <w:r>
+              <w:rPr>
+                <w:rFonts w:ascii="Verdana" w:cs="Verdana" w:eastAsia="Verdana" w:hAnsi="Verdana"/>
+                <w:b/>
+                <w:bCs/>
+                <w:sz w:val="15"/>
+                <w:szCs w:val="15"/>
+              </w:rPr>
+              <w:t xml:space="preserve">Coffee stores and retail</w:t>
+            </w:r>
+          </w:p>
+        </w:tc>
+        <w:tc>
+          <w:tcPr>
+            <w:tcW w:type="dxa" w:w="7072"/>
+            <w:tcBorders>
+              <w:top w:val="single" w:color="BFBFBF" w:sz="4"/>
+              <w:left w:val="single" w:color="BFBFBF" w:sz="4"/>
+              <w:bottom w:val="single" w:color="BFBFBF" w:sz="4"/>
+              <w:right w:val="single" w:color="BFBFBF" w:sz="4"/>
+            </w:tcBorders>
+            <w:shd w:fill="F2F2F2" w:color="auto" w:val="clear"/>
+            <w:tcMar>
+              <w:top w:type="dxa" w:w="60"/>
+              <w:left w:type="dxa" w:w="100"/>
+              <w:bottom w:type="dxa" w:w="40"/>
+              <w:right w:type="dxa" w:w="100"/>
+            </w:tcMar>
+          </w:tcPr>
+          <w:p>
+            <w:pPr>
+              <w:keepNext/>
+              <w:spacing w:after="40" w:line="240"/>
+            </w:pPr>
+            <w:r>
+              <w:rPr>
+                <w:rFonts w:ascii="Verdana" w:cs="Verdana" w:eastAsia="Verdana" w:hAnsi="Verdana"/>
+                <w:sz w:val="15"/>
+                <w:szCs w:val="15"/>
+              </w:rPr>
+              <w:t xml:space="preserve">Retail sales of coffee by value and volume; split into roasted beans, ground, capsules and instant; shares of supermarkets, specialty shops and online; leading brands and shelf price of a premium 250 g pack</w:t>
+            </w:r>
+          </w:p>
+        </w:tc>
+      </w:tr>
+      <w:tr>
+        <w:trPr>
+          <w:cantSplit/>
+        </w:trPr>
+        <w:tc>
+          <w:tcPr>
+            <w:tcW w:type="dxa" w:w="2000"/>
+            <w:tcBorders>
+              <w:top w:val="single" w:color="BFBFBF" w:sz="4"/>
+              <w:left w:val="single" w:color="BFBFBF" w:sz="4"/>
+              <w:bottom w:val="single" w:color="BFBFBF" w:sz="4"/>
+              <w:right w:val="single" w:color="BFBFBF" w:sz="4"/>
+            </w:tcBorders>
+            <w:tcMar>
+              <w:top w:type="dxa" w:w="60"/>
+              <w:left w:type="dxa" w:w="100"/>
+              <w:bottom w:type="dxa" w:w="40"/>
+              <w:right w:type="dxa" w:w="100"/>
+            </w:tcMar>
+          </w:tcPr>
+          <w:p>
+            <w:pPr>
+              <w:keepNext w:val="false"/>
+              <w:spacing w:after="40" w:line="240"/>
+            </w:pPr>
+            <w:r>
+              <w:rPr>
+                <w:rFonts w:ascii="Verdana" w:cs="Verdana" w:eastAsia="Verdana" w:hAnsi="Verdana"/>
+                <w:b/>
+                <w:bCs/>
+                <w:sz w:val="15"/>
+                <w:szCs w:val="15"/>
+              </w:rPr>
+              <w:t xml:space="preserve">Private end customers</w:t>
+            </w:r>
+          </w:p>
+        </w:tc>
+        <w:tc>
+          <w:tcPr>
+            <w:tcW w:type="dxa" w:w="7072"/>
+            <w:tcBorders>
+              <w:top w:val="single" w:color="BFBFBF" w:sz="4"/>
+              <w:left w:val="single" w:color="BFBFBF" w:sz="4"/>
+              <w:bottom w:val="single" w:color="BFBFBF" w:sz="4"/>
+              <w:right w:val="single" w:color="BFBFBF" w:sz="4"/>
+            </w:tcBorders>
+            <w:tcMar>
+              <w:top w:type="dxa" w:w="60"/>
+              <w:left w:type="dxa" w:w="100"/>
+              <w:bottom w:type="dxa" w:w="40"/>
+              <w:right w:type="dxa" w:w="100"/>
+            </w:tcMar>
+          </w:tcPr>
+          <w:p>
+            <w:pPr>
+              <w:keepNext w:val="false"/>
+              <w:spacing w:after="40" w:line="240"/>
+            </w:pPr>
+            <w:r>
+              <w:rPr>
+                <w:rFonts w:ascii="Verdana" w:cs="Verdana" w:eastAsia="Verdana" w:hAnsi="Verdana"/>
+                <w:sz w:val="15"/>
+                <w:szCs w:val="15"/>
+              </w:rPr>
+              <w:t xml:space="preserve">Coffee consumption per capita; share of coffee at home versus out of home; household spending on coffee; who drinks premium and specialty coffee (age, income, city); buying habits and attitudes (sustainability, origin, convenience)</w:t>
+            </w:r>
+          </w:p>
+        </w:tc>
+      </w:tr>
+    </w:tbl>
+    <w:p>
+      <w:pPr>
+        <w:keepNext/>
+        <w:spacing w:after="60" w:before="100" w:line="252"/>
+      </w:pPr>
+      <w:r>
+        <w:rPr>
+          <w:rFonts w:ascii="Verdana" w:cs="Verdana" w:eastAsia="Verdana" w:hAnsi="Verdana"/>
+          <w:sz w:val="19"/>
+          <w:szCs w:val="19"/>
+        </w:rPr>
+        <w:t xml:space="preserve">Add three short blocks that frame the statistics:</w:t>
       </w:r>
     </w:p>
     <w:p>
@@ -6915,15 +7371,15 @@
           <w:sz w:val="19"/>
           <w:szCs w:val="19"/>
         </w:rPr>
-        <w:t xml:space="preserve">Size, growth and demand drivers.</w:t>
-      </w:r>
-      <w:r>
-        <w:rPr>
-          <w:rFonts w:ascii="Verdana" w:cs="Verdana" w:eastAsia="Verdana" w:hAnsi="Verdana"/>
-          <w:sz w:val="19"/>
-          <w:szCs w:val="19"/>
-        </w:rPr>
-        <w:t xml:space="preserve"> Value and volume of coffee consumption out of home and at home, growth, and what drives it (tourism, incomes, urbanisation, café culture, premiumisation).</w:t>
+        <w:t xml:space="preserve">Value chain.</w:t>
+      </w:r>
+      <w:r>
+        <w:rPr>
+          <w:rFonts w:ascii="Verdana" w:cs="Verdana" w:eastAsia="Verdana" w:hAnsi="Verdana"/>
+          <w:sz w:val="19"/>
+          <w:szCs w:val="19"/>
+        </w:rPr>
+        <w:t xml:space="preserve"> Production and green coffee trade (imports, domestic production), roasting, import and distribution, hospitality and retail. Mark where Julius Meinl would enter (it exports roasted coffee from Vienna) and which steps depend on a local partner.</w:t>
       </w:r>
     </w:p>
     <w:p>
@@ -6943,62 +7399,6 @@
           <w:sz w:val="19"/>
           <w:szCs w:val="19"/>
         </w:rPr>
-        <w:t xml:space="preserve">Value chain.</w:t>
-      </w:r>
-      <w:r>
-        <w:rPr>
-          <w:rFonts w:ascii="Verdana" w:cs="Verdana" w:eastAsia="Verdana" w:hAnsi="Verdana"/>
-          <w:sz w:val="19"/>
-          <w:szCs w:val="19"/>
-        </w:rPr>
-        <w:t xml:space="preserve"> Map the chain from green coffee to the consumer: production and green coffee trade, roasting, import and distribution, hospitality and retail. Mark where Julius Meinl would enter (it exports roasted coffee from Vienna) and which steps depend on a local partner.</w:t>
-      </w:r>
-    </w:p>
-    <w:p>
-      <w:pPr>
-        <w:pStyle w:val="ListParagraph"/>
-        <w:numPr>
-          <w:ilvl w:val="0"/>
-          <w:numId w:val="2"/>
-        </w:numPr>
-        <w:spacing w:after="60" w:line="252"/>
-      </w:pPr>
-      <w:r>
-        <w:rPr>
-          <w:rFonts w:ascii="Verdana" w:cs="Verdana" w:eastAsia="Verdana" w:hAnsi="Verdana"/>
-          <w:b/>
-          <w:bCs/>
-          <w:sz w:val="19"/>
-          <w:szCs w:val="19"/>
-        </w:rPr>
-        <w:t xml:space="preserve">Industry structure.</w:t>
-      </w:r>
-      <w:r>
-        <w:rPr>
-          <w:rFonts w:ascii="Verdana" w:cs="Verdana" w:eastAsia="Verdana" w:hAnsi="Verdana"/>
-          <w:sz w:val="19"/>
-          <w:szCs w:val="19"/>
-        </w:rPr>
-        <w:t xml:space="preserve"> The main types of players (domestic roasters, multinational brands, specialty roasters and café chains, importers and distributors), how concentrated the industry is, and how products and prices are positioned across segments. Profiles of individual companies are not required now; they come with positioning and pricing in the final presentation.</w:t>
-      </w:r>
-    </w:p>
-    <w:p>
-      <w:pPr>
-        <w:pStyle w:val="ListParagraph"/>
-        <w:numPr>
-          <w:ilvl w:val="0"/>
-          <w:numId w:val="2"/>
-        </w:numPr>
-        <w:spacing w:after="60" w:line="252"/>
-      </w:pPr>
-      <w:r>
-        <w:rPr>
-          <w:rFonts w:ascii="Verdana" w:cs="Verdana" w:eastAsia="Verdana" w:hAnsi="Verdana"/>
-          <w:b/>
-          <w:bCs/>
-          <w:sz w:val="19"/>
-          <w:szCs w:val="19"/>
-        </w:rPr>
         <w:t xml:space="preserve">Rules of the game.</w:t>
       </w:r>
       <w:r>
@@ -7050,15 +7450,15 @@
           <w:sz w:val="19"/>
           <w:szCs w:val="19"/>
         </w:rPr>
-        <w:t xml:space="preserve">Sources.</w:t>
-      </w:r>
-      <w:r>
-        <w:rPr>
-          <w:rFonts w:ascii="Verdana" w:cs="Verdana" w:eastAsia="Verdana" w:hAnsi="Verdana"/>
-          <w:sz w:val="19"/>
-          <w:szCs w:val="19"/>
-        </w:rPr>
-        <w:t xml:space="preserve"> USDA Foreign Agricultural Service annual coffee reports and International Coffee Organization statistics; Euromonitor Passport and Statista (WU library); UN Comtrade and ITC Trade Map for coffee trade (HS 0901); WKO AUSSENWIRTSCHAFT country reports; EU Access2Markets. A short online scan of brands and prices (cafés, supermarkets, online shops, hotels) gives evidence for the industry structure and also feeds your Part A indicator "competitive landscape". Record each observation with brand, channel, product, price and unit, URL and date.</w:t>
+        <w:t xml:space="preserve">Rules for the statistics.</w:t>
+      </w:r>
+      <w:r>
+        <w:rPr>
+          <w:rFonts w:ascii="Verdana" w:cs="Verdana" w:eastAsia="Verdana" w:hAnsi="Verdana"/>
+          <w:sz w:val="19"/>
+          <w:szCs w:val="19"/>
+        </w:rPr>
+        <w:t xml:space="preserve"> Every figure needs value, unit, year, source and link. Use the most recent year available. If no figure exists, say so and use a transparent estimate or proxy (for example Google Maps count of cafes in the capital, with date and method) and label it as an estimate. Compare sources when they disagree. Mark the quality of each figure (official statistic, industry report, own count or estimate).</w:t>
       </w:r>
     </w:p>
     <w:p>
@@ -7073,6 +7473,29 @@
           <w:sz w:val="19"/>
           <w:szCs w:val="19"/>
         </w:rPr>
+        <w:t xml:space="preserve">Sources.</w:t>
+      </w:r>
+      <w:r>
+        <w:rPr>
+          <w:rFonts w:ascii="Verdana" w:cs="Verdana" w:eastAsia="Verdana" w:hAnsi="Verdana"/>
+          <w:sz w:val="19"/>
+          <w:szCs w:val="19"/>
+        </w:rPr>
+        <w:t xml:space="preserve"> Euromonitor Passport and Statista (WU library); USDA Foreign Agricultural Service annual coffee reports and International Coffee Organization statistics; national statistics offices and tourism boards; hotel and restaurant associations; UN Comtrade and ITC Trade Map for coffee trade (HS 0901); WKO AUSSENWIRTSCHAFT country reports; EU Access2Markets. A short online scan of brands and prices (cafes, supermarkets, online shops, hotels) supplies prices and brand evidence. Record each observation with brand, channel, product, price and unit, URL and date.</w:t>
+      </w:r>
+    </w:p>
+    <w:p>
+      <w:pPr>
+        <w:spacing w:after="120" w:before="0" w:line="252"/>
+      </w:pPr>
+      <w:r>
+        <w:rPr>
+          <w:rFonts w:ascii="Verdana" w:cs="Verdana" w:eastAsia="Verdana" w:hAnsi="Verdana"/>
+          <w:b/>
+          <w:bCs/>
+          <w:sz w:val="19"/>
+          <w:szCs w:val="19"/>
+        </w:rPr>
         <w:t xml:space="preserve">Hand in:</w:t>
       </w:r>
       <w:r>
@@ -7081,7 +7504,7 @@
           <w:sz w:val="19"/>
           <w:szCs w:val="19"/>
         </w:rPr>
-        <w:t xml:space="preserve"> the industry sheet in Excel (data, value-chain notes, industry structure, sources) and one or two slides: an industry snapshot (size, growth, structure, value chain) and the main trends. Close with the implication for Julius Meinl: where is there room for a Viennese coffee house brand, and where is none?</w:t>
+        <w:t xml:space="preserve"> the industry sheet in Excel (one row per statistic: segment, statistic, value, unit, year, source and link, quality) and three to five slides: an overview of the industry, key figures per segment (use charts and tables), and the main trends. Close with the implication for Julius Meinl: where is there room for a Viennese coffee house brand, and where is none?</w:t>
       </w:r>
     </w:p>
     <w:p>
@@ -7739,7 +8162,7 @@
           <w:sz w:val="19"/>
           <w:szCs w:val="19"/>
         </w:rPr>
-        <w:t xml:space="preserve"> (hand-in): a short workbook with (1) a copy of your country's data and sources, (2) the Part B industry sheet (data, value-chain notes, industry structure, brand and price scan) and (3) a list of the AI tools you used. Sources need URL, date accessed and who collected the data. Results come from formulas, not pasted values; inputs and formulas are visibly different.</w:t>
+        <w:t xml:space="preserve"> (hand-in): a short workbook with (1) a copy of your country's data and sources, (2) the Part B industry sheet (statistics by segment with unit, year, source and link; value-chain notes; brand and price scan) and (3) a list of the AI tools you used. Sources need URL, date accessed and who collected the data. Results come from formulas, not pasted values; inputs and formulas are visibly different.</w:t>
       </w:r>
     </w:p>
     <w:p>
@@ -9527,7 +9950,7 @@
       <w:pPr>
         <w:spacing w:after="140"/>
       </w:pPr>
-      <w:hyperlink w:history="1" r:id="rIdt9iob8rebj2l9ukr1qjkz">
+      <w:hyperlink w:history="1" r:id="rIdliidmk13sekjzzughfqoy">
         <w:r>
           <w:rPr>
             <w:rStyle w:val="Hyperlink"/>
@@ -9573,7 +9996,7 @@
         </w:rPr>
         <w:t xml:space="preserve">JRC: 10-step pocket guide to composite indicators (free): </w:t>
       </w:r>
-      <w:hyperlink w:history="1" r:id="rId5ssrum1dsklfizwld_xbm">
+      <w:hyperlink w:history="1" r:id="rIdko_as5uw1pnfkhrfvhxdc">
         <w:r>
           <w:rPr>
             <w:rStyle w:val="Hyperlink"/>
@@ -9602,7 +10025,7 @@
         </w:rPr>
         <w:t xml:space="preserve">OECD/JRC: Handbook on constructing composite indicators (free): </w:t>
       </w:r>
-      <w:hyperlink w:history="1" r:id="rIdptrifg17thd4cfwjcrz9n">
+      <w:hyperlink w:history="1" r:id="rId1cwew4ppiin1rrldsv0kz">
         <w:r>
           <w:rPr>
             <w:rStyle w:val="Hyperlink"/>
@@ -9631,7 +10054,7 @@
         </w:rPr>
         <w:t xml:space="preserve">Greco et al. (2019): weighting and aggregation in composite indices (open access): </w:t>
       </w:r>
-      <w:hyperlink w:history="1" r:id="rIdoe3skiusspiwlnt1kclte">
+      <w:hyperlink w:history="1" r:id="rIdtgnf0rghndbntkg_6kjit">
         <w:r>
           <w:rPr>
             <w:rStyle w:val="Hyperlink"/>
@@ -9660,7 +10083,7 @@
         </w:rPr>
         <w:t xml:space="preserve">BPMSG: AHP Excel template (free): </w:t>
       </w:r>
-      <w:hyperlink w:history="1" r:id="rIdomhbqqouf_fu9q4apthio">
+      <w:hyperlink w:history="1" r:id="rIdtzjaqmedpjdxx-zch40xm">
         <w:r>
           <w:rPr>
             <w:rStyle w:val="Hyperlink"/>
@@ -9689,7 +10112,7 @@
         </w:rPr>
         <w:t xml:space="preserve">Best-Worst Method solvers (free): </w:t>
       </w:r>
-      <w:hyperlink w:history="1" r:id="rIdqhnavvr4tfi6k0lgumthz">
+      <w:hyperlink w:history="1" r:id="rIdifjza7yv_e8wk0zmjvioh">
         <w:r>
           <w:rPr>
             <w:rStyle w:val="Hyperlink"/>
@@ -9718,7 +10141,7 @@
         </w:rPr>
         <w:t xml:space="preserve">JRC COIN Tool, Excel composite indicators (free): </w:t>
       </w:r>
-      <w:hyperlink w:history="1" r:id="rIdytih1g2zayvls5ypu2tnf">
+      <w:hyperlink w:history="1" r:id="rIdn1u504mxwiqkkhnkedgjs">
         <w:r>
           <w:rPr>
             <w:rStyle w:val="Hyperlink"/>
@@ -9764,7 +10187,7 @@
         </w:rPr>
         <w:t xml:space="preserve">globalEDGE Market Potential Index: eight dimensions with published weights (25, 15, 12.5, 12.5, 10, 10, 7.5, 7.5): </w:t>
       </w:r>
-      <w:hyperlink w:history="1" r:id="rIdk5msak34zwiuqvevtmyev">
+      <w:hyperlink w:history="1" r:id="rId3iuscmkgd7lehc62nvi9b">
         <w:r>
           <w:rPr>
             <w:rStyle w:val="Hyperlink"/>
@@ -9793,7 +10216,7 @@
         </w:rPr>
         <w:t xml:space="preserve">Cavusgil (1997): measuring the potential of emerging markets (WU library): </w:t>
       </w:r>
-      <w:hyperlink w:history="1" r:id="rId1qxyhmt1sg9pupfp87mlg">
+      <w:hyperlink w:history="1" r:id="rIdxbhkxao4ba0ef3onnvjed">
         <w:r>
           <w:rPr>
             <w:rStyle w:val="Hyperlink"/>
@@ -9822,7 +10245,7 @@
         </w:rPr>
         <w:t xml:space="preserve">Ghemawat (2001): Distance still matters, the CAGE framework (WU library): </w:t>
       </w:r>
-      <w:hyperlink w:history="1" r:id="rIdvqh6kvy3wmbhzpkghhstc">
+      <w:hyperlink w:history="1" r:id="rId6l6lprkdh_edjimsmtgjg">
         <w:r>
           <w:rPr>
             <w:rStyle w:val="Hyperlink"/>
@@ -9851,7 +10274,7 @@
         </w:rPr>
         <w:t xml:space="preserve">Musso and Francioni: how smaller firms select foreign markets (open access): </w:t>
       </w:r>
-      <w:hyperlink w:history="1" r:id="rIdld0s4tgmyg4cbzc0pqn37">
+      <w:hyperlink w:history="1" r:id="rIduagzdi4nr1jzcd7vrenyw">
         <w:r>
           <w:rPr>
             <w:rStyle w:val="Hyperlink"/>
@@ -9880,7 +10303,7 @@
         </w:rPr>
         <w:t xml:space="preserve">Pollesch and Dale (2016): normalisation choices (WU library): </w:t>
       </w:r>
-      <w:hyperlink w:history="1" r:id="rIdgvlrpjpitgm9sfhu91zwq">
+      <w:hyperlink w:history="1" r:id="rIdnoeapnxvem18li0kudyzz">
         <w:r>
           <w:rPr>
             <w:rStyle w:val="Hyperlink"/>
@@ -9926,7 +10349,7 @@
         </w:rPr>
         <w:t xml:space="preserve">ITC Export Potential Map, methodology (free): </w:t>
       </w:r>
-      <w:hyperlink w:history="1" r:id="rIdvcwoaakfznrjrqrrcppbz">
+      <w:hyperlink w:history="1" r:id="rIdjepohymbu22nz_5m3dhnc">
         <w:r>
           <w:rPr>
             <w:rStyle w:val="Hyperlink"/>
@@ -9955,7 +10378,7 @@
         </w:rPr>
         <w:t xml:space="preserve">Kearney Global Retail Development Index (free): </w:t>
       </w:r>
-      <w:hyperlink w:history="1" r:id="rIdbr6ntpmvah00vjrb8o_9l">
+      <w:hyperlink w:history="1" r:id="rIdk7ubfncfpdbllw9sfx_vt">
         <w:r>
           <w:rPr>
             <w:rStyle w:val="Hyperlink"/>
@@ -9984,7 +10407,7 @@
         </w:rPr>
         <w:t xml:space="preserve">Eurazeo: International Expansion Playbook (free): </w:t>
       </w:r>
-      <w:hyperlink w:history="1" r:id="rIdlxoqwyeweokdxg8tzt7ax">
+      <w:hyperlink w:history="1" r:id="rIdvktbkh8axgupfutwosnjv">
         <w:r>
           <w:rPr>
             <w:rStyle w:val="Hyperlink"/>
@@ -10013,7 +10436,7 @@
         </w:rPr>
         <w:t xml:space="preserve">Optional case about coffee: The Espresso Lane to Global Markets, illy (Ivey Publishing, paid): </w:t>
       </w:r>
-      <w:hyperlink w:history="1" r:id="rIdwruljdrah7t4pnoc5o7f-">
+      <w:hyperlink w:history="1" r:id="rId_k3lyuf1wzwquvz0yfexu">
         <w:r>
           <w:rPr>
             <w:rStyle w:val="Hyperlink"/>
@@ -10042,7 +10465,7 @@
         </w:rPr>
         <w:t xml:space="preserve">IFC PAYG Market Attractiveness Index, an Excel tool with user guide (free): </w:t>
       </w:r>
-      <w:hyperlink w:history="1" r:id="rIdey5woavfdo1gbriznoksb">
+      <w:hyperlink w:history="1" r:id="rIdgzq-mrybj3b0a6y1aa3jm">
         <w:r>
           <w:rPr>
             <w:rStyle w:val="Hyperlink"/>
@@ -10088,7 +10511,7 @@
         </w:rPr>
         <w:t xml:space="preserve">World Bank World Development Indicators: </w:t>
       </w:r>
-      <w:hyperlink w:history="1" r:id="rIdi_7couo44ufentky2qe5r">
+      <w:hyperlink w:history="1" r:id="rIdcpo8o4zxdm2clvh4wstc-">
         <w:r>
           <w:rPr>
             <w:rStyle w:val="Hyperlink"/>
@@ -10117,7 +10540,7 @@
         </w:rPr>
         <w:t xml:space="preserve">IMF World Economic Outlook: </w:t>
       </w:r>
-      <w:hyperlink w:history="1" r:id="rId-edxiz84q2xpo3tqywg5z">
+      <w:hyperlink w:history="1" r:id="rIdtxq9fcuenbwokllinz1yk">
         <w:r>
           <w:rPr>
             <w:rStyle w:val="Hyperlink"/>
@@ -10146,7 +10569,7 @@
         </w:rPr>
         <w:t xml:space="preserve">World Bank Worldwide Governance Indicators: </w:t>
       </w:r>
-      <w:hyperlink w:history="1" r:id="rIdgoyc3pf5u1qu7xchwsnkh">
+      <w:hyperlink w:history="1" r:id="rIdy7jlcgaeafmp2rj6aahpn">
         <w:r>
           <w:rPr>
             <w:rStyle w:val="Hyperlink"/>
@@ -10175,7 +10598,7 @@
         </w:rPr>
         <w:t xml:space="preserve">EU Access2Markets (tariffs, requirements, rules of origin for EU exporters): </w:t>
       </w:r>
-      <w:hyperlink w:history="1" r:id="rIdtmsg0qse3wdikvopemda8">
+      <w:hyperlink w:history="1" r:id="rId11u5q8tuxvaexwtdmzpvb">
         <w:r>
           <w:rPr>
             <w:rStyle w:val="Hyperlink"/>
@@ -10204,7 +10627,7 @@
         </w:rPr>
         <w:t xml:space="preserve">WTO tariff and trade data: </w:t>
       </w:r>
-      <w:hyperlink w:history="1" r:id="rIdf1d_yg77ry0oc69myac_6">
+      <w:hyperlink w:history="1" r:id="rIde68aq5kxevpibfwskhi81">
         <w:r>
           <w:rPr>
             <w:rStyle w:val="Hyperlink"/>
@@ -10233,7 +10656,7 @@
         </w:rPr>
         <w:t xml:space="preserve">CEPII Gravity database (distance, language; free login): </w:t>
       </w:r>
-      <w:hyperlink w:history="1" r:id="rIdatawouo3l754zppt-mxih">
+      <w:hyperlink w:history="1" r:id="rIdqi1u_e0supvqi5oajbllj">
         <w:r>
           <w:rPr>
             <w:rStyle w:val="Hyperlink"/>
@@ -10262,7 +10685,7 @@
         </w:rPr>
         <w:t xml:space="preserve">Hofstede dimension data matrix: </w:t>
       </w:r>
-      <w:hyperlink w:history="1" r:id="rIdn06lu06yg6rhnvk3zef3w">
+      <w:hyperlink w:history="1" r:id="rIdugud_vvqol_ckmibqavqj">
         <w:r>
           <w:rPr>
             <w:rStyle w:val="Hyperlink"/>
@@ -10291,7 +10714,7 @@
         </w:rPr>
         <w:t xml:space="preserve">Coface country risk assessments: </w:t>
       </w:r>
-      <w:hyperlink w:history="1" r:id="rIdr-unemad0aygtgz6eysjc">
+      <w:hyperlink w:history="1" r:id="rIdp4buocseejkishxbc9t7f">
         <w:r>
           <w:rPr>
             <w:rStyle w:val="Hyperlink"/>
@@ -10320,7 +10743,7 @@
         </w:rPr>
         <w:t xml:space="preserve">Euromonitor Passport and Statista (WU library; statista.com): </w:t>
       </w:r>
-      <w:hyperlink w:history="1" r:id="rIdtqcelezvn3c6f5fhyysix">
+      <w:hyperlink w:history="1" r:id="rIdoisswmbreo4e9ygzysrgo">
         <w:r>
           <w:rPr>
             <w:rStyle w:val="Hyperlink"/>
@@ -10349,7 +10772,7 @@
         </w:rPr>
         <w:t xml:space="preserve">International Coffee Organization: coffee statistics: </w:t>
       </w:r>
-      <w:hyperlink w:history="1" r:id="rIdodrgxke6ejugwhxegtowj">
+      <w:hyperlink w:history="1" r:id="rIdili8u7lml1x4rwzbk4cof">
         <w:r>
           <w:rPr>
             <w:rStyle w:val="Hyperlink"/>
@@ -10378,7 +10801,7 @@
         </w:rPr>
         <w:t xml:space="preserve">USDA Foreign Agricultural Service: annual coffee reports by country (search for your countries): </w:t>
       </w:r>
-      <w:hyperlink w:history="1" r:id="rIdudsgmdp0hm7sygqx1g_xl">
+      <w:hyperlink w:history="1" r:id="rIds0wccaz-10ipxhn8a8dwq">
         <w:r>
           <w:rPr>
             <w:rStyle w:val="Hyperlink"/>
@@ -10407,7 +10830,7 @@
         </w:rPr>
         <w:t xml:space="preserve">UN Comtrade (comtradeplus.un.org) and ITC Trade Map (free login): coffee trade flows and tariffs, HS 0901: </w:t>
       </w:r>
-      <w:hyperlink w:history="1" r:id="rIdgq5_v1fxzxd8rfxbkjsbi">
+      <w:hyperlink w:history="1" r:id="rIdvyvolxple_dzfg40fktsr">
         <w:r>
           <w:rPr>
             <w:rStyle w:val="Hyperlink"/>
@@ -10436,7 +10859,7 @@
         </w:rPr>
         <w:t xml:space="preserve">WKO AUSSENWIRTSCHAFT: reports and country profiles: </w:t>
       </w:r>
-      <w:hyperlink w:history="1" r:id="rIdujviokfgins12cidlsrdv">
+      <w:hyperlink w:history="1" r:id="rIdycu7a2clk5-hcs1jqzauk">
         <w:r>
           <w:rPr>
             <w:rStyle w:val="Hyperlink"/>

</xml_diff>

<commit_message>
Part B segments: hotels, restaurants, cafes, private end customers (coffee stores removed)
Co-Authored-By: Claude Sonnet 5.5 <noreply@anthropic.com>
Claude-Session: https://claude.ai/code/session_01RkWScMhuRmEB4zppSmB7Ri
</commit_message>
<xml_diff>
--- a/WT26-27/Student Brief Midterm Presentation WT26-27.docx
+++ b/WT26-27/Student Brief Midterm Presentation WT26-27.docx
@@ -1604,7 +1604,7 @@
           <w:sz w:val="19"/>
           <w:szCs w:val="19"/>
         </w:rPr>
-        <w:t xml:space="preserve"> Search for statistics and facts on the coffee industry in your allocated country (hotels, restaurants, cafes, coffee stores and private end customers) and present them. Section 8 describes the content.</w:t>
+        <w:t xml:space="preserve"> Search for statistics and facts on the coffee industry in your allocated country (hotels, restaurants, cafes and private end customers) and present them. Section 8 describes the content.</w:t>
       </w:r>
     </w:p>
     <w:p>
@@ -6895,7 +6895,7 @@
           <w:sz w:val="19"/>
           <w:szCs w:val="19"/>
         </w:rPr>
-        <w:t xml:space="preserve">. Search for information and numbers on the coffee industry in your allocated country and present them, segment by segment, as an evidence base for Julius Meinl: how big is each segment, how is it structured, how is it developing, and what does that mean for a premium newcomer from Vienna? Focus on the customers of the segments Julius Meinl serves, plus private end customers:</w:t>
+        <w:t xml:space="preserve">. Search for information and numbers on the coffee industry in your allocated country and present them, segment by segment, as an evidence base for Julius Meinl: how big is each segment, how is it structured, how is it developing, and what does that mean for a premium newcomer from Vienna? Focus on the hospitality customers Julius Meinl serves, plus private end customers:</w:t>
       </w:r>
     </w:p>
     <w:tbl>
@@ -7222,7 +7222,7 @@
           </w:tcPr>
           <w:p>
             <w:pPr>
-              <w:keepNext/>
+              <w:keepNext w:val="false"/>
               <w:spacing w:after="40" w:line="240"/>
             </w:pPr>
             <w:r>
@@ -7233,7 +7233,7 @@
                 <w:sz w:val="15"/>
                 <w:szCs w:val="15"/>
               </w:rPr>
-              <w:t xml:space="preserve">Coffee stores and retail</w:t>
+              <w:t xml:space="preserve">Private end customers</w:t>
             </w:r>
           </w:p>
         </w:tc>
@@ -7247,75 +7247,6 @@
               <w:right w:val="single" w:color="BFBFBF" w:sz="4"/>
             </w:tcBorders>
             <w:shd w:fill="F2F2F2" w:color="auto" w:val="clear"/>
-            <w:tcMar>
-              <w:top w:type="dxa" w:w="60"/>
-              <w:left w:type="dxa" w:w="100"/>
-              <w:bottom w:type="dxa" w:w="40"/>
-              <w:right w:type="dxa" w:w="100"/>
-            </w:tcMar>
-          </w:tcPr>
-          <w:p>
-            <w:pPr>
-              <w:keepNext/>
-              <w:spacing w:after="40" w:line="240"/>
-            </w:pPr>
-            <w:r>
-              <w:rPr>
-                <w:rFonts w:ascii="Verdana" w:cs="Verdana" w:eastAsia="Verdana" w:hAnsi="Verdana"/>
-                <w:sz w:val="15"/>
-                <w:szCs w:val="15"/>
-              </w:rPr>
-              <w:t xml:space="preserve">Retail sales of coffee by value and volume; split into roasted beans, ground, capsules and instant; shares of supermarkets, specialty shops and online; leading brands and shelf price of a premium 250 g pack</w:t>
-            </w:r>
-          </w:p>
-        </w:tc>
-      </w:tr>
-      <w:tr>
-        <w:trPr>
-          <w:cantSplit/>
-        </w:trPr>
-        <w:tc>
-          <w:tcPr>
-            <w:tcW w:type="dxa" w:w="2000"/>
-            <w:tcBorders>
-              <w:top w:val="single" w:color="BFBFBF" w:sz="4"/>
-              <w:left w:val="single" w:color="BFBFBF" w:sz="4"/>
-              <w:bottom w:val="single" w:color="BFBFBF" w:sz="4"/>
-              <w:right w:val="single" w:color="BFBFBF" w:sz="4"/>
-            </w:tcBorders>
-            <w:tcMar>
-              <w:top w:type="dxa" w:w="60"/>
-              <w:left w:type="dxa" w:w="100"/>
-              <w:bottom w:type="dxa" w:w="40"/>
-              <w:right w:type="dxa" w:w="100"/>
-            </w:tcMar>
-          </w:tcPr>
-          <w:p>
-            <w:pPr>
-              <w:keepNext w:val="false"/>
-              <w:spacing w:after="40" w:line="240"/>
-            </w:pPr>
-            <w:r>
-              <w:rPr>
-                <w:rFonts w:ascii="Verdana" w:cs="Verdana" w:eastAsia="Verdana" w:hAnsi="Verdana"/>
-                <w:b/>
-                <w:bCs/>
-                <w:sz w:val="15"/>
-                <w:szCs w:val="15"/>
-              </w:rPr>
-              <w:t xml:space="preserve">Private end customers</w:t>
-            </w:r>
-          </w:p>
-        </w:tc>
-        <w:tc>
-          <w:tcPr>
-            <w:tcW w:type="dxa" w:w="7072"/>
-            <w:tcBorders>
-              <w:top w:val="single" w:color="BFBFBF" w:sz="4"/>
-              <w:left w:val="single" w:color="BFBFBF" w:sz="4"/>
-              <w:bottom w:val="single" w:color="BFBFBF" w:sz="4"/>
-              <w:right w:val="single" w:color="BFBFBF" w:sz="4"/>
-            </w:tcBorders>
             <w:tcMar>
               <w:top w:type="dxa" w:w="60"/>
               <w:left w:type="dxa" w:w="100"/>
@@ -7481,7 +7412,7 @@
           <w:sz w:val="19"/>
           <w:szCs w:val="19"/>
         </w:rPr>
-        <w:t xml:space="preserve"> Euromonitor Passport and Statista (WU library); USDA Foreign Agricultural Service annual coffee reports and International Coffee Organization statistics; national statistics offices and tourism boards; hotel and restaurant associations; UN Comtrade and ITC Trade Map for coffee trade (HS 0901); WKO AUSSENWIRTSCHAFT country reports; EU Access2Markets. A short online scan of brands and prices (cafes, supermarkets, online shops, hotels) supplies prices and brand evidence. Record each observation with brand, channel, product, price and unit, URL and date.</w:t>
+        <w:t xml:space="preserve"> Euromonitor Passport and Statista (WU library); USDA Foreign Agricultural Service annual coffee reports and International Coffee Organization statistics; national statistics offices and tourism boards; hotel and restaurant associations; UN Comtrade and ITC Trade Map for coffee trade (HS 0901); WKO AUSSENWIRTSCHAFT country reports; EU Access2Markets. A short online scan of brands and prices (cafes, restaurants, hotels) supplies prices and brand evidence. Record each observation with brand, channel, product, price and unit, URL and date.</w:t>
       </w:r>
     </w:p>
     <w:p>
@@ -9950,7 +9881,7 @@
       <w:pPr>
         <w:spacing w:after="140"/>
       </w:pPr>
-      <w:hyperlink w:history="1" r:id="rIdliidmk13sekjzzughfqoy">
+      <w:hyperlink w:history="1" r:id="rIdtieajn38ow9eqjksk3e9a">
         <w:r>
           <w:rPr>
             <w:rStyle w:val="Hyperlink"/>
@@ -9996,7 +9927,7 @@
         </w:rPr>
         <w:t xml:space="preserve">JRC: 10-step pocket guide to composite indicators (free): </w:t>
       </w:r>
-      <w:hyperlink w:history="1" r:id="rIdko_as5uw1pnfkhrfvhxdc">
+      <w:hyperlink w:history="1" r:id="rIdqf_fixkhfy_kgjk4jikyh">
         <w:r>
           <w:rPr>
             <w:rStyle w:val="Hyperlink"/>
@@ -10025,7 +9956,7 @@
         </w:rPr>
         <w:t xml:space="preserve">OECD/JRC: Handbook on constructing composite indicators (free): </w:t>
       </w:r>
-      <w:hyperlink w:history="1" r:id="rId1cwew4ppiin1rrldsv0kz">
+      <w:hyperlink w:history="1" r:id="rIdxutbqz5etme4aalnoppdp">
         <w:r>
           <w:rPr>
             <w:rStyle w:val="Hyperlink"/>
@@ -10054,7 +9985,7 @@
         </w:rPr>
         <w:t xml:space="preserve">Greco et al. (2019): weighting and aggregation in composite indices (open access): </w:t>
       </w:r>
-      <w:hyperlink w:history="1" r:id="rIdtgnf0rghndbntkg_6kjit">
+      <w:hyperlink w:history="1" r:id="rId9za9qxungllrc2r4h9vyz">
         <w:r>
           <w:rPr>
             <w:rStyle w:val="Hyperlink"/>
@@ -10083,7 +10014,7 @@
         </w:rPr>
         <w:t xml:space="preserve">BPMSG: AHP Excel template (free): </w:t>
       </w:r>
-      <w:hyperlink w:history="1" r:id="rIdtzjaqmedpjdxx-zch40xm">
+      <w:hyperlink w:history="1" r:id="rIdoprvpdgahftycgwymj03-">
         <w:r>
           <w:rPr>
             <w:rStyle w:val="Hyperlink"/>
@@ -10112,7 +10043,7 @@
         </w:rPr>
         <w:t xml:space="preserve">Best-Worst Method solvers (free): </w:t>
       </w:r>
-      <w:hyperlink w:history="1" r:id="rIdifjza7yv_e8wk0zmjvioh">
+      <w:hyperlink w:history="1" r:id="rIdmoij2cgh9tmam2zpvy_5x">
         <w:r>
           <w:rPr>
             <w:rStyle w:val="Hyperlink"/>
@@ -10141,7 +10072,7 @@
         </w:rPr>
         <w:t xml:space="preserve">JRC COIN Tool, Excel composite indicators (free): </w:t>
       </w:r>
-      <w:hyperlink w:history="1" r:id="rIdn1u504mxwiqkkhnkedgjs">
+      <w:hyperlink w:history="1" r:id="rIdppk4uaozdqfbeoibmcrk4">
         <w:r>
           <w:rPr>
             <w:rStyle w:val="Hyperlink"/>
@@ -10187,7 +10118,7 @@
         </w:rPr>
         <w:t xml:space="preserve">globalEDGE Market Potential Index: eight dimensions with published weights (25, 15, 12.5, 12.5, 10, 10, 7.5, 7.5): </w:t>
       </w:r>
-      <w:hyperlink w:history="1" r:id="rId3iuscmkgd7lehc62nvi9b">
+      <w:hyperlink w:history="1" r:id="rIdurm5vylaktfnkk24fu_7d">
         <w:r>
           <w:rPr>
             <w:rStyle w:val="Hyperlink"/>
@@ -10216,7 +10147,7 @@
         </w:rPr>
         <w:t xml:space="preserve">Cavusgil (1997): measuring the potential of emerging markets (WU library): </w:t>
       </w:r>
-      <w:hyperlink w:history="1" r:id="rIdxbhkxao4ba0ef3onnvjed">
+      <w:hyperlink w:history="1" r:id="rIdae8krv_5jkfxq7scjanzl">
         <w:r>
           <w:rPr>
             <w:rStyle w:val="Hyperlink"/>
@@ -10245,7 +10176,7 @@
         </w:rPr>
         <w:t xml:space="preserve">Ghemawat (2001): Distance still matters, the CAGE framework (WU library): </w:t>
       </w:r>
-      <w:hyperlink w:history="1" r:id="rId6l6lprkdh_edjimsmtgjg">
+      <w:hyperlink w:history="1" r:id="rId77iom5bl5xrqrickozxqf">
         <w:r>
           <w:rPr>
             <w:rStyle w:val="Hyperlink"/>
@@ -10274,7 +10205,7 @@
         </w:rPr>
         <w:t xml:space="preserve">Musso and Francioni: how smaller firms select foreign markets (open access): </w:t>
       </w:r>
-      <w:hyperlink w:history="1" r:id="rIduagzdi4nr1jzcd7vrenyw">
+      <w:hyperlink w:history="1" r:id="rId3qxs6ncnhkl6lqnnwclfq">
         <w:r>
           <w:rPr>
             <w:rStyle w:val="Hyperlink"/>
@@ -10303,7 +10234,7 @@
         </w:rPr>
         <w:t xml:space="preserve">Pollesch and Dale (2016): normalisation choices (WU library): </w:t>
       </w:r>
-      <w:hyperlink w:history="1" r:id="rIdnoeapnxvem18li0kudyzz">
+      <w:hyperlink w:history="1" r:id="rIdypy2za6aztvw7zalmpif7">
         <w:r>
           <w:rPr>
             <w:rStyle w:val="Hyperlink"/>
@@ -10349,7 +10280,7 @@
         </w:rPr>
         <w:t xml:space="preserve">ITC Export Potential Map, methodology (free): </w:t>
       </w:r>
-      <w:hyperlink w:history="1" r:id="rIdjepohymbu22nz_5m3dhnc">
+      <w:hyperlink w:history="1" r:id="rIdi8lfg85ka9xs7pjvbgn0h">
         <w:r>
           <w:rPr>
             <w:rStyle w:val="Hyperlink"/>
@@ -10378,7 +10309,7 @@
         </w:rPr>
         <w:t xml:space="preserve">Kearney Global Retail Development Index (free): </w:t>
       </w:r>
-      <w:hyperlink w:history="1" r:id="rIdk7ubfncfpdbllw9sfx_vt">
+      <w:hyperlink w:history="1" r:id="rId5dumjd_rhrjmt_3xqngqd">
         <w:r>
           <w:rPr>
             <w:rStyle w:val="Hyperlink"/>
@@ -10407,7 +10338,7 @@
         </w:rPr>
         <w:t xml:space="preserve">Eurazeo: International Expansion Playbook (free): </w:t>
       </w:r>
-      <w:hyperlink w:history="1" r:id="rIdvktbkh8axgupfutwosnjv">
+      <w:hyperlink w:history="1" r:id="rIdty4f_mwp4af3flv0xo5ie">
         <w:r>
           <w:rPr>
             <w:rStyle w:val="Hyperlink"/>
@@ -10436,7 +10367,7 @@
         </w:rPr>
         <w:t xml:space="preserve">Optional case about coffee: The Espresso Lane to Global Markets, illy (Ivey Publishing, paid): </w:t>
       </w:r>
-      <w:hyperlink w:history="1" r:id="rId_k3lyuf1wzwquvz0yfexu">
+      <w:hyperlink w:history="1" r:id="rIdpd0mhunhnu5nwsmkc2znt">
         <w:r>
           <w:rPr>
             <w:rStyle w:val="Hyperlink"/>
@@ -10465,7 +10396,7 @@
         </w:rPr>
         <w:t xml:space="preserve">IFC PAYG Market Attractiveness Index, an Excel tool with user guide (free): </w:t>
       </w:r>
-      <w:hyperlink w:history="1" r:id="rIdgzq-mrybj3b0a6y1aa3jm">
+      <w:hyperlink w:history="1" r:id="rId4ufiu7esbanak3vppx91x">
         <w:r>
           <w:rPr>
             <w:rStyle w:val="Hyperlink"/>
@@ -10511,7 +10442,7 @@
         </w:rPr>
         <w:t xml:space="preserve">World Bank World Development Indicators: </w:t>
       </w:r>
-      <w:hyperlink w:history="1" r:id="rIdcpo8o4zxdm2clvh4wstc-">
+      <w:hyperlink w:history="1" r:id="rId3_s-z3zkadfyeuuvjndhy">
         <w:r>
           <w:rPr>
             <w:rStyle w:val="Hyperlink"/>
@@ -10540,7 +10471,7 @@
         </w:rPr>
         <w:t xml:space="preserve">IMF World Economic Outlook: </w:t>
       </w:r>
-      <w:hyperlink w:history="1" r:id="rIdtxq9fcuenbwokllinz1yk">
+      <w:hyperlink w:history="1" r:id="rId8eli3p8oighttcxhgqem6">
         <w:r>
           <w:rPr>
             <w:rStyle w:val="Hyperlink"/>
@@ -10569,7 +10500,7 @@
         </w:rPr>
         <w:t xml:space="preserve">World Bank Worldwide Governance Indicators: </w:t>
       </w:r>
-      <w:hyperlink w:history="1" r:id="rIdy7jlcgaeafmp2rj6aahpn">
+      <w:hyperlink w:history="1" r:id="rId3twc3i3r0m3ywrjgeswqi">
         <w:r>
           <w:rPr>
             <w:rStyle w:val="Hyperlink"/>
@@ -10598,7 +10529,7 @@
         </w:rPr>
         <w:t xml:space="preserve">EU Access2Markets (tariffs, requirements, rules of origin for EU exporters): </w:t>
       </w:r>
-      <w:hyperlink w:history="1" r:id="rId11u5q8tuxvaexwtdmzpvb">
+      <w:hyperlink w:history="1" r:id="rIdv240xzyojmryfpajbehnl">
         <w:r>
           <w:rPr>
             <w:rStyle w:val="Hyperlink"/>
@@ -10627,7 +10558,7 @@
         </w:rPr>
         <w:t xml:space="preserve">WTO tariff and trade data: </w:t>
       </w:r>
-      <w:hyperlink w:history="1" r:id="rIde68aq5kxevpibfwskhi81">
+      <w:hyperlink w:history="1" r:id="rIdzbjahliwjld_-flm_ob7m">
         <w:r>
           <w:rPr>
             <w:rStyle w:val="Hyperlink"/>
@@ -10656,7 +10587,7 @@
         </w:rPr>
         <w:t xml:space="preserve">CEPII Gravity database (distance, language; free login): </w:t>
       </w:r>
-      <w:hyperlink w:history="1" r:id="rIdqi1u_e0supvqi5oajbllj">
+      <w:hyperlink w:history="1" r:id="rId2xg7udap3guhtiesgprmp">
         <w:r>
           <w:rPr>
             <w:rStyle w:val="Hyperlink"/>
@@ -10685,7 +10616,7 @@
         </w:rPr>
         <w:t xml:space="preserve">Hofstede dimension data matrix: </w:t>
       </w:r>
-      <w:hyperlink w:history="1" r:id="rIdugud_vvqol_ckmibqavqj">
+      <w:hyperlink w:history="1" r:id="rIdowq4dwyqyjafherhf6z-g">
         <w:r>
           <w:rPr>
             <w:rStyle w:val="Hyperlink"/>
@@ -10714,7 +10645,7 @@
         </w:rPr>
         <w:t xml:space="preserve">Coface country risk assessments: </w:t>
       </w:r>
-      <w:hyperlink w:history="1" r:id="rIdp4buocseejkishxbc9t7f">
+      <w:hyperlink w:history="1" r:id="rIdxsn2gx7suxc-ewgvafmu0">
         <w:r>
           <w:rPr>
             <w:rStyle w:val="Hyperlink"/>
@@ -10743,7 +10674,7 @@
         </w:rPr>
         <w:t xml:space="preserve">Euromonitor Passport and Statista (WU library; statista.com): </w:t>
       </w:r>
-      <w:hyperlink w:history="1" r:id="rIdoisswmbreo4e9ygzysrgo">
+      <w:hyperlink w:history="1" r:id="rId_ryycgbqjlqws7tyh8r8c">
         <w:r>
           <w:rPr>
             <w:rStyle w:val="Hyperlink"/>
@@ -10772,7 +10703,7 @@
         </w:rPr>
         <w:t xml:space="preserve">International Coffee Organization: coffee statistics: </w:t>
       </w:r>
-      <w:hyperlink w:history="1" r:id="rIdili8u7lml1x4rwzbk4cof">
+      <w:hyperlink w:history="1" r:id="rId6kik2scddzqsy7ompghlq">
         <w:r>
           <w:rPr>
             <w:rStyle w:val="Hyperlink"/>
@@ -10801,7 +10732,7 @@
         </w:rPr>
         <w:t xml:space="preserve">USDA Foreign Agricultural Service: annual coffee reports by country (search for your countries): </w:t>
       </w:r>
-      <w:hyperlink w:history="1" r:id="rIds0wccaz-10ipxhn8a8dwq">
+      <w:hyperlink w:history="1" r:id="rIdjyr9zfyfxuscjl8-ntehc">
         <w:r>
           <w:rPr>
             <w:rStyle w:val="Hyperlink"/>
@@ -10830,7 +10761,7 @@
         </w:rPr>
         <w:t xml:space="preserve">UN Comtrade (comtradeplus.un.org) and ITC Trade Map (free login): coffee trade flows and tariffs, HS 0901: </w:t>
       </w:r>
-      <w:hyperlink w:history="1" r:id="rIdvyvolxple_dzfg40fktsr">
+      <w:hyperlink w:history="1" r:id="rId2gakezouhv2jpcfoksnbb">
         <w:r>
           <w:rPr>
             <w:rStyle w:val="Hyperlink"/>
@@ -10859,7 +10790,7 @@
         </w:rPr>
         <w:t xml:space="preserve">WKO AUSSENWIRTSCHAFT: reports and country profiles: </w:t>
       </w:r>
-      <w:hyperlink w:history="1" r:id="rIdycu7a2clk5-hcs1jqzauk">
+      <w:hyperlink w:history="1" r:id="rIdg2umkt46a0izytarpzsjc">
         <w:r>
           <w:rPr>
             <w:rStyle w:val="Hyperlink"/>

</xml_diff>

<commit_message>
Session dates, PESTEL criteria search as proposal step with mandatory sources, industry source list template, numbers presented in slides
Co-Authored-By: Claude Sonnet 5.5 <noreply@anthropic.com>
Claude-Session: https://claude.ai/code/session_01RkWScMhuRmEB4zppSmB7Ri
</commit_message>
<xml_diff>
--- a/WT26-27/Student Brief Midterm Presentation WT26-27.docx
+++ b/WT26-27/Student Brief Midterm Presentation WT26-27.docx
@@ -579,7 +579,7 @@
                 <w:sz w:val="16"/>
                 <w:szCs w:val="16"/>
               </w:rPr>
-              <w:t xml:space="preserve">Sessions 3 and 4: an online Zoom coaching session of 20 minutes per group (see section 12).</w:t>
+              <w:t xml:space="preserve">Session 3 (Mon 19 Oct) and session 4 (Mon 9 Nov): an online Zoom coaching session of 20 minutes per group (see section 12).</w:t>
             </w:r>
           </w:p>
         </w:tc>
@@ -2567,7 +2567,7 @@
           <w:sz w:val="19"/>
           <w:szCs w:val="19"/>
         </w:rPr>
-        <w:t xml:space="preserve">. For each PESTEL dimension search for indicators that could matter for Julius Meinl, check whether data exist for all six countries, name the source and the latest year, and shortlist the best ones. Questions about the sheet go to arne.floh@wu.ac.at. </w:t>
+        <w:t xml:space="preserve">. For each PESTEL dimension search for criteria (indicators) that could describe the six countries for Julius Meinl. For every criterion give the definition, unit, direction, the </w:t>
       </w:r>
       <w:r>
         <w:rPr>
@@ -2577,6 +2577,24 @@
           <w:sz w:val="19"/>
           <w:szCs w:val="19"/>
         </w:rPr>
+        <w:t xml:space="preserve">source name and a working link</w:t>
+      </w:r>
+      <w:r>
+        <w:rPr>
+          <w:rFonts w:ascii="Verdana" w:cs="Verdana" w:eastAsia="Verdana" w:hAnsi="Verdana"/>
+          <w:sz w:val="19"/>
+          <w:szCs w:val="19"/>
+        </w:rPr>
+        <w:t xml:space="preserve">, and the steps another group needs to find the data. Check that data exist for all six countries. The source is essential: if your criterion is selected, the groups of the other five countries must find the numbers for their countries with your instructions. Questions about the sheet go to arne.floh@wu.ac.at. </w:t>
+      </w:r>
+      <w:r>
+        <w:rPr>
+          <w:rFonts w:ascii="Verdana" w:cs="Verdana" w:eastAsia="Verdana" w:hAnsi="Verdana"/>
+          <w:b/>
+          <w:bCs/>
+          <w:sz w:val="19"/>
+          <w:szCs w:val="19"/>
+        </w:rPr>
         <w:t xml:space="preserve">Hand in:</w:t>
       </w:r>
       <w:r>
@@ -2585,7 +2603,7 @@
           <w:sz w:val="19"/>
           <w:szCs w:val="19"/>
         </w:rPr>
-        <w:t xml:space="preserve"> your completed copy of the sheet. The instructor uses the shortlists to confirm or adjust the common indicator set in section 5 </w:t>
+        <w:t xml:space="preserve"> your completed copy of the sheet by </w:t>
       </w:r>
       <w:r>
         <w:rPr>
@@ -2602,7 +2620,7 @@
           <w:sz w:val="19"/>
           <w:szCs w:val="19"/>
         </w:rPr>
-        <w:t xml:space="preserve">.</w:t>
+        <w:t xml:space="preserve">. The instructor merges the proposals of all groups and selects the final criteria: 5 political, 10 economic, 10 social, 10 technological, 5 environmental and 5 legal (section 5). Then the shared sheet "Country scoring model" is published with the selected criteria.</w:t>
       </w:r>
     </w:p>
     <w:p>
@@ -2646,7 +2664,7 @@
           <w:sz w:val="19"/>
           <w:szCs w:val="19"/>
         </w:rPr>
-        <w:t xml:space="preserve">: 45 indicators grouped under the six PESTEL dimensions (section 5). </w:t>
+        <w:t xml:space="preserve">: the 45 indicators the instructor selected from the group proposals, grouped under the six PESTEL dimensions (section 5). </w:t>
       </w:r>
       <w:r>
         <w:rPr>
@@ -4899,7 +4917,7 @@
         <w:rPr>
           <w:rFonts w:ascii="Verdana" w:cs="Verdana" w:eastAsia="Verdana" w:hAnsi="Verdana"/>
         </w:rPr>
-        <w:t xml:space="preserve">5  The common criteria, grouped by PESTEL</w:t>
+        <w:t xml:space="preserve">5  The common criteria, grouped by PESTEL (example list)</w:t>
       </w:r>
     </w:p>
     <w:p>
@@ -4912,7 +4930,7 @@
           <w:sz w:val="19"/>
           <w:szCs w:val="19"/>
         </w:rPr>
-        <w:t xml:space="preserve">Forty-five indicators in total, the same for all groups (proposal; the instructor confirms the final set after Step 1). The weight of a dimension is split equally among its indicators. Units, definitions and sources are on the Indicators sheet of the Google Sheet; rubric scores (R) follow the Rubrics sheet.</w:t>
+        <w:t xml:space="preserve">The final criteria are selected by the instructor from the proposals of all groups (Step 1): 5 political, 10 economic, 10 social, 10 technological, 5 environmental and 5 legal, 45 in total. The list below is the instructor's example list that starts the search; the selected list may differ. The weight of a dimension is split equally among its indicators. Units, definitions and sources are on the Indicators sheet of the Google Sheet; rubric scores (R) follow the Rubrics sheet.</w:t>
       </w:r>
     </w:p>
     <w:tbl>
@@ -7389,7 +7407,7 @@
           <w:sz w:val="19"/>
           <w:szCs w:val="19"/>
         </w:rPr>
-        <w:t xml:space="preserve"> Every figure needs value, unit, year, source and link. Use the most recent year available. If no figure exists, say so and use a transparent estimate or proxy (for example Google Maps count of cafes in the capital, with date and method) and label it as an estimate. Compare sources when they disagree. Mark the quality of each figure (official statistic, industry report, own count or estimate).</w:t>
+        <w:t xml:space="preserve"> Every figure needs value, unit, year, source and link. Use the most recent year available. If no figure exists, say so and use a transparent estimate or proxy (for example Google Maps count of cafes in the capital, with date and method) and label it as an estimate. Compare sources when they disagree. Mark the source type of each figure (official statistic, industry report, own count or estimate) in the source list.</w:t>
       </w:r>
     </w:p>
     <w:p>
@@ -7435,7 +7453,43 @@
           <w:sz w:val="19"/>
           <w:szCs w:val="19"/>
         </w:rPr>
-        <w:t xml:space="preserve"> the industry sheet in Excel (one row per statistic: segment, statistic, value, unit, year, source and link, quality) and three to five slides: an overview of the industry, key figures per segment (use charts and tables), and the main trends. Close with the implication for Julius Meinl: where is there room for a Viennese coffee house brand, and where is none?</w:t>
+        <w:t xml:space="preserve"> (1) the PowerPoint slides: </w:t>
+      </w:r>
+      <w:r>
+        <w:rPr>
+          <w:rFonts w:ascii="Verdana" w:cs="Verdana" w:eastAsia="Verdana" w:hAnsi="Verdana"/>
+          <w:b/>
+          <w:bCs/>
+          <w:sz w:val="19"/>
+          <w:szCs w:val="19"/>
+        </w:rPr>
+        <w:t xml:space="preserve">all numbers are presented in the slides</w:t>
+      </w:r>
+      <w:r>
+        <w:rPr>
+          <w:rFonts w:ascii="Verdana" w:cs="Verdana" w:eastAsia="Verdana" w:hAnsi="Verdana"/>
+          <w:sz w:val="19"/>
+          <w:szCs w:val="19"/>
+        </w:rPr>
+        <w:t xml:space="preserve">, three to five slides with an overview of the industry, key figures per segment (use charts and tables) and the main trends, closing with the implication for Julius Meinl (where is there room for a Viennese coffee house brand, and where is none?); (2) a </w:t>
+      </w:r>
+      <w:r>
+        <w:rPr>
+          <w:rFonts w:ascii="Verdana" w:cs="Verdana" w:eastAsia="Verdana" w:hAnsi="Verdana"/>
+          <w:b/>
+          <w:bCs/>
+          <w:sz w:val="19"/>
+          <w:szCs w:val="19"/>
+        </w:rPr>
+        <w:t xml:space="preserve">source list</w:t>
+      </w:r>
+      <w:r>
+        <w:rPr>
+          <w:rFonts w:ascii="Verdana" w:cs="Verdana" w:eastAsia="Verdana" w:hAnsi="Verdana"/>
+          <w:sz w:val="19"/>
+          <w:szCs w:val="19"/>
+        </w:rPr>
+        <w:t xml:space="preserve"> in Excel or Google Sheets (template "Industry sources") with one row per number or fact on your slides: segment, statistic, value, unit, year, source, source type, link, date accessed, slide number and quality.</w:t>
       </w:r>
     </w:p>
     <w:p>
@@ -8093,7 +8147,24 @@
           <w:sz w:val="19"/>
           <w:szCs w:val="19"/>
         </w:rPr>
-        <w:t xml:space="preserve"> (hand-in): a short workbook with (1) a copy of your country's data and sources, (2) the Part B industry sheet (statistics by segment with unit, year, source and link; value-chain notes; brand and price scan) and (3) a list of the AI tools you used. Sources need URL, date accessed and who collected the data. Results come from formulas, not pasted values; inputs and formulas are visibly different.</w:t>
+        <w:t xml:space="preserve"> (hand-in): a short workbook with (1) a copy of your country's data and sources, (2) the Part B source list (template "Industry sources" </w:t>
+      </w:r>
+      <w:r>
+        <w:rPr>
+          <w:rFonts w:ascii="Verdana" w:cs="Verdana" w:eastAsia="Verdana" w:hAnsi="Verdana"/>
+          <w:sz w:val="19"/>
+          <w:szCs w:val="19"/>
+          <w:highlight w:val="yellow"/>
+        </w:rPr>
+        <w:t xml:space="preserve">[link to be added]</w:t>
+      </w:r>
+      <w:r>
+        <w:rPr>
+          <w:rFonts w:ascii="Verdana" w:cs="Verdana" w:eastAsia="Verdana" w:hAnsi="Verdana"/>
+          <w:sz w:val="19"/>
+          <w:szCs w:val="19"/>
+        </w:rPr>
+        <w:t xml:space="preserve">): every source behind the numbers on your industry slides, and (3) a list of the AI tools you used. The industry numbers themselves are shown in the presentation. Sources need URL, date accessed and who collected the data. Results come from formulas, not pasted values; inputs and formulas are visibly different.</w:t>
       </w:r>
     </w:p>
     <w:p>
@@ -9161,7 +9232,24 @@
                 <w:sz w:val="16"/>
                 <w:szCs w:val="16"/>
               </w:rPr>
-              <w:t xml:space="preserve">PESTEL indicator sheet with shortlist; data plan for your country; weighting method chosen</w:t>
+              <w:t xml:space="preserve">PESTEL indicator sheet completed (proposed criteria with sources) by </w:t>
+            </w:r>
+            <w:r>
+              <w:rPr>
+                <w:rFonts w:ascii="Verdana" w:cs="Verdana" w:eastAsia="Verdana" w:hAnsi="Verdana"/>
+                <w:sz w:val="16"/>
+                <w:szCs w:val="16"/>
+                <w:highlight w:val="yellow"/>
+              </w:rPr>
+              <w:t xml:space="preserve">[date]</w:t>
+            </w:r>
+            <w:r>
+              <w:rPr>
+                <w:rFonts w:ascii="Verdana" w:cs="Verdana" w:eastAsia="Verdana" w:hAnsi="Verdana"/>
+                <w:sz w:val="16"/>
+                <w:szCs w:val="16"/>
+              </w:rPr>
+              <w:t xml:space="preserve">; data plan for your country</w:t>
             </w:r>
           </w:p>
         </w:tc>
@@ -9202,6 +9290,14 @@
               </w:rPr>
               <w:t xml:space="preserve">Session 3</w:t>
             </w:r>
+            <w:r>
+              <w:rPr>
+                <w:rFonts w:ascii="Verdana" w:cs="Verdana" w:eastAsia="Verdana" w:hAnsi="Verdana"/>
+                <w:sz w:val="16"/>
+                <w:szCs w:val="16"/>
+              </w:rPr>
+              <w:t xml:space="preserve"> (Mon 19 Oct)</w:t>
+            </w:r>
           </w:p>
         </w:tc>
         <w:tc>
@@ -9301,7 +9397,7 @@
                 <w:sz w:val="16"/>
                 <w:szCs w:val="16"/>
               </w:rPr>
-              <w:t xml:space="preserve">Instructor publishes the common criteria and the shared data file </w:t>
+              <w:t xml:space="preserve">Instructor merges the proposals, selects the final criteria and publishes the shared Country scoring model </w:t>
             </w:r>
             <w:r>
               <w:rPr>
@@ -9421,6 +9517,14 @@
               </w:rPr>
               <w:t xml:space="preserve">Session 4</w:t>
             </w:r>
+            <w:r>
+              <w:rPr>
+                <w:rFonts w:ascii="Verdana" w:cs="Verdana" w:eastAsia="Verdana" w:hAnsi="Verdana"/>
+                <w:sz w:val="16"/>
+                <w:szCs w:val="16"/>
+              </w:rPr>
+              <w:t xml:space="preserve"> (Mon 9 Nov)</w:t>
+            </w:r>
           </w:p>
         </w:tc>
         <w:tc>
@@ -9491,6 +9595,14 @@
               </w:rPr>
               <w:t xml:space="preserve">Between sessions 4 and 5</w:t>
             </w:r>
+            <w:r>
+              <w:rPr>
+                <w:rFonts w:ascii="Verdana" w:cs="Verdana" w:eastAsia="Verdana" w:hAnsi="Verdana"/>
+                <w:sz w:val="16"/>
+                <w:szCs w:val="16"/>
+              </w:rPr>
+              <w:t xml:space="preserve"> (9 to 16 Nov)</w:t>
+            </w:r>
           </w:p>
         </w:tc>
         <w:tc>
@@ -9560,6 +9672,14 @@
                 <w:szCs w:val="16"/>
               </w:rPr>
               <w:t xml:space="preserve">Session 5</w:t>
+            </w:r>
+            <w:r>
+              <w:rPr>
+                <w:rFonts w:ascii="Verdana" w:cs="Verdana" w:eastAsia="Verdana" w:hAnsi="Verdana"/>
+                <w:sz w:val="16"/>
+                <w:szCs w:val="16"/>
+              </w:rPr>
+              <w:t xml:space="preserve"> (Mon 16 Nov, 08:00)</w:t>
             </w:r>
           </w:p>
         </w:tc>
@@ -9881,7 +10001,7 @@
       <w:pPr>
         <w:spacing w:after="140"/>
       </w:pPr>
-      <w:hyperlink w:history="1" r:id="rIdtieajn38ow9eqjksk3e9a">
+      <w:hyperlink w:history="1" r:id="rIdim7dbjsr4crdgtmtnl2ey">
         <w:r>
           <w:rPr>
             <w:rStyle w:val="Hyperlink"/>
@@ -9927,7 +10047,7 @@
         </w:rPr>
         <w:t xml:space="preserve">JRC: 10-step pocket guide to composite indicators (free): </w:t>
       </w:r>
-      <w:hyperlink w:history="1" r:id="rIdqf_fixkhfy_kgjk4jikyh">
+      <w:hyperlink w:history="1" r:id="rIdwoy6cycpdaoslhuitbxja">
         <w:r>
           <w:rPr>
             <w:rStyle w:val="Hyperlink"/>
@@ -9956,7 +10076,7 @@
         </w:rPr>
         <w:t xml:space="preserve">OECD/JRC: Handbook on constructing composite indicators (free): </w:t>
       </w:r>
-      <w:hyperlink w:history="1" r:id="rIdxutbqz5etme4aalnoppdp">
+      <w:hyperlink w:history="1" r:id="rId25c-oq4tdsmwvzr8ckgo6">
         <w:r>
           <w:rPr>
             <w:rStyle w:val="Hyperlink"/>
@@ -9985,7 +10105,7 @@
         </w:rPr>
         <w:t xml:space="preserve">Greco et al. (2019): weighting and aggregation in composite indices (open access): </w:t>
       </w:r>
-      <w:hyperlink w:history="1" r:id="rId9za9qxungllrc2r4h9vyz">
+      <w:hyperlink w:history="1" r:id="rIdghs-a_u93mzlow26zyns4">
         <w:r>
           <w:rPr>
             <w:rStyle w:val="Hyperlink"/>
@@ -10014,7 +10134,7 @@
         </w:rPr>
         <w:t xml:space="preserve">BPMSG: AHP Excel template (free): </w:t>
       </w:r>
-      <w:hyperlink w:history="1" r:id="rIdoprvpdgahftycgwymj03-">
+      <w:hyperlink w:history="1" r:id="rIdamclggtyjcs2c7nds56fi">
         <w:r>
           <w:rPr>
             <w:rStyle w:val="Hyperlink"/>
@@ -10043,7 +10163,7 @@
         </w:rPr>
         <w:t xml:space="preserve">Best-Worst Method solvers (free): </w:t>
       </w:r>
-      <w:hyperlink w:history="1" r:id="rIdmoij2cgh9tmam2zpvy_5x">
+      <w:hyperlink w:history="1" r:id="rIdgdh9qvmiosmi9duqis9iu">
         <w:r>
           <w:rPr>
             <w:rStyle w:val="Hyperlink"/>
@@ -10072,7 +10192,7 @@
         </w:rPr>
         <w:t xml:space="preserve">JRC COIN Tool, Excel composite indicators (free): </w:t>
       </w:r>
-      <w:hyperlink w:history="1" r:id="rIdppk4uaozdqfbeoibmcrk4">
+      <w:hyperlink w:history="1" r:id="rId_u_q3uetjafu_hbsmsonw">
         <w:r>
           <w:rPr>
             <w:rStyle w:val="Hyperlink"/>
@@ -10118,7 +10238,7 @@
         </w:rPr>
         <w:t xml:space="preserve">globalEDGE Market Potential Index: eight dimensions with published weights (25, 15, 12.5, 12.5, 10, 10, 7.5, 7.5): </w:t>
       </w:r>
-      <w:hyperlink w:history="1" r:id="rIdurm5vylaktfnkk24fu_7d">
+      <w:hyperlink w:history="1" r:id="rIdun5ljxrmzwoinyffvcwh1">
         <w:r>
           <w:rPr>
             <w:rStyle w:val="Hyperlink"/>
@@ -10147,7 +10267,7 @@
         </w:rPr>
         <w:t xml:space="preserve">Cavusgil (1997): measuring the potential of emerging markets (WU library): </w:t>
       </w:r>
-      <w:hyperlink w:history="1" r:id="rIdae8krv_5jkfxq7scjanzl">
+      <w:hyperlink w:history="1" r:id="rIdrk1pavcyhbk29d1-s8sri">
         <w:r>
           <w:rPr>
             <w:rStyle w:val="Hyperlink"/>
@@ -10176,7 +10296,7 @@
         </w:rPr>
         <w:t xml:space="preserve">Ghemawat (2001): Distance still matters, the CAGE framework (WU library): </w:t>
       </w:r>
-      <w:hyperlink w:history="1" r:id="rId77iom5bl5xrqrickozxqf">
+      <w:hyperlink w:history="1" r:id="rIdswetbb_iro7-zhxw4vols">
         <w:r>
           <w:rPr>
             <w:rStyle w:val="Hyperlink"/>
@@ -10205,7 +10325,7 @@
         </w:rPr>
         <w:t xml:space="preserve">Musso and Francioni: how smaller firms select foreign markets (open access): </w:t>
       </w:r>
-      <w:hyperlink w:history="1" r:id="rId3qxs6ncnhkl6lqnnwclfq">
+      <w:hyperlink w:history="1" r:id="rIdyaxmyjkfv26vhq4jj-7jy">
         <w:r>
           <w:rPr>
             <w:rStyle w:val="Hyperlink"/>
@@ -10234,7 +10354,7 @@
         </w:rPr>
         <w:t xml:space="preserve">Pollesch and Dale (2016): normalisation choices (WU library): </w:t>
       </w:r>
-      <w:hyperlink w:history="1" r:id="rIdypy2za6aztvw7zalmpif7">
+      <w:hyperlink w:history="1" r:id="rIddtcrsk9vr2r06hjonxw7v">
         <w:r>
           <w:rPr>
             <w:rStyle w:val="Hyperlink"/>
@@ -10280,7 +10400,7 @@
         </w:rPr>
         <w:t xml:space="preserve">ITC Export Potential Map, methodology (free): </w:t>
       </w:r>
-      <w:hyperlink w:history="1" r:id="rIdi8lfg85ka9xs7pjvbgn0h">
+      <w:hyperlink w:history="1" r:id="rIdko46l4-olmx0p9d_ny4gc">
         <w:r>
           <w:rPr>
             <w:rStyle w:val="Hyperlink"/>
@@ -10309,7 +10429,7 @@
         </w:rPr>
         <w:t xml:space="preserve">Kearney Global Retail Development Index (free): </w:t>
       </w:r>
-      <w:hyperlink w:history="1" r:id="rId5dumjd_rhrjmt_3xqngqd">
+      <w:hyperlink w:history="1" r:id="rIdhgi198c7wmpfgs7ijlcte">
         <w:r>
           <w:rPr>
             <w:rStyle w:val="Hyperlink"/>
@@ -10338,7 +10458,7 @@
         </w:rPr>
         <w:t xml:space="preserve">Eurazeo: International Expansion Playbook (free): </w:t>
       </w:r>
-      <w:hyperlink w:history="1" r:id="rIdty4f_mwp4af3flv0xo5ie">
+      <w:hyperlink w:history="1" r:id="rIdljegwihwfmte2x06e9epm">
         <w:r>
           <w:rPr>
             <w:rStyle w:val="Hyperlink"/>
@@ -10367,7 +10487,7 @@
         </w:rPr>
         <w:t xml:space="preserve">Optional case about coffee: The Espresso Lane to Global Markets, illy (Ivey Publishing, paid): </w:t>
       </w:r>
-      <w:hyperlink w:history="1" r:id="rIdpd0mhunhnu5nwsmkc2znt">
+      <w:hyperlink w:history="1" r:id="rIdpmz0wet3i4qnx45ozwebs">
         <w:r>
           <w:rPr>
             <w:rStyle w:val="Hyperlink"/>
@@ -10396,7 +10516,7 @@
         </w:rPr>
         <w:t xml:space="preserve">IFC PAYG Market Attractiveness Index, an Excel tool with user guide (free): </w:t>
       </w:r>
-      <w:hyperlink w:history="1" r:id="rId4ufiu7esbanak3vppx91x">
+      <w:hyperlink w:history="1" r:id="rId5ikmuivpsntmtmtey6uxu">
         <w:r>
           <w:rPr>
             <w:rStyle w:val="Hyperlink"/>
@@ -10442,7 +10562,7 @@
         </w:rPr>
         <w:t xml:space="preserve">World Bank World Development Indicators: </w:t>
       </w:r>
-      <w:hyperlink w:history="1" r:id="rId3_s-z3zkadfyeuuvjndhy">
+      <w:hyperlink w:history="1" r:id="rIdy-hrsdl9yrqv6sk2gcjlh">
         <w:r>
           <w:rPr>
             <w:rStyle w:val="Hyperlink"/>
@@ -10471,7 +10591,7 @@
         </w:rPr>
         <w:t xml:space="preserve">IMF World Economic Outlook: </w:t>
       </w:r>
-      <w:hyperlink w:history="1" r:id="rId8eli3p8oighttcxhgqem6">
+      <w:hyperlink w:history="1" r:id="rIdzs5zxnwcxu-wacxqhvnfk">
         <w:r>
           <w:rPr>
             <w:rStyle w:val="Hyperlink"/>
@@ -10500,7 +10620,7 @@
         </w:rPr>
         <w:t xml:space="preserve">World Bank Worldwide Governance Indicators: </w:t>
       </w:r>
-      <w:hyperlink w:history="1" r:id="rId3twc3i3r0m3ywrjgeswqi">
+      <w:hyperlink w:history="1" r:id="rIdhketzxoaqavgqunz3j_2r">
         <w:r>
           <w:rPr>
             <w:rStyle w:val="Hyperlink"/>
@@ -10529,7 +10649,7 @@
         </w:rPr>
         <w:t xml:space="preserve">EU Access2Markets (tariffs, requirements, rules of origin for EU exporters): </w:t>
       </w:r>
-      <w:hyperlink w:history="1" r:id="rIdv240xzyojmryfpajbehnl">
+      <w:hyperlink w:history="1" r:id="rIdt8bgtlzc0s3-pe2_rzphn">
         <w:r>
           <w:rPr>
             <w:rStyle w:val="Hyperlink"/>
@@ -10558,7 +10678,7 @@
         </w:rPr>
         <w:t xml:space="preserve">WTO tariff and trade data: </w:t>
       </w:r>
-      <w:hyperlink w:history="1" r:id="rIdzbjahliwjld_-flm_ob7m">
+      <w:hyperlink w:history="1" r:id="rIdiuzeih4bfqmxu8khc9k7f">
         <w:r>
           <w:rPr>
             <w:rStyle w:val="Hyperlink"/>
@@ -10587,7 +10707,7 @@
         </w:rPr>
         <w:t xml:space="preserve">CEPII Gravity database (distance, language; free login): </w:t>
       </w:r>
-      <w:hyperlink w:history="1" r:id="rId2xg7udap3guhtiesgprmp">
+      <w:hyperlink w:history="1" r:id="rIdajtbbsh-r-nemsg_djm89">
         <w:r>
           <w:rPr>
             <w:rStyle w:val="Hyperlink"/>
@@ -10616,7 +10736,7 @@
         </w:rPr>
         <w:t xml:space="preserve">Hofstede dimension data matrix: </w:t>
       </w:r>
-      <w:hyperlink w:history="1" r:id="rIdowq4dwyqyjafherhf6z-g">
+      <w:hyperlink w:history="1" r:id="rIdvqnlrhsl9lpm6aravqxzs">
         <w:r>
           <w:rPr>
             <w:rStyle w:val="Hyperlink"/>
@@ -10645,7 +10765,7 @@
         </w:rPr>
         <w:t xml:space="preserve">Coface country risk assessments: </w:t>
       </w:r>
-      <w:hyperlink w:history="1" r:id="rIdxsn2gx7suxc-ewgvafmu0">
+      <w:hyperlink w:history="1" r:id="rIdaie1pe9ydkdfhngvjgmsw">
         <w:r>
           <w:rPr>
             <w:rStyle w:val="Hyperlink"/>
@@ -10674,7 +10794,7 @@
         </w:rPr>
         <w:t xml:space="preserve">Euromonitor Passport and Statista (WU library; statista.com): </w:t>
       </w:r>
-      <w:hyperlink w:history="1" r:id="rId_ryycgbqjlqws7tyh8r8c">
+      <w:hyperlink w:history="1" r:id="rIdjmshw6yelyosxmke9q4p8">
         <w:r>
           <w:rPr>
             <w:rStyle w:val="Hyperlink"/>
@@ -10703,7 +10823,7 @@
         </w:rPr>
         <w:t xml:space="preserve">International Coffee Organization: coffee statistics: </w:t>
       </w:r>
-      <w:hyperlink w:history="1" r:id="rId6kik2scddzqsy7ompghlq">
+      <w:hyperlink w:history="1" r:id="rIdufa6rnxbxrlopxkacmdv9">
         <w:r>
           <w:rPr>
             <w:rStyle w:val="Hyperlink"/>
@@ -10732,7 +10852,7 @@
         </w:rPr>
         <w:t xml:space="preserve">USDA Foreign Agricultural Service: annual coffee reports by country (search for your countries): </w:t>
       </w:r>
-      <w:hyperlink w:history="1" r:id="rIdjyr9zfyfxuscjl8-ntehc">
+      <w:hyperlink w:history="1" r:id="rIdiut959ot_8b70g5lvyet5">
         <w:r>
           <w:rPr>
             <w:rStyle w:val="Hyperlink"/>
@@ -10761,7 +10881,7 @@
         </w:rPr>
         <w:t xml:space="preserve">UN Comtrade (comtradeplus.un.org) and ITC Trade Map (free login): coffee trade flows and tariffs, HS 0901: </w:t>
       </w:r>
-      <w:hyperlink w:history="1" r:id="rId2gakezouhv2jpcfoksnbb">
+      <w:hyperlink w:history="1" r:id="rId5dehjnnglprqycdifhcty">
         <w:r>
           <w:rPr>
             <w:rStyle w:val="Hyperlink"/>
@@ -10790,7 +10910,7 @@
         </w:rPr>
         <w:t xml:space="preserve">WKO AUSSENWIRTSCHAFT: reports and country profiles: </w:t>
       </w:r>
-      <w:hyperlink w:history="1" r:id="rIdg2umkt46a0izytarpzsjc">
+      <w:hyperlink w:history="1" r:id="rIdldvj69_9y2lwypbg3sm9p">
         <w:r>
           <w:rPr>
             <w:rStyle w:val="Hyperlink"/>

</xml_diff>

<commit_message>
Brief: remove starting resources section
Co-Authored-By: Claude Sonnet 5.5 <noreply@anthropic.com>
Claude-Session: https://claude.ai/code/session_01RkWScMhuRmEB4zppSmB7Ri
</commit_message>
<xml_diff>
--- a/WT26-27/Student Brief Midterm Presentation WT26-27.docx
+++ b/WT26-27/Student Brief Midterm Presentation WT26-27.docx
@@ -5991,7 +5991,7 @@
           <w:sz w:val="20"/>
           <w:szCs w:val="20"/>
         </w:rPr>
-        <w:t xml:space="preserve">The competitive landscape and the hotel dimension are covered qualitatively in Part B (industry analysis) and in your recommendation. Look up the current status of trade agreements and tariffs and record the date. Links to the data portals are in section 14.</w:t>
+        <w:t xml:space="preserve">The competitive landscape and the hotel dimension are covered qualitatively in Part B (industry analysis) and in your recommendation. Look up the current status of trade agreements and tariffs and record the date.</w:t>
       </w:r>
     </w:p>
     <w:p>
@@ -9971,956 +9971,6 @@
         </w:rPr>
         <w:t xml:space="preserve"> A recommendation includes the countries you would not enter now.</w:t>
       </w:r>
-    </w:p>
-    <w:p>
-      <w:pPr>
-        <w:pStyle w:val="Heading1"/>
-        <w:keepNext/>
-      </w:pPr>
-      <w:r>
-        <w:rPr>
-          <w:rFonts w:ascii="Verdana" w:cs="Verdana" w:eastAsia="Verdana" w:hAnsi="Verdana"/>
-        </w:rPr>
-        <w:t xml:space="preserve">14  Starting resources</w:t>
-      </w:r>
-    </w:p>
-    <w:p>
-      <w:pPr>
-        <w:spacing w:after="40" w:before="0" w:line="252"/>
-      </w:pPr>
-      <w:r>
-        <w:rPr>
-          <w:rFonts w:ascii="Verdana" w:cs="Verdana" w:eastAsia="Verdana" w:hAnsi="Verdana"/>
-          <w:sz w:val="19"/>
-          <w:szCs w:val="19"/>
-        </w:rPr>
-        <w:t xml:space="preserve">Selected from the instructor's background collection of 248 annotated sources: </w:t>
-      </w:r>
-    </w:p>
-    <w:p>
-      <w:pPr>
-        <w:spacing w:after="140"/>
-      </w:pPr>
-      <w:hyperlink w:history="1" r:id="rIdim7dbjsr4crdgtmtnl2ey">
-        <w:r>
-          <w:rPr>
-            <w:rStyle w:val="Hyperlink"/>
-            <w:rFonts w:ascii="Verdana" w:cs="Verdana" w:eastAsia="Verdana" w:hAnsi="Verdana"/>
-            <w:sz w:val="20"/>
-            <w:szCs w:val="20"/>
-          </w:rPr>
-          <w:t xml:space="preserve">github.com/arnefloh-wu/scoring-method-search</w:t>
-        </w:r>
-      </w:hyperlink>
-    </w:p>
-    <w:p>
-      <w:pPr>
-        <w:keepNext/>
-        <w:spacing w:after="30" w:before="70"/>
-      </w:pPr>
-      <w:r>
-        <w:rPr>
-          <w:rFonts w:ascii="Verdana" w:cs="Verdana" w:eastAsia="Verdana" w:hAnsi="Verdana"/>
-          <w:b/>
-          <w:bCs/>
-          <w:color w:val="002350"/>
-          <w:sz w:val="20"/>
-          <w:szCs w:val="20"/>
-        </w:rPr>
-        <w:t xml:space="preserve">Methods and guides</w:t>
-      </w:r>
-    </w:p>
-    <w:p>
-      <w:pPr>
-        <w:pStyle w:val="ListParagraph"/>
-        <w:numPr>
-          <w:ilvl w:val="0"/>
-          <w:numId w:val="2"/>
-        </w:numPr>
-        <w:spacing w:after="10" w:line="240"/>
-      </w:pPr>
-      <w:r>
-        <w:rPr>
-          <w:rFonts w:ascii="Verdana" w:cs="Verdana" w:eastAsia="Verdana" w:hAnsi="Verdana"/>
-          <w:sz w:val="14"/>
-          <w:szCs w:val="14"/>
-        </w:rPr>
-        <w:t xml:space="preserve">JRC: 10-step pocket guide to composite indicators (free): </w:t>
-      </w:r>
-      <w:hyperlink w:history="1" r:id="rIdwoy6cycpdaoslhuitbxja">
-        <w:r>
-          <w:rPr>
-            <w:rStyle w:val="Hyperlink"/>
-            <w:rFonts w:ascii="Verdana" w:cs="Verdana" w:eastAsia="Verdana" w:hAnsi="Verdana"/>
-            <w:sz w:val="12"/>
-            <w:szCs w:val="12"/>
-          </w:rPr>
-          <w:t xml:space="preserve">https://knowledge4policy.ec.europa.eu/composite-indicators/toolkit_en/your-10-step-pocket-guide-composite-indicators-scoreboards_en</w:t>
-        </w:r>
-      </w:hyperlink>
-    </w:p>
-    <w:p>
-      <w:pPr>
-        <w:pStyle w:val="ListParagraph"/>
-        <w:numPr>
-          <w:ilvl w:val="0"/>
-          <w:numId w:val="2"/>
-        </w:numPr>
-        <w:spacing w:after="10" w:line="240"/>
-      </w:pPr>
-      <w:r>
-        <w:rPr>
-          <w:rFonts w:ascii="Verdana" w:cs="Verdana" w:eastAsia="Verdana" w:hAnsi="Verdana"/>
-          <w:sz w:val="14"/>
-          <w:szCs w:val="14"/>
-        </w:rPr>
-        <w:t xml:space="preserve">OECD/JRC: Handbook on constructing composite indicators (free): </w:t>
-      </w:r>
-      <w:hyperlink w:history="1" r:id="rId25c-oq4tdsmwvzr8ckgo6">
-        <w:r>
-          <w:rPr>
-            <w:rStyle w:val="Hyperlink"/>
-            <w:rFonts w:ascii="Verdana" w:cs="Verdana" w:eastAsia="Verdana" w:hAnsi="Verdana"/>
-            <w:sz w:val="12"/>
-            <w:szCs w:val="12"/>
-          </w:rPr>
-          <w:t xml:space="preserve">https://doi.org/10.1787/9789264043466-en</w:t>
-        </w:r>
-      </w:hyperlink>
-    </w:p>
-    <w:p>
-      <w:pPr>
-        <w:pStyle w:val="ListParagraph"/>
-        <w:numPr>
-          <w:ilvl w:val="0"/>
-          <w:numId w:val="2"/>
-        </w:numPr>
-        <w:spacing w:after="10" w:line="240"/>
-      </w:pPr>
-      <w:r>
-        <w:rPr>
-          <w:rFonts w:ascii="Verdana" w:cs="Verdana" w:eastAsia="Verdana" w:hAnsi="Verdana"/>
-          <w:sz w:val="14"/>
-          <w:szCs w:val="14"/>
-        </w:rPr>
-        <w:t xml:space="preserve">Greco et al. (2019): weighting and aggregation in composite indices (open access): </w:t>
-      </w:r>
-      <w:hyperlink w:history="1" r:id="rIdghs-a_u93mzlow26zyns4">
-        <w:r>
-          <w:rPr>
-            <w:rStyle w:val="Hyperlink"/>
-            <w:rFonts w:ascii="Verdana" w:cs="Verdana" w:eastAsia="Verdana" w:hAnsi="Verdana"/>
-            <w:sz w:val="12"/>
-            <w:szCs w:val="12"/>
-          </w:rPr>
-          <w:t xml:space="preserve">https://doi.org/10.1007/s11205-017-1832-9</w:t>
-        </w:r>
-      </w:hyperlink>
-    </w:p>
-    <w:p>
-      <w:pPr>
-        <w:pStyle w:val="ListParagraph"/>
-        <w:numPr>
-          <w:ilvl w:val="0"/>
-          <w:numId w:val="2"/>
-        </w:numPr>
-        <w:spacing w:after="10" w:line="240"/>
-      </w:pPr>
-      <w:r>
-        <w:rPr>
-          <w:rFonts w:ascii="Verdana" w:cs="Verdana" w:eastAsia="Verdana" w:hAnsi="Verdana"/>
-          <w:sz w:val="14"/>
-          <w:szCs w:val="14"/>
-        </w:rPr>
-        <w:t xml:space="preserve">BPMSG: AHP Excel template (free): </w:t>
-      </w:r>
-      <w:hyperlink w:history="1" r:id="rIdamclggtyjcs2c7nds56fi">
-        <w:r>
-          <w:rPr>
-            <w:rStyle w:val="Hyperlink"/>
-            <w:rFonts w:ascii="Verdana" w:cs="Verdana" w:eastAsia="Verdana" w:hAnsi="Verdana"/>
-            <w:sz w:val="12"/>
-            <w:szCs w:val="12"/>
-          </w:rPr>
-          <w:t xml:space="preserve">https://bpmsg.com/new-ahp-excel-template-with-multiple-inputs/</w:t>
-        </w:r>
-      </w:hyperlink>
-    </w:p>
-    <w:p>
-      <w:pPr>
-        <w:pStyle w:val="ListParagraph"/>
-        <w:numPr>
-          <w:ilvl w:val="0"/>
-          <w:numId w:val="2"/>
-        </w:numPr>
-        <w:spacing w:after="10" w:line="240"/>
-      </w:pPr>
-      <w:r>
-        <w:rPr>
-          <w:rFonts w:ascii="Verdana" w:cs="Verdana" w:eastAsia="Verdana" w:hAnsi="Verdana"/>
-          <w:sz w:val="14"/>
-          <w:szCs w:val="14"/>
-        </w:rPr>
-        <w:t xml:space="preserve">Best-Worst Method solvers (free): </w:t>
-      </w:r>
-      <w:hyperlink w:history="1" r:id="rIdgdh9qvmiosmi9duqis9iu">
-        <w:r>
-          <w:rPr>
-            <w:rStyle w:val="Hyperlink"/>
-            <w:rFonts w:ascii="Verdana" w:cs="Verdana" w:eastAsia="Verdana" w:hAnsi="Verdana"/>
-            <w:sz w:val="12"/>
-            <w:szCs w:val="12"/>
-          </w:rPr>
-          <w:t xml:space="preserve">https://bestworstmethod.com/</w:t>
-        </w:r>
-      </w:hyperlink>
-    </w:p>
-    <w:p>
-      <w:pPr>
-        <w:pStyle w:val="ListParagraph"/>
-        <w:numPr>
-          <w:ilvl w:val="0"/>
-          <w:numId w:val="2"/>
-        </w:numPr>
-        <w:spacing w:after="10" w:line="240"/>
-      </w:pPr>
-      <w:r>
-        <w:rPr>
-          <w:rFonts w:ascii="Verdana" w:cs="Verdana" w:eastAsia="Verdana" w:hAnsi="Verdana"/>
-          <w:sz w:val="14"/>
-          <w:szCs w:val="14"/>
-        </w:rPr>
-        <w:t xml:space="preserve">JRC COIN Tool, Excel composite indicators (free): </w:t>
-      </w:r>
-      <w:hyperlink w:history="1" r:id="rId_u_q3uetjafu_hbsmsonw">
-        <w:r>
-          <w:rPr>
-            <w:rStyle w:val="Hyperlink"/>
-            <w:rFonts w:ascii="Verdana" w:cs="Verdana" w:eastAsia="Verdana" w:hAnsi="Verdana"/>
-            <w:sz w:val="12"/>
-            <w:szCs w:val="12"/>
-          </w:rPr>
-          <w:t xml:space="preserve">https://knowledge4policy.ec.europa.eu/composite-indicators/coin-tool_en</w:t>
-        </w:r>
-      </w:hyperlink>
-    </w:p>
-    <w:p>
-      <w:pPr>
-        <w:keepNext/>
-        <w:spacing w:after="30" w:before="70"/>
-      </w:pPr>
-      <w:r>
-        <w:rPr>
-          <w:rFonts w:ascii="Verdana" w:cs="Verdana" w:eastAsia="Verdana" w:hAnsi="Verdana"/>
-          <w:b/>
-          <w:bCs/>
-          <w:color w:val="002350"/>
-          <w:sz w:val="20"/>
-          <w:szCs w:val="20"/>
-        </w:rPr>
-        <w:t xml:space="preserve">Market selection logic</w:t>
-      </w:r>
-    </w:p>
-    <w:p>
-      <w:pPr>
-        <w:pStyle w:val="ListParagraph"/>
-        <w:numPr>
-          <w:ilvl w:val="0"/>
-          <w:numId w:val="2"/>
-        </w:numPr>
-        <w:spacing w:after="10" w:line="240"/>
-      </w:pPr>
-      <w:r>
-        <w:rPr>
-          <w:rFonts w:ascii="Verdana" w:cs="Verdana" w:eastAsia="Verdana" w:hAnsi="Verdana"/>
-          <w:sz w:val="14"/>
-          <w:szCs w:val="14"/>
-        </w:rPr>
-        <w:t xml:space="preserve">globalEDGE Market Potential Index: eight dimensions with published weights (25, 15, 12.5, 12.5, 10, 10, 7.5, 7.5): </w:t>
-      </w:r>
-      <w:hyperlink w:history="1" r:id="rIdun5ljxrmzwoinyffvcwh1">
-        <w:r>
-          <w:rPr>
-            <w:rStyle w:val="Hyperlink"/>
-            <w:rFonts w:ascii="Verdana" w:cs="Verdana" w:eastAsia="Verdana" w:hAnsi="Verdana"/>
-            <w:sz w:val="12"/>
-            <w:szCs w:val="12"/>
-          </w:rPr>
-          <w:t xml:space="preserve">https://globaledge.msu.edu/mpi</w:t>
-        </w:r>
-      </w:hyperlink>
-    </w:p>
-    <w:p>
-      <w:pPr>
-        <w:pStyle w:val="ListParagraph"/>
-        <w:numPr>
-          <w:ilvl w:val="0"/>
-          <w:numId w:val="2"/>
-        </w:numPr>
-        <w:spacing w:after="10" w:line="240"/>
-      </w:pPr>
-      <w:r>
-        <w:rPr>
-          <w:rFonts w:ascii="Verdana" w:cs="Verdana" w:eastAsia="Verdana" w:hAnsi="Verdana"/>
-          <w:sz w:val="14"/>
-          <w:szCs w:val="14"/>
-        </w:rPr>
-        <w:t xml:space="preserve">Cavusgil (1997): measuring the potential of emerging markets (WU library): </w:t>
-      </w:r>
-      <w:hyperlink w:history="1" r:id="rIdrk1pavcyhbk29d1-s8sri">
-        <w:r>
-          <w:rPr>
-            <w:rStyle w:val="Hyperlink"/>
-            <w:rFonts w:ascii="Verdana" w:cs="Verdana" w:eastAsia="Verdana" w:hAnsi="Verdana"/>
-            <w:sz w:val="12"/>
-            <w:szCs w:val="12"/>
-          </w:rPr>
-          <w:t xml:space="preserve">https://doi.org/10.1016/S0007-6813%2897%2990030-6</w:t>
-        </w:r>
-      </w:hyperlink>
-    </w:p>
-    <w:p>
-      <w:pPr>
-        <w:pStyle w:val="ListParagraph"/>
-        <w:numPr>
-          <w:ilvl w:val="0"/>
-          <w:numId w:val="2"/>
-        </w:numPr>
-        <w:spacing w:after="10" w:line="240"/>
-      </w:pPr>
-      <w:r>
-        <w:rPr>
-          <w:rFonts w:ascii="Verdana" w:cs="Verdana" w:eastAsia="Verdana" w:hAnsi="Verdana"/>
-          <w:sz w:val="14"/>
-          <w:szCs w:val="14"/>
-        </w:rPr>
-        <w:t xml:space="preserve">Ghemawat (2001): Distance still matters, the CAGE framework (WU library): </w:t>
-      </w:r>
-      <w:hyperlink w:history="1" r:id="rIdswetbb_iro7-zhxw4vols">
-        <w:r>
-          <w:rPr>
-            <w:rStyle w:val="Hyperlink"/>
-            <w:rFonts w:ascii="Verdana" w:cs="Verdana" w:eastAsia="Verdana" w:hAnsi="Verdana"/>
-            <w:sz w:val="12"/>
-            <w:szCs w:val="12"/>
-          </w:rPr>
-          <w:t xml:space="preserve">https://hbr.org/2001/09/distance-still-matters-the-hard-reality-of-global-expansion</w:t>
-        </w:r>
-      </w:hyperlink>
-    </w:p>
-    <w:p>
-      <w:pPr>
-        <w:pStyle w:val="ListParagraph"/>
-        <w:numPr>
-          <w:ilvl w:val="0"/>
-          <w:numId w:val="2"/>
-        </w:numPr>
-        <w:spacing w:after="10" w:line="240"/>
-      </w:pPr>
-      <w:r>
-        <w:rPr>
-          <w:rFonts w:ascii="Verdana" w:cs="Verdana" w:eastAsia="Verdana" w:hAnsi="Verdana"/>
-          <w:sz w:val="14"/>
-          <w:szCs w:val="14"/>
-        </w:rPr>
-        <w:t xml:space="preserve">Musso and Francioni: how smaller firms select foreign markets (open access): </w:t>
-      </w:r>
-      <w:hyperlink w:history="1" r:id="rIdyaxmyjkfv26vhq4jj-7jy">
-        <w:r>
-          <w:rPr>
-            <w:rStyle w:val="Hyperlink"/>
-            <w:rFonts w:ascii="Verdana" w:cs="Verdana" w:eastAsia="Verdana" w:hAnsi="Verdana"/>
-            <w:sz w:val="12"/>
-            <w:szCs w:val="12"/>
-          </w:rPr>
-          <w:t xml:space="preserve">https://doi.org/10.5539/ijms.v4n6p44</w:t>
-        </w:r>
-      </w:hyperlink>
-    </w:p>
-    <w:p>
-      <w:pPr>
-        <w:pStyle w:val="ListParagraph"/>
-        <w:numPr>
-          <w:ilvl w:val="0"/>
-          <w:numId w:val="2"/>
-        </w:numPr>
-        <w:spacing w:after="10" w:line="240"/>
-      </w:pPr>
-      <w:r>
-        <w:rPr>
-          <w:rFonts w:ascii="Verdana" w:cs="Verdana" w:eastAsia="Verdana" w:hAnsi="Verdana"/>
-          <w:sz w:val="14"/>
-          <w:szCs w:val="14"/>
-        </w:rPr>
-        <w:t xml:space="preserve">Pollesch and Dale (2016): normalisation choices (WU library): </w:t>
-      </w:r>
-      <w:hyperlink w:history="1" r:id="rIddtcrsk9vr2r06hjonxw7v">
-        <w:r>
-          <w:rPr>
-            <w:rStyle w:val="Hyperlink"/>
-            <w:rFonts w:ascii="Verdana" w:cs="Verdana" w:eastAsia="Verdana" w:hAnsi="Verdana"/>
-            <w:sz w:val="12"/>
-            <w:szCs w:val="12"/>
-          </w:rPr>
-          <w:t xml:space="preserve">https://doi.org/10.1016/j.ecolecon.2016.06.018</w:t>
-        </w:r>
-      </w:hyperlink>
-    </w:p>
-    <w:p>
-      <w:pPr>
-        <w:keepNext/>
-        <w:spacing w:after="30" w:before="70"/>
-      </w:pPr>
-      <w:r>
-        <w:rPr>
-          <w:rFonts w:ascii="Verdana" w:cs="Verdana" w:eastAsia="Verdana" w:hAnsi="Verdana"/>
-          <w:b/>
-          <w:bCs/>
-          <w:color w:val="002350"/>
-          <w:sz w:val="20"/>
-          <w:szCs w:val="20"/>
-        </w:rPr>
-        <w:t xml:space="preserve">Benchmarks and examples</w:t>
-      </w:r>
-    </w:p>
-    <w:p>
-      <w:pPr>
-        <w:pStyle w:val="ListParagraph"/>
-        <w:numPr>
-          <w:ilvl w:val="0"/>
-          <w:numId w:val="2"/>
-        </w:numPr>
-        <w:spacing w:after="10" w:line="240"/>
-      </w:pPr>
-      <w:r>
-        <w:rPr>
-          <w:rFonts w:ascii="Verdana" w:cs="Verdana" w:eastAsia="Verdana" w:hAnsi="Verdana"/>
-          <w:sz w:val="14"/>
-          <w:szCs w:val="14"/>
-        </w:rPr>
-        <w:t xml:space="preserve">ITC Export Potential Map, methodology (free): </w:t>
-      </w:r>
-      <w:hyperlink w:history="1" r:id="rIdko46l4-olmx0p9d_ny4gc">
-        <w:r>
-          <w:rPr>
-            <w:rStyle w:val="Hyperlink"/>
-            <w:rFonts w:ascii="Verdana" w:cs="Verdana" w:eastAsia="Verdana" w:hAnsi="Verdana"/>
-            <w:sz w:val="12"/>
-            <w:szCs w:val="12"/>
-          </w:rPr>
-          <w:t xml:space="preserve">https://umbraco.exportpotential.intracen.org/media/cklh2pi5/epa-methodology_230627.pdf</w:t>
-        </w:r>
-      </w:hyperlink>
-    </w:p>
-    <w:p>
-      <w:pPr>
-        <w:pStyle w:val="ListParagraph"/>
-        <w:numPr>
-          <w:ilvl w:val="0"/>
-          <w:numId w:val="2"/>
-        </w:numPr>
-        <w:spacing w:after="10" w:line="240"/>
-      </w:pPr>
-      <w:r>
-        <w:rPr>
-          <w:rFonts w:ascii="Verdana" w:cs="Verdana" w:eastAsia="Verdana" w:hAnsi="Verdana"/>
-          <w:sz w:val="14"/>
-          <w:szCs w:val="14"/>
-        </w:rPr>
-        <w:t xml:space="preserve">Kearney Global Retail Development Index (free): </w:t>
-      </w:r>
-      <w:hyperlink w:history="1" r:id="rIdhgi198c7wmpfgs7ijlcte">
-        <w:r>
-          <w:rPr>
-            <w:rStyle w:val="Hyperlink"/>
-            <w:rFonts w:ascii="Verdana" w:cs="Verdana" w:eastAsia="Verdana" w:hAnsi="Verdana"/>
-            <w:sz w:val="12"/>
-            <w:szCs w:val="12"/>
-          </w:rPr>
-          <w:t xml:space="preserve">https://www.kearney.com/industry/consumer-retail/global-retail-development-index</w:t>
-        </w:r>
-      </w:hyperlink>
-    </w:p>
-    <w:p>
-      <w:pPr>
-        <w:pStyle w:val="ListParagraph"/>
-        <w:numPr>
-          <w:ilvl w:val="0"/>
-          <w:numId w:val="2"/>
-        </w:numPr>
-        <w:spacing w:after="10" w:line="240"/>
-      </w:pPr>
-      <w:r>
-        <w:rPr>
-          <w:rFonts w:ascii="Verdana" w:cs="Verdana" w:eastAsia="Verdana" w:hAnsi="Verdana"/>
-          <w:sz w:val="14"/>
-          <w:szCs w:val="14"/>
-        </w:rPr>
-        <w:t xml:space="preserve">Eurazeo: International Expansion Playbook (free): </w:t>
-      </w:r>
-      <w:hyperlink w:history="1" r:id="rIdljegwihwfmte2x06e9epm">
-        <w:r>
-          <w:rPr>
-            <w:rStyle w:val="Hyperlink"/>
-            <w:rFonts w:ascii="Verdana" w:cs="Verdana" w:eastAsia="Verdana" w:hAnsi="Verdana"/>
-            <w:sz w:val="12"/>
-            <w:szCs w:val="12"/>
-          </w:rPr>
-          <w:t xml:space="preserve">https://www.eurazeo.com/sites/default/files/2023-10/Eurazeo-International-Expansion-Playbook-GROWTH.pdf</w:t>
-        </w:r>
-      </w:hyperlink>
-    </w:p>
-    <w:p>
-      <w:pPr>
-        <w:pStyle w:val="ListParagraph"/>
-        <w:numPr>
-          <w:ilvl w:val="0"/>
-          <w:numId w:val="2"/>
-        </w:numPr>
-        <w:spacing w:after="10" w:line="240"/>
-      </w:pPr>
-      <w:r>
-        <w:rPr>
-          <w:rFonts w:ascii="Verdana" w:cs="Verdana" w:eastAsia="Verdana" w:hAnsi="Verdana"/>
-          <w:sz w:val="14"/>
-          <w:szCs w:val="14"/>
-        </w:rPr>
-        <w:t xml:space="preserve">Optional case about coffee: The Espresso Lane to Global Markets, illy (Ivey Publishing, paid): </w:t>
-      </w:r>
-      <w:hyperlink w:history="1" r:id="rIdpmz0wet3i4qnx45ozwebs">
-        <w:r>
-          <w:rPr>
-            <w:rStyle w:val="Hyperlink"/>
-            <w:rFonts w:ascii="Verdana" w:cs="Verdana" w:eastAsia="Verdana" w:hAnsi="Verdana"/>
-            <w:sz w:val="12"/>
-            <w:szCs w:val="12"/>
-          </w:rPr>
-          <w:t xml:space="preserve">https://www.iveypublishing.ca/s/product/the-espresso-lane-to-global-markets/01t5c00000CwqzKAAR</w:t>
-        </w:r>
-      </w:hyperlink>
-    </w:p>
-    <w:p>
-      <w:pPr>
-        <w:pStyle w:val="ListParagraph"/>
-        <w:numPr>
-          <w:ilvl w:val="0"/>
-          <w:numId w:val="2"/>
-        </w:numPr>
-        <w:spacing w:after="10" w:line="240"/>
-      </w:pPr>
-      <w:r>
-        <w:rPr>
-          <w:rFonts w:ascii="Verdana" w:cs="Verdana" w:eastAsia="Verdana" w:hAnsi="Verdana"/>
-          <w:sz w:val="14"/>
-          <w:szCs w:val="14"/>
-        </w:rPr>
-        <w:t xml:space="preserve">IFC PAYG Market Attractiveness Index, an Excel tool with user guide (free): </w:t>
-      </w:r>
-      <w:hyperlink w:history="1" r:id="rId5ikmuivpsntmtmtey6uxu">
-        <w:r>
-          <w:rPr>
-            <w:rStyle w:val="Hyperlink"/>
-            <w:rFonts w:ascii="Verdana" w:cs="Verdana" w:eastAsia="Verdana" w:hAnsi="Verdana"/>
-            <w:sz w:val="12"/>
-            <w:szCs w:val="12"/>
-          </w:rPr>
-          <w:t xml:space="preserve">https://www.lightingglobal.org/wp-content/uploads/2018/11/IFC-PAYG-market-attractiveness-index-USER-GUIDE-AND-DATA-1Oct2018.pdf</w:t>
-        </w:r>
-      </w:hyperlink>
-    </w:p>
-    <w:p>
-      <w:pPr>
-        <w:keepNext/>
-        <w:spacing w:after="30" w:before="70"/>
-      </w:pPr>
-      <w:r>
-        <w:rPr>
-          <w:rFonts w:ascii="Verdana" w:cs="Verdana" w:eastAsia="Verdana" w:hAnsi="Verdana"/>
-          <w:b/>
-          <w:bCs/>
-          <w:color w:val="002350"/>
-          <w:sz w:val="20"/>
-          <w:szCs w:val="20"/>
-        </w:rPr>
-        <w:t xml:space="preserve">Data</w:t>
-      </w:r>
-    </w:p>
-    <w:p>
-      <w:pPr>
-        <w:pStyle w:val="ListParagraph"/>
-        <w:numPr>
-          <w:ilvl w:val="0"/>
-          <w:numId w:val="2"/>
-        </w:numPr>
-        <w:spacing w:after="10" w:line="240"/>
-      </w:pPr>
-      <w:r>
-        <w:rPr>
-          <w:rFonts w:ascii="Verdana" w:cs="Verdana" w:eastAsia="Verdana" w:hAnsi="Verdana"/>
-          <w:sz w:val="14"/>
-          <w:szCs w:val="14"/>
-        </w:rPr>
-        <w:t xml:space="preserve">World Bank World Development Indicators: </w:t>
-      </w:r>
-      <w:hyperlink w:history="1" r:id="rIdy-hrsdl9yrqv6sk2gcjlh">
-        <w:r>
-          <w:rPr>
-            <w:rStyle w:val="Hyperlink"/>
-            <w:rFonts w:ascii="Verdana" w:cs="Verdana" w:eastAsia="Verdana" w:hAnsi="Verdana"/>
-            <w:sz w:val="12"/>
-            <w:szCs w:val="12"/>
-          </w:rPr>
-          <w:t xml:space="preserve">https://databank.worldbank.org/source/world-development-indicators</w:t>
-        </w:r>
-      </w:hyperlink>
-    </w:p>
-    <w:p>
-      <w:pPr>
-        <w:pStyle w:val="ListParagraph"/>
-        <w:numPr>
-          <w:ilvl w:val="0"/>
-          <w:numId w:val="2"/>
-        </w:numPr>
-        <w:spacing w:after="10" w:line="240"/>
-      </w:pPr>
-      <w:r>
-        <w:rPr>
-          <w:rFonts w:ascii="Verdana" w:cs="Verdana" w:eastAsia="Verdana" w:hAnsi="Verdana"/>
-          <w:sz w:val="14"/>
-          <w:szCs w:val="14"/>
-        </w:rPr>
-        <w:t xml:space="preserve">IMF World Economic Outlook: </w:t>
-      </w:r>
-      <w:hyperlink w:history="1" r:id="rIdzs5zxnwcxu-wacxqhvnfk">
-        <w:r>
-          <w:rPr>
-            <w:rStyle w:val="Hyperlink"/>
-            <w:rFonts w:ascii="Verdana" w:cs="Verdana" w:eastAsia="Verdana" w:hAnsi="Verdana"/>
-            <w:sz w:val="12"/>
-            <w:szCs w:val="12"/>
-          </w:rPr>
-          <w:t xml:space="preserve">https://data.imf.org/datasets/WEO</w:t>
-        </w:r>
-      </w:hyperlink>
-    </w:p>
-    <w:p>
-      <w:pPr>
-        <w:pStyle w:val="ListParagraph"/>
-        <w:numPr>
-          <w:ilvl w:val="0"/>
-          <w:numId w:val="2"/>
-        </w:numPr>
-        <w:spacing w:after="10" w:line="240"/>
-      </w:pPr>
-      <w:r>
-        <w:rPr>
-          <w:rFonts w:ascii="Verdana" w:cs="Verdana" w:eastAsia="Verdana" w:hAnsi="Verdana"/>
-          <w:sz w:val="14"/>
-          <w:szCs w:val="14"/>
-        </w:rPr>
-        <w:t xml:space="preserve">World Bank Worldwide Governance Indicators: </w:t>
-      </w:r>
-      <w:hyperlink w:history="1" r:id="rIdhketzxoaqavgqunz3j_2r">
-        <w:r>
-          <w:rPr>
-            <w:rStyle w:val="Hyperlink"/>
-            <w:rFonts w:ascii="Verdana" w:cs="Verdana" w:eastAsia="Verdana" w:hAnsi="Verdana"/>
-            <w:sz w:val="12"/>
-            <w:szCs w:val="12"/>
-          </w:rPr>
-          <w:t xml:space="preserve">https://www.worldbank.org/en/publication/worldwide-governance-indicators</w:t>
-        </w:r>
-      </w:hyperlink>
-    </w:p>
-    <w:p>
-      <w:pPr>
-        <w:pStyle w:val="ListParagraph"/>
-        <w:numPr>
-          <w:ilvl w:val="0"/>
-          <w:numId w:val="2"/>
-        </w:numPr>
-        <w:spacing w:after="10" w:line="240"/>
-      </w:pPr>
-      <w:r>
-        <w:rPr>
-          <w:rFonts w:ascii="Verdana" w:cs="Verdana" w:eastAsia="Verdana" w:hAnsi="Verdana"/>
-          <w:sz w:val="14"/>
-          <w:szCs w:val="14"/>
-        </w:rPr>
-        <w:t xml:space="preserve">EU Access2Markets (tariffs, requirements, rules of origin for EU exporters): </w:t>
-      </w:r>
-      <w:hyperlink w:history="1" r:id="rIdt8bgtlzc0s3-pe2_rzphn">
-        <w:r>
-          <w:rPr>
-            <w:rStyle w:val="Hyperlink"/>
-            <w:rFonts w:ascii="Verdana" w:cs="Verdana" w:eastAsia="Verdana" w:hAnsi="Verdana"/>
-            <w:sz w:val="12"/>
-            <w:szCs w:val="12"/>
-          </w:rPr>
-          <w:t xml:space="preserve">https://trade.ec.europa.eu/access-to-markets/en/content/what-access2markets-0</w:t>
-        </w:r>
-      </w:hyperlink>
-    </w:p>
-    <w:p>
-      <w:pPr>
-        <w:pStyle w:val="ListParagraph"/>
-        <w:numPr>
-          <w:ilvl w:val="0"/>
-          <w:numId w:val="2"/>
-        </w:numPr>
-        <w:spacing w:after="10" w:line="240"/>
-      </w:pPr>
-      <w:r>
-        <w:rPr>
-          <w:rFonts w:ascii="Verdana" w:cs="Verdana" w:eastAsia="Verdana" w:hAnsi="Verdana"/>
-          <w:sz w:val="14"/>
-          <w:szCs w:val="14"/>
-        </w:rPr>
-        <w:t xml:space="preserve">WTO tariff and trade data: </w:t>
-      </w:r>
-      <w:hyperlink w:history="1" r:id="rIdiuzeih4bfqmxu8khc9k7f">
-        <w:r>
-          <w:rPr>
-            <w:rStyle w:val="Hyperlink"/>
-            <w:rFonts w:ascii="Verdana" w:cs="Verdana" w:eastAsia="Verdana" w:hAnsi="Verdana"/>
-            <w:sz w:val="12"/>
-            <w:szCs w:val="12"/>
-          </w:rPr>
-          <w:t xml:space="preserve">https://stats.wto.org/</w:t>
-        </w:r>
-      </w:hyperlink>
-    </w:p>
-    <w:p>
-      <w:pPr>
-        <w:pStyle w:val="ListParagraph"/>
-        <w:numPr>
-          <w:ilvl w:val="0"/>
-          <w:numId w:val="2"/>
-        </w:numPr>
-        <w:spacing w:after="10" w:line="240"/>
-      </w:pPr>
-      <w:r>
-        <w:rPr>
-          <w:rFonts w:ascii="Verdana" w:cs="Verdana" w:eastAsia="Verdana" w:hAnsi="Verdana"/>
-          <w:sz w:val="14"/>
-          <w:szCs w:val="14"/>
-        </w:rPr>
-        <w:t xml:space="preserve">CEPII Gravity database (distance, language; free login): </w:t>
-      </w:r>
-      <w:hyperlink w:history="1" r:id="rIdajtbbsh-r-nemsg_djm89">
-        <w:r>
-          <w:rPr>
-            <w:rStyle w:val="Hyperlink"/>
-            <w:rFonts w:ascii="Verdana" w:cs="Verdana" w:eastAsia="Verdana" w:hAnsi="Verdana"/>
-            <w:sz w:val="12"/>
-            <w:szCs w:val="12"/>
-          </w:rPr>
-          <w:t xml:space="preserve">https://www.cepii.fr/CEPII/en/bdd_modele/bdd_modele_item.asp?id=8</w:t>
-        </w:r>
-      </w:hyperlink>
-    </w:p>
-    <w:p>
-      <w:pPr>
-        <w:pStyle w:val="ListParagraph"/>
-        <w:numPr>
-          <w:ilvl w:val="0"/>
-          <w:numId w:val="2"/>
-        </w:numPr>
-        <w:spacing w:after="10" w:line="240"/>
-      </w:pPr>
-      <w:r>
-        <w:rPr>
-          <w:rFonts w:ascii="Verdana" w:cs="Verdana" w:eastAsia="Verdana" w:hAnsi="Verdana"/>
-          <w:sz w:val="14"/>
-          <w:szCs w:val="14"/>
-        </w:rPr>
-        <w:t xml:space="preserve">Hofstede dimension data matrix: </w:t>
-      </w:r>
-      <w:hyperlink w:history="1" r:id="rIdvqnlrhsl9lpm6aravqxzs">
-        <w:r>
-          <w:rPr>
-            <w:rStyle w:val="Hyperlink"/>
-            <w:rFonts w:ascii="Verdana" w:cs="Verdana" w:eastAsia="Verdana" w:hAnsi="Verdana"/>
-            <w:sz w:val="12"/>
-            <w:szCs w:val="12"/>
-          </w:rPr>
-          <w:t xml:space="preserve">https://geerthofstede.com/research-and-vsm/dimension-data-matrix/</w:t>
-        </w:r>
-      </w:hyperlink>
-    </w:p>
-    <w:p>
-      <w:pPr>
-        <w:pStyle w:val="ListParagraph"/>
-        <w:numPr>
-          <w:ilvl w:val="0"/>
-          <w:numId w:val="2"/>
-        </w:numPr>
-        <w:spacing w:after="10" w:line="240"/>
-      </w:pPr>
-      <w:r>
-        <w:rPr>
-          <w:rFonts w:ascii="Verdana" w:cs="Verdana" w:eastAsia="Verdana" w:hAnsi="Verdana"/>
-          <w:sz w:val="14"/>
-          <w:szCs w:val="14"/>
-        </w:rPr>
-        <w:t xml:space="preserve">Coface country risk assessments: </w:t>
-      </w:r>
-      <w:hyperlink w:history="1" r:id="rIdaie1pe9ydkdfhngvjgmsw">
-        <w:r>
-          <w:rPr>
-            <w:rStyle w:val="Hyperlink"/>
-            <w:rFonts w:ascii="Verdana" w:cs="Verdana" w:eastAsia="Verdana" w:hAnsi="Verdana"/>
-            <w:sz w:val="12"/>
-            <w:szCs w:val="12"/>
-          </w:rPr>
-          <w:t xml:space="preserve">https://www.coface.com/news-economy-and-insights/business-risk-dashboard/country-risk-files</w:t>
-        </w:r>
-      </w:hyperlink>
-    </w:p>
-    <w:p>
-      <w:pPr>
-        <w:pStyle w:val="ListParagraph"/>
-        <w:numPr>
-          <w:ilvl w:val="0"/>
-          <w:numId w:val="2"/>
-        </w:numPr>
-        <w:spacing w:after="10" w:line="240"/>
-      </w:pPr>
-      <w:r>
-        <w:rPr>
-          <w:rFonts w:ascii="Verdana" w:cs="Verdana" w:eastAsia="Verdana" w:hAnsi="Verdana"/>
-          <w:sz w:val="14"/>
-          <w:szCs w:val="14"/>
-        </w:rPr>
-        <w:t xml:space="preserve">Euromonitor Passport and Statista (WU library; statista.com): </w:t>
-      </w:r>
-      <w:hyperlink w:history="1" r:id="rIdjmshw6yelyosxmke9q4p8">
-        <w:r>
-          <w:rPr>
-            <w:rStyle w:val="Hyperlink"/>
-            <w:rFonts w:ascii="Verdana" w:cs="Verdana" w:eastAsia="Verdana" w:hAnsi="Verdana"/>
-            <w:sz w:val="12"/>
-            <w:szCs w:val="12"/>
-          </w:rPr>
-          <w:t xml:space="preserve">https://www.euromonitor.com/our-expertise/passport</w:t>
-        </w:r>
-      </w:hyperlink>
-    </w:p>
-    <w:p>
-      <w:pPr>
-        <w:pStyle w:val="ListParagraph"/>
-        <w:numPr>
-          <w:ilvl w:val="0"/>
-          <w:numId w:val="2"/>
-        </w:numPr>
-        <w:spacing w:after="10" w:line="240"/>
-      </w:pPr>
-      <w:r>
-        <w:rPr>
-          <w:rFonts w:ascii="Verdana" w:cs="Verdana" w:eastAsia="Verdana" w:hAnsi="Verdana"/>
-          <w:sz w:val="14"/>
-          <w:szCs w:val="14"/>
-        </w:rPr>
-        <w:t xml:space="preserve">International Coffee Organization: coffee statistics: </w:t>
-      </w:r>
-      <w:hyperlink w:history="1" r:id="rIdufa6rnxbxrlopxkacmdv9">
-        <w:r>
-          <w:rPr>
-            <w:rStyle w:val="Hyperlink"/>
-            <w:rFonts w:ascii="Verdana" w:cs="Verdana" w:eastAsia="Verdana" w:hAnsi="Verdana"/>
-            <w:sz w:val="12"/>
-            <w:szCs w:val="12"/>
-          </w:rPr>
-          <w:t xml:space="preserve">https://www.ico.org/</w:t>
-        </w:r>
-      </w:hyperlink>
-    </w:p>
-    <w:p>
-      <w:pPr>
-        <w:pStyle w:val="ListParagraph"/>
-        <w:numPr>
-          <w:ilvl w:val="0"/>
-          <w:numId w:val="2"/>
-        </w:numPr>
-        <w:spacing w:after="10" w:line="240"/>
-      </w:pPr>
-      <w:r>
-        <w:rPr>
-          <w:rFonts w:ascii="Verdana" w:cs="Verdana" w:eastAsia="Verdana" w:hAnsi="Verdana"/>
-          <w:sz w:val="14"/>
-          <w:szCs w:val="14"/>
-        </w:rPr>
-        <w:t xml:space="preserve">USDA Foreign Agricultural Service: annual coffee reports by country (search for your countries): </w:t>
-      </w:r>
-      <w:hyperlink w:history="1" r:id="rIdiut959ot_8b70g5lvyet5">
-        <w:r>
-          <w:rPr>
-            <w:rStyle w:val="Hyperlink"/>
-            <w:rFonts w:ascii="Verdana" w:cs="Verdana" w:eastAsia="Verdana" w:hAnsi="Verdana"/>
-            <w:sz w:val="12"/>
-            <w:szCs w:val="12"/>
-          </w:rPr>
-          <w:t xml:space="preserve">https://www.fas.usda.gov/</w:t>
-        </w:r>
-      </w:hyperlink>
-    </w:p>
-    <w:p>
-      <w:pPr>
-        <w:pStyle w:val="ListParagraph"/>
-        <w:numPr>
-          <w:ilvl w:val="0"/>
-          <w:numId w:val="2"/>
-        </w:numPr>
-        <w:spacing w:after="10" w:line="240"/>
-      </w:pPr>
-      <w:r>
-        <w:rPr>
-          <w:rFonts w:ascii="Verdana" w:cs="Verdana" w:eastAsia="Verdana" w:hAnsi="Verdana"/>
-          <w:sz w:val="14"/>
-          <w:szCs w:val="14"/>
-        </w:rPr>
-        <w:t xml:space="preserve">UN Comtrade (comtradeplus.un.org) and ITC Trade Map (free login): coffee trade flows and tariffs, HS 0901: </w:t>
-      </w:r>
-      <w:hyperlink w:history="1" r:id="rId5dehjnnglprqycdifhcty">
-        <w:r>
-          <w:rPr>
-            <w:rStyle w:val="Hyperlink"/>
-            <w:rFonts w:ascii="Verdana" w:cs="Verdana" w:eastAsia="Verdana" w:hAnsi="Verdana"/>
-            <w:sz w:val="12"/>
-            <w:szCs w:val="12"/>
-          </w:rPr>
-          <w:t xml:space="preserve">https://www.trademap.org/</w:t>
-        </w:r>
-      </w:hyperlink>
-    </w:p>
-    <w:p>
-      <w:pPr>
-        <w:pStyle w:val="ListParagraph"/>
-        <w:numPr>
-          <w:ilvl w:val="0"/>
-          <w:numId w:val="2"/>
-        </w:numPr>
-        <w:spacing w:after="10" w:line="240"/>
-      </w:pPr>
-      <w:r>
-        <w:rPr>
-          <w:rFonts w:ascii="Verdana" w:cs="Verdana" w:eastAsia="Verdana" w:hAnsi="Verdana"/>
-          <w:sz w:val="14"/>
-          <w:szCs w:val="14"/>
-        </w:rPr>
-        <w:t xml:space="preserve">WKO AUSSENWIRTSCHAFT: reports and country profiles: </w:t>
-      </w:r>
-      <w:hyperlink w:history="1" r:id="rIdldvj69_9y2lwypbg3sm9p">
-        <w:r>
-          <w:rPr>
-            <w:rStyle w:val="Hyperlink"/>
-            <w:rFonts w:ascii="Verdana" w:cs="Verdana" w:eastAsia="Verdana" w:hAnsi="Verdana"/>
-            <w:sz w:val="12"/>
-            <w:szCs w:val="12"/>
-          </w:rPr>
-          <w:t xml:space="preserve">https://www.wko.at/aussenwirtschaft/berichte</w:t>
-        </w:r>
-      </w:hyperlink>
     </w:p>
     <w:sectPr>
       <w:footerReference w:type="default" r:id="rId6"/>

</xml_diff>

<commit_message>
Brief: tighten pitfalls to keep 10 pages
Co-Authored-By: Claude Sonnet 5.5 <noreply@anthropic.com>
Claude-Session: https://claude.ai/code/session_01RkWScMhuRmEB4zppSmB7Ri
</commit_message>
<xml_diff>
--- a/WT26-27/Student Brief Midterm Presentation WT26-27.docx
+++ b/WT26-27/Student Brief Midterm Presentation WT26-27.docx
@@ -9829,15 +9829,15 @@
           <w:sz w:val="19"/>
           <w:szCs w:val="19"/>
         </w:rPr>
-        <w:t xml:space="preserve">Mixed years, units or totals and per-capita values.</w:t>
-      </w:r>
-      <w:r>
-        <w:rPr>
-          <w:rFonts w:ascii="Verdana" w:cs="Verdana" w:eastAsia="Verdana" w:hAnsi="Verdana"/>
-          <w:sz w:val="19"/>
-          <w:szCs w:val="19"/>
-        </w:rPr>
-        <w:t xml:space="preserve"> Fix them in the data sheet before scoring.</w:t>
+        <w:t xml:space="preserve">Treating the fixed weights as the truth.</w:t>
+      </w:r>
+      <w:r>
+        <w:rPr>
+          <w:rFonts w:ascii="Verdana" w:cs="Verdana" w:eastAsia="Verdana" w:hAnsi="Verdana"/>
+          <w:sz w:val="19"/>
+          <w:szCs w:val="19"/>
+        </w:rPr>
+        <w:t xml:space="preserve"> They are a baseline; report what the other weight sets show.</w:t>
       </w:r>
     </w:p>
     <w:p>
@@ -9857,15 +9857,15 @@
           <w:sz w:val="19"/>
           <w:szCs w:val="19"/>
         </w:rPr>
-        <w:t xml:space="preserve">Treating the fixed weights as the truth.</w:t>
-      </w:r>
-      <w:r>
-        <w:rPr>
-          <w:rFonts w:ascii="Verdana" w:cs="Verdana" w:eastAsia="Verdana" w:hAnsi="Verdana"/>
-          <w:sz w:val="19"/>
-          <w:szCs w:val="19"/>
-        </w:rPr>
-        <w:t xml:space="preserve"> They are a baseline; report what the other weight sets show.</w:t>
+        <w:t xml:space="preserve">Treating the ranking as the truth.</w:t>
+      </w:r>
+      <w:r>
+        <w:rPr>
+          <w:rFonts w:ascii="Verdana" w:cs="Verdana" w:eastAsia="Verdana" w:hAnsi="Verdana"/>
+          <w:sz w:val="19"/>
+          <w:szCs w:val="19"/>
+        </w:rPr>
+        <w:t xml:space="preserve"> Report rank ranges and say what would change the order.</w:t>
       </w:r>
     </w:p>
     <w:p>
@@ -9885,34 +9885,6 @@
           <w:sz w:val="19"/>
           <w:szCs w:val="19"/>
         </w:rPr>
-        <w:t xml:space="preserve">Treating the ranking as the truth.</w:t>
-      </w:r>
-      <w:r>
-        <w:rPr>
-          <w:rFonts w:ascii="Verdana" w:cs="Verdana" w:eastAsia="Verdana" w:hAnsi="Verdana"/>
-          <w:sz w:val="19"/>
-          <w:szCs w:val="19"/>
-        </w:rPr>
-        <w:t xml:space="preserve"> Report rank ranges and say what would change the order.</w:t>
-      </w:r>
-    </w:p>
-    <w:p>
-      <w:pPr>
-        <w:pStyle w:val="ListParagraph"/>
-        <w:numPr>
-          <w:ilvl w:val="0"/>
-          <w:numId w:val="2"/>
-        </w:numPr>
-        <w:spacing w:after="60" w:line="252"/>
-      </w:pPr>
-      <w:r>
-        <w:rPr>
-          <w:rFonts w:ascii="Verdana" w:cs="Verdana" w:eastAsia="Verdana" w:hAnsi="Verdana"/>
-          <w:b/>
-          <w:bCs/>
-          <w:sz w:val="19"/>
-          <w:szCs w:val="19"/>
-        </w:rPr>
         <w:t xml:space="preserve">Ignoring Julius Meinl's model.</w:t>
       </w:r>
       <w:r>
@@ -9922,26 +9894,6 @@
           <w:szCs w:val="19"/>
         </w:rPr>
         <w:t xml:space="preserve"> A big market without hotels, premium buyers or a feasible partner may not fit.</w:t>
-      </w:r>
-    </w:p>
-    <w:p>
-      <w:pPr>
-        <w:pStyle w:val="ListParagraph"/>
-        <w:numPr>
-          <w:ilvl w:val="0"/>
-          <w:numId w:val="2"/>
-        </w:numPr>
-        <w:spacing w:after="60" w:line="252"/>
-      </w:pPr>
-      <w:r>
-        <w:rPr>
-          <w:rFonts w:ascii="Verdana" w:cs="Verdana" w:eastAsia="Verdana" w:hAnsi="Verdana"/>
-          <w:b/>
-          <w:bCs/>
-          <w:sz w:val="19"/>
-          <w:szCs w:val="19"/>
-        </w:rPr>
-        <w:t xml:space="preserve">Unsourced or unchecked AI numbers.</w:t>
       </w:r>
     </w:p>
     <w:p>

</xml_diff>

<commit_message>
Each group finds 45 criteria by session 3; PESTEL sheet targets per dimension
Co-Authored-By: Claude Sonnet 5.5 <noreply@anthropic.com>
Claude-Session: https://claude.ai/code/session_01RkWScMhuRmEB4zppSmB7Ri
</commit_message>
<xml_diff>
--- a/WT26-27/Student Brief Midterm Presentation WT26-27.docx
+++ b/WT26-27/Student Brief Midterm Presentation WT26-27.docx
@@ -2567,7 +2567,7 @@
           <w:sz w:val="19"/>
           <w:szCs w:val="19"/>
         </w:rPr>
-        <w:t xml:space="preserve">. For each PESTEL dimension search for criteria (indicators) that could describe the six countries for Julius Meinl. For every criterion give the definition, unit, direction, the </w:t>
+        <w:t xml:space="preserve">. </w:t>
       </w:r>
       <w:r>
         <w:rPr>
@@ -2577,15 +2577,15 @@
           <w:sz w:val="19"/>
           <w:szCs w:val="19"/>
         </w:rPr>
-        <w:t xml:space="preserve">source name and a working link</w:t>
-      </w:r>
-      <w:r>
-        <w:rPr>
-          <w:rFonts w:ascii="Verdana" w:cs="Verdana" w:eastAsia="Verdana" w:hAnsi="Verdana"/>
-          <w:sz w:val="19"/>
-          <w:szCs w:val="19"/>
-        </w:rPr>
-        <w:t xml:space="preserve">, and the steps another group needs to find the data. Check that data exist for all six countries. The source is essential: if your criterion is selected, the groups of the other five countries must find the numbers for their countries with your instructions. Questions about the sheet go to arne.floh@wu.ac.at. </w:t>
+        <w:t xml:space="preserve">Each group finds 45 criteria (indicators) by session 3 (Monday 19 October 2026)</w:t>
+      </w:r>
+      <w:r>
+        <w:rPr>
+          <w:rFonts w:ascii="Verdana" w:cs="Verdana" w:eastAsia="Verdana" w:hAnsi="Verdana"/>
+          <w:sz w:val="19"/>
+          <w:szCs w:val="19"/>
+        </w:rPr>
+        <w:t xml:space="preserve">: 5 political, 10 economic, 10 social, 10 technological, 5 environmental and 5 legal. They should describe the six countries for Julius Meinl. For every criterion give the definition, unit, direction, the </w:t>
       </w:r>
       <w:r>
         <w:rPr>
@@ -2595,6 +2595,24 @@
           <w:sz w:val="19"/>
           <w:szCs w:val="19"/>
         </w:rPr>
+        <w:t xml:space="preserve">source name and a working link</w:t>
+      </w:r>
+      <w:r>
+        <w:rPr>
+          <w:rFonts w:ascii="Verdana" w:cs="Verdana" w:eastAsia="Verdana" w:hAnsi="Verdana"/>
+          <w:sz w:val="19"/>
+          <w:szCs w:val="19"/>
+        </w:rPr>
+        <w:t xml:space="preserve">, and the steps another group needs to find the data. Check that data exist for all six countries. The source is essential: if your criterion is selected, the groups of the other five countries must find the numbers for their countries with your instructions. Questions about the sheet go to arne.floh@wu.ac.at. </w:t>
+      </w:r>
+      <w:r>
+        <w:rPr>
+          <w:rFonts w:ascii="Verdana" w:cs="Verdana" w:eastAsia="Verdana" w:hAnsi="Verdana"/>
+          <w:b/>
+          <w:bCs/>
+          <w:sz w:val="19"/>
+          <w:szCs w:val="19"/>
+        </w:rPr>
         <w:t xml:space="preserve">Hand in:</w:t>
       </w:r>
       <w:r>
@@ -2603,7 +2621,7 @@
           <w:sz w:val="19"/>
           <w:szCs w:val="19"/>
         </w:rPr>
-        <w:t xml:space="preserve"> your completed copy of the sheet by </w:t>
+        <w:t xml:space="preserve"> your completed copy of the sheet by session 3. The instructor merges the proposals of all groups and preselects the final criteria, again 5 political, 10 economic, 10 social, 10 technological, 5 environmental and 5 legal (section 5). Then the shared sheet "Country scoring model" is published with the selected criteria </w:t>
       </w:r>
       <w:r>
         <w:rPr>
@@ -2620,7 +2638,7 @@
           <w:sz w:val="19"/>
           <w:szCs w:val="19"/>
         </w:rPr>
-        <w:t xml:space="preserve">. The instructor merges the proposals of all groups and selects the final criteria: 5 political, 10 economic, 10 social, 10 technological, 5 environmental and 5 legal (section 5). Then the shared sheet "Country scoring model" is published with the selected criteria.</w:t>
+        <w:t xml:space="preserve">.</w:t>
       </w:r>
     </w:p>
     <w:p>
@@ -9232,24 +9250,7 @@
                 <w:sz w:val="16"/>
                 <w:szCs w:val="16"/>
               </w:rPr>
-              <w:t xml:space="preserve">PESTEL indicator sheet completed (proposed criteria with sources) by </w:t>
-            </w:r>
-            <w:r>
-              <w:rPr>
-                <w:rFonts w:ascii="Verdana" w:cs="Verdana" w:eastAsia="Verdana" w:hAnsi="Verdana"/>
-                <w:sz w:val="16"/>
-                <w:szCs w:val="16"/>
-                <w:highlight w:val="yellow"/>
-              </w:rPr>
-              <w:t xml:space="preserve">[date]</w:t>
-            </w:r>
-            <w:r>
-              <w:rPr>
-                <w:rFonts w:ascii="Verdana" w:cs="Verdana" w:eastAsia="Verdana" w:hAnsi="Verdana"/>
-                <w:sz w:val="16"/>
-                <w:szCs w:val="16"/>
-              </w:rPr>
-              <w:t xml:space="preserve">; data plan for your country</w:t>
+              <w:t xml:space="preserve">PESTEL indicator sheet completed: 45 proposed criteria with sources, handed in at session 3; data plan for your country</w:t>
             </w:r>
           </w:p>
         </w:tc>

</xml_diff>

<commit_message>
Brief: criteria and scoring model released on 19 Oct (session 3)
Co-Authored-By: Claude Sonnet 5.5 <noreply@anthropic.com>
Claude-Session: https://claude.ai/code/session_01RkWScMhuRmEB4zppSmB7Ri
</commit_message>
<xml_diff>
--- a/WT26-27/Student Brief Midterm Presentation WT26-27.docx
+++ b/WT26-27/Student Brief Midterm Presentation WT26-27.docx
@@ -2621,24 +2621,7 @@
           <w:sz w:val="19"/>
           <w:szCs w:val="19"/>
         </w:rPr>
-        <w:t xml:space="preserve"> your completed copy of the sheet by session 3. The instructor merges the proposals of all groups and preselects the final criteria, again 5 political, 10 economic, 10 social, 10 technological, 5 environmental and 5 legal (section 5). Then the shared sheet "Country scoring model" is published with the selected criteria </w:t>
-      </w:r>
-      <w:r>
-        <w:rPr>
-          <w:rFonts w:ascii="Verdana" w:cs="Verdana" w:eastAsia="Verdana" w:hAnsi="Verdana"/>
-          <w:sz w:val="19"/>
-          <w:szCs w:val="19"/>
-          <w:highlight w:val="yellow"/>
-        </w:rPr>
-        <w:t xml:space="preserve">[date]</w:t>
-      </w:r>
-      <w:r>
-        <w:rPr>
-          <w:rFonts w:ascii="Verdana" w:cs="Verdana" w:eastAsia="Verdana" w:hAnsi="Verdana"/>
-          <w:sz w:val="19"/>
-          <w:szCs w:val="19"/>
-        </w:rPr>
-        <w:t xml:space="preserve">.</w:t>
+        <w:t xml:space="preserve"> your completed copy of the sheet by session 3. The instructor merges the proposals of all groups and preselects the final criteria, again 5 political, 10 economic, 10 social, 10 technological, 5 environmental and 5 legal (section 5). Then the shared sheet "Country scoring model" is published with the selected criteria on Monday 19 October 2026 (session 3).</w:t>
       </w:r>
     </w:p>
     <w:p>
@@ -9367,7 +9350,7 @@
                 <w:sz w:val="16"/>
                 <w:szCs w:val="16"/>
               </w:rPr>
-              <w:t xml:space="preserve">After session 3</w:t>
+              <w:t xml:space="preserve">Session 3, Mon 19 Oct</w:t>
             </w:r>
           </w:p>
         </w:tc>
@@ -9398,16 +9381,7 @@
                 <w:sz w:val="16"/>
                 <w:szCs w:val="16"/>
               </w:rPr>
-              <w:t xml:space="preserve">Instructor merges the proposals, selects the final criteria and publishes the shared Country scoring model </w:t>
-            </w:r>
-            <w:r>
-              <w:rPr>
-                <w:rFonts w:ascii="Verdana" w:cs="Verdana" w:eastAsia="Verdana" w:hAnsi="Verdana"/>
-                <w:sz w:val="16"/>
-                <w:szCs w:val="16"/>
-                <w:highlight w:val="yellow"/>
-              </w:rPr>
-              <w:t xml:space="preserve">[date]</w:t>
+              <w:t xml:space="preserve">Instructor returns the merged and preselected criteria and publishes the shared Country scoring model; groups start entering the data of their country</w:t>
             </w:r>
           </w:p>
         </w:tc>

</xml_diff>

<commit_message>
Brief: remove Part A step 2 and sample criteria list, new assessment criteria (Part A, Part B, industry sources), links to the Google Sheets
Co-Authored-By: Claude Sonnet 5.5 <noreply@anthropic.com>
Claude-Session: https://claude.ai/code/session_01RkWScMhuRmEB4zppSmB7Ri
</commit_message>
<xml_diff>
--- a/WT26-27/Student Brief Midterm Presentation WT26-27.docx
+++ b/WT26-27/Student Brief Midterm Presentation WT26-27.docx
@@ -511,7 +511,7 @@
                 <w:sz w:val="16"/>
                 <w:szCs w:val="16"/>
               </w:rPr>
-              <w:t xml:space="preserve">Monday 16 November 2026, 08:00 on Canvas: one presentation file and one Excel file, named GroupX_Midterm and GroupX_Midterm_Data; your country's data are due in the shared Google Sheet earlier (Step 3).</w:t>
+              <w:t xml:space="preserve">Monday 16 November 2026, 08:00 on Canvas: one presentation file and one Excel file, named GroupX_Midterm and GroupX_Midterm_Data; your country's data are due in the shared Google Sheet earlier (Step 2).</w:t>
             </w:r>
           </w:p>
         </w:tc>
@@ -2477,7 +2477,7 @@
         <w:rPr>
           <w:rFonts w:ascii="Verdana" w:cs="Verdana" w:eastAsia="Verdana" w:hAnsi="Verdana"/>
         </w:rPr>
-        <w:t xml:space="preserve">4  Part A (scoring method) in eight steps, along PESTEL</w:t>
+        <w:t xml:space="preserve">4  Part A (scoring method) in seven steps, along PESTEL</w:t>
       </w:r>
     </w:p>
     <w:p>
@@ -2550,24 +2550,7 @@
           <w:sz w:val="19"/>
           <w:szCs w:val="19"/>
         </w:rPr>
-        <w:t xml:space="preserve">Your group receives a copy of the Google Sheet "PESTEL indicator search" </w:t>
-      </w:r>
-      <w:r>
-        <w:rPr>
-          <w:rFonts w:ascii="Verdana" w:cs="Verdana" w:eastAsia="Verdana" w:hAnsi="Verdana"/>
-          <w:sz w:val="19"/>
-          <w:szCs w:val="19"/>
-          <w:highlight w:val="yellow"/>
-        </w:rPr>
-        <w:t xml:space="preserve">[link to be added]</w:t>
-      </w:r>
-      <w:r>
-        <w:rPr>
-          <w:rFonts w:ascii="Verdana" w:cs="Verdana" w:eastAsia="Verdana" w:hAnsi="Verdana"/>
-          <w:sz w:val="19"/>
-          <w:szCs w:val="19"/>
-        </w:rPr>
-        <w:t xml:space="preserve">. </w:t>
+        <w:t xml:space="preserve">Your group receives a copy of the Google Sheet "PESTEL indicator search" (https://docs.google.com/spreadsheets/d/18zUrrOllyNWMXJhTvZjvD7LeAo98Ds-vUhu6JQ_B-tk/edit): open it, then File &gt; Make a copy. </w:t>
       </w:r>
       <w:r>
         <w:rPr>
@@ -2633,7 +2616,102 @@
         <w:rPr>
           <w:rFonts w:ascii="Verdana" w:cs="Verdana" w:eastAsia="Verdana" w:hAnsi="Verdana"/>
         </w:rPr>
-        <w:t xml:space="preserve">Step 2  Frame the decision and apply the common criteria</w:t>
+        <w:t xml:space="preserve">Step 2  Collect the data for your country</w:t>
+      </w:r>
+    </w:p>
+    <w:p>
+      <w:pPr>
+        <w:spacing w:after="120" w:before="0" w:line="252"/>
+      </w:pPr>
+      <w:r>
+        <w:rPr>
+          <w:rFonts w:ascii="Verdana" w:cs="Verdana" w:eastAsia="Verdana" w:hAnsi="Verdana"/>
+          <w:sz w:val="19"/>
+          <w:szCs w:val="19"/>
+        </w:rPr>
+        <w:t xml:space="preserve">Collect the values of your allocated country for all 45 indicators and enter them in the yellow cells of your country on the Data sheet of the shared Google Sheet. </w:t>
+      </w:r>
+      <w:r>
+        <w:rPr>
+          <w:rFonts w:ascii="Verdana" w:cs="Verdana" w:eastAsia="Verdana" w:hAnsi="Verdana"/>
+          <w:b/>
+          <w:bCs/>
+          <w:sz w:val="19"/>
+          <w:szCs w:val="19"/>
+        </w:rPr>
+        <w:t xml:space="preserve">You only enter the numbers</w:t>
+      </w:r>
+      <w:r>
+        <w:rPr>
+          <w:rFonts w:ascii="Verdana" w:cs="Verdana" w:eastAsia="Verdana" w:hAnsi="Verdana"/>
+          <w:sz w:val="19"/>
+          <w:szCs w:val="19"/>
+        </w:rPr>
+        <w:t xml:space="preserve"> (rubric indicators: a whole number from 1 to 5); the sheet does everything else. Use the latest year available and record the year and source (name and link) for every number. If a value is missing, substitute a comparable indicator with the instructor's agreement </w:t>
+      </w:r>
+      <w:r>
+        <w:rPr>
+          <w:rFonts w:ascii="Verdana" w:cs="Verdana" w:eastAsia="Verdana" w:hAnsi="Verdana"/>
+          <w:sz w:val="19"/>
+          <w:szCs w:val="19"/>
+          <w:highlight w:val="yellow"/>
+        </w:rPr>
+        <w:t xml:space="preserve">[process to be confirmed]</w:t>
+      </w:r>
+      <w:r>
+        <w:rPr>
+          <w:rFonts w:ascii="Verdana" w:cs="Verdana" w:eastAsia="Verdana" w:hAnsi="Verdana"/>
+          <w:sz w:val="19"/>
+          <w:szCs w:val="19"/>
+        </w:rPr>
+        <w:t xml:space="preserve"> and document it. Follow the definitions exactly: the other groups use your numbers. </w:t>
+      </w:r>
+      <w:r>
+        <w:rPr>
+          <w:rFonts w:ascii="Verdana" w:cs="Verdana" w:eastAsia="Verdana" w:hAnsi="Verdana"/>
+          <w:b/>
+          <w:bCs/>
+          <w:sz w:val="19"/>
+          <w:szCs w:val="19"/>
+        </w:rPr>
+        <w:t xml:space="preserve">Hand in:</w:t>
+      </w:r>
+      <w:r>
+        <w:rPr>
+          <w:rFonts w:ascii="Verdana" w:cs="Verdana" w:eastAsia="Verdana" w:hAnsi="Verdana"/>
+          <w:sz w:val="19"/>
+          <w:szCs w:val="19"/>
+        </w:rPr>
+        <w:t xml:space="preserve"> your country's data and sources, entered by </w:t>
+      </w:r>
+      <w:r>
+        <w:rPr>
+          <w:rFonts w:ascii="Verdana" w:cs="Verdana" w:eastAsia="Verdana" w:hAnsi="Verdana"/>
+          <w:sz w:val="19"/>
+          <w:szCs w:val="19"/>
+          <w:highlight w:val="yellow"/>
+        </w:rPr>
+        <w:t xml:space="preserve">[deadline]</w:t>
+      </w:r>
+      <w:r>
+        <w:rPr>
+          <w:rFonts w:ascii="Verdana" w:cs="Verdana" w:eastAsia="Verdana" w:hAnsi="Verdana"/>
+          <w:sz w:val="19"/>
+          <w:szCs w:val="19"/>
+        </w:rPr>
+        <w:t xml:space="preserve">. Normalisation, scores, ranks and the weight-set comparison appear automatically as soon as all six countries are complete; the other sheets are locked.</w:t>
+      </w:r>
+    </w:p>
+    <w:p>
+      <w:pPr>
+        <w:pStyle w:val="Heading2"/>
+        <w:keepNext/>
+      </w:pPr>
+      <w:r>
+        <w:rPr>
+          <w:rFonts w:ascii="Verdana" w:cs="Verdana" w:eastAsia="Verdana" w:hAnsi="Verdana"/>
+        </w:rPr>
+        <w:t xml:space="preserve">Step 3  Normalisation: automatic, you interpret</w:t>
       </w:r>
     </w:p>
     <w:p>
@@ -2647,43 +2725,7 @@
           <w:sz w:val="19"/>
           <w:szCs w:val="19"/>
         </w:rPr>
-        <w:t xml:space="preserve">Write one sentence that says what your model decides, for example: "Which of the six countries offers Julius Meinl the best prospects for launching a premium coffee brand through local partners in hospitality and retail?" Then apply the </w:t>
-      </w:r>
-      <w:r>
-        <w:rPr>
-          <w:rFonts w:ascii="Verdana" w:cs="Verdana" w:eastAsia="Verdana" w:hAnsi="Verdana"/>
-          <w:b/>
-          <w:bCs/>
-          <w:sz w:val="19"/>
-          <w:szCs w:val="19"/>
-        </w:rPr>
-        <w:t xml:space="preserve">common criteria</w:t>
-      </w:r>
-      <w:r>
-        <w:rPr>
-          <w:rFonts w:ascii="Verdana" w:cs="Verdana" w:eastAsia="Verdana" w:hAnsi="Verdana"/>
-          <w:sz w:val="19"/>
-          <w:szCs w:val="19"/>
-        </w:rPr>
-        <w:t xml:space="preserve">: the 45 indicators the instructor selected from the group proposals, grouped under the six PESTEL dimensions (section 5). </w:t>
-      </w:r>
-      <w:r>
-        <w:rPr>
-          <w:rFonts w:ascii="Verdana" w:cs="Verdana" w:eastAsia="Verdana" w:hAnsi="Verdana"/>
-          <w:b/>
-          <w:bCs/>
-          <w:sz w:val="19"/>
-          <w:szCs w:val="19"/>
-        </w:rPr>
-        <w:t xml:space="preserve">All groups use the same criteria unchanged</w:t>
-      </w:r>
-      <w:r>
-        <w:rPr>
-          <w:rFonts w:ascii="Verdana" w:cs="Verdana" w:eastAsia="Verdana" w:hAnsi="Verdana"/>
-          <w:sz w:val="19"/>
-          <w:szCs w:val="19"/>
-        </w:rPr>
-        <w:t xml:space="preserve">, so the six country results are comparable. Rules:</w:t>
+        <w:t xml:space="preserve">You do not normalise anything yourself. As soon as all six countries are entered, the Google Sheet rescales every indicator across the six countries and applies the direction (higher or lower is better) automatically. Indicators come in different units (US dollars, percent, index points), so subtracting the mean (centering) alone would not be enough: it fixes the zero point but not the unit. The sheet therefore gives two normalised scores:</w:t>
       </w:r>
     </w:p>
     <w:p>
@@ -2698,28 +2740,20 @@
       <w:r>
         <w:rPr>
           <w:rFonts w:ascii="Verdana" w:cs="Verdana" w:eastAsia="Verdana" w:hAnsi="Verdana"/>
-          <w:sz w:val="19"/>
-          <w:szCs w:val="19"/>
-        </w:rPr>
-        <w:t xml:space="preserve">Every indicator has a fixed definition, unit and direction (higher is better or lower is better). Do not change them.</w:t>
-      </w:r>
-    </w:p>
-    <w:p>
-      <w:pPr>
-        <w:pStyle w:val="ListParagraph"/>
-        <w:numPr>
-          <w:ilvl w:val="0"/>
-          <w:numId w:val="2"/>
-        </w:numPr>
-        <w:spacing w:after="60" w:line="252"/>
-      </w:pPr>
-      <w:r>
-        <w:rPr>
-          <w:rFonts w:ascii="Verdana" w:cs="Verdana" w:eastAsia="Verdana" w:hAnsi="Verdana"/>
-          <w:sz w:val="19"/>
-          <w:szCs w:val="19"/>
-        </w:rPr>
-        <w:t xml:space="preserve">Qualitative criteria use the same rubric in every group (anchors on the Rubrics sheet). Two team members score independently, then agree and write down the reason.</w:t>
+          <w:b/>
+          <w:bCs/>
+          <w:sz w:val="19"/>
+          <w:szCs w:val="19"/>
+        </w:rPr>
+        <w:t xml:space="preserve">Normalised sheet (min-max, 0 to 100):</w:t>
+      </w:r>
+      <w:r>
+        <w:rPr>
+          <w:rFonts w:ascii="Verdana" w:cs="Verdana" w:eastAsia="Verdana" w:hAnsi="Verdana"/>
+          <w:sz w:val="19"/>
+          <w:szCs w:val="19"/>
+        </w:rPr>
+        <w:t xml:space="preserve"> the best country scores 100 and the weakest 0 on each indicator.</w:t>
       </w:r>
     </w:p>
     <w:p>
@@ -2734,10 +2768,20 @@
       <w:r>
         <w:rPr>
           <w:rFonts w:ascii="Verdana" w:cs="Verdana" w:eastAsia="Verdana" w:hAnsi="Verdana"/>
-          <w:sz w:val="19"/>
-          <w:szCs w:val="19"/>
-        </w:rPr>
-        <w:t xml:space="preserve">You may add an extra indicator of your own, but label it clearly as an extra: it stays out of the common score.</w:t>
+          <w:b/>
+          <w:bCs/>
+          <w:sz w:val="19"/>
+          <w:szCs w:val="19"/>
+        </w:rPr>
+        <w:t xml:space="preserve">T-scores sheet:</w:t>
+      </w:r>
+      <w:r>
+        <w:rPr>
+          <w:rFonts w:ascii="Verdana" w:cs="Verdana" w:eastAsia="Verdana" w:hAnsi="Verdana"/>
+          <w:sz w:val="19"/>
+          <w:szCs w:val="19"/>
+        </w:rPr>
+        <w:t xml:space="preserve"> z-score (subtract the mean, divide by the standard deviation), then T = 50 + 10 x z. A T-score of 50 is the average of the six countries and 60 is one standard deviation better.</w:t>
       </w:r>
     </w:p>
     <w:p>
@@ -2752,6 +2796,24 @@
           <w:sz w:val="19"/>
           <w:szCs w:val="19"/>
         </w:rPr>
+        <w:t xml:space="preserve">Caution with six countries:</w:t>
+      </w:r>
+      <w:r>
+        <w:rPr>
+          <w:rFonts w:ascii="Verdana" w:cs="Verdana" w:eastAsia="Verdana" w:hAnsi="Verdana"/>
+          <w:sz w:val="19"/>
+          <w:szCs w:val="19"/>
+        </w:rPr>
+        <w:t xml:space="preserve"> min-max scaling exaggerates small differences, because it stretches the weakest and the best country to 0 and 100 even if the real gap is tiny. T-scores keep the distances in the data and are not capped. Compare both for your country and explain where they differ (Pollesch and Dale; JRC pocket guide). </w:t>
+      </w:r>
+      <w:r>
+        <w:rPr>
+          <w:rFonts w:ascii="Verdana" w:cs="Verdana" w:eastAsia="Verdana" w:hAnsi="Verdana"/>
+          <w:b/>
+          <w:bCs/>
+          <w:sz w:val="19"/>
+          <w:szCs w:val="19"/>
+        </w:rPr>
         <w:t xml:space="preserve">Hand in:</w:t>
       </w:r>
       <w:r>
@@ -2760,7 +2822,7 @@
           <w:sz w:val="19"/>
           <w:szCs w:val="19"/>
         </w:rPr>
-        <w:t xml:space="preserve"> the decision sentence (slide 2) and a short rationale for each PESTEL dimension: why it matters for Julius Meinl.</w:t>
+        <w:t xml:space="preserve"> one slide with the normalised scores of your country and your comment.</w:t>
       </w:r>
     </w:p>
     <w:p>
@@ -2772,7 +2834,7 @@
         <w:rPr>
           <w:rFonts w:ascii="Verdana" w:cs="Verdana" w:eastAsia="Verdana" w:hAnsi="Verdana"/>
         </w:rPr>
-        <w:t xml:space="preserve">Step 3  Collect the data for your country</w:t>
+        <w:t xml:space="preserve">Step 4  Weights: fixed upfront</w:t>
       </w:r>
     </w:p>
     <w:p>
@@ -2785,7 +2847,7 @@
           <w:sz w:val="19"/>
           <w:szCs w:val="19"/>
         </w:rPr>
-        <w:t xml:space="preserve">Collect the values of your allocated country for all 45 indicators and enter them in the yellow cells of your country on the Data sheet of the shared Google Sheet. </w:t>
+        <w:t xml:space="preserve">The weights are </w:t>
       </w:r>
       <w:r>
         <w:rPr>
@@ -2795,32 +2857,15 @@
           <w:sz w:val="19"/>
           <w:szCs w:val="19"/>
         </w:rPr>
-        <w:t xml:space="preserve">You only enter the numbers</w:t>
-      </w:r>
-      <w:r>
-        <w:rPr>
-          <w:rFonts w:ascii="Verdana" w:cs="Verdana" w:eastAsia="Verdana" w:hAnsi="Verdana"/>
-          <w:sz w:val="19"/>
-          <w:szCs w:val="19"/>
-        </w:rPr>
-        <w:t xml:space="preserve"> (rubric indicators: a whole number from 1 to 5); the sheet does everything else. Use the latest year available and record the year and source (name and link) for every number. If a value is missing, substitute a comparable indicator with the instructor's agreement </w:t>
-      </w:r>
-      <w:r>
-        <w:rPr>
-          <w:rFonts w:ascii="Verdana" w:cs="Verdana" w:eastAsia="Verdana" w:hAnsi="Verdana"/>
-          <w:sz w:val="19"/>
-          <w:szCs w:val="19"/>
-          <w:highlight w:val="yellow"/>
-        </w:rPr>
-        <w:t xml:space="preserve">[process to be confirmed]</w:t>
-      </w:r>
-      <w:r>
-        <w:rPr>
-          <w:rFonts w:ascii="Verdana" w:cs="Verdana" w:eastAsia="Verdana" w:hAnsi="Verdana"/>
-          <w:sz w:val="19"/>
-          <w:szCs w:val="19"/>
-        </w:rPr>
-        <w:t xml:space="preserve"> and document it. Follow the definitions exactly: the other groups use your numbers. </w:t>
+        <w:t xml:space="preserve">set by the instructor before data collection</w:t>
+      </w:r>
+      <w:r>
+        <w:rPr>
+          <w:rFonts w:ascii="Verdana" w:cs="Verdana" w:eastAsia="Verdana" w:hAnsi="Verdana"/>
+          <w:sz w:val="19"/>
+          <w:szCs w:val="19"/>
+        </w:rPr>
+        <w:t xml:space="preserve"> and are the same for all groups (sheet Weights, section 6). They are not part of your model choices, so nobody can tune them to a preferred ranking. Understand them: explain on one slide why each PESTEL dimension has the weight it has, using Julius Meinl's priorities, and say whether you would weigh differently and why. </w:t>
       </w:r>
       <w:r>
         <w:rPr>
@@ -2838,24 +2883,7 @@
           <w:sz w:val="19"/>
           <w:szCs w:val="19"/>
         </w:rPr>
-        <w:t xml:space="preserve"> your country's data and sources, entered by </w:t>
-      </w:r>
-      <w:r>
-        <w:rPr>
-          <w:rFonts w:ascii="Verdana" w:cs="Verdana" w:eastAsia="Verdana" w:hAnsi="Verdana"/>
-          <w:sz w:val="19"/>
-          <w:szCs w:val="19"/>
-          <w:highlight w:val="yellow"/>
-        </w:rPr>
-        <w:t xml:space="preserve">[deadline]</w:t>
-      </w:r>
-      <w:r>
-        <w:rPr>
-          <w:rFonts w:ascii="Verdana" w:cs="Verdana" w:eastAsia="Verdana" w:hAnsi="Verdana"/>
-          <w:sz w:val="19"/>
-          <w:szCs w:val="19"/>
-        </w:rPr>
-        <w:t xml:space="preserve">. Normalisation, scores, ranks and the weight-set comparison appear automatically as soon as all six countries are complete; the other sheets are locked.</w:t>
+        <w:t xml:space="preserve"> the explanation slide.</w:t>
       </w:r>
     </w:p>
     <w:p>
@@ -2867,77 +2895,7 @@
         <w:rPr>
           <w:rFonts w:ascii="Verdana" w:cs="Verdana" w:eastAsia="Verdana" w:hAnsi="Verdana"/>
         </w:rPr>
-        <w:t xml:space="preserve">Step 4  Normalisation: automatic, you interpret</w:t>
-      </w:r>
-    </w:p>
-    <w:p>
-      <w:pPr>
-        <w:keepNext/>
-        <w:spacing w:after="60" w:before="0" w:line="252"/>
-      </w:pPr>
-      <w:r>
-        <w:rPr>
-          <w:rFonts w:ascii="Verdana" w:cs="Verdana" w:eastAsia="Verdana" w:hAnsi="Verdana"/>
-          <w:sz w:val="19"/>
-          <w:szCs w:val="19"/>
-        </w:rPr>
-        <w:t xml:space="preserve">You do not normalise anything yourself. As soon as all six countries are entered, the Google Sheet rescales every indicator across the six countries and applies the direction (higher or lower is better) automatically. Indicators come in different units (US dollars, percent, index points), so subtracting the mean (centering) alone would not be enough: it fixes the zero point but not the unit. The sheet therefore gives two normalised scores:</w:t>
-      </w:r>
-    </w:p>
-    <w:p>
-      <w:pPr>
-        <w:pStyle w:val="ListParagraph"/>
-        <w:numPr>
-          <w:ilvl w:val="0"/>
-          <w:numId w:val="2"/>
-        </w:numPr>
-        <w:spacing w:after="60" w:line="252"/>
-      </w:pPr>
-      <w:r>
-        <w:rPr>
-          <w:rFonts w:ascii="Verdana" w:cs="Verdana" w:eastAsia="Verdana" w:hAnsi="Verdana"/>
-          <w:b/>
-          <w:bCs/>
-          <w:sz w:val="19"/>
-          <w:szCs w:val="19"/>
-        </w:rPr>
-        <w:t xml:space="preserve">Normalised sheet (min-max, 0 to 100):</w:t>
-      </w:r>
-      <w:r>
-        <w:rPr>
-          <w:rFonts w:ascii="Verdana" w:cs="Verdana" w:eastAsia="Verdana" w:hAnsi="Verdana"/>
-          <w:sz w:val="19"/>
-          <w:szCs w:val="19"/>
-        </w:rPr>
-        <w:t xml:space="preserve"> the best country scores 100 and the weakest 0 on each indicator.</w:t>
-      </w:r>
-    </w:p>
-    <w:p>
-      <w:pPr>
-        <w:pStyle w:val="ListParagraph"/>
-        <w:numPr>
-          <w:ilvl w:val="0"/>
-          <w:numId w:val="2"/>
-        </w:numPr>
-        <w:spacing w:after="100" w:line="252"/>
-      </w:pPr>
-      <w:r>
-        <w:rPr>
-          <w:rFonts w:ascii="Verdana" w:cs="Verdana" w:eastAsia="Verdana" w:hAnsi="Verdana"/>
-          <w:b/>
-          <w:bCs/>
-          <w:sz w:val="19"/>
-          <w:szCs w:val="19"/>
-        </w:rPr>
-        <w:t xml:space="preserve">T-scores sheet:</w:t>
-      </w:r>
-      <w:r>
-        <w:rPr>
-          <w:rFonts w:ascii="Verdana" w:cs="Verdana" w:eastAsia="Verdana" w:hAnsi="Verdana"/>
-          <w:sz w:val="19"/>
-          <w:szCs w:val="19"/>
-        </w:rPr>
-        <w:t xml:space="preserve"> z-score (subtract the mean, divide by the standard deviation), then T = 50 + 10 x z. A T-score of 50 is the average of the six countries and 60 is one standard deviation better.</w:t>
+        <w:t xml:space="preserve">Step 5  Aggregate</w:t>
       </w:r>
     </w:p>
     <w:p>
@@ -2947,29 +2905,19 @@
       <w:r>
         <w:rPr>
           <w:rFonts w:ascii="Verdana" w:cs="Verdana" w:eastAsia="Verdana" w:hAnsi="Verdana"/>
+          <w:sz w:val="19"/>
+          <w:szCs w:val="19"/>
+        </w:rPr>
+        <w:t xml:space="preserve">Score(country) = sum of weight x normalised score (weighted sum), calculated by the sheet. Note what the weighted sum implies: a large market can offset a poor business climate (full compensation). If some conditions are knock-outs for Julius Meinl (for example, import barriers that make premium pricing impossible), say so: this is where a non-compensatory filter would apply (screening funnel, Cavusgil 1985). </w:t>
+      </w:r>
+      <w:r>
+        <w:rPr>
+          <w:rFonts w:ascii="Verdana" w:cs="Verdana" w:eastAsia="Verdana" w:hAnsi="Verdana"/>
           <w:b/>
           <w:bCs/>
           <w:sz w:val="19"/>
           <w:szCs w:val="19"/>
         </w:rPr>
-        <w:t xml:space="preserve">Caution with six countries:</w:t>
-      </w:r>
-      <w:r>
-        <w:rPr>
-          <w:rFonts w:ascii="Verdana" w:cs="Verdana" w:eastAsia="Verdana" w:hAnsi="Verdana"/>
-          <w:sz w:val="19"/>
-          <w:szCs w:val="19"/>
-        </w:rPr>
-        <w:t xml:space="preserve"> min-max scaling exaggerates small differences, because it stretches the weakest and the best country to 0 and 100 even if the real gap is tiny. T-scores keep the distances in the data and are not capped. Compare both for your country and explain where they differ (Pollesch and Dale; JRC pocket guide). </w:t>
-      </w:r>
-      <w:r>
-        <w:rPr>
-          <w:rFonts w:ascii="Verdana" w:cs="Verdana" w:eastAsia="Verdana" w:hAnsi="Verdana"/>
-          <w:b/>
-          <w:bCs/>
-          <w:sz w:val="19"/>
-          <w:szCs w:val="19"/>
-        </w:rPr>
         <w:t xml:space="preserve">Hand in:</w:t>
       </w:r>
       <w:r>
@@ -2978,7 +2926,7 @@
           <w:sz w:val="19"/>
           <w:szCs w:val="19"/>
         </w:rPr>
-        <w:t xml:space="preserve"> one slide with the normalised scores of your country and your comment.</w:t>
+        <w:t xml:space="preserve"> the score and rank of your country, with the scores by PESTEL dimension (sheet Scores, block C), on one slide.</w:t>
       </w:r>
     </w:p>
     <w:p>
@@ -2990,111 +2938,7 @@
         <w:rPr>
           <w:rFonts w:ascii="Verdana" w:cs="Verdana" w:eastAsia="Verdana" w:hAnsi="Verdana"/>
         </w:rPr>
-        <w:t xml:space="preserve">Step 5  Weights: fixed upfront</w:t>
-      </w:r>
-    </w:p>
-    <w:p>
-      <w:pPr>
-        <w:spacing w:after="120" w:before="0" w:line="252"/>
-      </w:pPr>
-      <w:r>
-        <w:rPr>
-          <w:rFonts w:ascii="Verdana" w:cs="Verdana" w:eastAsia="Verdana" w:hAnsi="Verdana"/>
-          <w:sz w:val="19"/>
-          <w:szCs w:val="19"/>
-        </w:rPr>
-        <w:t xml:space="preserve">The weights are </w:t>
-      </w:r>
-      <w:r>
-        <w:rPr>
-          <w:rFonts w:ascii="Verdana" w:cs="Verdana" w:eastAsia="Verdana" w:hAnsi="Verdana"/>
-          <w:b/>
-          <w:bCs/>
-          <w:sz w:val="19"/>
-          <w:szCs w:val="19"/>
-        </w:rPr>
-        <w:t xml:space="preserve">set by the instructor before data collection</w:t>
-      </w:r>
-      <w:r>
-        <w:rPr>
-          <w:rFonts w:ascii="Verdana" w:cs="Verdana" w:eastAsia="Verdana" w:hAnsi="Verdana"/>
-          <w:sz w:val="19"/>
-          <w:szCs w:val="19"/>
-        </w:rPr>
-        <w:t xml:space="preserve"> and are the same for all groups (sheet Weights, section 6). They are not part of your model choices, so nobody can tune them to a preferred ranking. Understand them: explain on one slide why each PESTEL dimension has the weight it has, using Julius Meinl's priorities, and say whether you would weigh differently and why. </w:t>
-      </w:r>
-      <w:r>
-        <w:rPr>
-          <w:rFonts w:ascii="Verdana" w:cs="Verdana" w:eastAsia="Verdana" w:hAnsi="Verdana"/>
-          <w:b/>
-          <w:bCs/>
-          <w:sz w:val="19"/>
-          <w:szCs w:val="19"/>
-        </w:rPr>
-        <w:t xml:space="preserve">Hand in:</w:t>
-      </w:r>
-      <w:r>
-        <w:rPr>
-          <w:rFonts w:ascii="Verdana" w:cs="Verdana" w:eastAsia="Verdana" w:hAnsi="Verdana"/>
-          <w:sz w:val="19"/>
-          <w:szCs w:val="19"/>
-        </w:rPr>
-        <w:t xml:space="preserve"> the explanation slide.</w:t>
-      </w:r>
-    </w:p>
-    <w:p>
-      <w:pPr>
-        <w:pStyle w:val="Heading2"/>
-        <w:keepNext/>
-      </w:pPr>
-      <w:r>
-        <w:rPr>
-          <w:rFonts w:ascii="Verdana" w:cs="Verdana" w:eastAsia="Verdana" w:hAnsi="Verdana"/>
-        </w:rPr>
-        <w:t xml:space="preserve">Step 6  Aggregate</w:t>
-      </w:r>
-    </w:p>
-    <w:p>
-      <w:pPr>
-        <w:spacing w:after="120" w:before="0" w:line="252"/>
-      </w:pPr>
-      <w:r>
-        <w:rPr>
-          <w:rFonts w:ascii="Verdana" w:cs="Verdana" w:eastAsia="Verdana" w:hAnsi="Verdana"/>
-          <w:sz w:val="19"/>
-          <w:szCs w:val="19"/>
-        </w:rPr>
-        <w:t xml:space="preserve">Score(country) = sum of weight x normalised score (weighted sum), calculated by the sheet. Note what the weighted sum implies: a large market can offset a poor business climate (full compensation). If some conditions are knock-outs for Julius Meinl (for example, import barriers that make premium pricing impossible), say so: this is where a non-compensatory filter would apply (screening funnel, Cavusgil 1985). </w:t>
-      </w:r>
-      <w:r>
-        <w:rPr>
-          <w:rFonts w:ascii="Verdana" w:cs="Verdana" w:eastAsia="Verdana" w:hAnsi="Verdana"/>
-          <w:b/>
-          <w:bCs/>
-          <w:sz w:val="19"/>
-          <w:szCs w:val="19"/>
-        </w:rPr>
-        <w:t xml:space="preserve">Hand in:</w:t>
-      </w:r>
-      <w:r>
-        <w:rPr>
-          <w:rFonts w:ascii="Verdana" w:cs="Verdana" w:eastAsia="Verdana" w:hAnsi="Verdana"/>
-          <w:sz w:val="19"/>
-          <w:szCs w:val="19"/>
-        </w:rPr>
-        <w:t xml:space="preserve"> the score and rank of your country, with the scores by PESTEL dimension (sheet Scores, block C), on one slide.</w:t>
-      </w:r>
-    </w:p>
-    <w:p>
-      <w:pPr>
-        <w:pStyle w:val="Heading2"/>
-        <w:keepNext/>
-      </w:pPr>
-      <w:r>
-        <w:rPr>
-          <w:rFonts w:ascii="Verdana" w:cs="Verdana" w:eastAsia="Verdana" w:hAnsi="Verdana"/>
-        </w:rPr>
-        <w:t xml:space="preserve">Step 7  Test robustness: other weights (required)</w:t>
+        <w:t xml:space="preserve">Step 6  Test robustness: other weights (required)</w:t>
       </w:r>
     </w:p>
     <w:p>
@@ -4839,7 +4683,7 @@
         <w:rPr>
           <w:rFonts w:ascii="Verdana" w:cs="Verdana" w:eastAsia="Verdana" w:hAnsi="Verdana"/>
         </w:rPr>
-        <w:t xml:space="preserve">Step 8  Interpret and recommend</w:t>
+        <w:t xml:space="preserve">Step 7  Interpret and recommend</w:t>
       </w:r>
     </w:p>
     <w:p>
@@ -4918,7 +4762,7 @@
         <w:rPr>
           <w:rFonts w:ascii="Verdana" w:cs="Verdana" w:eastAsia="Verdana" w:hAnsi="Verdana"/>
         </w:rPr>
-        <w:t xml:space="preserve">5  The common criteria, grouped by PESTEL (example list)</w:t>
+        <w:t xml:space="preserve">5  The common criteria, grouped by PESTEL</w:t>
       </w:r>
     </w:p>
     <w:p>
@@ -4931,1057 +4775,9 @@
           <w:sz w:val="19"/>
           <w:szCs w:val="19"/>
         </w:rPr>
-        <w:t xml:space="preserve">The final criteria are selected by the instructor from the proposals of all groups (Step 1): 5 political, 10 economic, 10 social, 10 technological, 5 environmental and 5 legal, 45 in total. The list below is the instructor's example list that starts the search; the selected list may differ. The weight of a dimension is split equally among its indicators. Units, definitions and sources are on the Indicators sheet of the Google Sheet; rubric scores (R) follow the Rubrics sheet.</w:t>
+        <w:t xml:space="preserve">The final criteria are selected by the instructor from the proposals of all groups (Step 1): 5 political, 10 economic, 10 social, 10 technological, 5 environmental and 5 legal, 45 in total. The weight of a dimension is split equally among its indicators. Units, definitions and sources are on the Indicators sheet of the Google Sheet; rubric scores (R) follow the Rubrics sheet.</w:t>
       </w:r>
     </w:p>
-    <w:tbl>
-      <w:tblPr>
-        <w:tblW w:type="dxa" w:w="9072"/>
-        <w:tblBorders>
-          <w:top w:val="single" w:color="auto" w:sz="4"/>
-          <w:left w:val="single" w:color="auto" w:sz="4"/>
-          <w:bottom w:val="single" w:color="auto" w:sz="4"/>
-          <w:right w:val="single" w:color="auto" w:sz="4"/>
-          <w:insideH w:val="single" w:color="auto" w:sz="4"/>
-          <w:insideV w:val="single" w:color="auto" w:sz="4"/>
-        </w:tblBorders>
-      </w:tblPr>
-      <w:tblGrid>
-        <w:gridCol w:w="1700"/>
-        <w:gridCol w:w="7372"/>
-      </w:tblGrid>
-      <w:tr>
-        <w:trPr>
-          <w:cantSplit/>
-          <w:tblHeader/>
-        </w:trPr>
-        <w:tc>
-          <w:tcPr>
-            <w:tcW w:type="dxa" w:w="1700"/>
-            <w:tcBorders>
-              <w:top w:val="single" w:color="BFBFBF" w:sz="4"/>
-              <w:left w:val="single" w:color="BFBFBF" w:sz="4"/>
-              <w:bottom w:val="single" w:color="BFBFBF" w:sz="4"/>
-              <w:right w:val="single" w:color="BFBFBF" w:sz="4"/>
-            </w:tcBorders>
-            <w:shd w:fill="002350" w:color="auto" w:val="clear"/>
-            <w:tcMar>
-              <w:top w:type="dxa" w:w="60"/>
-              <w:left w:type="dxa" w:w="100"/>
-              <w:bottom w:type="dxa" w:w="40"/>
-              <w:right w:type="dxa" w:w="100"/>
-            </w:tcMar>
-          </w:tcPr>
-          <w:p>
-            <w:pPr>
-              <w:spacing w:after="40" w:line="240"/>
-            </w:pPr>
-            <w:r>
-              <w:rPr>
-                <w:rFonts w:ascii="Verdana" w:cs="Verdana" w:eastAsia="Verdana" w:hAnsi="Verdana"/>
-                <w:b/>
-                <w:bCs/>
-                <w:color w:val="FFFFFF"/>
-                <w:sz w:val="15"/>
-                <w:szCs w:val="15"/>
-              </w:rPr>
-              <w:t xml:space="preserve">PESTEL dimension</w:t>
-            </w:r>
-          </w:p>
-        </w:tc>
-        <w:tc>
-          <w:tcPr>
-            <w:tcW w:type="dxa" w:w="7372"/>
-            <w:tcBorders>
-              <w:top w:val="single" w:color="BFBFBF" w:sz="4"/>
-              <w:left w:val="single" w:color="BFBFBF" w:sz="4"/>
-              <w:bottom w:val="single" w:color="BFBFBF" w:sz="4"/>
-              <w:right w:val="single" w:color="BFBFBF" w:sz="4"/>
-            </w:tcBorders>
-            <w:shd w:fill="002350" w:color="auto" w:val="clear"/>
-            <w:tcMar>
-              <w:top w:type="dxa" w:w="60"/>
-              <w:left w:type="dxa" w:w="100"/>
-              <w:bottom w:type="dxa" w:w="40"/>
-              <w:right w:type="dxa" w:w="100"/>
-            </w:tcMar>
-          </w:tcPr>
-          <w:p>
-            <w:pPr>
-              <w:spacing w:after="40" w:line="240"/>
-            </w:pPr>
-            <w:r>
-              <w:rPr>
-                <w:rFonts w:ascii="Verdana" w:cs="Verdana" w:eastAsia="Verdana" w:hAnsi="Verdana"/>
-                <w:b/>
-                <w:bCs/>
-                <w:color w:val="FFFFFF"/>
-                <w:sz w:val="15"/>
-                <w:szCs w:val="15"/>
-              </w:rPr>
-              <w:t xml:space="preserve">Indicators</w:t>
-            </w:r>
-          </w:p>
-        </w:tc>
-      </w:tr>
-      <w:tr>
-        <w:trPr>
-          <w:cantSplit/>
-        </w:trPr>
-        <w:tc>
-          <w:tcPr>
-            <w:tcW w:type="dxa" w:w="1700"/>
-            <w:tcBorders>
-              <w:top w:val="single" w:color="BFBFBF" w:sz="4"/>
-              <w:left w:val="single" w:color="BFBFBF" w:sz="4"/>
-              <w:bottom w:val="single" w:color="BFBFBF" w:sz="4"/>
-              <w:right w:val="single" w:color="BFBFBF" w:sz="4"/>
-            </w:tcBorders>
-            <w:tcMar>
-              <w:top w:type="dxa" w:w="60"/>
-              <w:left w:type="dxa" w:w="100"/>
-              <w:bottom w:type="dxa" w:w="40"/>
-              <w:right w:type="dxa" w:w="100"/>
-            </w:tcMar>
-          </w:tcPr>
-          <w:p>
-            <w:pPr>
-              <w:spacing w:after="40" w:line="240"/>
-            </w:pPr>
-            <w:r>
-              <w:rPr>
-                <w:rFonts w:ascii="Verdana" w:cs="Verdana" w:eastAsia="Verdana" w:hAnsi="Verdana"/>
-                <w:b/>
-                <w:bCs/>
-                <w:sz w:val="15"/>
-                <w:szCs w:val="15"/>
-              </w:rPr>
-              <w:t xml:space="preserve">Political</w:t>
-            </w:r>
-            <w:r>
-              <w:rPr>
-                <w:rFonts w:ascii="Verdana" w:cs="Verdana" w:eastAsia="Verdana" w:hAnsi="Verdana"/>
-                <w:sz w:val="15"/>
-                <w:szCs w:val="15"/>
-              </w:rPr>
-              <w:t xml:space="preserve"> (5 indicators, weight 15)</w:t>
-            </w:r>
-          </w:p>
-        </w:tc>
-        <w:tc>
-          <w:tcPr>
-            <w:tcW w:type="dxa" w:w="7372"/>
-            <w:tcBorders>
-              <w:top w:val="single" w:color="BFBFBF" w:sz="4"/>
-              <w:left w:val="single" w:color="BFBFBF" w:sz="4"/>
-              <w:bottom w:val="single" w:color="BFBFBF" w:sz="4"/>
-              <w:right w:val="single" w:color="BFBFBF" w:sz="4"/>
-            </w:tcBorders>
-            <w:tcMar>
-              <w:top w:type="dxa" w:w="60"/>
-              <w:left w:type="dxa" w:w="100"/>
-              <w:bottom w:type="dxa" w:w="40"/>
-              <w:right w:type="dxa" w:w="100"/>
-            </w:tcMar>
-          </w:tcPr>
-          <w:p>
-            <w:pPr>
-              <w:spacing w:after="40" w:line="240"/>
-            </w:pPr>
-            <w:r>
-              <w:rPr>
-                <w:rFonts w:ascii="Verdana" w:cs="Verdana" w:eastAsia="Verdana" w:hAnsi="Verdana"/>
-                <w:sz w:val="15"/>
-                <w:szCs w:val="15"/>
-              </w:rPr>
-              <w:t xml:space="preserve">Political stability and absence of violence (WGI)</w:t>
-            </w:r>
-          </w:p>
-          <w:p>
-            <w:pPr>
-              <w:spacing w:after="40" w:line="240"/>
-            </w:pPr>
-            <w:r>
-              <w:rPr>
-                <w:rFonts w:ascii="Verdana" w:cs="Verdana" w:eastAsia="Verdana" w:hAnsi="Verdana"/>
-                <w:sz w:val="15"/>
-                <w:szCs w:val="15"/>
-              </w:rPr>
-              <w:t xml:space="preserve">Government effectiveness (WGI)</w:t>
-            </w:r>
-          </w:p>
-          <w:p>
-            <w:pPr>
-              <w:spacing w:after="40" w:line="240"/>
-            </w:pPr>
-            <w:r>
-              <w:rPr>
-                <w:rFonts w:ascii="Verdana" w:cs="Verdana" w:eastAsia="Verdana" w:hAnsi="Verdana"/>
-                <w:sz w:val="15"/>
-                <w:szCs w:val="15"/>
-              </w:rPr>
-              <w:t xml:space="preserve">Corruption Perceptions Index</w:t>
-            </w:r>
-          </w:p>
-          <w:p>
-            <w:pPr>
-              <w:spacing w:after="40" w:line="240"/>
-            </w:pPr>
-            <w:r>
-              <w:rPr>
-                <w:rFonts w:ascii="Verdana" w:cs="Verdana" w:eastAsia="Verdana" w:hAnsi="Verdana"/>
-                <w:sz w:val="15"/>
-                <w:szCs w:val="15"/>
-              </w:rPr>
-              <w:t xml:space="preserve">Country risk rating (Coface)</w:t>
-            </w:r>
-          </w:p>
-          <w:p>
-            <w:pPr>
-              <w:spacing w:after="40" w:line="240"/>
-            </w:pPr>
-            <w:r>
-              <w:rPr>
-                <w:rFonts w:ascii="Verdana" w:cs="Verdana" w:eastAsia="Verdana" w:hAnsi="Verdana"/>
-                <w:sz w:val="15"/>
-                <w:szCs w:val="15"/>
-              </w:rPr>
-              <w:t xml:space="preserve">EU trade agreement with the country (R)</w:t>
-            </w:r>
-          </w:p>
-        </w:tc>
-      </w:tr>
-      <w:tr>
-        <w:trPr>
-          <w:cantSplit/>
-        </w:trPr>
-        <w:tc>
-          <w:tcPr>
-            <w:tcW w:type="dxa" w:w="1700"/>
-            <w:tcBorders>
-              <w:top w:val="single" w:color="BFBFBF" w:sz="4"/>
-              <w:left w:val="single" w:color="BFBFBF" w:sz="4"/>
-              <w:bottom w:val="single" w:color="BFBFBF" w:sz="4"/>
-              <w:right w:val="single" w:color="BFBFBF" w:sz="4"/>
-            </w:tcBorders>
-            <w:tcMar>
-              <w:top w:type="dxa" w:w="60"/>
-              <w:left w:type="dxa" w:w="100"/>
-              <w:bottom w:type="dxa" w:w="40"/>
-              <w:right w:type="dxa" w:w="100"/>
-            </w:tcMar>
-          </w:tcPr>
-          <w:p>
-            <w:pPr>
-              <w:spacing w:after="40" w:line="240"/>
-            </w:pPr>
-            <w:r>
-              <w:rPr>
-                <w:rFonts w:ascii="Verdana" w:cs="Verdana" w:eastAsia="Verdana" w:hAnsi="Verdana"/>
-                <w:b/>
-                <w:bCs/>
-                <w:sz w:val="15"/>
-                <w:szCs w:val="15"/>
-              </w:rPr>
-              <w:t xml:space="preserve">Economic</w:t>
-            </w:r>
-            <w:r>
-              <w:rPr>
-                <w:rFonts w:ascii="Verdana" w:cs="Verdana" w:eastAsia="Verdana" w:hAnsi="Verdana"/>
-                <w:sz w:val="15"/>
-                <w:szCs w:val="15"/>
-              </w:rPr>
-              <w:t xml:space="preserve"> (10, weight 25)</w:t>
-            </w:r>
-          </w:p>
-        </w:tc>
-        <w:tc>
-          <w:tcPr>
-            <w:tcW w:type="dxa" w:w="7372"/>
-            <w:tcBorders>
-              <w:top w:val="single" w:color="BFBFBF" w:sz="4"/>
-              <w:left w:val="single" w:color="BFBFBF" w:sz="4"/>
-              <w:bottom w:val="single" w:color="BFBFBF" w:sz="4"/>
-              <w:right w:val="single" w:color="BFBFBF" w:sz="4"/>
-            </w:tcBorders>
-            <w:tcMar>
-              <w:top w:type="dxa" w:w="60"/>
-              <w:left w:type="dxa" w:w="100"/>
-              <w:bottom w:type="dxa" w:w="40"/>
-              <w:right w:type="dxa" w:w="100"/>
-            </w:tcMar>
-          </w:tcPr>
-          <w:p>
-            <w:pPr>
-              <w:spacing w:after="40" w:line="240"/>
-            </w:pPr>
-            <w:r>
-              <w:rPr>
-                <w:rFonts w:ascii="Verdana" w:cs="Verdana" w:eastAsia="Verdana" w:hAnsi="Verdana"/>
-                <w:sz w:val="15"/>
-                <w:szCs w:val="15"/>
-              </w:rPr>
-              <w:t xml:space="preserve">GDP per capita, PPP</w:t>
-            </w:r>
-          </w:p>
-          <w:p>
-            <w:pPr>
-              <w:spacing w:after="40" w:line="240"/>
-            </w:pPr>
-            <w:r>
-              <w:rPr>
-                <w:rFonts w:ascii="Verdana" w:cs="Verdana" w:eastAsia="Verdana" w:hAnsi="Verdana"/>
-                <w:sz w:val="15"/>
-                <w:szCs w:val="15"/>
-              </w:rPr>
-              <w:t xml:space="preserve">GDP growth, projected (IMF)</w:t>
-            </w:r>
-          </w:p>
-          <w:p>
-            <w:pPr>
-              <w:spacing w:after="40" w:line="240"/>
-            </w:pPr>
-            <w:r>
-              <w:rPr>
-                <w:rFonts w:ascii="Verdana" w:cs="Verdana" w:eastAsia="Verdana" w:hAnsi="Verdana"/>
-                <w:sz w:val="15"/>
-                <w:szCs w:val="15"/>
-              </w:rPr>
-              <w:t xml:space="preserve">Household consumption per capita</w:t>
-            </w:r>
-          </w:p>
-          <w:p>
-            <w:pPr>
-              <w:spacing w:after="40" w:line="240"/>
-            </w:pPr>
-            <w:r>
-              <w:rPr>
-                <w:rFonts w:ascii="Verdana" w:cs="Verdana" w:eastAsia="Verdana" w:hAnsi="Verdana"/>
-                <w:sz w:val="15"/>
-                <w:szCs w:val="15"/>
-              </w:rPr>
-              <w:t xml:space="preserve">Inflation (lower is better)</w:t>
-            </w:r>
-          </w:p>
-          <w:p>
-            <w:pPr>
-              <w:spacing w:after="40" w:line="240"/>
-            </w:pPr>
-            <w:r>
-              <w:rPr>
-                <w:rFonts w:ascii="Verdana" w:cs="Verdana" w:eastAsia="Verdana" w:hAnsi="Verdana"/>
-                <w:sz w:val="15"/>
-                <w:szCs w:val="15"/>
-              </w:rPr>
-              <w:t xml:space="preserve">Income inequality, Gini (lower is better)</w:t>
-            </w:r>
-          </w:p>
-          <w:p>
-            <w:pPr>
-              <w:spacing w:after="40" w:line="240"/>
-            </w:pPr>
-            <w:r>
-              <w:rPr>
-                <w:rFonts w:ascii="Verdana" w:cs="Verdana" w:eastAsia="Verdana" w:hAnsi="Verdana"/>
-                <w:sz w:val="15"/>
-                <w:szCs w:val="15"/>
-              </w:rPr>
-              <w:t xml:space="preserve">Exchange-rate change against the US dollar (lower is better)</w:t>
-            </w:r>
-          </w:p>
-          <w:p>
-            <w:pPr>
-              <w:spacing w:after="40" w:line="240"/>
-            </w:pPr>
-            <w:r>
-              <w:rPr>
-                <w:rFonts w:ascii="Verdana" w:cs="Verdana" w:eastAsia="Verdana" w:hAnsi="Verdana"/>
-                <w:sz w:val="15"/>
-                <w:szCs w:val="15"/>
-              </w:rPr>
-              <w:t xml:space="preserve">Population</w:t>
-            </w:r>
-          </w:p>
-          <w:p>
-            <w:pPr>
-              <w:spacing w:after="40" w:line="240"/>
-            </w:pPr>
-            <w:r>
-              <w:rPr>
-                <w:rFonts w:ascii="Verdana" w:cs="Verdana" w:eastAsia="Verdana" w:hAnsi="Verdana"/>
-                <w:sz w:val="15"/>
-                <w:szCs w:val="15"/>
-              </w:rPr>
-              <w:t xml:space="preserve">International tourism receipts</w:t>
-            </w:r>
-          </w:p>
-          <w:p>
-            <w:pPr>
-              <w:spacing w:after="40" w:line="240"/>
-            </w:pPr>
-            <w:r>
-              <w:rPr>
-                <w:rFonts w:ascii="Verdana" w:cs="Verdana" w:eastAsia="Verdana" w:hAnsi="Verdana"/>
-                <w:sz w:val="15"/>
-                <w:szCs w:val="15"/>
-              </w:rPr>
-              <w:t xml:space="preserve">Coffee imports, HS 0901</w:t>
-            </w:r>
-          </w:p>
-          <w:p>
-            <w:pPr>
-              <w:spacing w:after="40" w:line="240"/>
-            </w:pPr>
-            <w:r>
-              <w:rPr>
-                <w:rFonts w:ascii="Verdana" w:cs="Verdana" w:eastAsia="Verdana" w:hAnsi="Verdana"/>
-                <w:sz w:val="15"/>
-                <w:szCs w:val="15"/>
-              </w:rPr>
-              <w:t xml:space="preserve">Applied tariff on roasted coffee, HS 0901.21, EU origin (lower is better)</w:t>
-            </w:r>
-          </w:p>
-        </w:tc>
-      </w:tr>
-      <w:tr>
-        <w:trPr>
-          <w:cantSplit/>
-        </w:trPr>
-        <w:tc>
-          <w:tcPr>
-            <w:tcW w:type="dxa" w:w="1700"/>
-            <w:tcBorders>
-              <w:top w:val="single" w:color="BFBFBF" w:sz="4"/>
-              <w:left w:val="single" w:color="BFBFBF" w:sz="4"/>
-              <w:bottom w:val="single" w:color="BFBFBF" w:sz="4"/>
-              <w:right w:val="single" w:color="BFBFBF" w:sz="4"/>
-            </w:tcBorders>
-            <w:tcMar>
-              <w:top w:type="dxa" w:w="60"/>
-              <w:left w:type="dxa" w:w="100"/>
-              <w:bottom w:type="dxa" w:w="40"/>
-              <w:right w:type="dxa" w:w="100"/>
-            </w:tcMar>
-          </w:tcPr>
-          <w:p>
-            <w:pPr>
-              <w:spacing w:after="40" w:line="240"/>
-            </w:pPr>
-            <w:r>
-              <w:rPr>
-                <w:rFonts w:ascii="Verdana" w:cs="Verdana" w:eastAsia="Verdana" w:hAnsi="Verdana"/>
-                <w:b/>
-                <w:bCs/>
-                <w:sz w:val="15"/>
-                <w:szCs w:val="15"/>
-              </w:rPr>
-              <w:t xml:space="preserve">Social</w:t>
-            </w:r>
-            <w:r>
-              <w:rPr>
-                <w:rFonts w:ascii="Verdana" w:cs="Verdana" w:eastAsia="Verdana" w:hAnsi="Verdana"/>
-                <w:sz w:val="15"/>
-                <w:szCs w:val="15"/>
-              </w:rPr>
-              <w:t xml:space="preserve"> (10, weight 25)</w:t>
-            </w:r>
-          </w:p>
-        </w:tc>
-        <w:tc>
-          <w:tcPr>
-            <w:tcW w:type="dxa" w:w="7372"/>
-            <w:tcBorders>
-              <w:top w:val="single" w:color="BFBFBF" w:sz="4"/>
-              <w:left w:val="single" w:color="BFBFBF" w:sz="4"/>
-              <w:bottom w:val="single" w:color="BFBFBF" w:sz="4"/>
-              <w:right w:val="single" w:color="BFBFBF" w:sz="4"/>
-            </w:tcBorders>
-            <w:tcMar>
-              <w:top w:type="dxa" w:w="60"/>
-              <w:left w:type="dxa" w:w="100"/>
-              <w:bottom w:type="dxa" w:w="40"/>
-              <w:right w:type="dxa" w:w="100"/>
-            </w:tcMar>
-          </w:tcPr>
-          <w:p>
-            <w:pPr>
-              <w:spacing w:after="40" w:line="240"/>
-            </w:pPr>
-            <w:r>
-              <w:rPr>
-                <w:rFonts w:ascii="Verdana" w:cs="Verdana" w:eastAsia="Verdana" w:hAnsi="Verdana"/>
-                <w:sz w:val="15"/>
-                <w:szCs w:val="15"/>
-              </w:rPr>
-              <w:t xml:space="preserve">Coffee consumption per capita</w:t>
-            </w:r>
-          </w:p>
-          <w:p>
-            <w:pPr>
-              <w:spacing w:after="40" w:line="240"/>
-            </w:pPr>
-            <w:r>
-              <w:rPr>
-                <w:rFonts w:ascii="Verdana" w:cs="Verdana" w:eastAsia="Verdana" w:hAnsi="Verdana"/>
-                <w:sz w:val="15"/>
-                <w:szCs w:val="15"/>
-              </w:rPr>
-              <w:t xml:space="preserve">International tourist arrivals</w:t>
-            </w:r>
-          </w:p>
-          <w:p>
-            <w:pPr>
-              <w:spacing w:after="40" w:line="240"/>
-            </w:pPr>
-            <w:r>
-              <w:rPr>
-                <w:rFonts w:ascii="Verdana" w:cs="Verdana" w:eastAsia="Verdana" w:hAnsi="Verdana"/>
-                <w:sz w:val="15"/>
-                <w:szCs w:val="15"/>
-              </w:rPr>
-              <w:t xml:space="preserve">Share of visitors from Europe</w:t>
-            </w:r>
-          </w:p>
-          <w:p>
-            <w:pPr>
-              <w:spacing w:after="40" w:line="240"/>
-            </w:pPr>
-            <w:r>
-              <w:rPr>
-                <w:rFonts w:ascii="Verdana" w:cs="Verdana" w:eastAsia="Verdana" w:hAnsi="Verdana"/>
-                <w:sz w:val="15"/>
-                <w:szCs w:val="15"/>
-              </w:rPr>
-              <w:t xml:space="preserve">Urban population share</w:t>
-            </w:r>
-          </w:p>
-          <w:p>
-            <w:pPr>
-              <w:spacing w:after="40" w:line="240"/>
-            </w:pPr>
-            <w:r>
-              <w:rPr>
-                <w:rFonts w:ascii="Verdana" w:cs="Verdana" w:eastAsia="Verdana" w:hAnsi="Verdana"/>
-                <w:sz w:val="15"/>
-                <w:szCs w:val="15"/>
-              </w:rPr>
-              <w:t xml:space="preserve">Cafe culture (R)</w:t>
-            </w:r>
-          </w:p>
-          <w:p>
-            <w:pPr>
-              <w:spacing w:after="40" w:line="240"/>
-            </w:pPr>
-            <w:r>
-              <w:rPr>
-                <w:rFonts w:ascii="Verdana" w:cs="Verdana" w:eastAsia="Verdana" w:hAnsi="Verdana"/>
-                <w:sz w:val="15"/>
-                <w:szCs w:val="15"/>
-              </w:rPr>
-              <w:t xml:space="preserve">European influence on coffee culture (R)</w:t>
-            </w:r>
-          </w:p>
-          <w:p>
-            <w:pPr>
-              <w:spacing w:after="40" w:line="240"/>
-            </w:pPr>
-            <w:r>
-              <w:rPr>
-                <w:rFonts w:ascii="Verdana" w:cs="Verdana" w:eastAsia="Verdana" w:hAnsi="Verdana"/>
-                <w:sz w:val="15"/>
-                <w:szCs w:val="15"/>
-              </w:rPr>
-              <w:t xml:space="preserve">Human Development Index</w:t>
-            </w:r>
-          </w:p>
-          <w:p>
-            <w:pPr>
-              <w:spacing w:after="40" w:line="240"/>
-            </w:pPr>
-            <w:r>
-              <w:rPr>
-                <w:rFonts w:ascii="Verdana" w:cs="Verdana" w:eastAsia="Verdana" w:hAnsi="Verdana"/>
-                <w:sz w:val="15"/>
-                <w:szCs w:val="15"/>
-              </w:rPr>
-              <w:t xml:space="preserve">Specialty cafes in the capital (own count)</w:t>
-            </w:r>
-          </w:p>
-          <w:p>
-            <w:pPr>
-              <w:spacing w:after="40" w:line="240"/>
-            </w:pPr>
-            <w:r>
-              <w:rPr>
-                <w:rFonts w:ascii="Verdana" w:cs="Verdana" w:eastAsia="Verdana" w:hAnsi="Verdana"/>
-                <w:sz w:val="15"/>
-                <w:szCs w:val="15"/>
-              </w:rPr>
-              <w:t xml:space="preserve">International-brand hotels in the capital (own count)</w:t>
-            </w:r>
-          </w:p>
-          <w:p>
-            <w:pPr>
-              <w:spacing w:after="40" w:line="240"/>
-            </w:pPr>
-            <w:r>
-              <w:rPr>
-                <w:rFonts w:ascii="Verdana" w:cs="Verdana" w:eastAsia="Verdana" w:hAnsi="Verdana"/>
-                <w:sz w:val="15"/>
-                <w:szCs w:val="15"/>
-              </w:rPr>
-              <w:t xml:space="preserve">Tertiary school enrolment</w:t>
-            </w:r>
-          </w:p>
-        </w:tc>
-      </w:tr>
-      <w:tr>
-        <w:trPr>
-          <w:cantSplit/>
-        </w:trPr>
-        <w:tc>
-          <w:tcPr>
-            <w:tcW w:type="dxa" w:w="1700"/>
-            <w:tcBorders>
-              <w:top w:val="single" w:color="BFBFBF" w:sz="4"/>
-              <w:left w:val="single" w:color="BFBFBF" w:sz="4"/>
-              <w:bottom w:val="single" w:color="BFBFBF" w:sz="4"/>
-              <w:right w:val="single" w:color="BFBFBF" w:sz="4"/>
-            </w:tcBorders>
-            <w:tcMar>
-              <w:top w:type="dxa" w:w="60"/>
-              <w:left w:type="dxa" w:w="100"/>
-              <w:bottom w:type="dxa" w:w="40"/>
-              <w:right w:type="dxa" w:w="100"/>
-            </w:tcMar>
-          </w:tcPr>
-          <w:p>
-            <w:pPr>
-              <w:spacing w:after="40" w:line="240"/>
-            </w:pPr>
-            <w:r>
-              <w:rPr>
-                <w:rFonts w:ascii="Verdana" w:cs="Verdana" w:eastAsia="Verdana" w:hAnsi="Verdana"/>
-                <w:b/>
-                <w:bCs/>
-                <w:sz w:val="15"/>
-                <w:szCs w:val="15"/>
-              </w:rPr>
-              <w:t xml:space="preserve">Technological</w:t>
-            </w:r>
-            <w:r>
-              <w:rPr>
-                <w:rFonts w:ascii="Verdana" w:cs="Verdana" w:eastAsia="Verdana" w:hAnsi="Verdana"/>
-                <w:sz w:val="15"/>
-                <w:szCs w:val="15"/>
-              </w:rPr>
-              <w:t xml:space="preserve"> (10, weight 10)</w:t>
-            </w:r>
-          </w:p>
-        </w:tc>
-        <w:tc>
-          <w:tcPr>
-            <w:tcW w:type="dxa" w:w="7372"/>
-            <w:tcBorders>
-              <w:top w:val="single" w:color="BFBFBF" w:sz="4"/>
-              <w:left w:val="single" w:color="BFBFBF" w:sz="4"/>
-              <w:bottom w:val="single" w:color="BFBFBF" w:sz="4"/>
-              <w:right w:val="single" w:color="BFBFBF" w:sz="4"/>
-            </w:tcBorders>
-            <w:tcMar>
-              <w:top w:type="dxa" w:w="60"/>
-              <w:left w:type="dxa" w:w="100"/>
-              <w:bottom w:type="dxa" w:w="40"/>
-              <w:right w:type="dxa" w:w="100"/>
-            </w:tcMar>
-          </w:tcPr>
-          <w:p>
-            <w:pPr>
-              <w:spacing w:after="40" w:line="240"/>
-            </w:pPr>
-            <w:r>
-              <w:rPr>
-                <w:rFonts w:ascii="Verdana" w:cs="Verdana" w:eastAsia="Verdana" w:hAnsi="Verdana"/>
-                <w:sz w:val="15"/>
-                <w:szCs w:val="15"/>
-              </w:rPr>
-              <w:t xml:space="preserve">Individuals using the Internet</w:t>
-            </w:r>
-          </w:p>
-          <w:p>
-            <w:pPr>
-              <w:spacing w:after="40" w:line="240"/>
-            </w:pPr>
-            <w:r>
-              <w:rPr>
-                <w:rFonts w:ascii="Verdana" w:cs="Verdana" w:eastAsia="Verdana" w:hAnsi="Verdana"/>
-                <w:sz w:val="15"/>
-                <w:szCs w:val="15"/>
-              </w:rPr>
-              <w:t xml:space="preserve">Logistics Performance Index</w:t>
-            </w:r>
-          </w:p>
-          <w:p>
-            <w:pPr>
-              <w:spacing w:after="40" w:line="240"/>
-            </w:pPr>
-            <w:r>
-              <w:rPr>
-                <w:rFonts w:ascii="Verdana" w:cs="Verdana" w:eastAsia="Verdana" w:hAnsi="Verdana"/>
-                <w:sz w:val="15"/>
-                <w:szCs w:val="15"/>
-              </w:rPr>
-              <w:t xml:space="preserve">Global Innovation Index</w:t>
-            </w:r>
-          </w:p>
-          <w:p>
-            <w:pPr>
-              <w:spacing w:after="40" w:line="240"/>
-            </w:pPr>
-            <w:r>
-              <w:rPr>
-                <w:rFonts w:ascii="Verdana" w:cs="Verdana" w:eastAsia="Verdana" w:hAnsi="Verdana"/>
-                <w:sz w:val="15"/>
-                <w:szCs w:val="15"/>
-              </w:rPr>
-              <w:t xml:space="preserve">Online retail and food delivery share</w:t>
-            </w:r>
-          </w:p>
-          <w:p>
-            <w:pPr>
-              <w:spacing w:after="40" w:line="240"/>
-            </w:pPr>
-            <w:r>
-              <w:rPr>
-                <w:rFonts w:ascii="Verdana" w:cs="Verdana" w:eastAsia="Verdana" w:hAnsi="Verdana"/>
-                <w:sz w:val="15"/>
-                <w:szCs w:val="15"/>
-              </w:rPr>
-              <w:t xml:space="preserve">Account ownership, adults</w:t>
-            </w:r>
-          </w:p>
-          <w:p>
-            <w:pPr>
-              <w:spacing w:after="40" w:line="240"/>
-            </w:pPr>
-            <w:r>
-              <w:rPr>
-                <w:rFonts w:ascii="Verdana" w:cs="Verdana" w:eastAsia="Verdana" w:hAnsi="Verdana"/>
-                <w:sz w:val="15"/>
-                <w:szCs w:val="15"/>
-              </w:rPr>
-              <w:t xml:space="preserve">Mobile cellular subscriptions</w:t>
-            </w:r>
-          </w:p>
-          <w:p>
-            <w:pPr>
-              <w:spacing w:after="40" w:line="240"/>
-            </w:pPr>
-            <w:r>
-              <w:rPr>
-                <w:rFonts w:ascii="Verdana" w:cs="Verdana" w:eastAsia="Verdana" w:hAnsi="Verdana"/>
-                <w:sz w:val="15"/>
-                <w:szCs w:val="15"/>
-              </w:rPr>
-              <w:t xml:space="preserve">Fixed broadband subscriptions</w:t>
-            </w:r>
-          </w:p>
-          <w:p>
-            <w:pPr>
-              <w:spacing w:after="40" w:line="240"/>
-            </w:pPr>
-            <w:r>
-              <w:rPr>
-                <w:rFonts w:ascii="Verdana" w:cs="Verdana" w:eastAsia="Verdana" w:hAnsi="Verdana"/>
-                <w:sz w:val="15"/>
-                <w:szCs w:val="15"/>
-              </w:rPr>
-              <w:t xml:space="preserve">Secure Internet servers</w:t>
-            </w:r>
-          </w:p>
-          <w:p>
-            <w:pPr>
-              <w:spacing w:after="40" w:line="240"/>
-            </w:pPr>
-            <w:r>
-              <w:rPr>
-                <w:rFonts w:ascii="Verdana" w:cs="Verdana" w:eastAsia="Verdana" w:hAnsi="Verdana"/>
-                <w:sz w:val="15"/>
-                <w:szCs w:val="15"/>
-              </w:rPr>
-              <w:t xml:space="preserve">E-Government Development Index</w:t>
-            </w:r>
-          </w:p>
-          <w:p>
-            <w:pPr>
-              <w:spacing w:after="40" w:line="240"/>
-            </w:pPr>
-            <w:r>
-              <w:rPr>
-                <w:rFonts w:ascii="Verdana" w:cs="Verdana" w:eastAsia="Verdana" w:hAnsi="Verdana"/>
-                <w:sz w:val="15"/>
-                <w:szCs w:val="15"/>
-              </w:rPr>
-              <w:t xml:space="preserve">Container port traffic</w:t>
-            </w:r>
-          </w:p>
-        </w:tc>
-      </w:tr>
-      <w:tr>
-        <w:trPr>
-          <w:cantSplit/>
-        </w:trPr>
-        <w:tc>
-          <w:tcPr>
-            <w:tcW w:type="dxa" w:w="1700"/>
-            <w:tcBorders>
-              <w:top w:val="single" w:color="BFBFBF" w:sz="4"/>
-              <w:left w:val="single" w:color="BFBFBF" w:sz="4"/>
-              <w:bottom w:val="single" w:color="BFBFBF" w:sz="4"/>
-              <w:right w:val="single" w:color="BFBFBF" w:sz="4"/>
-            </w:tcBorders>
-            <w:tcMar>
-              <w:top w:type="dxa" w:w="60"/>
-              <w:left w:type="dxa" w:w="100"/>
-              <w:bottom w:type="dxa" w:w="40"/>
-              <w:right w:type="dxa" w:w="100"/>
-            </w:tcMar>
-          </w:tcPr>
-          <w:p>
-            <w:pPr>
-              <w:spacing w:after="40" w:line="240"/>
-            </w:pPr>
-            <w:r>
-              <w:rPr>
-                <w:rFonts w:ascii="Verdana" w:cs="Verdana" w:eastAsia="Verdana" w:hAnsi="Verdana"/>
-                <w:b/>
-                <w:bCs/>
-                <w:sz w:val="15"/>
-                <w:szCs w:val="15"/>
-              </w:rPr>
-              <w:t xml:space="preserve">Environmental</w:t>
-            </w:r>
-            <w:r>
-              <w:rPr>
-                <w:rFonts w:ascii="Verdana" w:cs="Verdana" w:eastAsia="Verdana" w:hAnsi="Verdana"/>
-                <w:sz w:val="15"/>
-                <w:szCs w:val="15"/>
-              </w:rPr>
-              <w:t xml:space="preserve"> (5, weight 5)</w:t>
-            </w:r>
-          </w:p>
-        </w:tc>
-        <w:tc>
-          <w:tcPr>
-            <w:tcW w:type="dxa" w:w="7372"/>
-            <w:tcBorders>
-              <w:top w:val="single" w:color="BFBFBF" w:sz="4"/>
-              <w:left w:val="single" w:color="BFBFBF" w:sz="4"/>
-              <w:bottom w:val="single" w:color="BFBFBF" w:sz="4"/>
-              <w:right w:val="single" w:color="BFBFBF" w:sz="4"/>
-            </w:tcBorders>
-            <w:tcMar>
-              <w:top w:type="dxa" w:w="60"/>
-              <w:left w:type="dxa" w:w="100"/>
-              <w:bottom w:type="dxa" w:w="40"/>
-              <w:right w:type="dxa" w:w="100"/>
-            </w:tcMar>
-          </w:tcPr>
-          <w:p>
-            <w:pPr>
-              <w:spacing w:after="40" w:line="240"/>
-            </w:pPr>
-            <w:r>
-              <w:rPr>
-                <w:rFonts w:ascii="Verdana" w:cs="Verdana" w:eastAsia="Verdana" w:hAnsi="Verdana"/>
-                <w:sz w:val="15"/>
-                <w:szCs w:val="15"/>
-              </w:rPr>
-              <w:t xml:space="preserve">Demand for certified and sustainable coffee (R)</w:t>
-            </w:r>
-          </w:p>
-          <w:p>
-            <w:pPr>
-              <w:spacing w:after="40" w:line="240"/>
-            </w:pPr>
-            <w:r>
-              <w:rPr>
-                <w:rFonts w:ascii="Verdana" w:cs="Verdana" w:eastAsia="Verdana" w:hAnsi="Verdana"/>
-                <w:sz w:val="15"/>
-                <w:szCs w:val="15"/>
-              </w:rPr>
-              <w:t xml:space="preserve">Environmental Performance Index</w:t>
-            </w:r>
-          </w:p>
-          <w:p>
-            <w:pPr>
-              <w:spacing w:after="40" w:line="240"/>
-            </w:pPr>
-            <w:r>
-              <w:rPr>
-                <w:rFonts w:ascii="Verdana" w:cs="Verdana" w:eastAsia="Verdana" w:hAnsi="Verdana"/>
-                <w:sz w:val="15"/>
-                <w:szCs w:val="15"/>
-              </w:rPr>
-              <w:t xml:space="preserve">Climate vulnerability and readiness (ND-GAIN)</w:t>
-            </w:r>
-          </w:p>
-          <w:p>
-            <w:pPr>
-              <w:spacing w:after="40" w:line="240"/>
-            </w:pPr>
-            <w:r>
-              <w:rPr>
-                <w:rFonts w:ascii="Verdana" w:cs="Verdana" w:eastAsia="Verdana" w:hAnsi="Verdana"/>
-                <w:sz w:val="15"/>
-                <w:szCs w:val="15"/>
-              </w:rPr>
-              <w:t xml:space="preserve">Domestic coffee production (lower is better: local competition)</w:t>
-            </w:r>
-          </w:p>
-          <w:p>
-            <w:pPr>
-              <w:spacing w:after="40" w:line="240"/>
-            </w:pPr>
-            <w:r>
-              <w:rPr>
-                <w:rFonts w:ascii="Verdana" w:cs="Verdana" w:eastAsia="Verdana" w:hAnsi="Verdana"/>
-                <w:sz w:val="15"/>
-                <w:szCs w:val="15"/>
-              </w:rPr>
-              <w:t xml:space="preserve">Packaging and waste rules for imported goods (R)</w:t>
-            </w:r>
-          </w:p>
-        </w:tc>
-      </w:tr>
-      <w:tr>
-        <w:trPr>
-          <w:cantSplit/>
-        </w:trPr>
-        <w:tc>
-          <w:tcPr>
-            <w:tcW w:type="dxa" w:w="1700"/>
-            <w:tcBorders>
-              <w:top w:val="single" w:color="BFBFBF" w:sz="4"/>
-              <w:left w:val="single" w:color="BFBFBF" w:sz="4"/>
-              <w:bottom w:val="single" w:color="BFBFBF" w:sz="4"/>
-              <w:right w:val="single" w:color="BFBFBF" w:sz="4"/>
-            </w:tcBorders>
-            <w:tcMar>
-              <w:top w:type="dxa" w:w="60"/>
-              <w:left w:type="dxa" w:w="100"/>
-              <w:bottom w:type="dxa" w:w="40"/>
-              <w:right w:type="dxa" w:w="100"/>
-            </w:tcMar>
-          </w:tcPr>
-          <w:p>
-            <w:pPr>
-              <w:spacing w:after="40" w:line="240"/>
-            </w:pPr>
-            <w:r>
-              <w:rPr>
-                <w:rFonts w:ascii="Verdana" w:cs="Verdana" w:eastAsia="Verdana" w:hAnsi="Verdana"/>
-                <w:b/>
-                <w:bCs/>
-                <w:sz w:val="15"/>
-                <w:szCs w:val="15"/>
-              </w:rPr>
-              <w:t xml:space="preserve">Legal</w:t>
-            </w:r>
-            <w:r>
-              <w:rPr>
-                <w:rFonts w:ascii="Verdana" w:cs="Verdana" w:eastAsia="Verdana" w:hAnsi="Verdana"/>
-                <w:sz w:val="15"/>
-                <w:szCs w:val="15"/>
-              </w:rPr>
-              <w:t xml:space="preserve"> (5, weight 20)</w:t>
-            </w:r>
-          </w:p>
-        </w:tc>
-        <w:tc>
-          <w:tcPr>
-            <w:tcW w:type="dxa" w:w="7372"/>
-            <w:tcBorders>
-              <w:top w:val="single" w:color="BFBFBF" w:sz="4"/>
-              <w:left w:val="single" w:color="BFBFBF" w:sz="4"/>
-              <w:bottom w:val="single" w:color="BFBFBF" w:sz="4"/>
-              <w:right w:val="single" w:color="BFBFBF" w:sz="4"/>
-            </w:tcBorders>
-            <w:tcMar>
-              <w:top w:type="dxa" w:w="60"/>
-              <w:left w:type="dxa" w:w="100"/>
-              <w:bottom w:type="dxa" w:w="40"/>
-              <w:right w:type="dxa" w:w="100"/>
-            </w:tcMar>
-          </w:tcPr>
-          <w:p>
-            <w:pPr>
-              <w:spacing w:after="40" w:line="240"/>
-            </w:pPr>
-            <w:r>
-              <w:rPr>
-                <w:rFonts w:ascii="Verdana" w:cs="Verdana" w:eastAsia="Verdana" w:hAnsi="Verdana"/>
-                <w:sz w:val="15"/>
-                <w:szCs w:val="15"/>
-              </w:rPr>
-              <w:t xml:space="preserve">Regulatory quality (WGI)</w:t>
-            </w:r>
-          </w:p>
-          <w:p>
-            <w:pPr>
-              <w:spacing w:after="40" w:line="240"/>
-            </w:pPr>
-            <w:r>
-              <w:rPr>
-                <w:rFonts w:ascii="Verdana" w:cs="Verdana" w:eastAsia="Verdana" w:hAnsi="Verdana"/>
-                <w:sz w:val="15"/>
-                <w:szCs w:val="15"/>
-              </w:rPr>
-              <w:t xml:space="preserve">Rule of law (WGI)</w:t>
-            </w:r>
-          </w:p>
-          <w:p>
-            <w:pPr>
-              <w:spacing w:after="40" w:line="240"/>
-            </w:pPr>
-            <w:r>
-              <w:rPr>
-                <w:rFonts w:ascii="Verdana" w:cs="Verdana" w:eastAsia="Verdana" w:hAnsi="Verdana"/>
-                <w:sz w:val="15"/>
-                <w:szCs w:val="15"/>
-              </w:rPr>
-              <w:t xml:space="preserve">Product, labelling and certification requirements for coffee (R)</w:t>
-            </w:r>
-          </w:p>
-          <w:p>
-            <w:pPr>
-              <w:spacing w:after="40" w:line="240"/>
-            </w:pPr>
-            <w:r>
-              <w:rPr>
-                <w:rFonts w:ascii="Verdana" w:cs="Verdana" w:eastAsia="Verdana" w:hAnsi="Verdana"/>
-                <w:sz w:val="15"/>
-                <w:szCs w:val="15"/>
-              </w:rPr>
-              <w:t xml:space="preserve">Trademark protection (R)</w:t>
-            </w:r>
-          </w:p>
-          <w:p>
-            <w:pPr>
-              <w:spacing w:after="40" w:line="240"/>
-            </w:pPr>
-            <w:r>
-              <w:rPr>
-                <w:rFonts w:ascii="Verdana" w:cs="Verdana" w:eastAsia="Verdana" w:hAnsi="Verdana"/>
-                <w:sz w:val="15"/>
-                <w:szCs w:val="15"/>
-              </w:rPr>
-              <w:t xml:space="preserve">Rules for ending a distribution agreement (R)</w:t>
-            </w:r>
-          </w:p>
-        </w:tc>
-      </w:tr>
-    </w:tbl>
     <w:p>
       <w:pPr>
         <w:spacing w:after="120" w:before="100" w:line="252"/>
@@ -6768,7 +5564,7 @@
           <w:sz w:val="19"/>
           <w:szCs w:val="19"/>
         </w:rPr>
-        <w:t xml:space="preserve">Aggregation is the weighted sum of the normalised indicator scores. Weighted sums let strengths offset weaknesses; the Access-led weight set in Step 7 shows how much your result depends on that. Other methods (AHP, best-worst, rank-order centroid, entropy) belong to the content presentation (Presentation 1); here the weights are given.</w:t>
+        <w:t xml:space="preserve">Aggregation is the weighted sum of the normalised indicator scores. Weighted sums let strengths offset weaknesses; the Access-led weight set in Step 6 shows how much your result depends on that. Other methods (AHP, best-worst, rank-order centroid, entropy) belong to the content presentation (Presentation 1); here the weights are given.</w:t>
       </w:r>
     </w:p>
     <w:p>
@@ -7490,7 +6286,7 @@
           <w:sz w:val="19"/>
           <w:szCs w:val="19"/>
         </w:rPr>
-        <w:t xml:space="preserve"> in Excel or Google Sheets (template "Industry sources") with one row per number or fact on your slides: segment, statistic, value, unit, year, source, source type, link, date accessed, slide number and quality.</w:t>
+        <w:t xml:space="preserve"> in Excel or Google Sheets (template "Industry analysis source list") with one row per number or fact on your slides: segment, statistic, value, unit, year, source, source type, link, date accessed, slide number and quality.</w:t>
       </w:r>
     </w:p>
     <w:p>
@@ -7526,24 +6322,7 @@
           <w:sz w:val="19"/>
           <w:szCs w:val="19"/>
         </w:rPr>
-        <w:t xml:space="preserve"> </w:t>
-      </w:r>
-      <w:r>
-        <w:rPr>
-          <w:rFonts w:ascii="Verdana" w:cs="Verdana" w:eastAsia="Verdana" w:hAnsi="Verdana"/>
-          <w:sz w:val="19"/>
-          <w:szCs w:val="19"/>
-          <w:highlight w:val="yellow"/>
-        </w:rPr>
-        <w:t xml:space="preserve">[link to be added]</w:t>
-      </w:r>
-      <w:r>
-        <w:rPr>
-          <w:rFonts w:ascii="Verdana" w:cs="Verdana" w:eastAsia="Verdana" w:hAnsi="Verdana"/>
-          <w:sz w:val="19"/>
-          <w:szCs w:val="19"/>
-        </w:rPr>
-        <w:t xml:space="preserve"> for all six groups. You enter data only in the yellow cells of your own country (the numbers, with year and source for documentation); the rest is automatic and locked. Sheets:</w:t>
+        <w:t xml:space="preserve"> (https://docs.google.com/spreadsheets/d/1ifCycoxWtutCrwbsCETGqZynYf1nFx7izoGMwWKapVE/edit) for all six groups. You enter data only in the yellow cells of your own country (the numbers, with year and source for documentation); the rest is automatic and locked. Sheets:</w:t>
       </w:r>
     </w:p>
     <w:tbl>
@@ -8148,24 +6927,7 @@
           <w:sz w:val="19"/>
           <w:szCs w:val="19"/>
         </w:rPr>
-        <w:t xml:space="preserve"> (hand-in): a short workbook with (1) a copy of your country's data and sources, (2) the Part B source list (template "Industry sources" </w:t>
-      </w:r>
-      <w:r>
-        <w:rPr>
-          <w:rFonts w:ascii="Verdana" w:cs="Verdana" w:eastAsia="Verdana" w:hAnsi="Verdana"/>
-          <w:sz w:val="19"/>
-          <w:szCs w:val="19"/>
-          <w:highlight w:val="yellow"/>
-        </w:rPr>
-        <w:t xml:space="preserve">[link to be added]</w:t>
-      </w:r>
-      <w:r>
-        <w:rPr>
-          <w:rFonts w:ascii="Verdana" w:cs="Verdana" w:eastAsia="Verdana" w:hAnsi="Verdana"/>
-          <w:sz w:val="19"/>
-          <w:szCs w:val="19"/>
-        </w:rPr>
-        <w:t xml:space="preserve">): every source behind the numbers on your industry slides, and (3) a list of the AI tools you used. The industry numbers themselves are shown in the presentation. Sources need URL, date accessed and who collected the data. Results come from formulas, not pasted values; inputs and formulas are visibly different.</w:t>
+        <w:t xml:space="preserve"> (hand-in): a short workbook with (1) a copy of your country's data and sources, (2) the Part B source list (template "Industry analysis source list": https://docs.google.com/spreadsheets/d/1j_sCad7k4kMgdCHRPM9sbeIKD9YeIDw6v16mskYxjB4/edit, File &gt; Make a copy): every source behind the numbers on your industry slides, and (3) a list of the AI tools you used. The industry numbers themselves are shown in the presentation. Sources need URL, date accessed and who collected the data. Results come from formulas, not pasted values; inputs and formulas are visibly different.</w:t>
       </w:r>
     </w:p>
     <w:p>
@@ -8519,7 +7281,7 @@
                 <w:sz w:val="16"/>
                 <w:szCs w:val="16"/>
               </w:rPr>
-              <w:t xml:space="preserve">Common criteria applied unchanged; the view from Vienna; the hard question is addressed</w:t>
+              <w:t xml:space="preserve">The common criteria are applied unchanged; the view from Vienna; the hard question is addressed</w:t>
             </w:r>
           </w:p>
         </w:tc>
@@ -8589,7 +7351,7 @@
                 <w:sz w:val="16"/>
                 <w:szCs w:val="16"/>
               </w:rPr>
-              <w:t xml:space="preserve">Data quality and documentation</w:t>
+              <w:t xml:space="preserve">Part A: scoring method</w:t>
             </w:r>
           </w:p>
         </w:tc>
@@ -8621,7 +7383,7 @@
                 <w:sz w:val="16"/>
                 <w:szCs w:val="16"/>
               </w:rPr>
-              <w:t xml:space="preserve">Named sources, years and units; missing data handled openly; everything traceable</w:t>
+              <w:t xml:space="preserve">Data of your country complete and correct; scores, ranks and the four weight sets understood and explained; rubric scores justified</w:t>
             </w:r>
           </w:p>
         </w:tc>
@@ -8653,7 +7415,7 @@
                 <w:sz w:val="16"/>
                 <w:szCs w:val="16"/>
               </w:rPr>
-              <w:t xml:space="preserve">15 %</w:t>
+              <w:t xml:space="preserve">20 %</w:t>
             </w:r>
           </w:p>
         </w:tc>
@@ -8691,7 +7453,7 @@
                 <w:sz w:val="16"/>
                 <w:szCs w:val="16"/>
               </w:rPr>
-              <w:t xml:space="preserve">Method</w:t>
+              <w:t xml:space="preserve">Part B: industry analysis</w:t>
             </w:r>
           </w:p>
         </w:tc>
@@ -8722,7 +7484,7 @@
                 <w:sz w:val="16"/>
                 <w:szCs w:val="16"/>
               </w:rPr>
-              <w:t xml:space="preserve">Data collected and documented correctly; normalisation, weights and results explained; rubric scores justified</w:t>
+              <w:t xml:space="preserve">Relevant statistics for hotels, restaurants, cafes and private end customers; value chain, rules of the game and trends; clear charts and tables</w:t>
             </w:r>
           </w:p>
         </w:tc>
@@ -8792,7 +7554,7 @@
                 <w:sz w:val="16"/>
                 <w:szCs w:val="16"/>
               </w:rPr>
-              <w:t xml:space="preserve">Robustness</w:t>
+              <w:t xml:space="preserve">Insights and recommendation</w:t>
             </w:r>
           </w:p>
         </w:tc>
@@ -8824,7 +7586,7 @@
                 <w:sz w:val="16"/>
                 <w:szCs w:val="16"/>
               </w:rPr>
-              <w:t xml:space="preserve">All four alternative weight sets run correctly; honest reading of what they show</w:t>
+              <w:t xml:space="preserve">Clear recommendation for your country; says what not to do; states uncertainty</w:t>
             </w:r>
           </w:p>
         </w:tc>
@@ -8894,7 +7656,7 @@
                 <w:sz w:val="16"/>
                 <w:szCs w:val="16"/>
               </w:rPr>
-              <w:t xml:space="preserve">Insight and recommendation</w:t>
+              <w:t xml:space="preserve">Presentation</w:t>
             </w:r>
           </w:p>
         </w:tc>
@@ -8925,7 +7687,7 @@
                 <w:sz w:val="16"/>
                 <w:szCs w:val="16"/>
               </w:rPr>
-              <w:t xml:space="preserve">Clear recommendation for your country; says what not to do; states uncertainty; Part B adds real industry insight</w:t>
+              <w:t xml:space="preserve">Structure, timing, visuals, answers to questions</w:t>
             </w:r>
           </w:p>
         </w:tc>
@@ -8956,7 +7718,7 @@
                 <w:sz w:val="16"/>
                 <w:szCs w:val="16"/>
               </w:rPr>
-              <w:t xml:space="preserve">20 %</w:t>
+              <w:t xml:space="preserve">15 %</w:t>
             </w:r>
           </w:p>
         </w:tc>
@@ -8995,7 +7757,7 @@
                 <w:sz w:val="16"/>
                 <w:szCs w:val="16"/>
               </w:rPr>
-              <w:t xml:space="preserve">Presentation and Excel</w:t>
+              <w:t xml:space="preserve">Industry analysis sources</w:t>
             </w:r>
           </w:p>
         </w:tc>
@@ -9027,7 +7789,7 @@
                 <w:sz w:val="16"/>
                 <w:szCs w:val="16"/>
               </w:rPr>
-              <w:t xml:space="preserve">Structure, timing, visuals, answers to questions; clear workbook</w:t>
+              <w:t xml:space="preserve">Source list complete: every number on the industry slides is traceable with year, link and source type</w:t>
             </w:r>
           </w:p>
         </w:tc>
@@ -9729,34 +8491,6 @@
           <w:szCs w:val="19"/>
         </w:rPr>
         <w:t xml:space="preserve"> Other groups depend on your data. Keep definitions, units and years as agreed.</w:t>
-      </w:r>
-    </w:p>
-    <w:p>
-      <w:pPr>
-        <w:pStyle w:val="ListParagraph"/>
-        <w:numPr>
-          <w:ilvl w:val="0"/>
-          <w:numId w:val="2"/>
-        </w:numPr>
-        <w:spacing w:after="60" w:line="252"/>
-      </w:pPr>
-      <w:r>
-        <w:rPr>
-          <w:rFonts w:ascii="Verdana" w:cs="Verdana" w:eastAsia="Verdana" w:hAnsi="Verdana"/>
-          <w:b/>
-          <w:bCs/>
-          <w:sz w:val="19"/>
-          <w:szCs w:val="19"/>
-        </w:rPr>
-        <w:t xml:space="preserve">Double counting.</w:t>
-      </w:r>
-      <w:r>
-        <w:rPr>
-          <w:rFonts w:ascii="Verdana" w:cs="Verdana" w:eastAsia="Verdana" w:hAnsi="Verdana"/>
-          <w:sz w:val="19"/>
-          <w:szCs w:val="19"/>
-        </w:rPr>
-        <w:t xml:space="preserve"> GDP, population and imports are strongly correlated.</w:t>
       </w:r>
     </w:p>
     <w:p>

</xml_diff>

<commit_message>
Brief: instructor e-mail in the ground rules
Co-Authored-By: Claude Sonnet 5.5 <noreply@anthropic.com>
Claude-Session: https://claude.ai/code/session_01RkWScMhuRmEB4zppSmB7Ri
</commit_message>
<xml_diff>
--- a/WT26-27/Student Brief Midterm Presentation WT26-27.docx
+++ b/WT26-27/Student Brief Midterm Presentation WT26-27.docx
@@ -951,24 +951,7 @@
           <w:sz w:val="19"/>
           <w:szCs w:val="19"/>
         </w:rPr>
-        <w:t xml:space="preserve"> Use public data only. Julius Meinl provides no internal figures (sales, margins, prices, partner names) and you do not need them. If you contact companies or people for your research, you do so as students on a university project, not on behalf of Julius Meinl. Julius Meinl has offered feedback on your market selection once the rankings are in. Its Group Export team answers questions that are bundled for the whole course: collect yours and send them to the instructor </w:t>
-      </w:r>
-      <w:r>
-        <w:rPr>
-          <w:rFonts w:ascii="Verdana" w:cs="Verdana" w:eastAsia="Verdana" w:hAnsi="Verdana"/>
-          <w:sz w:val="19"/>
-          <w:szCs w:val="19"/>
-          <w:highlight w:val="yellow"/>
-        </w:rPr>
-        <w:t xml:space="preserve">[process to be confirmed]</w:t>
-      </w:r>
-      <w:r>
-        <w:rPr>
-          <w:rFonts w:ascii="Verdana" w:cs="Verdana" w:eastAsia="Verdana" w:hAnsi="Verdana"/>
-          <w:sz w:val="19"/>
-          <w:szCs w:val="19"/>
-        </w:rPr>
-        <w:t xml:space="preserve">.</w:t>
+        <w:t xml:space="preserve"> Use public data only. Julius Meinl provides no internal figures (sales, margins, prices, partner names) and you do not need them. If you contact companies or people for your research, you do so as students on a university project, not on behalf of Julius Meinl. Julius Meinl has offered feedback on your market selection once the rankings are in. Its Group Export team answers questions that are bundled for the whole course: collect yours and send them by e-mail to the instructor, arne.floh@wu.ac.at.</w:t>
       </w:r>
     </w:p>
     <w:p>

</xml_diff>

<commit_message>
Brief: Google Sheet links, data entry deadline Mon 26 Oct 08:00
Co-Authored-By: Claude Sonnet 5.5 <noreply@anthropic.com>
Claude-Session: https://claude.ai/code/session_01RkWScMhuRmEB4zppSmB7Ri
</commit_message>
<xml_diff>
--- a/WT26-27/Student Brief Midterm Presentation WT26-27.docx
+++ b/WT26-27/Student Brief Midterm Presentation WT26-27.docx
@@ -511,7 +511,7 @@
                 <w:sz w:val="16"/>
                 <w:szCs w:val="16"/>
               </w:rPr>
-              <w:t xml:space="preserve">Monday 16 November 2026, 08:00 on Canvas: one presentation file and one Excel file, named GroupX_Midterm and GroupX_Midterm_Data; your country's data are due in the shared Google Sheet earlier (Step 2).</w:t>
+              <w:t xml:space="preserve">Monday 16 November 2026, 08:00 on Canvas: one presentation file and one Excel file, named GroupX_Midterm and GroupX_Midterm_Data; your country's data are due in the shared Google Sheet by Monday 26 October 2026, 08:00 (Step 2).</w:t>
             </w:r>
           </w:p>
         </w:tc>
@@ -2491,24 +2491,7 @@
           <w:sz w:val="19"/>
           <w:szCs w:val="19"/>
         </w:rPr>
-        <w:t xml:space="preserve"> (political, economic, social, technological, environmental, legal). Each step lists what to hand in. The shared Google Sheet "Country scoring model" </w:t>
-      </w:r>
-      <w:r>
-        <w:rPr>
-          <w:rFonts w:ascii="Verdana" w:cs="Verdana" w:eastAsia="Verdana" w:hAnsi="Verdana"/>
-          <w:sz w:val="19"/>
-          <w:szCs w:val="19"/>
-          <w:highlight w:val="yellow"/>
-        </w:rPr>
-        <w:t xml:space="preserve">[link to be added]</w:t>
-      </w:r>
-      <w:r>
-        <w:rPr>
-          <w:rFonts w:ascii="Verdana" w:cs="Verdana" w:eastAsia="Verdana" w:hAnsi="Verdana"/>
-          <w:sz w:val="19"/>
-          <w:szCs w:val="19"/>
-        </w:rPr>
-        <w:t xml:space="preserve"> mirrors the steps (section 9).</w:t>
+        <w:t xml:space="preserve"> (political, economic, social, technological, environmental, legal). Each step lists what to hand in. The shared Google Sheet "Country scoring model" (https://docs.google.com/spreadsheets/d/1ifCycoxWtutCrwbsCETGqZynYf1nFx7izoGMwWKapVE/edit) mirrors the steps (section 9).</w:t>
       </w:r>
     </w:p>
     <w:p>
@@ -2612,7 +2595,7 @@
           <w:sz w:val="19"/>
           <w:szCs w:val="19"/>
         </w:rPr>
-        <w:t xml:space="preserve">Collect the values of your allocated country for all 45 indicators and enter them in the yellow cells of your country on the Data sheet of the shared Google Sheet. </w:t>
+        <w:t xml:space="preserve">Collect the values of your allocated country for all 45 indicators and enter them in the yellow cells of your country on the Data sheet of the shared Google Sheet (https://docs.google.com/spreadsheets/d/1ifCycoxWtutCrwbsCETGqZynYf1nFx7izoGMwWKapVE/edit). </w:t>
       </w:r>
       <w:r>
         <w:rPr>
@@ -2630,24 +2613,7 @@
           <w:sz w:val="19"/>
           <w:szCs w:val="19"/>
         </w:rPr>
-        <w:t xml:space="preserve"> (rubric indicators: a whole number from 1 to 5); the sheet does everything else. Use the latest year available and record the year and source (name and link) for every number. If a value is missing, substitute a comparable indicator with the instructor's agreement </w:t>
-      </w:r>
-      <w:r>
-        <w:rPr>
-          <w:rFonts w:ascii="Verdana" w:cs="Verdana" w:eastAsia="Verdana" w:hAnsi="Verdana"/>
-          <w:sz w:val="19"/>
-          <w:szCs w:val="19"/>
-          <w:highlight w:val="yellow"/>
-        </w:rPr>
-        <w:t xml:space="preserve">[process to be confirmed]</w:t>
-      </w:r>
-      <w:r>
-        <w:rPr>
-          <w:rFonts w:ascii="Verdana" w:cs="Verdana" w:eastAsia="Verdana" w:hAnsi="Verdana"/>
-          <w:sz w:val="19"/>
-          <w:szCs w:val="19"/>
-        </w:rPr>
-        <w:t xml:space="preserve"> and document it. Follow the definitions exactly: the other groups use your numbers. </w:t>
+        <w:t xml:space="preserve"> (rubric indicators: a whole number from 1 to 5); the sheet does everything else. Use the latest year available and record the year and source (name and link) for every number. If a value is missing, ask the instructor (arne.floh@wu.ac.at) before you substitute a comparable indicator, and document it. Follow the definitions exactly: the other groups use your numbers. </w:t>
       </w:r>
       <w:r>
         <w:rPr>
@@ -2670,11 +2636,12 @@
       <w:r>
         <w:rPr>
           <w:rFonts w:ascii="Verdana" w:cs="Verdana" w:eastAsia="Verdana" w:hAnsi="Verdana"/>
-          <w:sz w:val="19"/>
-          <w:szCs w:val="19"/>
-          <w:highlight w:val="yellow"/>
-        </w:rPr>
-        <w:t xml:space="preserve">[deadline]</w:t>
+          <w:b/>
+          <w:bCs/>
+          <w:sz w:val="19"/>
+          <w:szCs w:val="19"/>
+        </w:rPr>
+        <w:t xml:space="preserve">Monday 26 October 2026, 08:00</w:t>
       </w:r>
       <w:r>
         <w:rPr>
@@ -4758,7 +4725,7 @@
           <w:sz w:val="19"/>
           <w:szCs w:val="19"/>
         </w:rPr>
-        <w:t xml:space="preserve">The final criteria are selected by the instructor from the proposals of all groups (Step 1): 5 political, 10 economic, 10 social, 10 technological, 5 environmental and 5 legal, 45 in total. The weight of a dimension is split equally among its indicators. Units, definitions and sources are on the Indicators sheet of the Google Sheet; rubric scores (R) follow the Rubrics sheet.</w:t>
+        <w:t xml:space="preserve">The final criteria are selected by the instructor from the proposals of all groups (Step 1): 5 political, 10 economic, 10 social, 10 technological, 5 environmental and 5 legal, 45 in total. The weight of a dimension is split equally among its indicators. Units, definitions and sources are on the Indicators sheet of the Google Sheet; rubric scores follow the definitions on the Indicators sheet.</w:t>
       </w:r>
     </w:p>
     <w:p>
@@ -6269,7 +6236,7 @@
           <w:sz w:val="19"/>
           <w:szCs w:val="19"/>
         </w:rPr>
-        <w:t xml:space="preserve"> in Excel or Google Sheets (template "Industry analysis source list") with one row per number or fact on your slides: segment, statistic, value, unit, year, source, source type, link, date accessed, slide number and quality.</w:t>
+        <w:t xml:space="preserve"> in Excel or Google Sheets (template "Industry analysis source list": https://docs.google.com/spreadsheets/d/1j_sCad7k4kMgdCHRPM9sbeIKD9YeIDw6v16mskYxjB4/edit, File &gt; Make a copy) with one row per number or fact on your slides: segment, statistic, value, unit, year, source, source type, link, date accessed, slide number and quality.</w:t>
       </w:r>
     </w:p>
     <w:p>
@@ -7052,24 +7019,7 @@
           <w:sz w:val="19"/>
           <w:szCs w:val="19"/>
         </w:rPr>
-        <w:t xml:space="preserve">The midterm is graded as a group and counts 30 % of the course grade. Indicative weighting of the criteria: </w:t>
-      </w:r>
-      <w:r>
-        <w:rPr>
-          <w:rFonts w:ascii="Verdana" w:cs="Verdana" w:eastAsia="Verdana" w:hAnsi="Verdana"/>
-          <w:sz w:val="19"/>
-          <w:szCs w:val="19"/>
-          <w:highlight w:val="yellow"/>
-        </w:rPr>
-        <w:t xml:space="preserve">[to be confirmed]</w:t>
-      </w:r>
-      <w:r>
-        <w:rPr>
-          <w:rFonts w:ascii="Verdana" w:cs="Verdana" w:eastAsia="Verdana" w:hAnsi="Verdana"/>
-          <w:sz w:val="19"/>
-          <w:szCs w:val="19"/>
-        </w:rPr>
-        <w:t xml:space="preserve">.</w:t>
+        <w:t xml:space="preserve">The midterm is graded as a group and counts 30 % of the course grade. Indicative weighting of the criteria:</w:t>
       </w:r>
     </w:p>
     <w:tbl>
@@ -8197,7 +8147,7 @@
                 <w:sz w:val="16"/>
                 <w:szCs w:val="16"/>
               </w:rPr>
-              <w:t xml:space="preserve">Your country's data entered in the shared file; then normalisation, weights, first scores</w:t>
+              <w:t xml:space="preserve">Your country's data entered in the shared sheet by Mon 26 Oct, 08:00; then your first results and robustness checks</w:t>
             </w:r>
           </w:p>
         </w:tc>

</xml_diff>

<commit_message>
Brief: remove common pitfalls section
Co-Authored-By: Claude Sonnet 5.5 <noreply@anthropic.com>
Claude-Session: https://claude.ai/code/session_01RkWScMhuRmEB4zppSmB7Ri
</commit_message>
<xml_diff>
--- a/WT26-27/Student Brief Midterm Presentation WT26-27.docx
+++ b/WT26-27/Student Brief Midterm Presentation WT26-27.docx
@@ -8386,186 +8386,6 @@
         </w:tc>
       </w:tr>
     </w:tbl>
-    <w:p>
-      <w:pPr>
-        <w:pStyle w:val="Heading1"/>
-        <w:keepNext/>
-      </w:pPr>
-      <w:r>
-        <w:rPr>
-          <w:rFonts w:ascii="Verdana" w:cs="Verdana" w:eastAsia="Verdana" w:hAnsi="Verdana"/>
-        </w:rPr>
-        <w:t xml:space="preserve">13  Common pitfalls</w:t>
-      </w:r>
-    </w:p>
-    <w:p>
-      <w:pPr>
-        <w:pStyle w:val="ListParagraph"/>
-        <w:numPr>
-          <w:ilvl w:val="0"/>
-          <w:numId w:val="2"/>
-        </w:numPr>
-        <w:spacing w:after="60" w:line="252"/>
-      </w:pPr>
-      <w:r>
-        <w:rPr>
-          <w:rFonts w:ascii="Verdana" w:cs="Verdana" w:eastAsia="Verdana" w:hAnsi="Verdana"/>
-          <w:b/>
-          <w:bCs/>
-          <w:sz w:val="19"/>
-          <w:szCs w:val="19"/>
-        </w:rPr>
-        <w:t xml:space="preserve">Changing the common criteria.</w:t>
-      </w:r>
-      <w:r>
-        <w:rPr>
-          <w:rFonts w:ascii="Verdana" w:cs="Verdana" w:eastAsia="Verdana" w:hAnsi="Verdana"/>
-          <w:sz w:val="19"/>
-          <w:szCs w:val="19"/>
-        </w:rPr>
-        <w:t xml:space="preserve"> Other groups depend on your data. Keep definitions, units and years as agreed.</w:t>
-      </w:r>
-    </w:p>
-    <w:p>
-      <w:pPr>
-        <w:pStyle w:val="ListParagraph"/>
-        <w:numPr>
-          <w:ilvl w:val="0"/>
-          <w:numId w:val="2"/>
-        </w:numPr>
-        <w:spacing w:after="60" w:line="252"/>
-      </w:pPr>
-      <w:r>
-        <w:rPr>
-          <w:rFonts w:ascii="Verdana" w:cs="Verdana" w:eastAsia="Verdana" w:hAnsi="Verdana"/>
-          <w:b/>
-          <w:bCs/>
-          <w:sz w:val="19"/>
-          <w:szCs w:val="19"/>
-        </w:rPr>
-        <w:t xml:space="preserve">Min-max with six countries.</w:t>
-      </w:r>
-      <w:r>
-        <w:rPr>
-          <w:rFonts w:ascii="Verdana" w:cs="Verdana" w:eastAsia="Verdana" w:hAnsi="Verdana"/>
-          <w:sz w:val="19"/>
-          <w:szCs w:val="19"/>
-        </w:rPr>
-        <w:t xml:space="preserve"> It stretches tiny differences. Compare it with the T-scores.</w:t>
-      </w:r>
-    </w:p>
-    <w:p>
-      <w:pPr>
-        <w:pStyle w:val="ListParagraph"/>
-        <w:numPr>
-          <w:ilvl w:val="0"/>
-          <w:numId w:val="2"/>
-        </w:numPr>
-        <w:spacing w:after="60" w:line="252"/>
-      </w:pPr>
-      <w:r>
-        <w:rPr>
-          <w:rFonts w:ascii="Verdana" w:cs="Verdana" w:eastAsia="Verdana" w:hAnsi="Verdana"/>
-          <w:b/>
-          <w:bCs/>
-          <w:sz w:val="19"/>
-          <w:szCs w:val="19"/>
-        </w:rPr>
-        <w:t xml:space="preserve">Treating the fixed weights as the truth.</w:t>
-      </w:r>
-      <w:r>
-        <w:rPr>
-          <w:rFonts w:ascii="Verdana" w:cs="Verdana" w:eastAsia="Verdana" w:hAnsi="Verdana"/>
-          <w:sz w:val="19"/>
-          <w:szCs w:val="19"/>
-        </w:rPr>
-        <w:t xml:space="preserve"> They are a baseline; report what the other weight sets show.</w:t>
-      </w:r>
-    </w:p>
-    <w:p>
-      <w:pPr>
-        <w:pStyle w:val="ListParagraph"/>
-        <w:numPr>
-          <w:ilvl w:val="0"/>
-          <w:numId w:val="2"/>
-        </w:numPr>
-        <w:spacing w:after="60" w:line="252"/>
-      </w:pPr>
-      <w:r>
-        <w:rPr>
-          <w:rFonts w:ascii="Verdana" w:cs="Verdana" w:eastAsia="Verdana" w:hAnsi="Verdana"/>
-          <w:b/>
-          <w:bCs/>
-          <w:sz w:val="19"/>
-          <w:szCs w:val="19"/>
-        </w:rPr>
-        <w:t xml:space="preserve">Treating the ranking as the truth.</w:t>
-      </w:r>
-      <w:r>
-        <w:rPr>
-          <w:rFonts w:ascii="Verdana" w:cs="Verdana" w:eastAsia="Verdana" w:hAnsi="Verdana"/>
-          <w:sz w:val="19"/>
-          <w:szCs w:val="19"/>
-        </w:rPr>
-        <w:t xml:space="preserve"> Report rank ranges and say what would change the order.</w:t>
-      </w:r>
-    </w:p>
-    <w:p>
-      <w:pPr>
-        <w:pStyle w:val="ListParagraph"/>
-        <w:numPr>
-          <w:ilvl w:val="0"/>
-          <w:numId w:val="2"/>
-        </w:numPr>
-        <w:spacing w:after="60" w:line="252"/>
-      </w:pPr>
-      <w:r>
-        <w:rPr>
-          <w:rFonts w:ascii="Verdana" w:cs="Verdana" w:eastAsia="Verdana" w:hAnsi="Verdana"/>
-          <w:b/>
-          <w:bCs/>
-          <w:sz w:val="19"/>
-          <w:szCs w:val="19"/>
-        </w:rPr>
-        <w:t xml:space="preserve">Ignoring Julius Meinl's model.</w:t>
-      </w:r>
-      <w:r>
-        <w:rPr>
-          <w:rFonts w:ascii="Verdana" w:cs="Verdana" w:eastAsia="Verdana" w:hAnsi="Verdana"/>
-          <w:sz w:val="19"/>
-          <w:szCs w:val="19"/>
-        </w:rPr>
-        <w:t xml:space="preserve"> A big market without hotels, premium buyers or a feasible partner may not fit.</w:t>
-      </w:r>
-    </w:p>
-    <w:p>
-      <w:pPr>
-        <w:pStyle w:val="ListParagraph"/>
-        <w:numPr>
-          <w:ilvl w:val="0"/>
-          <w:numId w:val="2"/>
-        </w:numPr>
-        <w:spacing w:after="60" w:line="252"/>
-      </w:pPr>
-      <w:r>
-        <w:rPr>
-          <w:rFonts w:ascii="Verdana" w:cs="Verdana" w:eastAsia="Verdana" w:hAnsi="Verdana"/>
-          <w:b/>
-          <w:bCs/>
-          <w:sz w:val="19"/>
-          <w:szCs w:val="19"/>
-        </w:rPr>
-        <w:t xml:space="preserve">No "what not to do".</w:t>
-      </w:r>
-      <w:r>
-        <w:rPr>
-          <w:rFonts w:ascii="Verdana" w:cs="Verdana" w:eastAsia="Verdana" w:hAnsi="Verdana"/>
-          <w:sz w:val="19"/>
-          <w:szCs w:val="19"/>
-        </w:rPr>
-        <w:t xml:space="preserve"> A recommendation includes the countries you would not enter now.</w:t>
-      </w:r>
-    </w:p>
     <w:sectPr>
       <w:footerReference w:type="default" r:id="rId6"/>
       <w:pgSz w:w="11906" w:h="16838" w:orient="portrait"/>

</xml_diff>

<commit_message>
Brief: restore common pitfalls section
Co-Authored-By: Claude Sonnet 5.5 <noreply@anthropic.com>
Claude-Session: https://claude.ai/code/session_01RkWScMhuRmEB4zppSmB7Ri
</commit_message>
<xml_diff>
--- a/WT26-27/Student Brief Midterm Presentation WT26-27.docx
+++ b/WT26-27/Student Brief Midterm Presentation WT26-27.docx
@@ -8386,6 +8386,186 @@
         </w:tc>
       </w:tr>
     </w:tbl>
+    <w:p>
+      <w:pPr>
+        <w:pStyle w:val="Heading1"/>
+        <w:keepNext/>
+      </w:pPr>
+      <w:r>
+        <w:rPr>
+          <w:rFonts w:ascii="Verdana" w:cs="Verdana" w:eastAsia="Verdana" w:hAnsi="Verdana"/>
+        </w:rPr>
+        <w:t xml:space="preserve">13  Common pitfalls</w:t>
+      </w:r>
+    </w:p>
+    <w:p>
+      <w:pPr>
+        <w:pStyle w:val="ListParagraph"/>
+        <w:numPr>
+          <w:ilvl w:val="0"/>
+          <w:numId w:val="2"/>
+        </w:numPr>
+        <w:spacing w:after="60" w:line="252"/>
+      </w:pPr>
+      <w:r>
+        <w:rPr>
+          <w:rFonts w:ascii="Verdana" w:cs="Verdana" w:eastAsia="Verdana" w:hAnsi="Verdana"/>
+          <w:b/>
+          <w:bCs/>
+          <w:sz w:val="19"/>
+          <w:szCs w:val="19"/>
+        </w:rPr>
+        <w:t xml:space="preserve">Changing the common criteria.</w:t>
+      </w:r>
+      <w:r>
+        <w:rPr>
+          <w:rFonts w:ascii="Verdana" w:cs="Verdana" w:eastAsia="Verdana" w:hAnsi="Verdana"/>
+          <w:sz w:val="19"/>
+          <w:szCs w:val="19"/>
+        </w:rPr>
+        <w:t xml:space="preserve"> Other groups depend on your data. Keep definitions, units and years as agreed.</w:t>
+      </w:r>
+    </w:p>
+    <w:p>
+      <w:pPr>
+        <w:pStyle w:val="ListParagraph"/>
+        <w:numPr>
+          <w:ilvl w:val="0"/>
+          <w:numId w:val="2"/>
+        </w:numPr>
+        <w:spacing w:after="60" w:line="252"/>
+      </w:pPr>
+      <w:r>
+        <w:rPr>
+          <w:rFonts w:ascii="Verdana" w:cs="Verdana" w:eastAsia="Verdana" w:hAnsi="Verdana"/>
+          <w:b/>
+          <w:bCs/>
+          <w:sz w:val="19"/>
+          <w:szCs w:val="19"/>
+        </w:rPr>
+        <w:t xml:space="preserve">Min-max with six countries.</w:t>
+      </w:r>
+      <w:r>
+        <w:rPr>
+          <w:rFonts w:ascii="Verdana" w:cs="Verdana" w:eastAsia="Verdana" w:hAnsi="Verdana"/>
+          <w:sz w:val="19"/>
+          <w:szCs w:val="19"/>
+        </w:rPr>
+        <w:t xml:space="preserve"> It stretches tiny differences. Compare it with the T-scores.</w:t>
+      </w:r>
+    </w:p>
+    <w:p>
+      <w:pPr>
+        <w:pStyle w:val="ListParagraph"/>
+        <w:numPr>
+          <w:ilvl w:val="0"/>
+          <w:numId w:val="2"/>
+        </w:numPr>
+        <w:spacing w:after="60" w:line="252"/>
+      </w:pPr>
+      <w:r>
+        <w:rPr>
+          <w:rFonts w:ascii="Verdana" w:cs="Verdana" w:eastAsia="Verdana" w:hAnsi="Verdana"/>
+          <w:b/>
+          <w:bCs/>
+          <w:sz w:val="19"/>
+          <w:szCs w:val="19"/>
+        </w:rPr>
+        <w:t xml:space="preserve">Treating the fixed weights as the truth.</w:t>
+      </w:r>
+      <w:r>
+        <w:rPr>
+          <w:rFonts w:ascii="Verdana" w:cs="Verdana" w:eastAsia="Verdana" w:hAnsi="Verdana"/>
+          <w:sz w:val="19"/>
+          <w:szCs w:val="19"/>
+        </w:rPr>
+        <w:t xml:space="preserve"> They are a baseline; report what the other weight sets show.</w:t>
+      </w:r>
+    </w:p>
+    <w:p>
+      <w:pPr>
+        <w:pStyle w:val="ListParagraph"/>
+        <w:numPr>
+          <w:ilvl w:val="0"/>
+          <w:numId w:val="2"/>
+        </w:numPr>
+        <w:spacing w:after="60" w:line="252"/>
+      </w:pPr>
+      <w:r>
+        <w:rPr>
+          <w:rFonts w:ascii="Verdana" w:cs="Verdana" w:eastAsia="Verdana" w:hAnsi="Verdana"/>
+          <w:b/>
+          <w:bCs/>
+          <w:sz w:val="19"/>
+          <w:szCs w:val="19"/>
+        </w:rPr>
+        <w:t xml:space="preserve">Treating the ranking as the truth.</w:t>
+      </w:r>
+      <w:r>
+        <w:rPr>
+          <w:rFonts w:ascii="Verdana" w:cs="Verdana" w:eastAsia="Verdana" w:hAnsi="Verdana"/>
+          <w:sz w:val="19"/>
+          <w:szCs w:val="19"/>
+        </w:rPr>
+        <w:t xml:space="preserve"> Report rank ranges and say what would change the order.</w:t>
+      </w:r>
+    </w:p>
+    <w:p>
+      <w:pPr>
+        <w:pStyle w:val="ListParagraph"/>
+        <w:numPr>
+          <w:ilvl w:val="0"/>
+          <w:numId w:val="2"/>
+        </w:numPr>
+        <w:spacing w:after="60" w:line="252"/>
+      </w:pPr>
+      <w:r>
+        <w:rPr>
+          <w:rFonts w:ascii="Verdana" w:cs="Verdana" w:eastAsia="Verdana" w:hAnsi="Verdana"/>
+          <w:b/>
+          <w:bCs/>
+          <w:sz w:val="19"/>
+          <w:szCs w:val="19"/>
+        </w:rPr>
+        <w:t xml:space="preserve">Ignoring Julius Meinl's model.</w:t>
+      </w:r>
+      <w:r>
+        <w:rPr>
+          <w:rFonts w:ascii="Verdana" w:cs="Verdana" w:eastAsia="Verdana" w:hAnsi="Verdana"/>
+          <w:sz w:val="19"/>
+          <w:szCs w:val="19"/>
+        </w:rPr>
+        <w:t xml:space="preserve"> A big market without hotels, premium buyers or a feasible partner may not fit.</w:t>
+      </w:r>
+    </w:p>
+    <w:p>
+      <w:pPr>
+        <w:pStyle w:val="ListParagraph"/>
+        <w:numPr>
+          <w:ilvl w:val="0"/>
+          <w:numId w:val="2"/>
+        </w:numPr>
+        <w:spacing w:after="60" w:line="252"/>
+      </w:pPr>
+      <w:r>
+        <w:rPr>
+          <w:rFonts w:ascii="Verdana" w:cs="Verdana" w:eastAsia="Verdana" w:hAnsi="Verdana"/>
+          <w:b/>
+          <w:bCs/>
+          <w:sz w:val="19"/>
+          <w:szCs w:val="19"/>
+        </w:rPr>
+        <w:t xml:space="preserve">No "what not to do".</w:t>
+      </w:r>
+      <w:r>
+        <w:rPr>
+          <w:rFonts w:ascii="Verdana" w:cs="Verdana" w:eastAsia="Verdana" w:hAnsi="Verdana"/>
+          <w:sz w:val="19"/>
+          <w:szCs w:val="19"/>
+        </w:rPr>
+        <w:t xml:space="preserve"> A recommendation includes the countries you would not enter now.</w:t>
+      </w:r>
+    </w:p>
     <w:sectPr>
       <w:footerReference w:type="default" r:id="rId6"/>
       <w:pgSz w:w="11906" w:h="16838" w:orient="portrait"/>

</xml_diff>

<commit_message>
Brief: Google Sheet links as named hyperlinks
Co-Authored-By: Claude Sonnet 5.5 <noreply@anthropic.com>
Claude-Session: https://claude.ai/code/session_01RkWScMhuRmEB4zppSmB7Ri
</commit_message>
<xml_diff>
--- a/WT26-27/Student Brief Midterm Presentation WT26-27.docx
+++ b/WT26-27/Student Brief Midterm Presentation WT26-27.docx
@@ -2491,7 +2491,26 @@
           <w:sz w:val="19"/>
           <w:szCs w:val="19"/>
         </w:rPr>
-        <w:t xml:space="preserve"> (political, economic, social, technological, environmental, legal). Each step lists what to hand in. The shared Google Sheet "Country scoring model" (https://docs.google.com/spreadsheets/d/1ifCycoxWtutCrwbsCETGqZynYf1nFx7izoGMwWKapVE/edit) mirrors the steps (section 9).</w:t>
+        <w:t xml:space="preserve"> (political, economic, social, technological, environmental, legal). Each step lists what to hand in. The shared Google Sheet </w:t>
+      </w:r>
+      <w:hyperlink w:history="1" r:id="rIdze2fxdtduimi_pm9lheem">
+        <w:r>
+          <w:rPr>
+            <w:rStyle w:val="Hyperlink"/>
+            <w:rFonts w:ascii="Verdana" w:cs="Verdana" w:eastAsia="Verdana" w:hAnsi="Verdana"/>
+            <w:sz w:val="19"/>
+            <w:szCs w:val="19"/>
+          </w:rPr>
+          <w:t xml:space="preserve">Country scoring model</w:t>
+        </w:r>
+      </w:hyperlink>
+      <w:r>
+        <w:rPr>
+          <w:rFonts w:ascii="Verdana" w:cs="Verdana" w:eastAsia="Verdana" w:hAnsi="Verdana"/>
+          <w:sz w:val="19"/>
+          <w:szCs w:val="19"/>
+        </w:rPr>
+        <w:t xml:space="preserve"> mirrors the steps (section 9).</w:t>
       </w:r>
     </w:p>
     <w:p>
@@ -2516,7 +2535,26 @@
           <w:sz w:val="19"/>
           <w:szCs w:val="19"/>
         </w:rPr>
-        <w:t xml:space="preserve">Your group receives a copy of the Google Sheet "PESTEL indicator search" (https://docs.google.com/spreadsheets/d/18zUrrOllyNWMXJhTvZjvD7LeAo98Ds-vUhu6JQ_B-tk/edit): open it, then File &gt; Make a copy. </w:t>
+        <w:t xml:space="preserve">Your group receives a copy of the Google Sheet </w:t>
+      </w:r>
+      <w:hyperlink w:history="1" r:id="rIdmiec8dlm_vvk8404egr8c">
+        <w:r>
+          <w:rPr>
+            <w:rStyle w:val="Hyperlink"/>
+            <w:rFonts w:ascii="Verdana" w:cs="Verdana" w:eastAsia="Verdana" w:hAnsi="Verdana"/>
+            <w:sz w:val="19"/>
+            <w:szCs w:val="19"/>
+          </w:rPr>
+          <w:t xml:space="preserve">PESTEL indicator search</w:t>
+        </w:r>
+      </w:hyperlink>
+      <w:r>
+        <w:rPr>
+          <w:rFonts w:ascii="Verdana" w:cs="Verdana" w:eastAsia="Verdana" w:hAnsi="Verdana"/>
+          <w:sz w:val="19"/>
+          <w:szCs w:val="19"/>
+        </w:rPr>
+        <w:t xml:space="preserve">: open it, then File &gt; Make a copy. </w:t>
       </w:r>
       <w:r>
         <w:rPr>
@@ -2595,7 +2633,26 @@
           <w:sz w:val="19"/>
           <w:szCs w:val="19"/>
         </w:rPr>
-        <w:t xml:space="preserve">Collect the values of your allocated country for all 45 indicators and enter them in the yellow cells of your country on the Data sheet of the shared Google Sheet (https://docs.google.com/spreadsheets/d/1ifCycoxWtutCrwbsCETGqZynYf1nFx7izoGMwWKapVE/edit). </w:t>
+        <w:t xml:space="preserve">Collect the values of your allocated country for all 45 indicators and enter them in the yellow cells of your country on the Data sheet of the shared Google Sheet </w:t>
+      </w:r>
+      <w:hyperlink w:history="1" r:id="rIdbj2yeribkerc_lszxgc5l">
+        <w:r>
+          <w:rPr>
+            <w:rStyle w:val="Hyperlink"/>
+            <w:rFonts w:ascii="Verdana" w:cs="Verdana" w:eastAsia="Verdana" w:hAnsi="Verdana"/>
+            <w:sz w:val="19"/>
+            <w:szCs w:val="19"/>
+          </w:rPr>
+          <w:t xml:space="preserve">Country scoring model</w:t>
+        </w:r>
+      </w:hyperlink>
+      <w:r>
+        <w:rPr>
+          <w:rFonts w:ascii="Verdana" w:cs="Verdana" w:eastAsia="Verdana" w:hAnsi="Verdana"/>
+          <w:sz w:val="19"/>
+          <w:szCs w:val="19"/>
+        </w:rPr>
+        <w:t xml:space="preserve">. </w:t>
       </w:r>
       <w:r>
         <w:rPr>
@@ -6236,7 +6293,26 @@
           <w:sz w:val="19"/>
           <w:szCs w:val="19"/>
         </w:rPr>
-        <w:t xml:space="preserve"> in Excel or Google Sheets (template "Industry analysis source list": https://docs.google.com/spreadsheets/d/1j_sCad7k4kMgdCHRPM9sbeIKD9YeIDw6v16mskYxjB4/edit, File &gt; Make a copy) with one row per number or fact on your slides: segment, statistic, value, unit, year, source, source type, link, date accessed, slide number and quality.</w:t>
+        <w:t xml:space="preserve"> in Excel or Google Sheets (template </w:t>
+      </w:r>
+      <w:hyperlink w:history="1" r:id="rIdpbh4dwbm8uigg9oqsxdkk">
+        <w:r>
+          <w:rPr>
+            <w:rStyle w:val="Hyperlink"/>
+            <w:rFonts w:ascii="Verdana" w:cs="Verdana" w:eastAsia="Verdana" w:hAnsi="Verdana"/>
+            <w:sz w:val="19"/>
+            <w:szCs w:val="19"/>
+          </w:rPr>
+          <w:t xml:space="preserve">Industry analysis source list</w:t>
+        </w:r>
+      </w:hyperlink>
+      <w:r>
+        <w:rPr>
+          <w:rFonts w:ascii="Verdana" w:cs="Verdana" w:eastAsia="Verdana" w:hAnsi="Verdana"/>
+          <w:sz w:val="19"/>
+          <w:szCs w:val="19"/>
+        </w:rPr>
+        <w:t xml:space="preserve">, File &gt; Make a copy) with one row per number or fact on your slides: segment, statistic, value, unit, year, source, source type, link, date accessed, slide number and quality.</w:t>
       </w:r>
     </w:p>
     <w:p>
@@ -6264,15 +6340,34 @@
           <w:sz w:val="19"/>
           <w:szCs w:val="19"/>
         </w:rPr>
-        <w:t xml:space="preserve">Shared Google Sheet "Country scoring model"</w:t>
-      </w:r>
-      <w:r>
-        <w:rPr>
-          <w:rFonts w:ascii="Verdana" w:cs="Verdana" w:eastAsia="Verdana" w:hAnsi="Verdana"/>
-          <w:sz w:val="19"/>
-          <w:szCs w:val="19"/>
-        </w:rPr>
-        <w:t xml:space="preserve"> (https://docs.google.com/spreadsheets/d/1ifCycoxWtutCrwbsCETGqZynYf1nFx7izoGMwWKapVE/edit) for all six groups. You enter data only in the yellow cells of your own country (the numbers, with year and source for documentation); the rest is automatic and locked. Sheets:</w:t>
+        <w:t xml:space="preserve">Shared Google Sheet:</w:t>
+      </w:r>
+      <w:r>
+        <w:rPr>
+          <w:rFonts w:ascii="Verdana" w:cs="Verdana" w:eastAsia="Verdana" w:hAnsi="Verdana"/>
+          <w:sz w:val="19"/>
+          <w:szCs w:val="19"/>
+        </w:rPr>
+        <w:t xml:space="preserve"> </w:t>
+      </w:r>
+      <w:hyperlink w:history="1" r:id="rIdb-u16x8wtriscaeusj_7w">
+        <w:r>
+          <w:rPr>
+            <w:rStyle w:val="Hyperlink"/>
+            <w:rFonts w:ascii="Verdana" w:cs="Verdana" w:eastAsia="Verdana" w:hAnsi="Verdana"/>
+            <w:sz w:val="19"/>
+            <w:szCs w:val="19"/>
+          </w:rPr>
+          <w:t xml:space="preserve">Country scoring model</w:t>
+        </w:r>
+      </w:hyperlink>
+      <w:r>
+        <w:rPr>
+          <w:rFonts w:ascii="Verdana" w:cs="Verdana" w:eastAsia="Verdana" w:hAnsi="Verdana"/>
+          <w:sz w:val="19"/>
+          <w:szCs w:val="19"/>
+        </w:rPr>
+        <w:t xml:space="preserve"> for all six groups. You enter data only in the yellow cells of your own country (the numbers, with year and source for documentation); the rest is automatic and locked. Sheets:</w:t>
       </w:r>
     </w:p>
     <w:tbl>
@@ -6877,7 +6972,26 @@
           <w:sz w:val="19"/>
           <w:szCs w:val="19"/>
         </w:rPr>
-        <w:t xml:space="preserve"> (hand-in): a short workbook with (1) a copy of your country's data and sources, (2) the Part B source list (template "Industry analysis source list": https://docs.google.com/spreadsheets/d/1j_sCad7k4kMgdCHRPM9sbeIKD9YeIDw6v16mskYxjB4/edit, File &gt; Make a copy): every source behind the numbers on your industry slides, and (3) a list of the AI tools you used. The industry numbers themselves are shown in the presentation. Sources need URL, date accessed and who collected the data. Results come from formulas, not pasted values; inputs and formulas are visibly different.</w:t>
+        <w:t xml:space="preserve"> (hand-in): a short workbook with (1) a copy of your country's data and sources, (2) the Part B source list (template </w:t>
+      </w:r>
+      <w:hyperlink w:history="1" r:id="rIdcgj8xdqkjjgy2wqrrb6he">
+        <w:r>
+          <w:rPr>
+            <w:rStyle w:val="Hyperlink"/>
+            <w:rFonts w:ascii="Verdana" w:cs="Verdana" w:eastAsia="Verdana" w:hAnsi="Verdana"/>
+            <w:sz w:val="19"/>
+            <w:szCs w:val="19"/>
+          </w:rPr>
+          <w:t xml:space="preserve">Industry analysis source list</w:t>
+        </w:r>
+      </w:hyperlink>
+      <w:r>
+        <w:rPr>
+          <w:rFonts w:ascii="Verdana" w:cs="Verdana" w:eastAsia="Verdana" w:hAnsi="Verdana"/>
+          <w:sz w:val="19"/>
+          <w:szCs w:val="19"/>
+        </w:rPr>
+        <w:t xml:space="preserve">, File &gt; Make a copy): every source behind the numbers on your industry slides, and (3) a list of the AI tools you used. The industry numbers themselves are shown in the presentation. Sources need URL, date accessed and who collected the data. Results come from formulas, not pasted values; inputs and formulas are visibly different.</w:t>
       </w:r>
     </w:p>
     <w:p>

</xml_diff>

<commit_message>
Brief: data entry deadline Monday 9 November 2026, 08:00
Co-Authored-By: Claude Sonnet 5.5 <noreply@anthropic.com>
Claude-Session: https://claude.ai/code/session_01RkWScMhuRmEB4zppSmB7Ri
</commit_message>
<xml_diff>
--- a/WT26-27/Student Brief Midterm Presentation WT26-27.docx
+++ b/WT26-27/Student Brief Midterm Presentation WT26-27.docx
@@ -511,7 +511,7 @@
                 <w:sz w:val="16"/>
                 <w:szCs w:val="16"/>
               </w:rPr>
-              <w:t xml:space="preserve">Monday 16 November 2026, 08:00 on Canvas: one presentation file and one Excel file, named GroupX_Midterm and GroupX_Midterm_Data; your country's data are due in the shared Google Sheet by Monday 26 October 2026, 08:00 (Step 2).</w:t>
+              <w:t xml:space="preserve">Monday 16 November 2026, 08:00 on Canvas: one presentation file and one Excel file, named GroupX_Midterm and GroupX_Midterm_Data; your country's data are due in the shared Google Sheet by Monday 9 November 2026, 08:00 (Step 2).</w:t>
             </w:r>
           </w:p>
         </w:tc>
@@ -2493,7 +2493,7 @@
         </w:rPr>
         <w:t xml:space="preserve"> (political, economic, social, technological, environmental, legal). Each step lists what to hand in. The shared Google Sheet </w:t>
       </w:r>
-      <w:hyperlink w:history="1" r:id="rIdze2fxdtduimi_pm9lheem">
+      <w:hyperlink w:history="1" r:id="rId63mr3-ngmc8u0lskzeakk">
         <w:r>
           <w:rPr>
             <w:rStyle w:val="Hyperlink"/>
@@ -2537,7 +2537,7 @@
         </w:rPr>
         <w:t xml:space="preserve">Your group receives a copy of the Google Sheet </w:t>
       </w:r>
-      <w:hyperlink w:history="1" r:id="rIdmiec8dlm_vvk8404egr8c">
+      <w:hyperlink w:history="1" r:id="rIdzzt0q747uhk4rd8dpwerc">
         <w:r>
           <w:rPr>
             <w:rStyle w:val="Hyperlink"/>
@@ -2635,7 +2635,7 @@
         </w:rPr>
         <w:t xml:space="preserve">Collect the values of your allocated country for all 45 indicators and enter them in the yellow cells of your country on the Data sheet of the shared Google Sheet </w:t>
       </w:r>
-      <w:hyperlink w:history="1" r:id="rIdbj2yeribkerc_lszxgc5l">
+      <w:hyperlink w:history="1" r:id="rIdrrp3qgmtv9iniugylzm7f">
         <w:r>
           <w:rPr>
             <w:rStyle w:val="Hyperlink"/>
@@ -2698,7 +2698,7 @@
           <w:sz w:val="19"/>
           <w:szCs w:val="19"/>
         </w:rPr>
-        <w:t xml:space="preserve">Monday 26 October 2026, 08:00</w:t>
+        <w:t xml:space="preserve">Monday 9 November 2026, 08:00</w:t>
       </w:r>
       <w:r>
         <w:rPr>
@@ -6295,7 +6295,7 @@
         </w:rPr>
         <w:t xml:space="preserve"> in Excel or Google Sheets (template </w:t>
       </w:r>
-      <w:hyperlink w:history="1" r:id="rIdpbh4dwbm8uigg9oqsxdkk">
+      <w:hyperlink w:history="1" r:id="rIdlz486dulrai2b82g4ly5j">
         <w:r>
           <w:rPr>
             <w:rStyle w:val="Hyperlink"/>
@@ -6350,7 +6350,7 @@
         </w:rPr>
         <w:t xml:space="preserve"> </w:t>
       </w:r>
-      <w:hyperlink w:history="1" r:id="rIdb-u16x8wtriscaeusj_7w">
+      <w:hyperlink w:history="1" r:id="rIdacgpvhbvtcpewuylxk6-t">
         <w:r>
           <w:rPr>
             <w:rStyle w:val="Hyperlink"/>
@@ -6974,7 +6974,7 @@
         </w:rPr>
         <w:t xml:space="preserve"> (hand-in): a short workbook with (1) a copy of your country's data and sources, (2) the Part B source list (template </w:t>
       </w:r>
-      <w:hyperlink w:history="1" r:id="rIdcgj8xdqkjjgy2wqrrb6he">
+      <w:hyperlink w:history="1" r:id="rIdodnp49uk9ji7tlb6yxf4h">
         <w:r>
           <w:rPr>
             <w:rStyle w:val="Hyperlink"/>
@@ -8261,7 +8261,7 @@
                 <w:sz w:val="16"/>
                 <w:szCs w:val="16"/>
               </w:rPr>
-              <w:t xml:space="preserve">Your country's data entered in the shared sheet by Mon 26 Oct, 08:00; then your first results and robustness checks</w:t>
+              <w:t xml:space="preserve">Your country's data entered in the shared sheet by Mon 9 Nov, 08:00; then your results and robustness checks</w:t>
             </w:r>
           </w:p>
         </w:tc>

</xml_diff>

<commit_message>
Brief: data entry deadline Sunday 8 November 2026, 23:59
Co-Authored-By: Claude Sonnet 5.5 <noreply@anthropic.com>
Claude-Session: https://claude.ai/code/session_01RkWScMhuRmEB4zppSmB7Ri
</commit_message>
<xml_diff>
--- a/WT26-27/Student Brief Midterm Presentation WT26-27.docx
+++ b/WT26-27/Student Brief Midterm Presentation WT26-27.docx
@@ -511,7 +511,7 @@
                 <w:sz w:val="16"/>
                 <w:szCs w:val="16"/>
               </w:rPr>
-              <w:t xml:space="preserve">Monday 16 November 2026, 08:00 on Canvas: one presentation file and one Excel file, named GroupX_Midterm and GroupX_Midterm_Data; your country's data are due in the shared Google Sheet by Monday 9 November 2026, 08:00 (Step 2).</w:t>
+              <w:t xml:space="preserve">Monday 16 November 2026, 08:00 on Canvas: one presentation file and one Excel file, named GroupX_Midterm and GroupX_Midterm_Data; your country's data are due in the shared Google Sheet by Sunday 8 November 2026, 23:59 (Step 2).</w:t>
             </w:r>
           </w:p>
         </w:tc>
@@ -2493,7 +2493,7 @@
         </w:rPr>
         <w:t xml:space="preserve"> (political, economic, social, technological, environmental, legal). Each step lists what to hand in. The shared Google Sheet </w:t>
       </w:r>
-      <w:hyperlink w:history="1" r:id="rId63mr3-ngmc8u0lskzeakk">
+      <w:hyperlink w:history="1" r:id="rIdyqmp-cm-kphyu5rukmko6">
         <w:r>
           <w:rPr>
             <w:rStyle w:val="Hyperlink"/>
@@ -2537,7 +2537,7 @@
         </w:rPr>
         <w:t xml:space="preserve">Your group receives a copy of the Google Sheet </w:t>
       </w:r>
-      <w:hyperlink w:history="1" r:id="rIdzzt0q747uhk4rd8dpwerc">
+      <w:hyperlink w:history="1" r:id="rId3biliz3pxorl5gqiojh4c">
         <w:r>
           <w:rPr>
             <w:rStyle w:val="Hyperlink"/>
@@ -2635,7 +2635,7 @@
         </w:rPr>
         <w:t xml:space="preserve">Collect the values of your allocated country for all 45 indicators and enter them in the yellow cells of your country on the Data sheet of the shared Google Sheet </w:t>
       </w:r>
-      <w:hyperlink w:history="1" r:id="rIdrrp3qgmtv9iniugylzm7f">
+      <w:hyperlink w:history="1" r:id="rId7srkubjgg7rcx9zhrmme6">
         <w:r>
           <w:rPr>
             <w:rStyle w:val="Hyperlink"/>
@@ -2698,7 +2698,7 @@
           <w:sz w:val="19"/>
           <w:szCs w:val="19"/>
         </w:rPr>
-        <w:t xml:space="preserve">Monday 9 November 2026, 08:00</w:t>
+        <w:t xml:space="preserve">Sunday 8 November 2026, 23:59</w:t>
       </w:r>
       <w:r>
         <w:rPr>
@@ -6295,7 +6295,7 @@
         </w:rPr>
         <w:t xml:space="preserve"> in Excel or Google Sheets (template </w:t>
       </w:r>
-      <w:hyperlink w:history="1" r:id="rIdlz486dulrai2b82g4ly5j">
+      <w:hyperlink w:history="1" r:id="rIdfgmnmw3wvuv1vvyyup8w3">
         <w:r>
           <w:rPr>
             <w:rStyle w:val="Hyperlink"/>
@@ -6350,7 +6350,7 @@
         </w:rPr>
         <w:t xml:space="preserve"> </w:t>
       </w:r>
-      <w:hyperlink w:history="1" r:id="rIdacgpvhbvtcpewuylxk6-t">
+      <w:hyperlink w:history="1" r:id="rIdjmlod6bowxtru7f4asim4">
         <w:r>
           <w:rPr>
             <w:rStyle w:val="Hyperlink"/>
@@ -6974,7 +6974,7 @@
         </w:rPr>
         <w:t xml:space="preserve"> (hand-in): a short workbook with (1) a copy of your country's data and sources, (2) the Part B source list (template </w:t>
       </w:r>
-      <w:hyperlink w:history="1" r:id="rIdodnp49uk9ji7tlb6yxf4h">
+      <w:hyperlink w:history="1" r:id="rIdnctipvqq8kjxfr0h85iwt">
         <w:r>
           <w:rPr>
             <w:rStyle w:val="Hyperlink"/>
@@ -8261,7 +8261,7 @@
                 <w:sz w:val="16"/>
                 <w:szCs w:val="16"/>
               </w:rPr>
-              <w:t xml:space="preserve">Your country's data entered in the shared sheet by Mon 9 Nov, 08:00; then your results and robustness checks</w:t>
+              <w:t xml:space="preserve">Your country's data entered in the shared sheet by Sun 8 Nov, 23:59; then your results and robustness checks</w:t>
             </w:r>
           </w:p>
         </w:tc>

</xml_diff>